<commit_message>
Dia 29: Evaluacion de sistemas hibridos ML + LLM
</commit_message>
<xml_diff>
--- a/Sistemas híbridos ML + LLM/Sistemas híbridos ML + LLM.docx
+++ b/Sistemas híbridos ML + LLM/Sistemas híbridos ML + LLM.docx
@@ -1315,7 +1315,7 @@
     <w:p>
       <w:r>
         <w:pict w14:anchorId="504083DE">
-          <v:rect id="_x0000_i1171" style="width:0;height:1.5pt" o:hralign="center" o:hrstd="t" o:hr="t" fillcolor="#a0a0a0" stroked="f"/>
+          <v:rect id="_x0000_i1036" style="width:0;height:1.5pt" o:hralign="center" o:hrstd="t" o:hr="t" fillcolor="#a0a0a0" stroked="f"/>
         </w:pict>
       </w:r>
     </w:p>
@@ -1522,7 +1522,7 @@
     <w:p>
       <w:r>
         <w:pict w14:anchorId="560FC2F9">
-          <v:rect id="_x0000_i1172" style="width:0;height:1.5pt" o:hralign="center" o:hrstd="t" o:hr="t" fillcolor="#a0a0a0" stroked="f"/>
+          <v:rect id="_x0000_i1037" style="width:0;height:1.5pt" o:hralign="center" o:hrstd="t" o:hr="t" fillcolor="#a0a0a0" stroked="f"/>
         </w:pict>
       </w:r>
     </w:p>
@@ -1725,7 +1725,7 @@
     <w:p>
       <w:r>
         <w:pict w14:anchorId="35B7B6CE">
-          <v:rect id="_x0000_i1173" style="width:0;height:1.5pt" o:hralign="center" o:hrstd="t" o:hr="t" fillcolor="#a0a0a0" stroked="f"/>
+          <v:rect id="_x0000_i1038" style="width:0;height:1.5pt" o:hralign="center" o:hrstd="t" o:hr="t" fillcolor="#a0a0a0" stroked="f"/>
         </w:pict>
       </w:r>
     </w:p>
@@ -1821,7 +1821,7 @@
     <w:p>
       <w:r>
         <w:pict w14:anchorId="63ECC956">
-          <v:rect id="_x0000_i1174" style="width:0;height:1.5pt" o:hralign="center" o:hrstd="t" o:hr="t" fillcolor="#a0a0a0" stroked="f"/>
+          <v:rect id="_x0000_i1039" style="width:0;height:1.5pt" o:hralign="center" o:hrstd="t" o:hr="t" fillcolor="#a0a0a0" stroked="f"/>
         </w:pict>
       </w:r>
     </w:p>
@@ -1917,7 +1917,7 @@
       <w:r>
         <w:lastRenderedPageBreak/>
         <w:pict w14:anchorId="0DF4D38B">
-          <v:rect id="_x0000_i1175" style="width:0;height:1.5pt" o:hralign="center" o:hrstd="t" o:hr="t" fillcolor="#a0a0a0" stroked="f"/>
+          <v:rect id="_x0000_i1040" style="width:0;height:1.5pt" o:hralign="center" o:hrstd="t" o:hr="t" fillcolor="#a0a0a0" stroked="f"/>
         </w:pict>
       </w:r>
     </w:p>
@@ -2012,7 +2012,7 @@
     <w:p>
       <w:r>
         <w:pict w14:anchorId="0464332C">
-          <v:rect id="_x0000_i1176" style="width:0;height:1.5pt" o:hralign="center" o:hrstd="t" o:hr="t" fillcolor="#a0a0a0" stroked="f"/>
+          <v:rect id="_x0000_i1041" style="width:0;height:1.5pt" o:hralign="center" o:hrstd="t" o:hr="t" fillcolor="#a0a0a0" stroked="f"/>
         </w:pict>
       </w:r>
     </w:p>
@@ -2108,7 +2108,7 @@
     <w:p>
       <w:r>
         <w:pict w14:anchorId="130BD0E4">
-          <v:rect id="_x0000_i1177" style="width:0;height:1.5pt" o:hralign="center" o:hrstd="t" o:hr="t" fillcolor="#a0a0a0" stroked="f"/>
+          <v:rect id="_x0000_i1042" style="width:0;height:1.5pt" o:hralign="center" o:hrstd="t" o:hr="t" fillcolor="#a0a0a0" stroked="f"/>
         </w:pict>
       </w:r>
     </w:p>
@@ -2171,7 +2171,7 @@
     <w:p>
       <w:r>
         <w:pict w14:anchorId="47596D41">
-          <v:rect id="_x0000_i1178" style="width:0;height:1.5pt" o:hralign="center" o:hrstd="t" o:hr="t" fillcolor="#a0a0a0" stroked="f"/>
+          <v:rect id="_x0000_i1043" style="width:0;height:1.5pt" o:hralign="center" o:hrstd="t" o:hr="t" fillcolor="#a0a0a0" stroked="f"/>
         </w:pict>
       </w:r>
     </w:p>
@@ -2221,7 +2221,7 @@
     <w:p>
       <w:r>
         <w:pict w14:anchorId="4CC139D1">
-          <v:rect id="_x0000_i1179" style="width:0;height:1.5pt" o:hralign="center" o:hrstd="t" o:hr="t" fillcolor="#a0a0a0" stroked="f"/>
+          <v:rect id="_x0000_i1044" style="width:0;height:1.5pt" o:hralign="center" o:hrstd="t" o:hr="t" fillcolor="#a0a0a0" stroked="f"/>
         </w:pict>
       </w:r>
     </w:p>
@@ -2272,6 +2272,1238 @@
         <w:t>El sistema orquesta ambos.</w:t>
       </w:r>
     </w:p>
+    <w:p/>
+    <w:p/>
+    <w:p/>
+    <w:p>
+      <w:pPr>
+        <w:rPr>
+          <w:b/>
+          <w:bCs/>
+          <w:sz w:val="36"/>
+          <w:szCs w:val="36"/>
+          <w:u w:val="single"/>
+        </w:rPr>
+      </w:pPr>
+      <w:r>
+        <w:rPr>
+          <w:b/>
+          <w:bCs/>
+          <w:sz w:val="36"/>
+          <w:szCs w:val="36"/>
+          <w:u w:val="single"/>
+        </w:rPr>
+        <w:lastRenderedPageBreak/>
+        <w:t>Evaluación de sistemas híbridos</w:t>
+      </w:r>
+    </w:p>
+    <w:p>
+      <w:pPr>
+        <w:rPr>
+          <w:rFonts w:cstheme="minorHAnsi"/>
+          <w:b/>
+          <w:bCs/>
+          <w:sz w:val="28"/>
+          <w:szCs w:val="28"/>
+          <w:u w:val="single"/>
+        </w:rPr>
+      </w:pPr>
+      <w:r>
+        <w:rPr>
+          <w:rFonts w:cstheme="minorHAnsi"/>
+          <w:b/>
+          <w:bCs/>
+          <w:sz w:val="28"/>
+          <w:szCs w:val="28"/>
+          <w:u w:val="single"/>
+        </w:rPr>
+        <w:t>1️</w:t>
+      </w:r>
+      <w:r>
+        <w:rPr>
+          <w:rFonts w:cstheme="minorHAnsi"/>
+          <w:b/>
+          <w:bCs/>
+          <w:sz w:val="28"/>
+          <w:szCs w:val="28"/>
+          <w:u w:val="single"/>
+        </w:rPr>
+        <w:t xml:space="preserve">) </w:t>
+      </w:r>
+      <w:r>
+        <w:rPr>
+          <w:rFonts w:cstheme="minorHAnsi"/>
+          <w:b/>
+          <w:bCs/>
+          <w:sz w:val="28"/>
+          <w:szCs w:val="28"/>
+          <w:u w:val="single"/>
+        </w:rPr>
+        <w:t>Evaluación del ML clásico</w:t>
+      </w:r>
+    </w:p>
+    <w:p>
+      <w:r>
+        <w:t xml:space="preserve">Esto ya lo </w:t>
+      </w:r>
+      <w:proofErr w:type="spellStart"/>
+      <w:r>
+        <w:t>conocés</w:t>
+      </w:r>
+      <w:proofErr w:type="spellEnd"/>
+      <w:r>
+        <w:t>.</w:t>
+      </w:r>
+    </w:p>
+    <w:p>
+      <w:r>
+        <w:t>Se evalúa con métricas claras:</w:t>
+      </w:r>
+    </w:p>
+    <w:p>
+      <w:pPr>
+        <w:numPr>
+          <w:ilvl w:val="0"/>
+          <w:numId w:val="31"/>
+        </w:numPr>
+      </w:pPr>
+      <w:proofErr w:type="spellStart"/>
+      <w:r>
+        <w:t>Accuracy</w:t>
+      </w:r>
+      <w:proofErr w:type="spellEnd"/>
+    </w:p>
+    <w:p>
+      <w:pPr>
+        <w:numPr>
+          <w:ilvl w:val="0"/>
+          <w:numId w:val="31"/>
+        </w:numPr>
+      </w:pPr>
+      <w:proofErr w:type="spellStart"/>
+      <w:r>
+        <w:t>Precision</w:t>
+      </w:r>
+      <w:proofErr w:type="spellEnd"/>
+    </w:p>
+    <w:p>
+      <w:pPr>
+        <w:numPr>
+          <w:ilvl w:val="0"/>
+          <w:numId w:val="31"/>
+        </w:numPr>
+      </w:pPr>
+      <w:proofErr w:type="spellStart"/>
+      <w:r>
+        <w:t>Recall</w:t>
+      </w:r>
+      <w:proofErr w:type="spellEnd"/>
+    </w:p>
+    <w:p>
+      <w:pPr>
+        <w:numPr>
+          <w:ilvl w:val="0"/>
+          <w:numId w:val="31"/>
+        </w:numPr>
+      </w:pPr>
+      <w:r>
+        <w:t>F1</w:t>
+      </w:r>
+    </w:p>
+    <w:p>
+      <w:pPr>
+        <w:numPr>
+          <w:ilvl w:val="0"/>
+          <w:numId w:val="31"/>
+        </w:numPr>
+      </w:pPr>
+      <w:r>
+        <w:t>ROC-AUC</w:t>
+      </w:r>
+    </w:p>
+    <w:p>
+      <w:r>
+        <w:t>Ejemplo:</w:t>
+      </w:r>
+    </w:p>
+    <w:p>
+      <w:r>
+        <w:t>Modelo abandono estudiantes</w:t>
+      </w:r>
+      <w:r>
+        <w:br/>
+      </w:r>
+      <w:proofErr w:type="spellStart"/>
+      <w:r>
+        <w:t>Accuracy</w:t>
+      </w:r>
+      <w:proofErr w:type="spellEnd"/>
+      <w:r>
+        <w:t>: 0.84</w:t>
+      </w:r>
+      <w:r>
+        <w:br/>
+      </w:r>
+      <w:proofErr w:type="spellStart"/>
+      <w:r>
+        <w:t>Recall</w:t>
+      </w:r>
+      <w:proofErr w:type="spellEnd"/>
+      <w:r>
+        <w:t>: 0.78</w:t>
+      </w:r>
+      <w:r>
+        <w:br/>
+      </w:r>
+      <w:proofErr w:type="spellStart"/>
+      <w:r>
+        <w:t>Precision</w:t>
+      </w:r>
+      <w:proofErr w:type="spellEnd"/>
+      <w:r>
+        <w:t>: 0.81</w:t>
+      </w:r>
+    </w:p>
+    <w:p>
+      <w:r>
+        <w:rPr>
+          <w:rFonts w:ascii="Segoe UI Emoji" w:hAnsi="Segoe UI Emoji" w:cs="Segoe UI Emoji"/>
+        </w:rPr>
+        <w:t>📌</w:t>
+      </w:r>
+      <w:r>
+        <w:t xml:space="preserve"> Esto es </w:t>
+      </w:r>
+      <w:r>
+        <w:rPr>
+          <w:b/>
+          <w:bCs/>
+        </w:rPr>
+        <w:t>objetivo y repetible</w:t>
+      </w:r>
+      <w:r>
+        <w:t>.</w:t>
+      </w:r>
+    </w:p>
+    <w:p>
+      <w:r>
+        <w:pict w14:anchorId="2CEA0DD0">
+          <v:rect id="_x0000_i1090" style="width:0;height:1.5pt" o:hralign="center" o:hrstd="t" o:hr="t" fillcolor="#a0a0a0" stroked="f"/>
+        </w:pict>
+      </w:r>
+    </w:p>
+    <w:p>
+      <w:pPr>
+        <w:rPr>
+          <w:rFonts w:cstheme="minorHAnsi"/>
+          <w:b/>
+          <w:bCs/>
+          <w:sz w:val="28"/>
+          <w:szCs w:val="28"/>
+          <w:u w:val="single"/>
+        </w:rPr>
+      </w:pPr>
+      <w:r>
+        <w:rPr>
+          <w:rFonts w:cstheme="minorHAnsi"/>
+          <w:b/>
+          <w:bCs/>
+          <w:sz w:val="28"/>
+          <w:szCs w:val="28"/>
+          <w:u w:val="single"/>
+        </w:rPr>
+        <w:t>2️</w:t>
+      </w:r>
+      <w:r>
+        <w:rPr>
+          <w:rFonts w:cstheme="minorHAnsi"/>
+          <w:b/>
+          <w:bCs/>
+          <w:sz w:val="28"/>
+          <w:szCs w:val="28"/>
+          <w:u w:val="single"/>
+        </w:rPr>
+        <w:t xml:space="preserve">) </w:t>
+      </w:r>
+      <w:r>
+        <w:rPr>
+          <w:rFonts w:cstheme="minorHAnsi"/>
+          <w:b/>
+          <w:bCs/>
+          <w:sz w:val="28"/>
+          <w:szCs w:val="28"/>
+          <w:u w:val="single"/>
+        </w:rPr>
+        <w:t>Evaluación del LLM</w:t>
+      </w:r>
+    </w:p>
+    <w:p>
+      <w:r>
+        <w:t>Acá cambia todo.</w:t>
+      </w:r>
+    </w:p>
+    <w:p>
+      <w:r>
+        <w:t xml:space="preserve">El LLM no devuelve números sino </w:t>
+      </w:r>
+      <w:r>
+        <w:rPr>
+          <w:b/>
+          <w:bCs/>
+        </w:rPr>
+        <w:t>lenguaje</w:t>
+      </w:r>
+      <w:r>
+        <w:t>, entonces se evalúa con:</w:t>
+      </w:r>
+    </w:p>
+    <w:p>
+      <w:pPr>
+        <w:rPr>
+          <w:b/>
+          <w:bCs/>
+        </w:rPr>
+      </w:pPr>
+      <w:r>
+        <w:rPr>
+          <w:b/>
+          <w:bCs/>
+        </w:rPr>
+        <w:t>criterios</w:t>
+      </w:r>
+    </w:p>
+    <w:p>
+      <w:pPr>
+        <w:numPr>
+          <w:ilvl w:val="0"/>
+          <w:numId w:val="32"/>
+        </w:numPr>
+      </w:pPr>
+      <w:r>
+        <w:t>claridad</w:t>
+      </w:r>
+    </w:p>
+    <w:p>
+      <w:pPr>
+        <w:numPr>
+          <w:ilvl w:val="0"/>
+          <w:numId w:val="32"/>
+        </w:numPr>
+      </w:pPr>
+      <w:r>
+        <w:t>relevancia</w:t>
+      </w:r>
+    </w:p>
+    <w:p>
+      <w:pPr>
+        <w:numPr>
+          <w:ilvl w:val="0"/>
+          <w:numId w:val="32"/>
+        </w:numPr>
+      </w:pPr>
+      <w:r>
+        <w:t>fidelidad a los datos</w:t>
+      </w:r>
+    </w:p>
+    <w:p>
+      <w:pPr>
+        <w:numPr>
+          <w:ilvl w:val="0"/>
+          <w:numId w:val="32"/>
+        </w:numPr>
+      </w:pPr>
+      <w:r>
+        <w:t>ausencia de alucinaciones</w:t>
+      </w:r>
+    </w:p>
+    <w:p>
+      <w:pPr>
+        <w:numPr>
+          <w:ilvl w:val="0"/>
+          <w:numId w:val="32"/>
+        </w:numPr>
+      </w:pPr>
+      <w:r>
+        <w:t>utilidad</w:t>
+      </w:r>
+    </w:p>
+    <w:p>
+      <w:r>
+        <w:t>Ejemplo de evaluación:</w:t>
+      </w:r>
+    </w:p>
+    <w:tbl>
+      <w:tblPr>
+        <w:tblW w:w="0" w:type="auto"/>
+        <w:tblCellSpacing w:w="15" w:type="dxa"/>
+        <w:tblCellMar>
+          <w:top w:w="15" w:type="dxa"/>
+          <w:left w:w="15" w:type="dxa"/>
+          <w:bottom w:w="15" w:type="dxa"/>
+          <w:right w:w="15" w:type="dxa"/>
+        </w:tblCellMar>
+        <w:tblLook w:val="04A0" w:firstRow="1" w:lastRow="0" w:firstColumn="1" w:lastColumn="0" w:noHBand="0" w:noVBand="1"/>
+      </w:tblPr>
+      <w:tblGrid>
+        <w:gridCol w:w="991"/>
+        <w:gridCol w:w="563"/>
+      </w:tblGrid>
+      <w:tr>
+        <w:trPr>
+          <w:tblHeader/>
+          <w:tblCellSpacing w:w="15" w:type="dxa"/>
+        </w:trPr>
+        <w:tc>
+          <w:tcPr>
+            <w:tcW w:w="0" w:type="auto"/>
+            <w:vAlign w:val="center"/>
+            <w:hideMark/>
+          </w:tcPr>
+          <w:p>
+            <w:pPr>
+              <w:rPr>
+                <w:b/>
+                <w:bCs/>
+              </w:rPr>
+            </w:pPr>
+            <w:r>
+              <w:rPr>
+                <w:b/>
+                <w:bCs/>
+              </w:rPr>
+              <w:t>criterio</w:t>
+            </w:r>
+          </w:p>
+        </w:tc>
+        <w:tc>
+          <w:tcPr>
+            <w:tcW w:w="0" w:type="auto"/>
+            <w:vAlign w:val="center"/>
+            <w:hideMark/>
+          </w:tcPr>
+          <w:p>
+            <w:pPr>
+              <w:rPr>
+                <w:b/>
+                <w:bCs/>
+              </w:rPr>
+            </w:pPr>
+            <w:r>
+              <w:rPr>
+                <w:b/>
+                <w:bCs/>
+              </w:rPr>
+              <w:t>score</w:t>
+            </w:r>
+          </w:p>
+        </w:tc>
+      </w:tr>
+      <w:tr>
+        <w:trPr>
+          <w:tblCellSpacing w:w="15" w:type="dxa"/>
+        </w:trPr>
+        <w:tc>
+          <w:tcPr>
+            <w:tcW w:w="0" w:type="auto"/>
+            <w:vAlign w:val="center"/>
+            <w:hideMark/>
+          </w:tcPr>
+          <w:p>
+            <w:r>
+              <w:t>claridad</w:t>
+            </w:r>
+          </w:p>
+        </w:tc>
+        <w:tc>
+          <w:tcPr>
+            <w:tcW w:w="0" w:type="auto"/>
+            <w:vAlign w:val="center"/>
+            <w:hideMark/>
+          </w:tcPr>
+          <w:p>
+            <w:r>
+              <w:t>4/5</w:t>
+            </w:r>
+          </w:p>
+        </w:tc>
+      </w:tr>
+      <w:tr>
+        <w:trPr>
+          <w:tblCellSpacing w:w="15" w:type="dxa"/>
+        </w:trPr>
+        <w:tc>
+          <w:tcPr>
+            <w:tcW w:w="0" w:type="auto"/>
+            <w:vAlign w:val="center"/>
+            <w:hideMark/>
+          </w:tcPr>
+          <w:p>
+            <w:r>
+              <w:t>relevancia</w:t>
+            </w:r>
+          </w:p>
+        </w:tc>
+        <w:tc>
+          <w:tcPr>
+            <w:tcW w:w="0" w:type="auto"/>
+            <w:vAlign w:val="center"/>
+            <w:hideMark/>
+          </w:tcPr>
+          <w:p>
+            <w:r>
+              <w:t>5/5</w:t>
+            </w:r>
+          </w:p>
+        </w:tc>
+      </w:tr>
+      <w:tr>
+        <w:trPr>
+          <w:tblCellSpacing w:w="15" w:type="dxa"/>
+        </w:trPr>
+        <w:tc>
+          <w:tcPr>
+            <w:tcW w:w="0" w:type="auto"/>
+            <w:vAlign w:val="center"/>
+            <w:hideMark/>
+          </w:tcPr>
+          <w:p>
+            <w:r>
+              <w:t>fidelidad</w:t>
+            </w:r>
+          </w:p>
+        </w:tc>
+        <w:tc>
+          <w:tcPr>
+            <w:tcW w:w="0" w:type="auto"/>
+            <w:vAlign w:val="center"/>
+            <w:hideMark/>
+          </w:tcPr>
+          <w:p>
+            <w:r>
+              <w:t>4/5</w:t>
+            </w:r>
+          </w:p>
+        </w:tc>
+      </w:tr>
+      <w:tr>
+        <w:trPr>
+          <w:tblCellSpacing w:w="15" w:type="dxa"/>
+        </w:trPr>
+        <w:tc>
+          <w:tcPr>
+            <w:tcW w:w="0" w:type="auto"/>
+            <w:vAlign w:val="center"/>
+            <w:hideMark/>
+          </w:tcPr>
+          <w:p>
+            <w:r>
+              <w:lastRenderedPageBreak/>
+              <w:t>utilidad</w:t>
+            </w:r>
+          </w:p>
+        </w:tc>
+        <w:tc>
+          <w:tcPr>
+            <w:tcW w:w="0" w:type="auto"/>
+            <w:vAlign w:val="center"/>
+            <w:hideMark/>
+          </w:tcPr>
+          <w:p>
+            <w:r>
+              <w:t>4/5</w:t>
+            </w:r>
+          </w:p>
+        </w:tc>
+      </w:tr>
+    </w:tbl>
+    <w:p>
+      <w:r>
+        <w:t xml:space="preserve">Esto es lo que ya hiciste con </w:t>
+      </w:r>
+      <w:r>
+        <w:rPr>
+          <w:b/>
+          <w:bCs/>
+        </w:rPr>
+        <w:t>rúbricas</w:t>
+      </w:r>
+      <w:r>
+        <w:t>.</w:t>
+      </w:r>
+    </w:p>
+    <w:p>
+      <w:r>
+        <w:pict w14:anchorId="2A20B0EB">
+          <v:rect id="_x0000_i1091" style="width:0;height:1.5pt" o:hralign="center" o:hrstd="t" o:hr="t" fillcolor="#a0a0a0" stroked="f"/>
+        </w:pict>
+      </w:r>
+    </w:p>
+    <w:p>
+      <w:pPr>
+        <w:rPr>
+          <w:rFonts w:cstheme="minorHAnsi"/>
+          <w:b/>
+          <w:bCs/>
+          <w:sz w:val="28"/>
+          <w:szCs w:val="28"/>
+          <w:u w:val="single"/>
+        </w:rPr>
+      </w:pPr>
+      <w:r>
+        <w:rPr>
+          <w:rFonts w:cstheme="minorHAnsi"/>
+          <w:b/>
+          <w:bCs/>
+          <w:sz w:val="28"/>
+          <w:szCs w:val="28"/>
+          <w:u w:val="single"/>
+        </w:rPr>
+        <w:t>3️</w:t>
+      </w:r>
+      <w:r>
+        <w:rPr>
+          <w:rFonts w:cstheme="minorHAnsi"/>
+          <w:b/>
+          <w:bCs/>
+          <w:sz w:val="28"/>
+          <w:szCs w:val="28"/>
+          <w:u w:val="single"/>
+        </w:rPr>
+        <w:t xml:space="preserve">) </w:t>
+      </w:r>
+      <w:r>
+        <w:rPr>
+          <w:rFonts w:cstheme="minorHAnsi"/>
+          <w:b/>
+          <w:bCs/>
+          <w:sz w:val="28"/>
+          <w:szCs w:val="28"/>
+          <w:u w:val="single"/>
+        </w:rPr>
+        <w:t>Evaluación del sistema completo</w:t>
+      </w:r>
+    </w:p>
+    <w:p>
+      <w:r>
+        <w:t>Ahora juntamos todo.</w:t>
+      </w:r>
+    </w:p>
+    <w:p>
+      <w:r>
+        <w:t>Ejemplo:</w:t>
+      </w:r>
+    </w:p>
+    <w:p>
+      <w:r>
+        <w:t>Sistema que predice abandono y explica la decisión.</w:t>
+      </w:r>
+    </w:p>
+    <w:p>
+      <w:pPr>
+        <w:rPr>
+          <w:b/>
+          <w:bCs/>
+        </w:rPr>
+      </w:pPr>
+      <w:r>
+        <w:rPr>
+          <w:b/>
+          <w:bCs/>
+        </w:rPr>
+        <w:t>Parte ML</w:t>
+      </w:r>
+    </w:p>
+    <w:p>
+      <w:proofErr w:type="spellStart"/>
+      <w:r>
+        <w:t>Accuracy</w:t>
+      </w:r>
+      <w:proofErr w:type="spellEnd"/>
+      <w:r>
+        <w:t xml:space="preserve"> → 0.84</w:t>
+      </w:r>
+    </w:p>
+    <w:p>
+      <w:pPr>
+        <w:rPr>
+          <w:b/>
+          <w:bCs/>
+        </w:rPr>
+      </w:pPr>
+      <w:r>
+        <w:rPr>
+          <w:b/>
+          <w:bCs/>
+        </w:rPr>
+        <w:t>Parte LLM</w:t>
+      </w:r>
+    </w:p>
+    <w:p>
+      <w:r>
+        <w:t>Explicación evaluada con rúbrica.</w:t>
+      </w:r>
+    </w:p>
+    <w:p>
+      <w:pPr>
+        <w:rPr>
+          <w:b/>
+          <w:bCs/>
+        </w:rPr>
+      </w:pPr>
+      <w:r>
+        <w:rPr>
+          <w:b/>
+          <w:bCs/>
+        </w:rPr>
+        <w:t>Evaluación final</w:t>
+      </w:r>
+    </w:p>
+    <w:p>
+      <w:r>
+        <w:t>Preguntas clave:</w:t>
+      </w:r>
+    </w:p>
+    <w:p>
+      <w:pPr>
+        <w:numPr>
+          <w:ilvl w:val="0"/>
+          <w:numId w:val="33"/>
+        </w:numPr>
+      </w:pPr>
+      <w:r>
+        <w:t>¿La explicación refleja realmente la decisión del modelo?</w:t>
+      </w:r>
+    </w:p>
+    <w:p>
+      <w:pPr>
+        <w:numPr>
+          <w:ilvl w:val="0"/>
+          <w:numId w:val="33"/>
+        </w:numPr>
+      </w:pPr>
+      <w:r>
+        <w:t>¿El usuario entiende la recomendación?</w:t>
+      </w:r>
+    </w:p>
+    <w:p>
+      <w:pPr>
+        <w:numPr>
+          <w:ilvl w:val="0"/>
+          <w:numId w:val="33"/>
+        </w:numPr>
+      </w:pPr>
+      <w:r>
+        <w:t>¿El LLM inventa información?</w:t>
+      </w:r>
+    </w:p>
+    <w:p>
+      <w:r>
+        <w:pict w14:anchorId="432FDE5E">
+          <v:rect id="_x0000_i1092" style="width:0;height:1.5pt" o:hralign="center" o:hrstd="t" o:hr="t" fillcolor="#a0a0a0" stroked="f"/>
+        </w:pict>
+      </w:r>
+    </w:p>
+    <w:p>
+      <w:pPr>
+        <w:rPr>
+          <w:rFonts w:cstheme="minorHAnsi"/>
+          <w:b/>
+          <w:bCs/>
+          <w:sz w:val="28"/>
+          <w:szCs w:val="28"/>
+          <w:u w:val="single"/>
+        </w:rPr>
+      </w:pPr>
+      <w:r>
+        <w:rPr>
+          <w:rFonts w:cstheme="minorHAnsi"/>
+          <w:b/>
+          <w:bCs/>
+          <w:sz w:val="28"/>
+          <w:szCs w:val="28"/>
+          <w:u w:val="single"/>
+        </w:rPr>
+        <w:t>4️</w:t>
+      </w:r>
+      <w:r>
+        <w:rPr>
+          <w:rFonts w:cstheme="minorHAnsi"/>
+          <w:b/>
+          <w:bCs/>
+          <w:sz w:val="28"/>
+          <w:szCs w:val="28"/>
+          <w:u w:val="single"/>
+        </w:rPr>
+        <w:t xml:space="preserve">) </w:t>
+      </w:r>
+      <w:r>
+        <w:rPr>
+          <w:rFonts w:cstheme="minorHAnsi"/>
+          <w:b/>
+          <w:bCs/>
+          <w:sz w:val="28"/>
+          <w:szCs w:val="28"/>
+          <w:u w:val="single"/>
+        </w:rPr>
+        <w:t>Error común</w:t>
+      </w:r>
+    </w:p>
+    <w:p>
+      <w:r>
+        <w:t>Muchos sistemas fallan porque:</w:t>
+      </w:r>
+    </w:p>
+    <w:p>
+      <w:pPr>
+        <w:numPr>
+          <w:ilvl w:val="0"/>
+          <w:numId w:val="34"/>
+        </w:numPr>
+      </w:pPr>
+      <w:r>
+        <w:t>el ML está bien</w:t>
+      </w:r>
+    </w:p>
+    <w:p>
+      <w:pPr>
+        <w:numPr>
+          <w:ilvl w:val="0"/>
+          <w:numId w:val="34"/>
+        </w:numPr>
+      </w:pPr>
+      <w:r>
+        <w:t xml:space="preserve">el LLM explica </w:t>
+      </w:r>
+      <w:r>
+        <w:rPr>
+          <w:b/>
+          <w:bCs/>
+        </w:rPr>
+        <w:t>mal</w:t>
+      </w:r>
+    </w:p>
+    <w:p>
+      <w:r>
+        <w:t>Ejemplo:</w:t>
+      </w:r>
+    </w:p>
+    <w:p>
+      <w:r>
+        <w:t>ML dice:</w:t>
+      </w:r>
+    </w:p>
+    <w:p>
+      <w:r>
+        <w:t>riesgo alto por baja asistencia</w:t>
+      </w:r>
+    </w:p>
+    <w:p>
+      <w:r>
+        <w:t>LLM responde:</w:t>
+      </w:r>
+    </w:p>
+    <w:p>
+      <w:r>
+        <w:t>tu rendimiento académico es bajo</w:t>
+      </w:r>
+    </w:p>
+    <w:p>
+      <w:r>
+        <w:rPr>
+          <w:rFonts w:ascii="Segoe UI Emoji" w:hAnsi="Segoe UI Emoji" w:cs="Segoe UI Emoji"/>
+        </w:rPr>
+        <w:t>❌</w:t>
+      </w:r>
+      <w:r>
+        <w:t xml:space="preserve"> Eso es </w:t>
+      </w:r>
+      <w:r>
+        <w:rPr>
+          <w:b/>
+          <w:bCs/>
+        </w:rPr>
+        <w:t>distorsión</w:t>
+      </w:r>
+      <w:r>
+        <w:t>.</w:t>
+      </w:r>
+    </w:p>
+    <w:p/>
+    <w:p/>
+    <w:p>
+      <w:pPr>
+        <w:rPr>
+          <w:b/>
+          <w:bCs/>
+          <w:sz w:val="32"/>
+          <w:szCs w:val="32"/>
+          <w:u w:val="single"/>
+        </w:rPr>
+      </w:pPr>
+      <w:r>
+        <w:rPr>
+          <w:b/>
+          <w:bCs/>
+          <w:sz w:val="32"/>
+          <w:szCs w:val="32"/>
+          <w:u w:val="single"/>
+        </w:rPr>
+        <w:lastRenderedPageBreak/>
+        <w:t>¿Qué hacer si el LLM falla o alucina?</w:t>
+      </w:r>
+    </w:p>
+    <w:p>
+      <w:pPr>
+        <w:rPr>
+          <w:b/>
+          <w:bCs/>
+        </w:rPr>
+      </w:pPr>
+      <w:r>
+        <w:rPr>
+          <w:rFonts w:ascii="Segoe UI Emoji" w:hAnsi="Segoe UI Emoji" w:cs="Segoe UI Emoji"/>
+          <w:b/>
+          <w:bCs/>
+        </w:rPr>
+        <w:t>🔑</w:t>
+      </w:r>
+      <w:r>
+        <w:rPr>
+          <w:b/>
+          <w:bCs/>
+        </w:rPr>
+        <w:t xml:space="preserve"> Idea clave</w:t>
+      </w:r>
+    </w:p>
+    <w:p>
+      <w:r>
+        <w:rPr>
+          <w:b/>
+          <w:bCs/>
+        </w:rPr>
+        <w:t>La calidad del sistema híbrido está limitada por su parte más débil.</w:t>
+      </w:r>
+    </w:p>
+    <w:p>
+      <w:r>
+        <w:t xml:space="preserve">Si el ML es 0.92 </w:t>
+      </w:r>
+      <w:proofErr w:type="spellStart"/>
+      <w:proofErr w:type="gramStart"/>
+      <w:r>
+        <w:t>precision</w:t>
+      </w:r>
+      <w:proofErr w:type="spellEnd"/>
+      <w:proofErr w:type="gramEnd"/>
+      <w:r>
+        <w:t xml:space="preserve"> pero el LLM “explica inventando”, el sistema:</w:t>
+      </w:r>
+    </w:p>
+    <w:p>
+      <w:pPr>
+        <w:numPr>
+          <w:ilvl w:val="0"/>
+          <w:numId w:val="35"/>
+        </w:numPr>
+      </w:pPr>
+      <w:r>
+        <w:t>pierde confianza</w:t>
+      </w:r>
+    </w:p>
+    <w:p>
+      <w:pPr>
+        <w:numPr>
+          <w:ilvl w:val="0"/>
+          <w:numId w:val="35"/>
+        </w:numPr>
+      </w:pPr>
+      <w:r>
+        <w:t>puede causar conflictos (soporte, reclamos)</w:t>
+      </w:r>
+    </w:p>
+    <w:p>
+      <w:pPr>
+        <w:numPr>
+          <w:ilvl w:val="0"/>
+          <w:numId w:val="35"/>
+        </w:numPr>
+      </w:pPr>
+      <w:r>
+        <w:t>puede ser riesgoso (en fraude/crédito aún más)</w:t>
+      </w:r>
+    </w:p>
+    <w:p>
+      <w:r>
+        <w:pict w14:anchorId="556CC4DC">
+          <v:rect id="_x0000_i1153" style="width:0;height:1.5pt" o:hralign="center" o:hrstd="t" o:hr="t" fillcolor="#a0a0a0" stroked="f"/>
+        </w:pict>
+      </w:r>
+    </w:p>
+    <w:p>
+      <w:pPr>
+        <w:rPr>
+          <w:b/>
+          <w:bCs/>
+        </w:rPr>
+      </w:pPr>
+      <w:r>
+        <w:rPr>
+          <w:rFonts w:ascii="Segoe UI Emoji" w:hAnsi="Segoe UI Emoji" w:cs="Segoe UI Emoji"/>
+          <w:b/>
+          <w:bCs/>
+        </w:rPr>
+        <w:t>✅</w:t>
+      </w:r>
+      <w:r>
+        <w:rPr>
+          <w:b/>
+          <w:bCs/>
+        </w:rPr>
+        <w:t xml:space="preserve"> Cómo se corrige (sin entrar en API)</w:t>
+      </w:r>
+    </w:p>
+    <w:p>
+      <w:r>
+        <w:t xml:space="preserve">Se arregla con </w:t>
+      </w:r>
+      <w:r>
+        <w:rPr>
+          <w:b/>
+          <w:bCs/>
+        </w:rPr>
+        <w:t>diseño</w:t>
+      </w:r>
+      <w:r>
+        <w:t>, no con “mejor modelo”.</w:t>
+      </w:r>
+    </w:p>
+    <w:p>
+      <w:pPr>
+        <w:rPr>
+          <w:b/>
+          <w:bCs/>
+        </w:rPr>
+      </w:pPr>
+      <w:r>
+        <w:rPr>
+          <w:b/>
+          <w:bCs/>
+        </w:rPr>
+        <w:t>1) Contrato de salida (interface)</w:t>
+      </w:r>
+    </w:p>
+    <w:p>
+      <w:r>
+        <w:t>El LLM solo puede usar:</w:t>
+      </w:r>
+    </w:p>
+    <w:p>
+      <w:pPr>
+        <w:numPr>
+          <w:ilvl w:val="0"/>
+          <w:numId w:val="36"/>
+        </w:numPr>
+      </w:pPr>
+      <w:proofErr w:type="spellStart"/>
+      <w:r>
+        <w:t>prediccion</w:t>
+      </w:r>
+      <w:proofErr w:type="spellEnd"/>
+    </w:p>
+    <w:p>
+      <w:pPr>
+        <w:numPr>
+          <w:ilvl w:val="0"/>
+          <w:numId w:val="36"/>
+        </w:numPr>
+      </w:pPr>
+      <w:proofErr w:type="spellStart"/>
+      <w:r>
+        <w:t>razones_ml</w:t>
+      </w:r>
+      <w:proofErr w:type="spellEnd"/>
+      <w:r>
+        <w:t xml:space="preserve"> (top </w:t>
+      </w:r>
+      <w:proofErr w:type="spellStart"/>
+      <w:r>
+        <w:t>features</w:t>
+      </w:r>
+      <w:proofErr w:type="spellEnd"/>
+      <w:r>
+        <w:t>)</w:t>
+      </w:r>
+    </w:p>
+    <w:p>
+      <w:pPr>
+        <w:numPr>
+          <w:ilvl w:val="0"/>
+          <w:numId w:val="36"/>
+        </w:numPr>
+      </w:pPr>
+      <w:r>
+        <w:t>evidencia (texto autorizado)</w:t>
+      </w:r>
+    </w:p>
+    <w:p>
+      <w:proofErr w:type="gramStart"/>
+      <w:r>
+        <w:t>Y</w:t>
+      </w:r>
+      <w:proofErr w:type="gramEnd"/>
+      <w:r>
+        <w:t xml:space="preserve"> además:</w:t>
+      </w:r>
+    </w:p>
+    <w:p>
+      <w:r>
+        <w:t>“Si algo no está en esos campos, no lo menciones.”</w:t>
+      </w:r>
+    </w:p>
+    <w:p>
+      <w:r>
+        <w:pict w14:anchorId="48C915CC">
+          <v:rect id="_x0000_i1154" style="width:0;height:1.5pt" o:hralign="center" o:hrstd="t" o:hr="t" fillcolor="#a0a0a0" stroked="f"/>
+        </w:pict>
+      </w:r>
+    </w:p>
+    <w:p>
+      <w:pPr>
+        <w:rPr>
+          <w:b/>
+          <w:bCs/>
+        </w:rPr>
+      </w:pPr>
+      <w:r>
+        <w:rPr>
+          <w:b/>
+          <w:bCs/>
+        </w:rPr>
+        <w:t>2) Rúbrica de fidelidad (la más importante)</w:t>
+      </w:r>
+    </w:p>
+    <w:p>
+      <w:r>
+        <w:t xml:space="preserve">Cuando </w:t>
+      </w:r>
+      <w:proofErr w:type="spellStart"/>
+      <w:r>
+        <w:t>evaluás</w:t>
+      </w:r>
+      <w:proofErr w:type="spellEnd"/>
+      <w:r>
+        <w:t xml:space="preserve"> explicaciones del LLM, el criterio #1 es:</w:t>
+      </w:r>
+    </w:p>
+    <w:p>
+      <w:pPr>
+        <w:numPr>
+          <w:ilvl w:val="0"/>
+          <w:numId w:val="37"/>
+        </w:numPr>
+      </w:pPr>
+      <w:r>
+        <w:rPr>
+          <w:b/>
+          <w:bCs/>
+        </w:rPr>
+        <w:t>Fidelidad</w:t>
+      </w:r>
+      <w:r>
+        <w:t>: “¿Dice SOLO lo que se puede justificar con evidencia?”</w:t>
+      </w:r>
+    </w:p>
+    <w:p>
+      <w:r>
+        <w:t>Si falla eso, es “no pasa”, aunque sea clarísimo.</w:t>
+      </w:r>
+    </w:p>
+    <w:p>
+      <w:r>
+        <w:pict w14:anchorId="6555FFD6">
+          <v:rect id="_x0000_i1155" style="width:0;height:1.5pt" o:hralign="center" o:hrstd="t" o:hr="t" fillcolor="#a0a0a0" stroked="f"/>
+        </w:pict>
+      </w:r>
+    </w:p>
+    <w:p>
+      <w:pPr>
+        <w:rPr>
+          <w:b/>
+          <w:bCs/>
+        </w:rPr>
+      </w:pPr>
+      <w:r>
+        <w:rPr>
+          <w:b/>
+          <w:bCs/>
+        </w:rPr>
+        <w:t>3) Plantilla de explicación</w:t>
+      </w:r>
+    </w:p>
+    <w:p>
+      <w:r>
+        <w:t>En vez de respuesta libre:</w:t>
+      </w:r>
+    </w:p>
+    <w:p>
+      <w:pPr>
+        <w:numPr>
+          <w:ilvl w:val="0"/>
+          <w:numId w:val="38"/>
+        </w:numPr>
+      </w:pPr>
+      <w:r>
+        <w:t>“Decisión: …”</w:t>
+      </w:r>
+    </w:p>
+    <w:p>
+      <w:pPr>
+        <w:numPr>
+          <w:ilvl w:val="0"/>
+          <w:numId w:val="38"/>
+        </w:numPr>
+      </w:pPr>
+      <w:r>
+        <w:t>“Motivos (del modelo): …”</w:t>
+      </w:r>
+    </w:p>
+    <w:p>
+      <w:pPr>
+        <w:numPr>
+          <w:ilvl w:val="0"/>
+          <w:numId w:val="38"/>
+        </w:numPr>
+      </w:pPr>
+      <w:r>
+        <w:t xml:space="preserve">“Qué </w:t>
+      </w:r>
+      <w:proofErr w:type="spellStart"/>
+      <w:r>
+        <w:t>podés</w:t>
+      </w:r>
+      <w:proofErr w:type="spellEnd"/>
+      <w:r>
+        <w:t xml:space="preserve"> hacer: …”</w:t>
+      </w:r>
+    </w:p>
+    <w:p>
+      <w:pPr>
+        <w:numPr>
+          <w:ilvl w:val="0"/>
+          <w:numId w:val="38"/>
+        </w:numPr>
+      </w:pPr>
+      <w:r>
+        <w:t>“Qué NO podemos afirmar: …”</w:t>
+      </w:r>
+    </w:p>
+    <w:p>
+      <w:r>
+        <w:t>Eso corta alucinación de raíz.</w:t>
+      </w:r>
+    </w:p>
+    <w:p/>
+    <w:p/>
     <w:p/>
     <w:sectPr>
       <w:pgSz w:w="11906" w:h="16838"/>
@@ -2435,6 +3667,155 @@
     </w:lvl>
   </w:abstractNum>
   <w:abstractNum w:abstractNumId="1" w15:restartNumberingAfterBreak="0">
+    <w:nsid w:val="06564B2D"/>
+    <w:multiLevelType w:val="multilevel"/>
+    <w:tmpl w:val="700E666E"/>
+    <w:lvl w:ilvl="0">
+      <w:start w:val="1"/>
+      <w:numFmt w:val="bullet"/>
+      <w:lvlText w:val=""/>
+      <w:lvlJc w:val="left"/>
+      <w:pPr>
+        <w:tabs>
+          <w:tab w:val="num" w:pos="720"/>
+        </w:tabs>
+        <w:ind w:left="720" w:hanging="360"/>
+      </w:pPr>
+      <w:rPr>
+        <w:rFonts w:ascii="Symbol" w:hAnsi="Symbol" w:hint="default"/>
+        <w:sz w:val="20"/>
+      </w:rPr>
+    </w:lvl>
+    <w:lvl w:ilvl="1" w:tentative="1">
+      <w:start w:val="1"/>
+      <w:numFmt w:val="bullet"/>
+      <w:lvlText w:val="o"/>
+      <w:lvlJc w:val="left"/>
+      <w:pPr>
+        <w:tabs>
+          <w:tab w:val="num" w:pos="1440"/>
+        </w:tabs>
+        <w:ind w:left="1440" w:hanging="360"/>
+      </w:pPr>
+      <w:rPr>
+        <w:rFonts w:ascii="Courier New" w:hAnsi="Courier New" w:hint="default"/>
+        <w:sz w:val="20"/>
+      </w:rPr>
+    </w:lvl>
+    <w:lvl w:ilvl="2" w:tentative="1">
+      <w:start w:val="1"/>
+      <w:numFmt w:val="bullet"/>
+      <w:lvlText w:val=""/>
+      <w:lvlJc w:val="left"/>
+      <w:pPr>
+        <w:tabs>
+          <w:tab w:val="num" w:pos="2160"/>
+        </w:tabs>
+        <w:ind w:left="2160" w:hanging="360"/>
+      </w:pPr>
+      <w:rPr>
+        <w:rFonts w:ascii="Wingdings" w:hAnsi="Wingdings" w:hint="default"/>
+        <w:sz w:val="20"/>
+      </w:rPr>
+    </w:lvl>
+    <w:lvl w:ilvl="3" w:tentative="1">
+      <w:start w:val="1"/>
+      <w:numFmt w:val="bullet"/>
+      <w:lvlText w:val=""/>
+      <w:lvlJc w:val="left"/>
+      <w:pPr>
+        <w:tabs>
+          <w:tab w:val="num" w:pos="2880"/>
+        </w:tabs>
+        <w:ind w:left="2880" w:hanging="360"/>
+      </w:pPr>
+      <w:rPr>
+        <w:rFonts w:ascii="Wingdings" w:hAnsi="Wingdings" w:hint="default"/>
+        <w:sz w:val="20"/>
+      </w:rPr>
+    </w:lvl>
+    <w:lvl w:ilvl="4" w:tentative="1">
+      <w:start w:val="1"/>
+      <w:numFmt w:val="bullet"/>
+      <w:lvlText w:val=""/>
+      <w:lvlJc w:val="left"/>
+      <w:pPr>
+        <w:tabs>
+          <w:tab w:val="num" w:pos="3600"/>
+        </w:tabs>
+        <w:ind w:left="3600" w:hanging="360"/>
+      </w:pPr>
+      <w:rPr>
+        <w:rFonts w:ascii="Wingdings" w:hAnsi="Wingdings" w:hint="default"/>
+        <w:sz w:val="20"/>
+      </w:rPr>
+    </w:lvl>
+    <w:lvl w:ilvl="5" w:tentative="1">
+      <w:start w:val="1"/>
+      <w:numFmt w:val="bullet"/>
+      <w:lvlText w:val=""/>
+      <w:lvlJc w:val="left"/>
+      <w:pPr>
+        <w:tabs>
+          <w:tab w:val="num" w:pos="4320"/>
+        </w:tabs>
+        <w:ind w:left="4320" w:hanging="360"/>
+      </w:pPr>
+      <w:rPr>
+        <w:rFonts w:ascii="Wingdings" w:hAnsi="Wingdings" w:hint="default"/>
+        <w:sz w:val="20"/>
+      </w:rPr>
+    </w:lvl>
+    <w:lvl w:ilvl="6" w:tentative="1">
+      <w:start w:val="1"/>
+      <w:numFmt w:val="bullet"/>
+      <w:lvlText w:val=""/>
+      <w:lvlJc w:val="left"/>
+      <w:pPr>
+        <w:tabs>
+          <w:tab w:val="num" w:pos="5040"/>
+        </w:tabs>
+        <w:ind w:left="5040" w:hanging="360"/>
+      </w:pPr>
+      <w:rPr>
+        <w:rFonts w:ascii="Wingdings" w:hAnsi="Wingdings" w:hint="default"/>
+        <w:sz w:val="20"/>
+      </w:rPr>
+    </w:lvl>
+    <w:lvl w:ilvl="7" w:tentative="1">
+      <w:start w:val="1"/>
+      <w:numFmt w:val="bullet"/>
+      <w:lvlText w:val=""/>
+      <w:lvlJc w:val="left"/>
+      <w:pPr>
+        <w:tabs>
+          <w:tab w:val="num" w:pos="5760"/>
+        </w:tabs>
+        <w:ind w:left="5760" w:hanging="360"/>
+      </w:pPr>
+      <w:rPr>
+        <w:rFonts w:ascii="Wingdings" w:hAnsi="Wingdings" w:hint="default"/>
+        <w:sz w:val="20"/>
+      </w:rPr>
+    </w:lvl>
+    <w:lvl w:ilvl="8" w:tentative="1">
+      <w:start w:val="1"/>
+      <w:numFmt w:val="bullet"/>
+      <w:lvlText w:val=""/>
+      <w:lvlJc w:val="left"/>
+      <w:pPr>
+        <w:tabs>
+          <w:tab w:val="num" w:pos="6480"/>
+        </w:tabs>
+        <w:ind w:left="6480" w:hanging="360"/>
+      </w:pPr>
+      <w:rPr>
+        <w:rFonts w:ascii="Wingdings" w:hAnsi="Wingdings" w:hint="default"/>
+        <w:sz w:val="20"/>
+      </w:rPr>
+    </w:lvl>
+  </w:abstractNum>
+  <w:abstractNum w:abstractNumId="2" w15:restartNumberingAfterBreak="0">
     <w:nsid w:val="065D5FE6"/>
     <w:multiLevelType w:val="multilevel"/>
     <w:tmpl w:val="97BED464"/>
@@ -2583,7 +3964,7 @@
       </w:rPr>
     </w:lvl>
   </w:abstractNum>
-  <w:abstractNum w:abstractNumId="2" w15:restartNumberingAfterBreak="0">
+  <w:abstractNum w:abstractNumId="3" w15:restartNumberingAfterBreak="0">
     <w:nsid w:val="0663362A"/>
     <w:multiLevelType w:val="multilevel"/>
     <w:tmpl w:val="4F0E6462"/>
@@ -2732,7 +4113,7 @@
       </w:rPr>
     </w:lvl>
   </w:abstractNum>
-  <w:abstractNum w:abstractNumId="3" w15:restartNumberingAfterBreak="0">
+  <w:abstractNum w:abstractNumId="4" w15:restartNumberingAfterBreak="0">
     <w:nsid w:val="0D010857"/>
     <w:multiLevelType w:val="multilevel"/>
     <w:tmpl w:val="1EC603FC"/>
@@ -2881,7 +4262,7 @@
       </w:rPr>
     </w:lvl>
   </w:abstractNum>
-  <w:abstractNum w:abstractNumId="4" w15:restartNumberingAfterBreak="0">
+  <w:abstractNum w:abstractNumId="5" w15:restartNumberingAfterBreak="0">
     <w:nsid w:val="12A319D4"/>
     <w:multiLevelType w:val="multilevel"/>
     <w:tmpl w:val="2C622292"/>
@@ -3030,7 +4411,156 @@
       </w:rPr>
     </w:lvl>
   </w:abstractNum>
-  <w:abstractNum w:abstractNumId="5" w15:restartNumberingAfterBreak="0">
+  <w:abstractNum w:abstractNumId="6" w15:restartNumberingAfterBreak="0">
+    <w:nsid w:val="13944DD0"/>
+    <w:multiLevelType w:val="multilevel"/>
+    <w:tmpl w:val="E9A27296"/>
+    <w:lvl w:ilvl="0">
+      <w:start w:val="1"/>
+      <w:numFmt w:val="bullet"/>
+      <w:lvlText w:val=""/>
+      <w:lvlJc w:val="left"/>
+      <w:pPr>
+        <w:tabs>
+          <w:tab w:val="num" w:pos="720"/>
+        </w:tabs>
+        <w:ind w:left="720" w:hanging="360"/>
+      </w:pPr>
+      <w:rPr>
+        <w:rFonts w:ascii="Symbol" w:hAnsi="Symbol" w:hint="default"/>
+        <w:sz w:val="20"/>
+      </w:rPr>
+    </w:lvl>
+    <w:lvl w:ilvl="1" w:tentative="1">
+      <w:start w:val="1"/>
+      <w:numFmt w:val="bullet"/>
+      <w:lvlText w:val="o"/>
+      <w:lvlJc w:val="left"/>
+      <w:pPr>
+        <w:tabs>
+          <w:tab w:val="num" w:pos="1440"/>
+        </w:tabs>
+        <w:ind w:left="1440" w:hanging="360"/>
+      </w:pPr>
+      <w:rPr>
+        <w:rFonts w:ascii="Courier New" w:hAnsi="Courier New" w:hint="default"/>
+        <w:sz w:val="20"/>
+      </w:rPr>
+    </w:lvl>
+    <w:lvl w:ilvl="2" w:tentative="1">
+      <w:start w:val="1"/>
+      <w:numFmt w:val="bullet"/>
+      <w:lvlText w:val=""/>
+      <w:lvlJc w:val="left"/>
+      <w:pPr>
+        <w:tabs>
+          <w:tab w:val="num" w:pos="2160"/>
+        </w:tabs>
+        <w:ind w:left="2160" w:hanging="360"/>
+      </w:pPr>
+      <w:rPr>
+        <w:rFonts w:ascii="Wingdings" w:hAnsi="Wingdings" w:hint="default"/>
+        <w:sz w:val="20"/>
+      </w:rPr>
+    </w:lvl>
+    <w:lvl w:ilvl="3" w:tentative="1">
+      <w:start w:val="1"/>
+      <w:numFmt w:val="bullet"/>
+      <w:lvlText w:val=""/>
+      <w:lvlJc w:val="left"/>
+      <w:pPr>
+        <w:tabs>
+          <w:tab w:val="num" w:pos="2880"/>
+        </w:tabs>
+        <w:ind w:left="2880" w:hanging="360"/>
+      </w:pPr>
+      <w:rPr>
+        <w:rFonts w:ascii="Wingdings" w:hAnsi="Wingdings" w:hint="default"/>
+        <w:sz w:val="20"/>
+      </w:rPr>
+    </w:lvl>
+    <w:lvl w:ilvl="4" w:tentative="1">
+      <w:start w:val="1"/>
+      <w:numFmt w:val="bullet"/>
+      <w:lvlText w:val=""/>
+      <w:lvlJc w:val="left"/>
+      <w:pPr>
+        <w:tabs>
+          <w:tab w:val="num" w:pos="3600"/>
+        </w:tabs>
+        <w:ind w:left="3600" w:hanging="360"/>
+      </w:pPr>
+      <w:rPr>
+        <w:rFonts w:ascii="Wingdings" w:hAnsi="Wingdings" w:hint="default"/>
+        <w:sz w:val="20"/>
+      </w:rPr>
+    </w:lvl>
+    <w:lvl w:ilvl="5" w:tentative="1">
+      <w:start w:val="1"/>
+      <w:numFmt w:val="bullet"/>
+      <w:lvlText w:val=""/>
+      <w:lvlJc w:val="left"/>
+      <w:pPr>
+        <w:tabs>
+          <w:tab w:val="num" w:pos="4320"/>
+        </w:tabs>
+        <w:ind w:left="4320" w:hanging="360"/>
+      </w:pPr>
+      <w:rPr>
+        <w:rFonts w:ascii="Wingdings" w:hAnsi="Wingdings" w:hint="default"/>
+        <w:sz w:val="20"/>
+      </w:rPr>
+    </w:lvl>
+    <w:lvl w:ilvl="6" w:tentative="1">
+      <w:start w:val="1"/>
+      <w:numFmt w:val="bullet"/>
+      <w:lvlText w:val=""/>
+      <w:lvlJc w:val="left"/>
+      <w:pPr>
+        <w:tabs>
+          <w:tab w:val="num" w:pos="5040"/>
+        </w:tabs>
+        <w:ind w:left="5040" w:hanging="360"/>
+      </w:pPr>
+      <w:rPr>
+        <w:rFonts w:ascii="Wingdings" w:hAnsi="Wingdings" w:hint="default"/>
+        <w:sz w:val="20"/>
+      </w:rPr>
+    </w:lvl>
+    <w:lvl w:ilvl="7" w:tentative="1">
+      <w:start w:val="1"/>
+      <w:numFmt w:val="bullet"/>
+      <w:lvlText w:val=""/>
+      <w:lvlJc w:val="left"/>
+      <w:pPr>
+        <w:tabs>
+          <w:tab w:val="num" w:pos="5760"/>
+        </w:tabs>
+        <w:ind w:left="5760" w:hanging="360"/>
+      </w:pPr>
+      <w:rPr>
+        <w:rFonts w:ascii="Wingdings" w:hAnsi="Wingdings" w:hint="default"/>
+        <w:sz w:val="20"/>
+      </w:rPr>
+    </w:lvl>
+    <w:lvl w:ilvl="8" w:tentative="1">
+      <w:start w:val="1"/>
+      <w:numFmt w:val="bullet"/>
+      <w:lvlText w:val=""/>
+      <w:lvlJc w:val="left"/>
+      <w:pPr>
+        <w:tabs>
+          <w:tab w:val="num" w:pos="6480"/>
+        </w:tabs>
+        <w:ind w:left="6480" w:hanging="360"/>
+      </w:pPr>
+      <w:rPr>
+        <w:rFonts w:ascii="Wingdings" w:hAnsi="Wingdings" w:hint="default"/>
+        <w:sz w:val="20"/>
+      </w:rPr>
+    </w:lvl>
+  </w:abstractNum>
+  <w:abstractNum w:abstractNumId="7" w15:restartNumberingAfterBreak="0">
     <w:nsid w:val="146F2D1C"/>
     <w:multiLevelType w:val="multilevel"/>
     <w:tmpl w:val="9EF82712"/>
@@ -3179,7 +4709,156 @@
       </w:rPr>
     </w:lvl>
   </w:abstractNum>
-  <w:abstractNum w:abstractNumId="6" w15:restartNumberingAfterBreak="0">
+  <w:abstractNum w:abstractNumId="8" w15:restartNumberingAfterBreak="0">
+    <w:nsid w:val="152A158D"/>
+    <w:multiLevelType w:val="multilevel"/>
+    <w:tmpl w:val="FB80F726"/>
+    <w:lvl w:ilvl="0">
+      <w:start w:val="1"/>
+      <w:numFmt w:val="bullet"/>
+      <w:lvlText w:val=""/>
+      <w:lvlJc w:val="left"/>
+      <w:pPr>
+        <w:tabs>
+          <w:tab w:val="num" w:pos="720"/>
+        </w:tabs>
+        <w:ind w:left="720" w:hanging="360"/>
+      </w:pPr>
+      <w:rPr>
+        <w:rFonts w:ascii="Symbol" w:hAnsi="Symbol" w:hint="default"/>
+        <w:sz w:val="20"/>
+      </w:rPr>
+    </w:lvl>
+    <w:lvl w:ilvl="1" w:tentative="1">
+      <w:start w:val="1"/>
+      <w:numFmt w:val="bullet"/>
+      <w:lvlText w:val="o"/>
+      <w:lvlJc w:val="left"/>
+      <w:pPr>
+        <w:tabs>
+          <w:tab w:val="num" w:pos="1440"/>
+        </w:tabs>
+        <w:ind w:left="1440" w:hanging="360"/>
+      </w:pPr>
+      <w:rPr>
+        <w:rFonts w:ascii="Courier New" w:hAnsi="Courier New" w:hint="default"/>
+        <w:sz w:val="20"/>
+      </w:rPr>
+    </w:lvl>
+    <w:lvl w:ilvl="2" w:tentative="1">
+      <w:start w:val="1"/>
+      <w:numFmt w:val="bullet"/>
+      <w:lvlText w:val=""/>
+      <w:lvlJc w:val="left"/>
+      <w:pPr>
+        <w:tabs>
+          <w:tab w:val="num" w:pos="2160"/>
+        </w:tabs>
+        <w:ind w:left="2160" w:hanging="360"/>
+      </w:pPr>
+      <w:rPr>
+        <w:rFonts w:ascii="Wingdings" w:hAnsi="Wingdings" w:hint="default"/>
+        <w:sz w:val="20"/>
+      </w:rPr>
+    </w:lvl>
+    <w:lvl w:ilvl="3" w:tentative="1">
+      <w:start w:val="1"/>
+      <w:numFmt w:val="bullet"/>
+      <w:lvlText w:val=""/>
+      <w:lvlJc w:val="left"/>
+      <w:pPr>
+        <w:tabs>
+          <w:tab w:val="num" w:pos="2880"/>
+        </w:tabs>
+        <w:ind w:left="2880" w:hanging="360"/>
+      </w:pPr>
+      <w:rPr>
+        <w:rFonts w:ascii="Wingdings" w:hAnsi="Wingdings" w:hint="default"/>
+        <w:sz w:val="20"/>
+      </w:rPr>
+    </w:lvl>
+    <w:lvl w:ilvl="4" w:tentative="1">
+      <w:start w:val="1"/>
+      <w:numFmt w:val="bullet"/>
+      <w:lvlText w:val=""/>
+      <w:lvlJc w:val="left"/>
+      <w:pPr>
+        <w:tabs>
+          <w:tab w:val="num" w:pos="3600"/>
+        </w:tabs>
+        <w:ind w:left="3600" w:hanging="360"/>
+      </w:pPr>
+      <w:rPr>
+        <w:rFonts w:ascii="Wingdings" w:hAnsi="Wingdings" w:hint="default"/>
+        <w:sz w:val="20"/>
+      </w:rPr>
+    </w:lvl>
+    <w:lvl w:ilvl="5" w:tentative="1">
+      <w:start w:val="1"/>
+      <w:numFmt w:val="bullet"/>
+      <w:lvlText w:val=""/>
+      <w:lvlJc w:val="left"/>
+      <w:pPr>
+        <w:tabs>
+          <w:tab w:val="num" w:pos="4320"/>
+        </w:tabs>
+        <w:ind w:left="4320" w:hanging="360"/>
+      </w:pPr>
+      <w:rPr>
+        <w:rFonts w:ascii="Wingdings" w:hAnsi="Wingdings" w:hint="default"/>
+        <w:sz w:val="20"/>
+      </w:rPr>
+    </w:lvl>
+    <w:lvl w:ilvl="6" w:tentative="1">
+      <w:start w:val="1"/>
+      <w:numFmt w:val="bullet"/>
+      <w:lvlText w:val=""/>
+      <w:lvlJc w:val="left"/>
+      <w:pPr>
+        <w:tabs>
+          <w:tab w:val="num" w:pos="5040"/>
+        </w:tabs>
+        <w:ind w:left="5040" w:hanging="360"/>
+      </w:pPr>
+      <w:rPr>
+        <w:rFonts w:ascii="Wingdings" w:hAnsi="Wingdings" w:hint="default"/>
+        <w:sz w:val="20"/>
+      </w:rPr>
+    </w:lvl>
+    <w:lvl w:ilvl="7" w:tentative="1">
+      <w:start w:val="1"/>
+      <w:numFmt w:val="bullet"/>
+      <w:lvlText w:val=""/>
+      <w:lvlJc w:val="left"/>
+      <w:pPr>
+        <w:tabs>
+          <w:tab w:val="num" w:pos="5760"/>
+        </w:tabs>
+        <w:ind w:left="5760" w:hanging="360"/>
+      </w:pPr>
+      <w:rPr>
+        <w:rFonts w:ascii="Wingdings" w:hAnsi="Wingdings" w:hint="default"/>
+        <w:sz w:val="20"/>
+      </w:rPr>
+    </w:lvl>
+    <w:lvl w:ilvl="8" w:tentative="1">
+      <w:start w:val="1"/>
+      <w:numFmt w:val="bullet"/>
+      <w:lvlText w:val=""/>
+      <w:lvlJc w:val="left"/>
+      <w:pPr>
+        <w:tabs>
+          <w:tab w:val="num" w:pos="6480"/>
+        </w:tabs>
+        <w:ind w:left="6480" w:hanging="360"/>
+      </w:pPr>
+      <w:rPr>
+        <w:rFonts w:ascii="Wingdings" w:hAnsi="Wingdings" w:hint="default"/>
+        <w:sz w:val="20"/>
+      </w:rPr>
+    </w:lvl>
+  </w:abstractNum>
+  <w:abstractNum w:abstractNumId="9" w15:restartNumberingAfterBreak="0">
     <w:nsid w:val="153B299B"/>
     <w:multiLevelType w:val="multilevel"/>
     <w:tmpl w:val="B7BE7A2E"/>
@@ -3328,7 +5007,7 @@
       </w:rPr>
     </w:lvl>
   </w:abstractNum>
-  <w:abstractNum w:abstractNumId="7" w15:restartNumberingAfterBreak="0">
+  <w:abstractNum w:abstractNumId="10" w15:restartNumberingAfterBreak="0">
     <w:nsid w:val="16E87DC8"/>
     <w:multiLevelType w:val="multilevel"/>
     <w:tmpl w:val="782A7C94"/>
@@ -3477,7 +5156,156 @@
       </w:rPr>
     </w:lvl>
   </w:abstractNum>
-  <w:abstractNum w:abstractNumId="8" w15:restartNumberingAfterBreak="0">
+  <w:abstractNum w:abstractNumId="11" w15:restartNumberingAfterBreak="0">
+    <w:nsid w:val="1E1554BE"/>
+    <w:multiLevelType w:val="multilevel"/>
+    <w:tmpl w:val="68A0640E"/>
+    <w:lvl w:ilvl="0">
+      <w:start w:val="1"/>
+      <w:numFmt w:val="bullet"/>
+      <w:lvlText w:val=""/>
+      <w:lvlJc w:val="left"/>
+      <w:pPr>
+        <w:tabs>
+          <w:tab w:val="num" w:pos="720"/>
+        </w:tabs>
+        <w:ind w:left="720" w:hanging="360"/>
+      </w:pPr>
+      <w:rPr>
+        <w:rFonts w:ascii="Symbol" w:hAnsi="Symbol" w:hint="default"/>
+        <w:sz w:val="20"/>
+      </w:rPr>
+    </w:lvl>
+    <w:lvl w:ilvl="1" w:tentative="1">
+      <w:start w:val="1"/>
+      <w:numFmt w:val="bullet"/>
+      <w:lvlText w:val="o"/>
+      <w:lvlJc w:val="left"/>
+      <w:pPr>
+        <w:tabs>
+          <w:tab w:val="num" w:pos="1440"/>
+        </w:tabs>
+        <w:ind w:left="1440" w:hanging="360"/>
+      </w:pPr>
+      <w:rPr>
+        <w:rFonts w:ascii="Courier New" w:hAnsi="Courier New" w:hint="default"/>
+        <w:sz w:val="20"/>
+      </w:rPr>
+    </w:lvl>
+    <w:lvl w:ilvl="2" w:tentative="1">
+      <w:start w:val="1"/>
+      <w:numFmt w:val="bullet"/>
+      <w:lvlText w:val=""/>
+      <w:lvlJc w:val="left"/>
+      <w:pPr>
+        <w:tabs>
+          <w:tab w:val="num" w:pos="2160"/>
+        </w:tabs>
+        <w:ind w:left="2160" w:hanging="360"/>
+      </w:pPr>
+      <w:rPr>
+        <w:rFonts w:ascii="Wingdings" w:hAnsi="Wingdings" w:hint="default"/>
+        <w:sz w:val="20"/>
+      </w:rPr>
+    </w:lvl>
+    <w:lvl w:ilvl="3" w:tentative="1">
+      <w:start w:val="1"/>
+      <w:numFmt w:val="bullet"/>
+      <w:lvlText w:val=""/>
+      <w:lvlJc w:val="left"/>
+      <w:pPr>
+        <w:tabs>
+          <w:tab w:val="num" w:pos="2880"/>
+        </w:tabs>
+        <w:ind w:left="2880" w:hanging="360"/>
+      </w:pPr>
+      <w:rPr>
+        <w:rFonts w:ascii="Wingdings" w:hAnsi="Wingdings" w:hint="default"/>
+        <w:sz w:val="20"/>
+      </w:rPr>
+    </w:lvl>
+    <w:lvl w:ilvl="4" w:tentative="1">
+      <w:start w:val="1"/>
+      <w:numFmt w:val="bullet"/>
+      <w:lvlText w:val=""/>
+      <w:lvlJc w:val="left"/>
+      <w:pPr>
+        <w:tabs>
+          <w:tab w:val="num" w:pos="3600"/>
+        </w:tabs>
+        <w:ind w:left="3600" w:hanging="360"/>
+      </w:pPr>
+      <w:rPr>
+        <w:rFonts w:ascii="Wingdings" w:hAnsi="Wingdings" w:hint="default"/>
+        <w:sz w:val="20"/>
+      </w:rPr>
+    </w:lvl>
+    <w:lvl w:ilvl="5" w:tentative="1">
+      <w:start w:val="1"/>
+      <w:numFmt w:val="bullet"/>
+      <w:lvlText w:val=""/>
+      <w:lvlJc w:val="left"/>
+      <w:pPr>
+        <w:tabs>
+          <w:tab w:val="num" w:pos="4320"/>
+        </w:tabs>
+        <w:ind w:left="4320" w:hanging="360"/>
+      </w:pPr>
+      <w:rPr>
+        <w:rFonts w:ascii="Wingdings" w:hAnsi="Wingdings" w:hint="default"/>
+        <w:sz w:val="20"/>
+      </w:rPr>
+    </w:lvl>
+    <w:lvl w:ilvl="6" w:tentative="1">
+      <w:start w:val="1"/>
+      <w:numFmt w:val="bullet"/>
+      <w:lvlText w:val=""/>
+      <w:lvlJc w:val="left"/>
+      <w:pPr>
+        <w:tabs>
+          <w:tab w:val="num" w:pos="5040"/>
+        </w:tabs>
+        <w:ind w:left="5040" w:hanging="360"/>
+      </w:pPr>
+      <w:rPr>
+        <w:rFonts w:ascii="Wingdings" w:hAnsi="Wingdings" w:hint="default"/>
+        <w:sz w:val="20"/>
+      </w:rPr>
+    </w:lvl>
+    <w:lvl w:ilvl="7" w:tentative="1">
+      <w:start w:val="1"/>
+      <w:numFmt w:val="bullet"/>
+      <w:lvlText w:val=""/>
+      <w:lvlJc w:val="left"/>
+      <w:pPr>
+        <w:tabs>
+          <w:tab w:val="num" w:pos="5760"/>
+        </w:tabs>
+        <w:ind w:left="5760" w:hanging="360"/>
+      </w:pPr>
+      <w:rPr>
+        <w:rFonts w:ascii="Wingdings" w:hAnsi="Wingdings" w:hint="default"/>
+        <w:sz w:val="20"/>
+      </w:rPr>
+    </w:lvl>
+    <w:lvl w:ilvl="8" w:tentative="1">
+      <w:start w:val="1"/>
+      <w:numFmt w:val="bullet"/>
+      <w:lvlText w:val=""/>
+      <w:lvlJc w:val="left"/>
+      <w:pPr>
+        <w:tabs>
+          <w:tab w:val="num" w:pos="6480"/>
+        </w:tabs>
+        <w:ind w:left="6480" w:hanging="360"/>
+      </w:pPr>
+      <w:rPr>
+        <w:rFonts w:ascii="Wingdings" w:hAnsi="Wingdings" w:hint="default"/>
+        <w:sz w:val="20"/>
+      </w:rPr>
+    </w:lvl>
+  </w:abstractNum>
+  <w:abstractNum w:abstractNumId="12" w15:restartNumberingAfterBreak="0">
     <w:nsid w:val="1F5A7787"/>
     <w:multiLevelType w:val="multilevel"/>
     <w:tmpl w:val="72E65428"/>
@@ -3626,7 +5454,7 @@
       </w:rPr>
     </w:lvl>
   </w:abstractNum>
-  <w:abstractNum w:abstractNumId="9" w15:restartNumberingAfterBreak="0">
+  <w:abstractNum w:abstractNumId="13" w15:restartNumberingAfterBreak="0">
     <w:nsid w:val="1FA23015"/>
     <w:multiLevelType w:val="multilevel"/>
     <w:tmpl w:val="B17C8C1E"/>
@@ -3775,7 +5603,7 @@
       </w:rPr>
     </w:lvl>
   </w:abstractNum>
-  <w:abstractNum w:abstractNumId="10" w15:restartNumberingAfterBreak="0">
+  <w:abstractNum w:abstractNumId="14" w15:restartNumberingAfterBreak="0">
     <w:nsid w:val="261641E3"/>
     <w:multiLevelType w:val="multilevel"/>
     <w:tmpl w:val="A2F29504"/>
@@ -3924,7 +5752,7 @@
       </w:rPr>
     </w:lvl>
   </w:abstractNum>
-  <w:abstractNum w:abstractNumId="11" w15:restartNumberingAfterBreak="0">
+  <w:abstractNum w:abstractNumId="15" w15:restartNumberingAfterBreak="0">
     <w:nsid w:val="2C631985"/>
     <w:multiLevelType w:val="multilevel"/>
     <w:tmpl w:val="7146106A"/>
@@ -4073,7 +5901,7 @@
       </w:rPr>
     </w:lvl>
   </w:abstractNum>
-  <w:abstractNum w:abstractNumId="12" w15:restartNumberingAfterBreak="0">
+  <w:abstractNum w:abstractNumId="16" w15:restartNumberingAfterBreak="0">
     <w:nsid w:val="2C894CD6"/>
     <w:multiLevelType w:val="multilevel"/>
     <w:tmpl w:val="DA5A3198"/>
@@ -4186,7 +6014,7 @@
       </w:pPr>
     </w:lvl>
   </w:abstractNum>
-  <w:abstractNum w:abstractNumId="13" w15:restartNumberingAfterBreak="0">
+  <w:abstractNum w:abstractNumId="17" w15:restartNumberingAfterBreak="0">
     <w:nsid w:val="2E0704B5"/>
     <w:multiLevelType w:val="multilevel"/>
     <w:tmpl w:val="93D8486A"/>
@@ -4335,7 +6163,156 @@
       </w:rPr>
     </w:lvl>
   </w:abstractNum>
-  <w:abstractNum w:abstractNumId="14" w15:restartNumberingAfterBreak="0">
+  <w:abstractNum w:abstractNumId="18" w15:restartNumberingAfterBreak="0">
+    <w:nsid w:val="3625634C"/>
+    <w:multiLevelType w:val="multilevel"/>
+    <w:tmpl w:val="480C6060"/>
+    <w:lvl w:ilvl="0">
+      <w:start w:val="1"/>
+      <w:numFmt w:val="bullet"/>
+      <w:lvlText w:val=""/>
+      <w:lvlJc w:val="left"/>
+      <w:pPr>
+        <w:tabs>
+          <w:tab w:val="num" w:pos="720"/>
+        </w:tabs>
+        <w:ind w:left="720" w:hanging="360"/>
+      </w:pPr>
+      <w:rPr>
+        <w:rFonts w:ascii="Symbol" w:hAnsi="Symbol" w:hint="default"/>
+        <w:sz w:val="20"/>
+      </w:rPr>
+    </w:lvl>
+    <w:lvl w:ilvl="1" w:tentative="1">
+      <w:start w:val="1"/>
+      <w:numFmt w:val="bullet"/>
+      <w:lvlText w:val="o"/>
+      <w:lvlJc w:val="left"/>
+      <w:pPr>
+        <w:tabs>
+          <w:tab w:val="num" w:pos="1440"/>
+        </w:tabs>
+        <w:ind w:left="1440" w:hanging="360"/>
+      </w:pPr>
+      <w:rPr>
+        <w:rFonts w:ascii="Courier New" w:hAnsi="Courier New" w:hint="default"/>
+        <w:sz w:val="20"/>
+      </w:rPr>
+    </w:lvl>
+    <w:lvl w:ilvl="2" w:tentative="1">
+      <w:start w:val="1"/>
+      <w:numFmt w:val="bullet"/>
+      <w:lvlText w:val=""/>
+      <w:lvlJc w:val="left"/>
+      <w:pPr>
+        <w:tabs>
+          <w:tab w:val="num" w:pos="2160"/>
+        </w:tabs>
+        <w:ind w:left="2160" w:hanging="360"/>
+      </w:pPr>
+      <w:rPr>
+        <w:rFonts w:ascii="Wingdings" w:hAnsi="Wingdings" w:hint="default"/>
+        <w:sz w:val="20"/>
+      </w:rPr>
+    </w:lvl>
+    <w:lvl w:ilvl="3" w:tentative="1">
+      <w:start w:val="1"/>
+      <w:numFmt w:val="bullet"/>
+      <w:lvlText w:val=""/>
+      <w:lvlJc w:val="left"/>
+      <w:pPr>
+        <w:tabs>
+          <w:tab w:val="num" w:pos="2880"/>
+        </w:tabs>
+        <w:ind w:left="2880" w:hanging="360"/>
+      </w:pPr>
+      <w:rPr>
+        <w:rFonts w:ascii="Wingdings" w:hAnsi="Wingdings" w:hint="default"/>
+        <w:sz w:val="20"/>
+      </w:rPr>
+    </w:lvl>
+    <w:lvl w:ilvl="4" w:tentative="1">
+      <w:start w:val="1"/>
+      <w:numFmt w:val="bullet"/>
+      <w:lvlText w:val=""/>
+      <w:lvlJc w:val="left"/>
+      <w:pPr>
+        <w:tabs>
+          <w:tab w:val="num" w:pos="3600"/>
+        </w:tabs>
+        <w:ind w:left="3600" w:hanging="360"/>
+      </w:pPr>
+      <w:rPr>
+        <w:rFonts w:ascii="Wingdings" w:hAnsi="Wingdings" w:hint="default"/>
+        <w:sz w:val="20"/>
+      </w:rPr>
+    </w:lvl>
+    <w:lvl w:ilvl="5" w:tentative="1">
+      <w:start w:val="1"/>
+      <w:numFmt w:val="bullet"/>
+      <w:lvlText w:val=""/>
+      <w:lvlJc w:val="left"/>
+      <w:pPr>
+        <w:tabs>
+          <w:tab w:val="num" w:pos="4320"/>
+        </w:tabs>
+        <w:ind w:left="4320" w:hanging="360"/>
+      </w:pPr>
+      <w:rPr>
+        <w:rFonts w:ascii="Wingdings" w:hAnsi="Wingdings" w:hint="default"/>
+        <w:sz w:val="20"/>
+      </w:rPr>
+    </w:lvl>
+    <w:lvl w:ilvl="6" w:tentative="1">
+      <w:start w:val="1"/>
+      <w:numFmt w:val="bullet"/>
+      <w:lvlText w:val=""/>
+      <w:lvlJc w:val="left"/>
+      <w:pPr>
+        <w:tabs>
+          <w:tab w:val="num" w:pos="5040"/>
+        </w:tabs>
+        <w:ind w:left="5040" w:hanging="360"/>
+      </w:pPr>
+      <w:rPr>
+        <w:rFonts w:ascii="Wingdings" w:hAnsi="Wingdings" w:hint="default"/>
+        <w:sz w:val="20"/>
+      </w:rPr>
+    </w:lvl>
+    <w:lvl w:ilvl="7" w:tentative="1">
+      <w:start w:val="1"/>
+      <w:numFmt w:val="bullet"/>
+      <w:lvlText w:val=""/>
+      <w:lvlJc w:val="left"/>
+      <w:pPr>
+        <w:tabs>
+          <w:tab w:val="num" w:pos="5760"/>
+        </w:tabs>
+        <w:ind w:left="5760" w:hanging="360"/>
+      </w:pPr>
+      <w:rPr>
+        <w:rFonts w:ascii="Wingdings" w:hAnsi="Wingdings" w:hint="default"/>
+        <w:sz w:val="20"/>
+      </w:rPr>
+    </w:lvl>
+    <w:lvl w:ilvl="8" w:tentative="1">
+      <w:start w:val="1"/>
+      <w:numFmt w:val="bullet"/>
+      <w:lvlText w:val=""/>
+      <w:lvlJc w:val="left"/>
+      <w:pPr>
+        <w:tabs>
+          <w:tab w:val="num" w:pos="6480"/>
+        </w:tabs>
+        <w:ind w:left="6480" w:hanging="360"/>
+      </w:pPr>
+      <w:rPr>
+        <w:rFonts w:ascii="Wingdings" w:hAnsi="Wingdings" w:hint="default"/>
+        <w:sz w:val="20"/>
+      </w:rPr>
+    </w:lvl>
+  </w:abstractNum>
+  <w:abstractNum w:abstractNumId="19" w15:restartNumberingAfterBreak="0">
     <w:nsid w:val="3CF66B99"/>
     <w:multiLevelType w:val="multilevel"/>
     <w:tmpl w:val="247E3C30"/>
@@ -4484,7 +6461,7 @@
       </w:rPr>
     </w:lvl>
   </w:abstractNum>
-  <w:abstractNum w:abstractNumId="15" w15:restartNumberingAfterBreak="0">
+  <w:abstractNum w:abstractNumId="20" w15:restartNumberingAfterBreak="0">
     <w:nsid w:val="3F431E86"/>
     <w:multiLevelType w:val="multilevel"/>
     <w:tmpl w:val="71683C9A"/>
@@ -4633,7 +6610,7 @@
       </w:rPr>
     </w:lvl>
   </w:abstractNum>
-  <w:abstractNum w:abstractNumId="16" w15:restartNumberingAfterBreak="0">
+  <w:abstractNum w:abstractNumId="21" w15:restartNumberingAfterBreak="0">
     <w:nsid w:val="3FBE27FE"/>
     <w:multiLevelType w:val="multilevel"/>
     <w:tmpl w:val="CE843100"/>
@@ -4782,7 +6759,7 @@
       </w:rPr>
     </w:lvl>
   </w:abstractNum>
-  <w:abstractNum w:abstractNumId="17" w15:restartNumberingAfterBreak="0">
+  <w:abstractNum w:abstractNumId="22" w15:restartNumberingAfterBreak="0">
     <w:nsid w:val="41552755"/>
     <w:multiLevelType w:val="multilevel"/>
     <w:tmpl w:val="43C0AF22"/>
@@ -4931,7 +6908,156 @@
       </w:rPr>
     </w:lvl>
   </w:abstractNum>
-  <w:abstractNum w:abstractNumId="18" w15:restartNumberingAfterBreak="0">
+  <w:abstractNum w:abstractNumId="23" w15:restartNumberingAfterBreak="0">
+    <w:nsid w:val="425B6D5D"/>
+    <w:multiLevelType w:val="multilevel"/>
+    <w:tmpl w:val="A86A55BA"/>
+    <w:lvl w:ilvl="0">
+      <w:start w:val="1"/>
+      <w:numFmt w:val="bullet"/>
+      <w:lvlText w:val=""/>
+      <w:lvlJc w:val="left"/>
+      <w:pPr>
+        <w:tabs>
+          <w:tab w:val="num" w:pos="720"/>
+        </w:tabs>
+        <w:ind w:left="720" w:hanging="360"/>
+      </w:pPr>
+      <w:rPr>
+        <w:rFonts w:ascii="Symbol" w:hAnsi="Symbol" w:hint="default"/>
+        <w:sz w:val="20"/>
+      </w:rPr>
+    </w:lvl>
+    <w:lvl w:ilvl="1" w:tentative="1">
+      <w:start w:val="1"/>
+      <w:numFmt w:val="bullet"/>
+      <w:lvlText w:val="o"/>
+      <w:lvlJc w:val="left"/>
+      <w:pPr>
+        <w:tabs>
+          <w:tab w:val="num" w:pos="1440"/>
+        </w:tabs>
+        <w:ind w:left="1440" w:hanging="360"/>
+      </w:pPr>
+      <w:rPr>
+        <w:rFonts w:ascii="Courier New" w:hAnsi="Courier New" w:hint="default"/>
+        <w:sz w:val="20"/>
+      </w:rPr>
+    </w:lvl>
+    <w:lvl w:ilvl="2" w:tentative="1">
+      <w:start w:val="1"/>
+      <w:numFmt w:val="bullet"/>
+      <w:lvlText w:val=""/>
+      <w:lvlJc w:val="left"/>
+      <w:pPr>
+        <w:tabs>
+          <w:tab w:val="num" w:pos="2160"/>
+        </w:tabs>
+        <w:ind w:left="2160" w:hanging="360"/>
+      </w:pPr>
+      <w:rPr>
+        <w:rFonts w:ascii="Wingdings" w:hAnsi="Wingdings" w:hint="default"/>
+        <w:sz w:val="20"/>
+      </w:rPr>
+    </w:lvl>
+    <w:lvl w:ilvl="3" w:tentative="1">
+      <w:start w:val="1"/>
+      <w:numFmt w:val="bullet"/>
+      <w:lvlText w:val=""/>
+      <w:lvlJc w:val="left"/>
+      <w:pPr>
+        <w:tabs>
+          <w:tab w:val="num" w:pos="2880"/>
+        </w:tabs>
+        <w:ind w:left="2880" w:hanging="360"/>
+      </w:pPr>
+      <w:rPr>
+        <w:rFonts w:ascii="Wingdings" w:hAnsi="Wingdings" w:hint="default"/>
+        <w:sz w:val="20"/>
+      </w:rPr>
+    </w:lvl>
+    <w:lvl w:ilvl="4" w:tentative="1">
+      <w:start w:val="1"/>
+      <w:numFmt w:val="bullet"/>
+      <w:lvlText w:val=""/>
+      <w:lvlJc w:val="left"/>
+      <w:pPr>
+        <w:tabs>
+          <w:tab w:val="num" w:pos="3600"/>
+        </w:tabs>
+        <w:ind w:left="3600" w:hanging="360"/>
+      </w:pPr>
+      <w:rPr>
+        <w:rFonts w:ascii="Wingdings" w:hAnsi="Wingdings" w:hint="default"/>
+        <w:sz w:val="20"/>
+      </w:rPr>
+    </w:lvl>
+    <w:lvl w:ilvl="5" w:tentative="1">
+      <w:start w:val="1"/>
+      <w:numFmt w:val="bullet"/>
+      <w:lvlText w:val=""/>
+      <w:lvlJc w:val="left"/>
+      <w:pPr>
+        <w:tabs>
+          <w:tab w:val="num" w:pos="4320"/>
+        </w:tabs>
+        <w:ind w:left="4320" w:hanging="360"/>
+      </w:pPr>
+      <w:rPr>
+        <w:rFonts w:ascii="Wingdings" w:hAnsi="Wingdings" w:hint="default"/>
+        <w:sz w:val="20"/>
+      </w:rPr>
+    </w:lvl>
+    <w:lvl w:ilvl="6" w:tentative="1">
+      <w:start w:val="1"/>
+      <w:numFmt w:val="bullet"/>
+      <w:lvlText w:val=""/>
+      <w:lvlJc w:val="left"/>
+      <w:pPr>
+        <w:tabs>
+          <w:tab w:val="num" w:pos="5040"/>
+        </w:tabs>
+        <w:ind w:left="5040" w:hanging="360"/>
+      </w:pPr>
+      <w:rPr>
+        <w:rFonts w:ascii="Wingdings" w:hAnsi="Wingdings" w:hint="default"/>
+        <w:sz w:val="20"/>
+      </w:rPr>
+    </w:lvl>
+    <w:lvl w:ilvl="7" w:tentative="1">
+      <w:start w:val="1"/>
+      <w:numFmt w:val="bullet"/>
+      <w:lvlText w:val=""/>
+      <w:lvlJc w:val="left"/>
+      <w:pPr>
+        <w:tabs>
+          <w:tab w:val="num" w:pos="5760"/>
+        </w:tabs>
+        <w:ind w:left="5760" w:hanging="360"/>
+      </w:pPr>
+      <w:rPr>
+        <w:rFonts w:ascii="Wingdings" w:hAnsi="Wingdings" w:hint="default"/>
+        <w:sz w:val="20"/>
+      </w:rPr>
+    </w:lvl>
+    <w:lvl w:ilvl="8" w:tentative="1">
+      <w:start w:val="1"/>
+      <w:numFmt w:val="bullet"/>
+      <w:lvlText w:val=""/>
+      <w:lvlJc w:val="left"/>
+      <w:pPr>
+        <w:tabs>
+          <w:tab w:val="num" w:pos="6480"/>
+        </w:tabs>
+        <w:ind w:left="6480" w:hanging="360"/>
+      </w:pPr>
+      <w:rPr>
+        <w:rFonts w:ascii="Wingdings" w:hAnsi="Wingdings" w:hint="default"/>
+        <w:sz w:val="20"/>
+      </w:rPr>
+    </w:lvl>
+  </w:abstractNum>
+  <w:abstractNum w:abstractNumId="24" w15:restartNumberingAfterBreak="0">
     <w:nsid w:val="4405324E"/>
     <w:multiLevelType w:val="multilevel"/>
     <w:tmpl w:val="3190ADBA"/>
@@ -5080,7 +7206,7 @@
       </w:rPr>
     </w:lvl>
   </w:abstractNum>
-  <w:abstractNum w:abstractNumId="19" w15:restartNumberingAfterBreak="0">
+  <w:abstractNum w:abstractNumId="25" w15:restartNumberingAfterBreak="0">
     <w:nsid w:val="471C315C"/>
     <w:multiLevelType w:val="multilevel"/>
     <w:tmpl w:val="C01EE712"/>
@@ -5229,7 +7355,7 @@
       </w:rPr>
     </w:lvl>
   </w:abstractNum>
-  <w:abstractNum w:abstractNumId="20" w15:restartNumberingAfterBreak="0">
+  <w:abstractNum w:abstractNumId="26" w15:restartNumberingAfterBreak="0">
     <w:nsid w:val="4A421664"/>
     <w:multiLevelType w:val="multilevel"/>
     <w:tmpl w:val="387C34F2"/>
@@ -5378,7 +7504,7 @@
       </w:rPr>
     </w:lvl>
   </w:abstractNum>
-  <w:abstractNum w:abstractNumId="21" w15:restartNumberingAfterBreak="0">
+  <w:abstractNum w:abstractNumId="27" w15:restartNumberingAfterBreak="0">
     <w:nsid w:val="503F437F"/>
     <w:multiLevelType w:val="multilevel"/>
     <w:tmpl w:val="638E97C2"/>
@@ -5527,7 +7653,7 @@
       </w:rPr>
     </w:lvl>
   </w:abstractNum>
-  <w:abstractNum w:abstractNumId="22" w15:restartNumberingAfterBreak="0">
+  <w:abstractNum w:abstractNumId="28" w15:restartNumberingAfterBreak="0">
     <w:nsid w:val="514F1507"/>
     <w:multiLevelType w:val="multilevel"/>
     <w:tmpl w:val="BE289292"/>
@@ -5676,7 +7802,7 @@
       </w:rPr>
     </w:lvl>
   </w:abstractNum>
-  <w:abstractNum w:abstractNumId="23" w15:restartNumberingAfterBreak="0">
+  <w:abstractNum w:abstractNumId="29" w15:restartNumberingAfterBreak="0">
     <w:nsid w:val="57F16EC6"/>
     <w:multiLevelType w:val="multilevel"/>
     <w:tmpl w:val="E00835D0"/>
@@ -5825,7 +7951,7 @@
       </w:rPr>
     </w:lvl>
   </w:abstractNum>
-  <w:abstractNum w:abstractNumId="24" w15:restartNumberingAfterBreak="0">
+  <w:abstractNum w:abstractNumId="30" w15:restartNumberingAfterBreak="0">
     <w:nsid w:val="58310EE2"/>
     <w:multiLevelType w:val="multilevel"/>
     <w:tmpl w:val="668C5E2C"/>
@@ -5938,7 +8064,7 @@
       </w:pPr>
     </w:lvl>
   </w:abstractNum>
-  <w:abstractNum w:abstractNumId="25" w15:restartNumberingAfterBreak="0">
+  <w:abstractNum w:abstractNumId="31" w15:restartNumberingAfterBreak="0">
     <w:nsid w:val="5834078D"/>
     <w:multiLevelType w:val="multilevel"/>
     <w:tmpl w:val="B7EC5BEE"/>
@@ -6087,7 +8213,7 @@
       </w:rPr>
     </w:lvl>
   </w:abstractNum>
-  <w:abstractNum w:abstractNumId="26" w15:restartNumberingAfterBreak="0">
+  <w:abstractNum w:abstractNumId="32" w15:restartNumberingAfterBreak="0">
     <w:nsid w:val="5C1F5117"/>
     <w:multiLevelType w:val="multilevel"/>
     <w:tmpl w:val="538A43B2"/>
@@ -6236,7 +8362,7 @@
       </w:rPr>
     </w:lvl>
   </w:abstractNum>
-  <w:abstractNum w:abstractNumId="27" w15:restartNumberingAfterBreak="0">
+  <w:abstractNum w:abstractNumId="33" w15:restartNumberingAfterBreak="0">
     <w:nsid w:val="5DF96BE6"/>
     <w:multiLevelType w:val="multilevel"/>
     <w:tmpl w:val="4054486A"/>
@@ -6385,7 +8511,305 @@
       </w:rPr>
     </w:lvl>
   </w:abstractNum>
-  <w:abstractNum w:abstractNumId="28" w15:restartNumberingAfterBreak="0">
+  <w:abstractNum w:abstractNumId="34" w15:restartNumberingAfterBreak="0">
+    <w:nsid w:val="72031CF4"/>
+    <w:multiLevelType w:val="multilevel"/>
+    <w:tmpl w:val="E808156C"/>
+    <w:lvl w:ilvl="0">
+      <w:start w:val="1"/>
+      <w:numFmt w:val="bullet"/>
+      <w:lvlText w:val=""/>
+      <w:lvlJc w:val="left"/>
+      <w:pPr>
+        <w:tabs>
+          <w:tab w:val="num" w:pos="720"/>
+        </w:tabs>
+        <w:ind w:left="720" w:hanging="360"/>
+      </w:pPr>
+      <w:rPr>
+        <w:rFonts w:ascii="Symbol" w:hAnsi="Symbol" w:hint="default"/>
+        <w:sz w:val="20"/>
+      </w:rPr>
+    </w:lvl>
+    <w:lvl w:ilvl="1" w:tentative="1">
+      <w:start w:val="1"/>
+      <w:numFmt w:val="bullet"/>
+      <w:lvlText w:val="o"/>
+      <w:lvlJc w:val="left"/>
+      <w:pPr>
+        <w:tabs>
+          <w:tab w:val="num" w:pos="1440"/>
+        </w:tabs>
+        <w:ind w:left="1440" w:hanging="360"/>
+      </w:pPr>
+      <w:rPr>
+        <w:rFonts w:ascii="Courier New" w:hAnsi="Courier New" w:hint="default"/>
+        <w:sz w:val="20"/>
+      </w:rPr>
+    </w:lvl>
+    <w:lvl w:ilvl="2" w:tentative="1">
+      <w:start w:val="1"/>
+      <w:numFmt w:val="bullet"/>
+      <w:lvlText w:val=""/>
+      <w:lvlJc w:val="left"/>
+      <w:pPr>
+        <w:tabs>
+          <w:tab w:val="num" w:pos="2160"/>
+        </w:tabs>
+        <w:ind w:left="2160" w:hanging="360"/>
+      </w:pPr>
+      <w:rPr>
+        <w:rFonts w:ascii="Wingdings" w:hAnsi="Wingdings" w:hint="default"/>
+        <w:sz w:val="20"/>
+      </w:rPr>
+    </w:lvl>
+    <w:lvl w:ilvl="3" w:tentative="1">
+      <w:start w:val="1"/>
+      <w:numFmt w:val="bullet"/>
+      <w:lvlText w:val=""/>
+      <w:lvlJc w:val="left"/>
+      <w:pPr>
+        <w:tabs>
+          <w:tab w:val="num" w:pos="2880"/>
+        </w:tabs>
+        <w:ind w:left="2880" w:hanging="360"/>
+      </w:pPr>
+      <w:rPr>
+        <w:rFonts w:ascii="Wingdings" w:hAnsi="Wingdings" w:hint="default"/>
+        <w:sz w:val="20"/>
+      </w:rPr>
+    </w:lvl>
+    <w:lvl w:ilvl="4" w:tentative="1">
+      <w:start w:val="1"/>
+      <w:numFmt w:val="bullet"/>
+      <w:lvlText w:val=""/>
+      <w:lvlJc w:val="left"/>
+      <w:pPr>
+        <w:tabs>
+          <w:tab w:val="num" w:pos="3600"/>
+        </w:tabs>
+        <w:ind w:left="3600" w:hanging="360"/>
+      </w:pPr>
+      <w:rPr>
+        <w:rFonts w:ascii="Wingdings" w:hAnsi="Wingdings" w:hint="default"/>
+        <w:sz w:val="20"/>
+      </w:rPr>
+    </w:lvl>
+    <w:lvl w:ilvl="5" w:tentative="1">
+      <w:start w:val="1"/>
+      <w:numFmt w:val="bullet"/>
+      <w:lvlText w:val=""/>
+      <w:lvlJc w:val="left"/>
+      <w:pPr>
+        <w:tabs>
+          <w:tab w:val="num" w:pos="4320"/>
+        </w:tabs>
+        <w:ind w:left="4320" w:hanging="360"/>
+      </w:pPr>
+      <w:rPr>
+        <w:rFonts w:ascii="Wingdings" w:hAnsi="Wingdings" w:hint="default"/>
+        <w:sz w:val="20"/>
+      </w:rPr>
+    </w:lvl>
+    <w:lvl w:ilvl="6" w:tentative="1">
+      <w:start w:val="1"/>
+      <w:numFmt w:val="bullet"/>
+      <w:lvlText w:val=""/>
+      <w:lvlJc w:val="left"/>
+      <w:pPr>
+        <w:tabs>
+          <w:tab w:val="num" w:pos="5040"/>
+        </w:tabs>
+        <w:ind w:left="5040" w:hanging="360"/>
+      </w:pPr>
+      <w:rPr>
+        <w:rFonts w:ascii="Wingdings" w:hAnsi="Wingdings" w:hint="default"/>
+        <w:sz w:val="20"/>
+      </w:rPr>
+    </w:lvl>
+    <w:lvl w:ilvl="7" w:tentative="1">
+      <w:start w:val="1"/>
+      <w:numFmt w:val="bullet"/>
+      <w:lvlText w:val=""/>
+      <w:lvlJc w:val="left"/>
+      <w:pPr>
+        <w:tabs>
+          <w:tab w:val="num" w:pos="5760"/>
+        </w:tabs>
+        <w:ind w:left="5760" w:hanging="360"/>
+      </w:pPr>
+      <w:rPr>
+        <w:rFonts w:ascii="Wingdings" w:hAnsi="Wingdings" w:hint="default"/>
+        <w:sz w:val="20"/>
+      </w:rPr>
+    </w:lvl>
+    <w:lvl w:ilvl="8" w:tentative="1">
+      <w:start w:val="1"/>
+      <w:numFmt w:val="bullet"/>
+      <w:lvlText w:val=""/>
+      <w:lvlJc w:val="left"/>
+      <w:pPr>
+        <w:tabs>
+          <w:tab w:val="num" w:pos="6480"/>
+        </w:tabs>
+        <w:ind w:left="6480" w:hanging="360"/>
+      </w:pPr>
+      <w:rPr>
+        <w:rFonts w:ascii="Wingdings" w:hAnsi="Wingdings" w:hint="default"/>
+        <w:sz w:val="20"/>
+      </w:rPr>
+    </w:lvl>
+  </w:abstractNum>
+  <w:abstractNum w:abstractNumId="35" w15:restartNumberingAfterBreak="0">
+    <w:nsid w:val="73E27E35"/>
+    <w:multiLevelType w:val="multilevel"/>
+    <w:tmpl w:val="1452DBEA"/>
+    <w:lvl w:ilvl="0">
+      <w:start w:val="1"/>
+      <w:numFmt w:val="bullet"/>
+      <w:lvlText w:val=""/>
+      <w:lvlJc w:val="left"/>
+      <w:pPr>
+        <w:tabs>
+          <w:tab w:val="num" w:pos="720"/>
+        </w:tabs>
+        <w:ind w:left="720" w:hanging="360"/>
+      </w:pPr>
+      <w:rPr>
+        <w:rFonts w:ascii="Symbol" w:hAnsi="Symbol" w:hint="default"/>
+        <w:sz w:val="20"/>
+      </w:rPr>
+    </w:lvl>
+    <w:lvl w:ilvl="1" w:tentative="1">
+      <w:start w:val="1"/>
+      <w:numFmt w:val="bullet"/>
+      <w:lvlText w:val="o"/>
+      <w:lvlJc w:val="left"/>
+      <w:pPr>
+        <w:tabs>
+          <w:tab w:val="num" w:pos="1440"/>
+        </w:tabs>
+        <w:ind w:left="1440" w:hanging="360"/>
+      </w:pPr>
+      <w:rPr>
+        <w:rFonts w:ascii="Courier New" w:hAnsi="Courier New" w:hint="default"/>
+        <w:sz w:val="20"/>
+      </w:rPr>
+    </w:lvl>
+    <w:lvl w:ilvl="2" w:tentative="1">
+      <w:start w:val="1"/>
+      <w:numFmt w:val="bullet"/>
+      <w:lvlText w:val=""/>
+      <w:lvlJc w:val="left"/>
+      <w:pPr>
+        <w:tabs>
+          <w:tab w:val="num" w:pos="2160"/>
+        </w:tabs>
+        <w:ind w:left="2160" w:hanging="360"/>
+      </w:pPr>
+      <w:rPr>
+        <w:rFonts w:ascii="Wingdings" w:hAnsi="Wingdings" w:hint="default"/>
+        <w:sz w:val="20"/>
+      </w:rPr>
+    </w:lvl>
+    <w:lvl w:ilvl="3" w:tentative="1">
+      <w:start w:val="1"/>
+      <w:numFmt w:val="bullet"/>
+      <w:lvlText w:val=""/>
+      <w:lvlJc w:val="left"/>
+      <w:pPr>
+        <w:tabs>
+          <w:tab w:val="num" w:pos="2880"/>
+        </w:tabs>
+        <w:ind w:left="2880" w:hanging="360"/>
+      </w:pPr>
+      <w:rPr>
+        <w:rFonts w:ascii="Wingdings" w:hAnsi="Wingdings" w:hint="default"/>
+        <w:sz w:val="20"/>
+      </w:rPr>
+    </w:lvl>
+    <w:lvl w:ilvl="4" w:tentative="1">
+      <w:start w:val="1"/>
+      <w:numFmt w:val="bullet"/>
+      <w:lvlText w:val=""/>
+      <w:lvlJc w:val="left"/>
+      <w:pPr>
+        <w:tabs>
+          <w:tab w:val="num" w:pos="3600"/>
+        </w:tabs>
+        <w:ind w:left="3600" w:hanging="360"/>
+      </w:pPr>
+      <w:rPr>
+        <w:rFonts w:ascii="Wingdings" w:hAnsi="Wingdings" w:hint="default"/>
+        <w:sz w:val="20"/>
+      </w:rPr>
+    </w:lvl>
+    <w:lvl w:ilvl="5" w:tentative="1">
+      <w:start w:val="1"/>
+      <w:numFmt w:val="bullet"/>
+      <w:lvlText w:val=""/>
+      <w:lvlJc w:val="left"/>
+      <w:pPr>
+        <w:tabs>
+          <w:tab w:val="num" w:pos="4320"/>
+        </w:tabs>
+        <w:ind w:left="4320" w:hanging="360"/>
+      </w:pPr>
+      <w:rPr>
+        <w:rFonts w:ascii="Wingdings" w:hAnsi="Wingdings" w:hint="default"/>
+        <w:sz w:val="20"/>
+      </w:rPr>
+    </w:lvl>
+    <w:lvl w:ilvl="6" w:tentative="1">
+      <w:start w:val="1"/>
+      <w:numFmt w:val="bullet"/>
+      <w:lvlText w:val=""/>
+      <w:lvlJc w:val="left"/>
+      <w:pPr>
+        <w:tabs>
+          <w:tab w:val="num" w:pos="5040"/>
+        </w:tabs>
+        <w:ind w:left="5040" w:hanging="360"/>
+      </w:pPr>
+      <w:rPr>
+        <w:rFonts w:ascii="Wingdings" w:hAnsi="Wingdings" w:hint="default"/>
+        <w:sz w:val="20"/>
+      </w:rPr>
+    </w:lvl>
+    <w:lvl w:ilvl="7" w:tentative="1">
+      <w:start w:val="1"/>
+      <w:numFmt w:val="bullet"/>
+      <w:lvlText w:val=""/>
+      <w:lvlJc w:val="left"/>
+      <w:pPr>
+        <w:tabs>
+          <w:tab w:val="num" w:pos="5760"/>
+        </w:tabs>
+        <w:ind w:left="5760" w:hanging="360"/>
+      </w:pPr>
+      <w:rPr>
+        <w:rFonts w:ascii="Wingdings" w:hAnsi="Wingdings" w:hint="default"/>
+        <w:sz w:val="20"/>
+      </w:rPr>
+    </w:lvl>
+    <w:lvl w:ilvl="8" w:tentative="1">
+      <w:start w:val="1"/>
+      <w:numFmt w:val="bullet"/>
+      <w:lvlText w:val=""/>
+      <w:lvlJc w:val="left"/>
+      <w:pPr>
+        <w:tabs>
+          <w:tab w:val="num" w:pos="6480"/>
+        </w:tabs>
+        <w:ind w:left="6480" w:hanging="360"/>
+      </w:pPr>
+      <w:rPr>
+        <w:rFonts w:ascii="Wingdings" w:hAnsi="Wingdings" w:hint="default"/>
+        <w:sz w:val="20"/>
+      </w:rPr>
+    </w:lvl>
+  </w:abstractNum>
+  <w:abstractNum w:abstractNumId="36" w15:restartNumberingAfterBreak="0">
     <w:nsid w:val="776B0E68"/>
     <w:multiLevelType w:val="multilevel"/>
     <w:tmpl w:val="B92691EC"/>
@@ -6534,7 +8958,7 @@
       </w:rPr>
     </w:lvl>
   </w:abstractNum>
-  <w:abstractNum w:abstractNumId="29" w15:restartNumberingAfterBreak="0">
+  <w:abstractNum w:abstractNumId="37" w15:restartNumberingAfterBreak="0">
     <w:nsid w:val="78C448DC"/>
     <w:multiLevelType w:val="multilevel"/>
     <w:tmpl w:val="C13E05A8"/>
@@ -6684,94 +9108,118 @@
     </w:lvl>
   </w:abstractNum>
   <w:num w:numId="1" w16cid:durableId="94332662">
-    <w:abstractNumId w:val="15"/>
+    <w:abstractNumId w:val="20"/>
   </w:num>
   <w:num w:numId="2" w16cid:durableId="1113944286">
+    <w:abstractNumId w:val="36"/>
+  </w:num>
+  <w:num w:numId="3" w16cid:durableId="1058550911">
+    <w:abstractNumId w:val="4"/>
+  </w:num>
+  <w:num w:numId="4" w16cid:durableId="538396424">
+    <w:abstractNumId w:val="9"/>
+  </w:num>
+  <w:num w:numId="5" w16cid:durableId="975186975">
+    <w:abstractNumId w:val="26"/>
+  </w:num>
+  <w:num w:numId="6" w16cid:durableId="1814329753">
+    <w:abstractNumId w:val="30"/>
+  </w:num>
+  <w:num w:numId="7" w16cid:durableId="1173690040">
     <w:abstractNumId w:val="28"/>
   </w:num>
-  <w:num w:numId="3" w16cid:durableId="1058550911">
-    <w:abstractNumId w:val="3"/>
-  </w:num>
-  <w:num w:numId="4" w16cid:durableId="538396424">
-    <w:abstractNumId w:val="6"/>
-  </w:num>
-  <w:num w:numId="5" w16cid:durableId="975186975">
-    <w:abstractNumId w:val="20"/>
-  </w:num>
-  <w:num w:numId="6" w16cid:durableId="1814329753">
-    <w:abstractNumId w:val="24"/>
-  </w:num>
-  <w:num w:numId="7" w16cid:durableId="1173690040">
-    <w:abstractNumId w:val="22"/>
-  </w:num>
   <w:num w:numId="8" w16cid:durableId="331109436">
-    <w:abstractNumId w:val="1"/>
+    <w:abstractNumId w:val="2"/>
   </w:num>
   <w:num w:numId="9" w16cid:durableId="1001393496">
-    <w:abstractNumId w:val="13"/>
+    <w:abstractNumId w:val="17"/>
   </w:num>
   <w:num w:numId="10" w16cid:durableId="414399510">
-    <w:abstractNumId w:val="10"/>
+    <w:abstractNumId w:val="14"/>
   </w:num>
   <w:num w:numId="11" w16cid:durableId="1630815640">
-    <w:abstractNumId w:val="17"/>
+    <w:abstractNumId w:val="22"/>
   </w:num>
   <w:num w:numId="12" w16cid:durableId="247927921">
     <w:abstractNumId w:val="0"/>
   </w:num>
   <w:num w:numId="13" w16cid:durableId="1879511623">
+    <w:abstractNumId w:val="10"/>
+  </w:num>
+  <w:num w:numId="14" w16cid:durableId="1835563121">
+    <w:abstractNumId w:val="33"/>
+  </w:num>
+  <w:num w:numId="15" w16cid:durableId="1333878340">
+    <w:abstractNumId w:val="29"/>
+  </w:num>
+  <w:num w:numId="16" w16cid:durableId="734543948">
+    <w:abstractNumId w:val="31"/>
+  </w:num>
+  <w:num w:numId="17" w16cid:durableId="1431580308">
+    <w:abstractNumId w:val="15"/>
+  </w:num>
+  <w:num w:numId="18" w16cid:durableId="238711473">
+    <w:abstractNumId w:val="37"/>
+  </w:num>
+  <w:num w:numId="19" w16cid:durableId="1198078395">
+    <w:abstractNumId w:val="5"/>
+  </w:num>
+  <w:num w:numId="20" w16cid:durableId="2006467281">
+    <w:abstractNumId w:val="27"/>
+  </w:num>
+  <w:num w:numId="21" w16cid:durableId="278336639">
     <w:abstractNumId w:val="7"/>
   </w:num>
-  <w:num w:numId="14" w16cid:durableId="1835563121">
-    <w:abstractNumId w:val="27"/>
+  <w:num w:numId="22" w16cid:durableId="2019650626">
+    <w:abstractNumId w:val="21"/>
   </w:num>
-  <w:num w:numId="15" w16cid:durableId="1333878340">
+  <w:num w:numId="23" w16cid:durableId="1858544659">
+    <w:abstractNumId w:val="19"/>
+  </w:num>
+  <w:num w:numId="24" w16cid:durableId="915210875">
+    <w:abstractNumId w:val="24"/>
+  </w:num>
+  <w:num w:numId="25" w16cid:durableId="1719207101">
+    <w:abstractNumId w:val="25"/>
+  </w:num>
+  <w:num w:numId="26" w16cid:durableId="128400261">
+    <w:abstractNumId w:val="32"/>
+  </w:num>
+  <w:num w:numId="27" w16cid:durableId="502208126">
+    <w:abstractNumId w:val="3"/>
+  </w:num>
+  <w:num w:numId="28" w16cid:durableId="285426373">
+    <w:abstractNumId w:val="13"/>
+  </w:num>
+  <w:num w:numId="29" w16cid:durableId="923565524">
+    <w:abstractNumId w:val="12"/>
+  </w:num>
+  <w:num w:numId="30" w16cid:durableId="18164325">
+    <w:abstractNumId w:val="16"/>
+  </w:num>
+  <w:num w:numId="31" w16cid:durableId="1772823898">
+    <w:abstractNumId w:val="11"/>
+  </w:num>
+  <w:num w:numId="32" w16cid:durableId="971520924">
+    <w:abstractNumId w:val="8"/>
+  </w:num>
+  <w:num w:numId="33" w16cid:durableId="170461905">
+    <w:abstractNumId w:val="34"/>
+  </w:num>
+  <w:num w:numId="34" w16cid:durableId="469247231">
+    <w:abstractNumId w:val="18"/>
+  </w:num>
+  <w:num w:numId="35" w16cid:durableId="1646396441">
+    <w:abstractNumId w:val="1"/>
+  </w:num>
+  <w:num w:numId="36" w16cid:durableId="1964575246">
     <w:abstractNumId w:val="23"/>
   </w:num>
-  <w:num w:numId="16" w16cid:durableId="734543948">
-    <w:abstractNumId w:val="25"/>
+  <w:num w:numId="37" w16cid:durableId="2135904848">
+    <w:abstractNumId w:val="6"/>
   </w:num>
-  <w:num w:numId="17" w16cid:durableId="1431580308">
-    <w:abstractNumId w:val="11"/>
-  </w:num>
-  <w:num w:numId="18" w16cid:durableId="238711473">
-    <w:abstractNumId w:val="29"/>
-  </w:num>
-  <w:num w:numId="19" w16cid:durableId="1198078395">
-    <w:abstractNumId w:val="4"/>
-  </w:num>
-  <w:num w:numId="20" w16cid:durableId="2006467281">
-    <w:abstractNumId w:val="21"/>
-  </w:num>
-  <w:num w:numId="21" w16cid:durableId="278336639">
-    <w:abstractNumId w:val="5"/>
-  </w:num>
-  <w:num w:numId="22" w16cid:durableId="2019650626">
-    <w:abstractNumId w:val="16"/>
-  </w:num>
-  <w:num w:numId="23" w16cid:durableId="1858544659">
-    <w:abstractNumId w:val="14"/>
-  </w:num>
-  <w:num w:numId="24" w16cid:durableId="915210875">
-    <w:abstractNumId w:val="18"/>
-  </w:num>
-  <w:num w:numId="25" w16cid:durableId="1719207101">
-    <w:abstractNumId w:val="19"/>
-  </w:num>
-  <w:num w:numId="26" w16cid:durableId="128400261">
-    <w:abstractNumId w:val="26"/>
-  </w:num>
-  <w:num w:numId="27" w16cid:durableId="502208126">
-    <w:abstractNumId w:val="2"/>
-  </w:num>
-  <w:num w:numId="28" w16cid:durableId="285426373">
-    <w:abstractNumId w:val="9"/>
-  </w:num>
-  <w:num w:numId="29" w16cid:durableId="923565524">
-    <w:abstractNumId w:val="8"/>
-  </w:num>
-  <w:num w:numId="30" w16cid:durableId="18164325">
-    <w:abstractNumId w:val="12"/>
+  <w:num w:numId="38" w16cid:durableId="47186873">
+    <w:abstractNumId w:val="35"/>
   </w:num>
 </w:numbering>
 </file>

</xml_diff>

<commit_message>
Dia 30: Mapa completo de sistemas de IA
</commit_message>
<xml_diff>
--- a/Sistemas híbridos ML + LLM/Sistemas híbridos ML + LLM.docx
+++ b/Sistemas híbridos ML + LLM/Sistemas híbridos ML + LLM.docx
@@ -80,13 +80,8 @@
           <w:numId w:val="1"/>
         </w:numPr>
       </w:pPr>
-      <w:proofErr w:type="spellStart"/>
-      <w:r>
-        <w:t>Random</w:t>
-      </w:r>
-      <w:proofErr w:type="spellEnd"/>
-      <w:r>
-        <w:t xml:space="preserve"> Forest → estabilidad</w:t>
+      <w:r>
+        <w:t>Random Forest → estabilidad</w:t>
       </w:r>
     </w:p>
     <w:p>
@@ -108,23 +103,7 @@
         </w:numPr>
       </w:pPr>
       <w:r>
-        <w:t xml:space="preserve">Métricas → </w:t>
-      </w:r>
-      <w:proofErr w:type="spellStart"/>
-      <w:r>
-        <w:t>accuracy</w:t>
-      </w:r>
-      <w:proofErr w:type="spellEnd"/>
-      <w:r>
-        <w:t xml:space="preserve">, </w:t>
-      </w:r>
-      <w:proofErr w:type="spellStart"/>
-      <w:r>
-        <w:t>recall</w:t>
-      </w:r>
-      <w:proofErr w:type="spellEnd"/>
-      <w:r>
-        <w:t>, F1</w:t>
+        <w:t>Métricas → accuracy, recall, F1</w:t>
       </w:r>
     </w:p>
     <w:p>
@@ -289,15 +268,7 @@
         <w:t>generativo y probabilístico</w:t>
       </w:r>
       <w:r>
-        <w:t xml:space="preserve">, no un clasificador entrenado en tu </w:t>
-      </w:r>
-      <w:proofErr w:type="spellStart"/>
-      <w:r>
-        <w:t>dataset</w:t>
-      </w:r>
-      <w:proofErr w:type="spellEnd"/>
-      <w:r>
-        <w:t>.</w:t>
+        <w:t>, no un clasificador entrenado en tu dataset.</w:t>
       </w:r>
     </w:p>
     <w:p>
@@ -1014,13 +985,8 @@
         </w:numPr>
       </w:pPr>
       <w:r>
-        <w:t xml:space="preserve">LLM propone </w:t>
-      </w:r>
-      <w:proofErr w:type="spellStart"/>
-      <w:r>
-        <w:t>features</w:t>
-      </w:r>
-      <w:proofErr w:type="spellEnd"/>
+        <w:t>LLM propone features</w:t>
+      </w:r>
     </w:p>
     <w:p>
       <w:pPr>
@@ -1282,23 +1248,7 @@
         </w:numPr>
       </w:pPr>
       <w:r>
-        <w:t>Se necesitan métricas (</w:t>
-      </w:r>
-      <w:proofErr w:type="spellStart"/>
-      <w:r>
-        <w:t>accuracy</w:t>
-      </w:r>
-      <w:proofErr w:type="spellEnd"/>
-      <w:r>
-        <w:t xml:space="preserve">, </w:t>
-      </w:r>
-      <w:proofErr w:type="spellStart"/>
-      <w:r>
-        <w:t>recall</w:t>
-      </w:r>
-      <w:proofErr w:type="spellEnd"/>
-      <w:r>
-        <w:t>, riesgo, score)</w:t>
+        <w:t>Se necesitan métricas (accuracy, recall, riesgo, score)</w:t>
       </w:r>
     </w:p>
     <w:p>
@@ -1423,23 +1373,7 @@
         </w:numPr>
       </w:pPr>
       <w:r>
-        <w:t>Variables importantes (</w:t>
-      </w:r>
-      <w:proofErr w:type="spellStart"/>
-      <w:r>
-        <w:t>feature</w:t>
-      </w:r>
-      <w:proofErr w:type="spellEnd"/>
-      <w:r>
-        <w:t xml:space="preserve"> </w:t>
-      </w:r>
-      <w:proofErr w:type="spellStart"/>
-      <w:r>
-        <w:t>importance</w:t>
-      </w:r>
-      <w:proofErr w:type="spellEnd"/>
-      <w:r>
-        <w:t>)</w:t>
+        <w:t>Variables importantes (feature importance)</w:t>
       </w:r>
     </w:p>
     <w:p>
@@ -1809,13 +1743,8 @@
           <w:numId w:val="24"/>
         </w:numPr>
       </w:pPr>
-      <w:proofErr w:type="spellStart"/>
-      <w:r>
-        <w:t>Necesitás</w:t>
-      </w:r>
-      <w:proofErr w:type="spellEnd"/>
-      <w:r>
-        <w:t xml:space="preserve"> convertir lenguaje en variables estructuradas</w:t>
+      <w:r>
+        <w:t>Necesitás convertir lenguaje en variables estructuradas</w:t>
       </w:r>
     </w:p>
     <w:p>
@@ -2085,13 +2014,8 @@
           <w:numId w:val="29"/>
         </w:numPr>
       </w:pPr>
-      <w:proofErr w:type="spellStart"/>
-      <w:r>
-        <w:t>Necesitás</w:t>
-      </w:r>
-      <w:proofErr w:type="spellEnd"/>
-      <w:r>
-        <w:t xml:space="preserve"> clasificación automática</w:t>
+      <w:r>
+        <w:t>Necesitás clasificación automática</w:t>
       </w:r>
     </w:p>
     <w:p>
@@ -2317,9 +2241,126 @@
           <w:szCs w:val="28"/>
           <w:u w:val="single"/>
         </w:rPr>
-        <w:t>1️</w:t>
-      </w:r>
-      <w:r>
+        <w:t>1️) Evaluación del ML clásico</w:t>
+      </w:r>
+    </w:p>
+    <w:p>
+      <w:r>
+        <w:t>Esto ya lo conocés.</w:t>
+      </w:r>
+    </w:p>
+    <w:p>
+      <w:r>
+        <w:t>Se evalúa con métricas claras:</w:t>
+      </w:r>
+    </w:p>
+    <w:p>
+      <w:pPr>
+        <w:numPr>
+          <w:ilvl w:val="0"/>
+          <w:numId w:val="31"/>
+        </w:numPr>
+      </w:pPr>
+      <w:r>
+        <w:t>Accuracy</w:t>
+      </w:r>
+    </w:p>
+    <w:p>
+      <w:pPr>
+        <w:numPr>
+          <w:ilvl w:val="0"/>
+          <w:numId w:val="31"/>
+        </w:numPr>
+      </w:pPr>
+      <w:r>
+        <w:t>Precision</w:t>
+      </w:r>
+    </w:p>
+    <w:p>
+      <w:pPr>
+        <w:numPr>
+          <w:ilvl w:val="0"/>
+          <w:numId w:val="31"/>
+        </w:numPr>
+      </w:pPr>
+      <w:r>
+        <w:t>Recall</w:t>
+      </w:r>
+    </w:p>
+    <w:p>
+      <w:pPr>
+        <w:numPr>
+          <w:ilvl w:val="0"/>
+          <w:numId w:val="31"/>
+        </w:numPr>
+      </w:pPr>
+      <w:r>
+        <w:t>F1</w:t>
+      </w:r>
+    </w:p>
+    <w:p>
+      <w:pPr>
+        <w:numPr>
+          <w:ilvl w:val="0"/>
+          <w:numId w:val="31"/>
+        </w:numPr>
+      </w:pPr>
+      <w:r>
+        <w:t>ROC-AUC</w:t>
+      </w:r>
+    </w:p>
+    <w:p>
+      <w:r>
+        <w:t>Ejemplo:</w:t>
+      </w:r>
+    </w:p>
+    <w:p>
+      <w:r>
+        <w:t>Modelo abandono estudiantes</w:t>
+      </w:r>
+      <w:r>
+        <w:br/>
+        <w:t>Accuracy: 0.84</w:t>
+      </w:r>
+      <w:r>
+        <w:br/>
+        <w:t>Recall: 0.78</w:t>
+      </w:r>
+      <w:r>
+        <w:br/>
+        <w:t>Precision: 0.81</w:t>
+      </w:r>
+    </w:p>
+    <w:p>
+      <w:r>
+        <w:rPr>
+          <w:rFonts w:ascii="Segoe UI Emoji" w:hAnsi="Segoe UI Emoji" w:cs="Segoe UI Emoji"/>
+        </w:rPr>
+        <w:t>📌</w:t>
+      </w:r>
+      <w:r>
+        <w:t xml:space="preserve"> Esto es </w:t>
+      </w:r>
+      <w:r>
+        <w:rPr>
+          <w:b/>
+          <w:bCs/>
+        </w:rPr>
+        <w:t>objetivo y repetible</w:t>
+      </w:r>
+      <w:r>
+        <w:t>.</w:t>
+      </w:r>
+    </w:p>
+    <w:p>
+      <w:r>
+        <w:pict w14:anchorId="2CEA0DD0">
+          <v:rect id="_x0000_i1045" style="width:0;height:1.5pt" o:hralign="center" o:hrstd="t" o:hr="t" fillcolor="#a0a0a0" stroked="f"/>
+        </w:pict>
+      </w:r>
+    </w:p>
+    <w:p>
+      <w:pPr>
         <w:rPr>
           <w:rFonts w:cstheme="minorHAnsi"/>
           <w:b/>
@@ -2328,8 +2369,7 @@
           <w:szCs w:val="28"/>
           <w:u w:val="single"/>
         </w:rPr>
-        <w:t xml:space="preserve">) </w:t>
-      </w:r>
+      </w:pPr>
       <w:r>
         <w:rPr>
           <w:rFonts w:cstheme="minorHAnsi"/>
@@ -2339,202 +2379,7 @@
           <w:szCs w:val="28"/>
           <w:u w:val="single"/>
         </w:rPr>
-        <w:t>Evaluación del ML clásico</w:t>
-      </w:r>
-    </w:p>
-    <w:p>
-      <w:r>
-        <w:t xml:space="preserve">Esto ya lo </w:t>
-      </w:r>
-      <w:proofErr w:type="spellStart"/>
-      <w:r>
-        <w:t>conocés</w:t>
-      </w:r>
-      <w:proofErr w:type="spellEnd"/>
-      <w:r>
-        <w:t>.</w:t>
-      </w:r>
-    </w:p>
-    <w:p>
-      <w:r>
-        <w:t>Se evalúa con métricas claras:</w:t>
-      </w:r>
-    </w:p>
-    <w:p>
-      <w:pPr>
-        <w:numPr>
-          <w:ilvl w:val="0"/>
-          <w:numId w:val="31"/>
-        </w:numPr>
-      </w:pPr>
-      <w:proofErr w:type="spellStart"/>
-      <w:r>
-        <w:t>Accuracy</w:t>
-      </w:r>
-      <w:proofErr w:type="spellEnd"/>
-    </w:p>
-    <w:p>
-      <w:pPr>
-        <w:numPr>
-          <w:ilvl w:val="0"/>
-          <w:numId w:val="31"/>
-        </w:numPr>
-      </w:pPr>
-      <w:proofErr w:type="spellStart"/>
-      <w:r>
-        <w:t>Precision</w:t>
-      </w:r>
-      <w:proofErr w:type="spellEnd"/>
-    </w:p>
-    <w:p>
-      <w:pPr>
-        <w:numPr>
-          <w:ilvl w:val="0"/>
-          <w:numId w:val="31"/>
-        </w:numPr>
-      </w:pPr>
-      <w:proofErr w:type="spellStart"/>
-      <w:r>
-        <w:t>Recall</w:t>
-      </w:r>
-      <w:proofErr w:type="spellEnd"/>
-    </w:p>
-    <w:p>
-      <w:pPr>
-        <w:numPr>
-          <w:ilvl w:val="0"/>
-          <w:numId w:val="31"/>
-        </w:numPr>
-      </w:pPr>
-      <w:r>
-        <w:t>F1</w:t>
-      </w:r>
-    </w:p>
-    <w:p>
-      <w:pPr>
-        <w:numPr>
-          <w:ilvl w:val="0"/>
-          <w:numId w:val="31"/>
-        </w:numPr>
-      </w:pPr>
-      <w:r>
-        <w:t>ROC-AUC</w:t>
-      </w:r>
-    </w:p>
-    <w:p>
-      <w:r>
-        <w:t>Ejemplo:</w:t>
-      </w:r>
-    </w:p>
-    <w:p>
-      <w:r>
-        <w:t>Modelo abandono estudiantes</w:t>
-      </w:r>
-      <w:r>
-        <w:br/>
-      </w:r>
-      <w:proofErr w:type="spellStart"/>
-      <w:r>
-        <w:t>Accuracy</w:t>
-      </w:r>
-      <w:proofErr w:type="spellEnd"/>
-      <w:r>
-        <w:t>: 0.84</w:t>
-      </w:r>
-      <w:r>
-        <w:br/>
-      </w:r>
-      <w:proofErr w:type="spellStart"/>
-      <w:r>
-        <w:t>Recall</w:t>
-      </w:r>
-      <w:proofErr w:type="spellEnd"/>
-      <w:r>
-        <w:t>: 0.78</w:t>
-      </w:r>
-      <w:r>
-        <w:br/>
-      </w:r>
-      <w:proofErr w:type="spellStart"/>
-      <w:r>
-        <w:t>Precision</w:t>
-      </w:r>
-      <w:proofErr w:type="spellEnd"/>
-      <w:r>
-        <w:t>: 0.81</w:t>
-      </w:r>
-    </w:p>
-    <w:p>
-      <w:r>
-        <w:rPr>
-          <w:rFonts w:ascii="Segoe UI Emoji" w:hAnsi="Segoe UI Emoji" w:cs="Segoe UI Emoji"/>
-        </w:rPr>
-        <w:t>📌</w:t>
-      </w:r>
-      <w:r>
-        <w:t xml:space="preserve"> Esto es </w:t>
-      </w:r>
-      <w:r>
-        <w:rPr>
-          <w:b/>
-          <w:bCs/>
-        </w:rPr>
-        <w:t>objetivo y repetible</w:t>
-      </w:r>
-      <w:r>
-        <w:t>.</w:t>
-      </w:r>
-    </w:p>
-    <w:p>
-      <w:r>
-        <w:pict w14:anchorId="2CEA0DD0">
-          <v:rect id="_x0000_i1090" style="width:0;height:1.5pt" o:hralign="center" o:hrstd="t" o:hr="t" fillcolor="#a0a0a0" stroked="f"/>
-        </w:pict>
-      </w:r>
-    </w:p>
-    <w:p>
-      <w:pPr>
-        <w:rPr>
-          <w:rFonts w:cstheme="minorHAnsi"/>
-          <w:b/>
-          <w:bCs/>
-          <w:sz w:val="28"/>
-          <w:szCs w:val="28"/>
-          <w:u w:val="single"/>
-        </w:rPr>
-      </w:pPr>
-      <w:r>
-        <w:rPr>
-          <w:rFonts w:cstheme="minorHAnsi"/>
-          <w:b/>
-          <w:bCs/>
-          <w:sz w:val="28"/>
-          <w:szCs w:val="28"/>
-          <w:u w:val="single"/>
-        </w:rPr>
-        <w:t>2️</w:t>
-      </w:r>
-      <w:r>
-        <w:rPr>
-          <w:rFonts w:cstheme="minorHAnsi"/>
-          <w:b/>
-          <w:bCs/>
-          <w:sz w:val="28"/>
-          <w:szCs w:val="28"/>
-          <w:u w:val="single"/>
-        </w:rPr>
-        <w:t xml:space="preserve">) </w:t>
-      </w:r>
-      <w:r>
-        <w:rPr>
-          <w:rFonts w:cstheme="minorHAnsi"/>
-          <w:b/>
-          <w:bCs/>
-          <w:sz w:val="28"/>
-          <w:szCs w:val="28"/>
-          <w:u w:val="single"/>
-        </w:rPr>
-        <w:t>Evaluación del LLM</w:t>
+        <w:t>2️) Evaluación del LLM</w:t>
       </w:r>
     </w:p>
     <w:p>
@@ -2834,7 +2679,7 @@
     <w:p>
       <w:r>
         <w:pict w14:anchorId="2A20B0EB">
-          <v:rect id="_x0000_i1091" style="width:0;height:1.5pt" o:hralign="center" o:hrstd="t" o:hr="t" fillcolor="#a0a0a0" stroked="f"/>
+          <v:rect id="_x0000_i1046" style="width:0;height:1.5pt" o:hralign="center" o:hrstd="t" o:hr="t" fillcolor="#a0a0a0" stroked="f"/>
         </w:pict>
       </w:r>
     </w:p>
@@ -2858,9 +2703,126 @@
           <w:szCs w:val="28"/>
           <w:u w:val="single"/>
         </w:rPr>
-        <w:t>3️</w:t>
-      </w:r>
-      <w:r>
+        <w:t>3️) Evaluación del sistema completo</w:t>
+      </w:r>
+    </w:p>
+    <w:p>
+      <w:r>
+        <w:t>Ahora juntamos todo.</w:t>
+      </w:r>
+    </w:p>
+    <w:p>
+      <w:r>
+        <w:t>Ejemplo:</w:t>
+      </w:r>
+    </w:p>
+    <w:p>
+      <w:r>
+        <w:t>Sistema que predice abandono y explica la decisión.</w:t>
+      </w:r>
+    </w:p>
+    <w:p>
+      <w:pPr>
+        <w:rPr>
+          <w:b/>
+          <w:bCs/>
+        </w:rPr>
+      </w:pPr>
+      <w:r>
+        <w:rPr>
+          <w:b/>
+          <w:bCs/>
+        </w:rPr>
+        <w:t>Parte ML</w:t>
+      </w:r>
+    </w:p>
+    <w:p>
+      <w:r>
+        <w:t>Accuracy → 0.84</w:t>
+      </w:r>
+    </w:p>
+    <w:p>
+      <w:pPr>
+        <w:rPr>
+          <w:b/>
+          <w:bCs/>
+        </w:rPr>
+      </w:pPr>
+      <w:r>
+        <w:rPr>
+          <w:b/>
+          <w:bCs/>
+        </w:rPr>
+        <w:t>Parte LLM</w:t>
+      </w:r>
+    </w:p>
+    <w:p>
+      <w:r>
+        <w:t>Explicación evaluada con rúbrica.</w:t>
+      </w:r>
+    </w:p>
+    <w:p>
+      <w:pPr>
+        <w:rPr>
+          <w:b/>
+          <w:bCs/>
+        </w:rPr>
+      </w:pPr>
+      <w:r>
+        <w:rPr>
+          <w:b/>
+          <w:bCs/>
+        </w:rPr>
+        <w:t>Evaluación final</w:t>
+      </w:r>
+    </w:p>
+    <w:p>
+      <w:r>
+        <w:t>Preguntas clave:</w:t>
+      </w:r>
+    </w:p>
+    <w:p>
+      <w:pPr>
+        <w:numPr>
+          <w:ilvl w:val="0"/>
+          <w:numId w:val="33"/>
+        </w:numPr>
+      </w:pPr>
+      <w:r>
+        <w:t>¿La explicación refleja realmente la decisión del modelo?</w:t>
+      </w:r>
+    </w:p>
+    <w:p>
+      <w:pPr>
+        <w:numPr>
+          <w:ilvl w:val="0"/>
+          <w:numId w:val="33"/>
+        </w:numPr>
+      </w:pPr>
+      <w:r>
+        <w:t>¿El usuario entiende la recomendación?</w:t>
+      </w:r>
+    </w:p>
+    <w:p>
+      <w:pPr>
+        <w:numPr>
+          <w:ilvl w:val="0"/>
+          <w:numId w:val="33"/>
+        </w:numPr>
+      </w:pPr>
+      <w:r>
+        <w:t>¿El LLM inventa información?</w:t>
+      </w:r>
+    </w:p>
+    <w:p>
+      <w:r>
+        <w:pict w14:anchorId="432FDE5E">
+          <v:rect id="_x0000_i1047" style="width:0;height:1.5pt" o:hralign="center" o:hrstd="t" o:hr="t" fillcolor="#a0a0a0" stroked="f"/>
+        </w:pict>
+      </w:r>
+    </w:p>
+    <w:p>
+      <w:pPr>
         <w:rPr>
           <w:rFonts w:cstheme="minorHAnsi"/>
           <w:b/>
@@ -2869,8 +2831,7 @@
           <w:szCs w:val="28"/>
           <w:u w:val="single"/>
         </w:rPr>
-        <w:t xml:space="preserve">) </w:t>
-      </w:r>
+      </w:pPr>
       <w:r>
         <w:rPr>
           <w:rFonts w:cstheme="minorHAnsi"/>
@@ -2880,12 +2841,41 @@
           <w:szCs w:val="28"/>
           <w:u w:val="single"/>
         </w:rPr>
-        <w:t>Evaluación del sistema completo</w:t>
-      </w:r>
-    </w:p>
-    <w:p>
-      <w:r>
-        <w:t>Ahora juntamos todo.</w:t>
+        <w:t>4️) Error común</w:t>
+      </w:r>
+    </w:p>
+    <w:p>
+      <w:r>
+        <w:t>Muchos sistemas fallan porque:</w:t>
+      </w:r>
+    </w:p>
+    <w:p>
+      <w:pPr>
+        <w:numPr>
+          <w:ilvl w:val="0"/>
+          <w:numId w:val="34"/>
+        </w:numPr>
+      </w:pPr>
+      <w:r>
+        <w:t>el ML está bien</w:t>
+      </w:r>
+    </w:p>
+    <w:p>
+      <w:pPr>
+        <w:numPr>
+          <w:ilvl w:val="0"/>
+          <w:numId w:val="34"/>
+        </w:numPr>
+      </w:pPr>
+      <w:r>
+        <w:t xml:space="preserve">el LLM explica </w:t>
+      </w:r>
+      <w:r>
+        <w:rPr>
+          <w:b/>
+          <w:bCs/>
+        </w:rPr>
+        <w:t>mal</w:t>
       </w:r>
     </w:p>
     <w:p>
@@ -2895,112 +2885,425 @@
     </w:p>
     <w:p>
       <w:r>
-        <w:t>Sistema que predice abandono y explica la decisión.</w:t>
-      </w:r>
-    </w:p>
-    <w:p>
-      <w:pPr>
-        <w:rPr>
-          <w:b/>
-          <w:bCs/>
-        </w:rPr>
-      </w:pPr>
-      <w:r>
-        <w:rPr>
-          <w:b/>
-          <w:bCs/>
-        </w:rPr>
-        <w:t>Parte ML</w:t>
-      </w:r>
-    </w:p>
-    <w:p>
-      <w:proofErr w:type="spellStart"/>
-      <w:r>
-        <w:t>Accuracy</w:t>
-      </w:r>
-      <w:proofErr w:type="spellEnd"/>
-      <w:r>
-        <w:t xml:space="preserve"> → 0.84</w:t>
-      </w:r>
-    </w:p>
-    <w:p>
-      <w:pPr>
-        <w:rPr>
-          <w:b/>
-          <w:bCs/>
-        </w:rPr>
-      </w:pPr>
-      <w:r>
-        <w:rPr>
-          <w:b/>
-          <w:bCs/>
-        </w:rPr>
-        <w:t>Parte LLM</w:t>
-      </w:r>
-    </w:p>
-    <w:p>
-      <w:r>
-        <w:t>Explicación evaluada con rúbrica.</w:t>
-      </w:r>
-    </w:p>
-    <w:p>
-      <w:pPr>
-        <w:rPr>
-          <w:b/>
-          <w:bCs/>
-        </w:rPr>
-      </w:pPr>
-      <w:r>
-        <w:rPr>
-          <w:b/>
-          <w:bCs/>
-        </w:rPr>
-        <w:t>Evaluación final</w:t>
-      </w:r>
-    </w:p>
-    <w:p>
-      <w:r>
-        <w:t>Preguntas clave:</w:t>
-      </w:r>
-    </w:p>
-    <w:p>
-      <w:pPr>
-        <w:numPr>
-          <w:ilvl w:val="0"/>
-          <w:numId w:val="33"/>
-        </w:numPr>
-      </w:pPr>
-      <w:r>
-        <w:t>¿La explicación refleja realmente la decisión del modelo?</w:t>
-      </w:r>
-    </w:p>
-    <w:p>
-      <w:pPr>
-        <w:numPr>
-          <w:ilvl w:val="0"/>
-          <w:numId w:val="33"/>
-        </w:numPr>
-      </w:pPr>
-      <w:r>
-        <w:t>¿El usuario entiende la recomendación?</w:t>
-      </w:r>
-    </w:p>
-    <w:p>
-      <w:pPr>
-        <w:numPr>
-          <w:ilvl w:val="0"/>
-          <w:numId w:val="33"/>
-        </w:numPr>
-      </w:pPr>
-      <w:r>
-        <w:t>¿El LLM inventa información?</w:t>
-      </w:r>
-    </w:p>
-    <w:p>
-      <w:r>
-        <w:pict w14:anchorId="432FDE5E">
-          <v:rect id="_x0000_i1092" style="width:0;height:1.5pt" o:hralign="center" o:hrstd="t" o:hr="t" fillcolor="#a0a0a0" stroked="f"/>
+        <w:t>ML dice:</w:t>
+      </w:r>
+    </w:p>
+    <w:p>
+      <w:r>
+        <w:t>riesgo alto por baja asistencia</w:t>
+      </w:r>
+    </w:p>
+    <w:p>
+      <w:r>
+        <w:t>LLM responde:</w:t>
+      </w:r>
+    </w:p>
+    <w:p>
+      <w:r>
+        <w:t>tu rendimiento académico es bajo</w:t>
+      </w:r>
+    </w:p>
+    <w:p>
+      <w:r>
+        <w:rPr>
+          <w:rFonts w:ascii="Segoe UI Emoji" w:hAnsi="Segoe UI Emoji" w:cs="Segoe UI Emoji"/>
+        </w:rPr>
+        <w:t>❌</w:t>
+      </w:r>
+      <w:r>
+        <w:t xml:space="preserve"> Eso es </w:t>
+      </w:r>
+      <w:r>
+        <w:rPr>
+          <w:b/>
+          <w:bCs/>
+        </w:rPr>
+        <w:t>distorsión</w:t>
+      </w:r>
+      <w:r>
+        <w:t>.</w:t>
+      </w:r>
+    </w:p>
+    <w:p/>
+    <w:p/>
+    <w:p>
+      <w:pPr>
+        <w:rPr>
+          <w:b/>
+          <w:bCs/>
+          <w:sz w:val="32"/>
+          <w:szCs w:val="32"/>
+          <w:u w:val="single"/>
+        </w:rPr>
+      </w:pPr>
+      <w:r>
+        <w:rPr>
+          <w:b/>
+          <w:bCs/>
+          <w:sz w:val="32"/>
+          <w:szCs w:val="32"/>
+          <w:u w:val="single"/>
+        </w:rPr>
+        <w:lastRenderedPageBreak/>
+        <w:t>¿Qué hacer si el LLM falla o alucina?</w:t>
+      </w:r>
+    </w:p>
+    <w:p>
+      <w:pPr>
+        <w:rPr>
+          <w:b/>
+          <w:bCs/>
+        </w:rPr>
+      </w:pPr>
+      <w:r>
+        <w:rPr>
+          <w:rFonts w:ascii="Segoe UI Emoji" w:hAnsi="Segoe UI Emoji" w:cs="Segoe UI Emoji"/>
+          <w:b/>
+          <w:bCs/>
+        </w:rPr>
+        <w:t>🔑</w:t>
+      </w:r>
+      <w:r>
+        <w:rPr>
+          <w:b/>
+          <w:bCs/>
+        </w:rPr>
+        <w:t xml:space="preserve"> Idea clave</w:t>
+      </w:r>
+    </w:p>
+    <w:p>
+      <w:r>
+        <w:rPr>
+          <w:b/>
+          <w:bCs/>
+        </w:rPr>
+        <w:t>La calidad del sistema híbrido está limitada por su parte más débil.</w:t>
+      </w:r>
+    </w:p>
+    <w:p>
+      <w:r>
+        <w:t>Si el ML es 0.92 precision pero el LLM “explica inventando”, el sistema:</w:t>
+      </w:r>
+    </w:p>
+    <w:p>
+      <w:pPr>
+        <w:numPr>
+          <w:ilvl w:val="0"/>
+          <w:numId w:val="35"/>
+        </w:numPr>
+      </w:pPr>
+      <w:r>
+        <w:t>pierde confianza</w:t>
+      </w:r>
+    </w:p>
+    <w:p>
+      <w:pPr>
+        <w:numPr>
+          <w:ilvl w:val="0"/>
+          <w:numId w:val="35"/>
+        </w:numPr>
+      </w:pPr>
+      <w:r>
+        <w:t>puede causar conflictos (soporte, reclamos)</w:t>
+      </w:r>
+    </w:p>
+    <w:p>
+      <w:pPr>
+        <w:numPr>
+          <w:ilvl w:val="0"/>
+          <w:numId w:val="35"/>
+        </w:numPr>
+      </w:pPr>
+      <w:r>
+        <w:t>puede ser riesgoso (en fraude/crédito aún más)</w:t>
+      </w:r>
+    </w:p>
+    <w:p>
+      <w:r>
+        <w:pict w14:anchorId="556CC4DC">
+          <v:rect id="_x0000_i1048" style="width:0;height:1.5pt" o:hralign="center" o:hrstd="t" o:hr="t" fillcolor="#a0a0a0" stroked="f"/>
         </w:pict>
+      </w:r>
+    </w:p>
+    <w:p>
+      <w:pPr>
+        <w:rPr>
+          <w:b/>
+          <w:bCs/>
+        </w:rPr>
+      </w:pPr>
+      <w:r>
+        <w:rPr>
+          <w:rFonts w:ascii="Segoe UI Emoji" w:hAnsi="Segoe UI Emoji" w:cs="Segoe UI Emoji"/>
+          <w:b/>
+          <w:bCs/>
+        </w:rPr>
+        <w:t>✅</w:t>
+      </w:r>
+      <w:r>
+        <w:rPr>
+          <w:b/>
+          <w:bCs/>
+        </w:rPr>
+        <w:t xml:space="preserve"> Cómo se corrige (sin entrar en API)</w:t>
+      </w:r>
+    </w:p>
+    <w:p>
+      <w:r>
+        <w:t xml:space="preserve">Se arregla con </w:t>
+      </w:r>
+      <w:r>
+        <w:rPr>
+          <w:b/>
+          <w:bCs/>
+        </w:rPr>
+        <w:t>diseño</w:t>
+      </w:r>
+      <w:r>
+        <w:t>, no con “mejor modelo”.</w:t>
+      </w:r>
+    </w:p>
+    <w:p>
+      <w:pPr>
+        <w:rPr>
+          <w:b/>
+          <w:bCs/>
+        </w:rPr>
+      </w:pPr>
+      <w:r>
+        <w:rPr>
+          <w:b/>
+          <w:bCs/>
+        </w:rPr>
+        <w:t>1) Contrato de salida (interface)</w:t>
+      </w:r>
+    </w:p>
+    <w:p>
+      <w:r>
+        <w:t>El LLM solo puede usar:</w:t>
+      </w:r>
+    </w:p>
+    <w:p>
+      <w:pPr>
+        <w:numPr>
+          <w:ilvl w:val="0"/>
+          <w:numId w:val="36"/>
+        </w:numPr>
+      </w:pPr>
+      <w:r>
+        <w:t>prediccion</w:t>
+      </w:r>
+    </w:p>
+    <w:p>
+      <w:pPr>
+        <w:numPr>
+          <w:ilvl w:val="0"/>
+          <w:numId w:val="36"/>
+        </w:numPr>
+      </w:pPr>
+      <w:r>
+        <w:t>razones_ml (top features)</w:t>
+      </w:r>
+    </w:p>
+    <w:p>
+      <w:pPr>
+        <w:numPr>
+          <w:ilvl w:val="0"/>
+          <w:numId w:val="36"/>
+        </w:numPr>
+      </w:pPr>
+      <w:r>
+        <w:t>evidencia (texto autorizado)</w:t>
+      </w:r>
+    </w:p>
+    <w:p>
+      <w:r>
+        <w:t>Y además:</w:t>
+      </w:r>
+    </w:p>
+    <w:p>
+      <w:r>
+        <w:t>“Si algo no está en esos campos, no lo menciones.”</w:t>
+      </w:r>
+    </w:p>
+    <w:p>
+      <w:r>
+        <w:pict w14:anchorId="48C915CC">
+          <v:rect id="_x0000_i1049" style="width:0;height:1.5pt" o:hralign="center" o:hrstd="t" o:hr="t" fillcolor="#a0a0a0" stroked="f"/>
+        </w:pict>
+      </w:r>
+    </w:p>
+    <w:p>
+      <w:pPr>
+        <w:rPr>
+          <w:b/>
+          <w:bCs/>
+        </w:rPr>
+      </w:pPr>
+      <w:r>
+        <w:rPr>
+          <w:b/>
+          <w:bCs/>
+        </w:rPr>
+        <w:t>2) Rúbrica de fidelidad (la más importante)</w:t>
+      </w:r>
+    </w:p>
+    <w:p>
+      <w:r>
+        <w:t>Cuando evaluás explicaciones del LLM, el criterio #1 es:</w:t>
+      </w:r>
+    </w:p>
+    <w:p>
+      <w:pPr>
+        <w:numPr>
+          <w:ilvl w:val="0"/>
+          <w:numId w:val="37"/>
+        </w:numPr>
+      </w:pPr>
+      <w:r>
+        <w:rPr>
+          <w:b/>
+          <w:bCs/>
+        </w:rPr>
+        <w:t>Fidelidad</w:t>
+      </w:r>
+      <w:r>
+        <w:t>: “¿Dice SOLO lo que se puede justificar con evidencia?”</w:t>
+      </w:r>
+    </w:p>
+    <w:p>
+      <w:r>
+        <w:t>Si falla eso, es “no pasa”, aunque sea clarísimo.</w:t>
+      </w:r>
+    </w:p>
+    <w:p>
+      <w:r>
+        <w:pict w14:anchorId="6555FFD6">
+          <v:rect id="_x0000_i1050" style="width:0;height:1.5pt" o:hralign="center" o:hrstd="t" o:hr="t" fillcolor="#a0a0a0" stroked="f"/>
+        </w:pict>
+      </w:r>
+    </w:p>
+    <w:p>
+      <w:pPr>
+        <w:rPr>
+          <w:b/>
+          <w:bCs/>
+        </w:rPr>
+      </w:pPr>
+      <w:r>
+        <w:rPr>
+          <w:b/>
+          <w:bCs/>
+        </w:rPr>
+        <w:t>3) Plantilla de explicación</w:t>
+      </w:r>
+    </w:p>
+    <w:p>
+      <w:r>
+        <w:t>En vez de respuesta libre:</w:t>
+      </w:r>
+    </w:p>
+    <w:p>
+      <w:pPr>
+        <w:numPr>
+          <w:ilvl w:val="0"/>
+          <w:numId w:val="38"/>
+        </w:numPr>
+      </w:pPr>
+      <w:r>
+        <w:t>“Decisión: …”</w:t>
+      </w:r>
+    </w:p>
+    <w:p>
+      <w:pPr>
+        <w:numPr>
+          <w:ilvl w:val="0"/>
+          <w:numId w:val="38"/>
+        </w:numPr>
+      </w:pPr>
+      <w:r>
+        <w:t>“Motivos (del modelo): …”</w:t>
+      </w:r>
+    </w:p>
+    <w:p>
+      <w:pPr>
+        <w:numPr>
+          <w:ilvl w:val="0"/>
+          <w:numId w:val="38"/>
+        </w:numPr>
+      </w:pPr>
+      <w:r>
+        <w:t>“Qué podés hacer: …”</w:t>
+      </w:r>
+    </w:p>
+    <w:p>
+      <w:pPr>
+        <w:numPr>
+          <w:ilvl w:val="0"/>
+          <w:numId w:val="38"/>
+        </w:numPr>
+      </w:pPr>
+      <w:r>
+        <w:t>“Qué NO podemos afirmar: …”</w:t>
+      </w:r>
+    </w:p>
+    <w:p>
+      <w:r>
+        <w:t>Eso corta alucinación de raíz.</w:t>
+      </w:r>
+    </w:p>
+    <w:p/>
+    <w:p>
+      <w:pPr>
+        <w:rPr>
+          <w:b/>
+          <w:bCs/>
+          <w:sz w:val="36"/>
+          <w:szCs w:val="36"/>
+          <w:u w:val="single"/>
+        </w:rPr>
+      </w:pPr>
+      <w:r>
+        <w:rPr>
+          <w:b/>
+          <w:bCs/>
+          <w:sz w:val="36"/>
+          <w:szCs w:val="36"/>
+          <w:u w:val="single"/>
+        </w:rPr>
+        <w:lastRenderedPageBreak/>
+        <w:t>Mapa de sistemas de IA modernos</w:t>
+      </w:r>
+    </w:p>
+    <w:p>
+      <w:pPr>
+        <w:rPr>
+          <w:rFonts w:cstheme="minorHAnsi"/>
+          <w:b/>
+          <w:bCs/>
+          <w:sz w:val="28"/>
+          <w:szCs w:val="28"/>
+        </w:rPr>
+      </w:pPr>
+      <w:r>
+        <w:rPr>
+          <w:rFonts w:ascii="Segoe UI Emoji" w:hAnsi="Segoe UI Emoji" w:cs="Segoe UI Emoji"/>
+          <w:b/>
+          <w:bCs/>
+          <w:sz w:val="28"/>
+          <w:szCs w:val="28"/>
+        </w:rPr>
+        <w:t>🧱</w:t>
+      </w:r>
+      <w:r>
+        <w:rPr>
+          <w:rFonts w:cstheme="minorHAnsi"/>
+          <w:b/>
+          <w:bCs/>
+          <w:sz w:val="28"/>
+          <w:szCs w:val="28"/>
+        </w:rPr>
+        <w:t xml:space="preserve"> Capas del sistema</w:t>
       </w:r>
     </w:p>
     <w:p>
@@ -3023,9 +3326,66 @@
           <w:szCs w:val="28"/>
           <w:u w:val="single"/>
         </w:rPr>
-        <w:t>4️</w:t>
-      </w:r>
-      <w:r>
+        <w:t>1) Entrada (Input)</w:t>
+      </w:r>
+    </w:p>
+    <w:p>
+      <w:pPr>
+        <w:numPr>
+          <w:ilvl w:val="0"/>
+          <w:numId w:val="39"/>
+        </w:numPr>
+      </w:pPr>
+      <w:r>
+        <w:t xml:space="preserve">Datos estructurados (números, categorías) → para </w:t>
+      </w:r>
+      <w:r>
+        <w:rPr>
+          <w:b/>
+          <w:bCs/>
+        </w:rPr>
+        <w:t>ML</w:t>
+      </w:r>
+    </w:p>
+    <w:p>
+      <w:pPr>
+        <w:numPr>
+          <w:ilvl w:val="0"/>
+          <w:numId w:val="39"/>
+        </w:numPr>
+      </w:pPr>
+      <w:r>
+        <w:t xml:space="preserve">Texto / preguntas / documentos → para </w:t>
+      </w:r>
+      <w:r>
+        <w:rPr>
+          <w:b/>
+          <w:bCs/>
+        </w:rPr>
+        <w:t>LLM / RAG</w:t>
+      </w:r>
+    </w:p>
+    <w:p>
+      <w:r>
+        <w:rPr>
+          <w:b/>
+          <w:bCs/>
+        </w:rPr>
+        <w:t>Salida de esta capa:</w:t>
+      </w:r>
+      <w:r>
+        <w:t xml:space="preserve"> petición del usuario + datos disponibles.</w:t>
+      </w:r>
+    </w:p>
+    <w:p>
+      <w:r>
+        <w:pict w14:anchorId="74311A05">
+          <v:rect id="_x0000_i1171" style="width:0;height:1.5pt" o:hralign="center" o:hrstd="t" o:hr="t" fillcolor="#a0a0a0" stroked="f"/>
+        </w:pict>
+      </w:r>
+    </w:p>
+    <w:p>
+      <w:pPr>
         <w:rPr>
           <w:rFonts w:cstheme="minorHAnsi"/>
           <w:b/>
@@ -3034,8 +3394,7 @@
           <w:szCs w:val="28"/>
           <w:u w:val="single"/>
         </w:rPr>
-        <w:t xml:space="preserve">) </w:t>
-      </w:r>
+      </w:pPr>
       <w:r>
         <w:rPr>
           <w:rFonts w:cstheme="minorHAnsi"/>
@@ -3045,463 +3404,1000 @@
           <w:szCs w:val="28"/>
           <w:u w:val="single"/>
         </w:rPr>
-        <w:t>Error común</w:t>
-      </w:r>
-    </w:p>
-    <w:p>
-      <w:r>
-        <w:t>Muchos sistemas fallan porque:</w:t>
-      </w:r>
-    </w:p>
-    <w:p>
-      <w:pPr>
-        <w:numPr>
-          <w:ilvl w:val="0"/>
-          <w:numId w:val="34"/>
-        </w:numPr>
-      </w:pPr>
-      <w:r>
-        <w:t>el ML está bien</w:t>
-      </w:r>
-    </w:p>
-    <w:p>
-      <w:pPr>
-        <w:numPr>
-          <w:ilvl w:val="0"/>
-          <w:numId w:val="34"/>
-        </w:numPr>
-      </w:pPr>
-      <w:r>
-        <w:t xml:space="preserve">el LLM explica </w:t>
-      </w:r>
-      <w:r>
-        <w:rPr>
-          <w:b/>
-          <w:bCs/>
-        </w:rPr>
-        <w:t>mal</w:t>
-      </w:r>
-    </w:p>
-    <w:p>
-      <w:r>
-        <w:t>Ejemplo:</w:t>
-      </w:r>
-    </w:p>
-    <w:p>
-      <w:r>
-        <w:t>ML dice:</w:t>
-      </w:r>
-    </w:p>
-    <w:p>
-      <w:r>
-        <w:t>riesgo alto por baja asistencia</w:t>
-      </w:r>
-    </w:p>
-    <w:p>
-      <w:r>
-        <w:t>LLM responde:</w:t>
-      </w:r>
-    </w:p>
-    <w:p>
-      <w:r>
-        <w:t>tu rendimiento académico es bajo</w:t>
-      </w:r>
-    </w:p>
-    <w:p>
-      <w:r>
+        <w:t>2) Recuperación de información (RAG)</w:t>
+      </w:r>
+    </w:p>
+    <w:p>
+      <w:r>
+        <w:t>Si hay conocimiento externo:</w:t>
+      </w:r>
+    </w:p>
+    <w:p>
+      <w:pPr>
+        <w:numPr>
+          <w:ilvl w:val="0"/>
+          <w:numId w:val="40"/>
+        </w:numPr>
+      </w:pPr>
+      <w:r>
+        <w:t xml:space="preserve">convertir consulta a </w:t>
+      </w:r>
+      <w:r>
+        <w:rPr>
+          <w:b/>
+          <w:bCs/>
+        </w:rPr>
+        <w:t>embedding</w:t>
+      </w:r>
+    </w:p>
+    <w:p>
+      <w:pPr>
+        <w:numPr>
+          <w:ilvl w:val="0"/>
+          <w:numId w:val="40"/>
+        </w:numPr>
+      </w:pPr>
+      <w:r>
+        <w:t xml:space="preserve">buscar en </w:t>
+      </w:r>
+      <w:r>
+        <w:rPr>
+          <w:b/>
+          <w:bCs/>
+        </w:rPr>
+        <w:t>vector DB</w:t>
+      </w:r>
+    </w:p>
+    <w:p>
+      <w:pPr>
+        <w:numPr>
+          <w:ilvl w:val="0"/>
+          <w:numId w:val="40"/>
+        </w:numPr>
+      </w:pPr>
+      <w:r>
+        <w:t xml:space="preserve">recuperar </w:t>
+      </w:r>
+      <w:r>
+        <w:rPr>
+          <w:b/>
+          <w:bCs/>
+        </w:rPr>
+        <w:t>contexto relevante</w:t>
+      </w:r>
+    </w:p>
+    <w:p>
+      <w:r>
+        <w:rPr>
+          <w:b/>
+          <w:bCs/>
+        </w:rPr>
+        <w:t>Salida:</w:t>
+      </w:r>
+      <w:r>
+        <w:t xml:space="preserve"> contexto que el LLM puede usar.</w:t>
+      </w:r>
+    </w:p>
+    <w:p>
+      <w:r>
+        <w:t xml:space="preserve">Regla: el LLM </w:t>
+      </w:r>
+      <w:r>
+        <w:rPr>
+          <w:b/>
+          <w:bCs/>
+        </w:rPr>
+        <w:t>no memoriza todo</w:t>
+      </w:r>
+      <w:r>
+        <w:t xml:space="preserve">, </w:t>
+      </w:r>
+      <w:r>
+        <w:rPr>
+          <w:b/>
+          <w:bCs/>
+        </w:rPr>
+        <w:t>recupera lo necesario</w:t>
+      </w:r>
+      <w:r>
+        <w:t>.</w:t>
+      </w:r>
+    </w:p>
+    <w:p>
+      <w:r>
+        <w:pict w14:anchorId="1AC02A87">
+          <v:rect id="_x0000_i1172" style="width:0;height:1.5pt" o:hralign="center" o:hrstd="t" o:hr="t" fillcolor="#a0a0a0" stroked="f"/>
+        </w:pict>
+      </w:r>
+    </w:p>
+    <w:p>
+      <w:pPr>
+        <w:rPr>
+          <w:rFonts w:cstheme="minorHAnsi"/>
+          <w:b/>
+          <w:bCs/>
+          <w:sz w:val="28"/>
+          <w:szCs w:val="28"/>
+          <w:u w:val="single"/>
+        </w:rPr>
+      </w:pPr>
+      <w:r>
+        <w:rPr>
+          <w:rFonts w:cstheme="minorHAnsi"/>
+          <w:b/>
+          <w:bCs/>
+          <w:sz w:val="28"/>
+          <w:szCs w:val="28"/>
+          <w:u w:val="single"/>
+        </w:rPr>
+        <w:t>3) ML clásico (decisión estructurada)</w:t>
+      </w:r>
+    </w:p>
+    <w:p>
+      <w:r>
+        <w:t>Cuando hay una variable objetivo clara:</w:t>
+      </w:r>
+    </w:p>
+    <w:p>
+      <w:pPr>
+        <w:numPr>
+          <w:ilvl w:val="0"/>
+          <w:numId w:val="41"/>
+        </w:numPr>
+      </w:pPr>
+      <w:r>
+        <w:t>clasificación</w:t>
+      </w:r>
+    </w:p>
+    <w:p>
+      <w:pPr>
+        <w:numPr>
+          <w:ilvl w:val="0"/>
+          <w:numId w:val="41"/>
+        </w:numPr>
+      </w:pPr>
+      <w:r>
+        <w:t>predicción</w:t>
+      </w:r>
+    </w:p>
+    <w:p>
+      <w:pPr>
+        <w:numPr>
+          <w:ilvl w:val="0"/>
+          <w:numId w:val="41"/>
+        </w:numPr>
+      </w:pPr>
+      <w:r>
+        <w:t>scoring</w:t>
+      </w:r>
+    </w:p>
+    <w:p>
+      <w:pPr>
+        <w:numPr>
+          <w:ilvl w:val="0"/>
+          <w:numId w:val="41"/>
+        </w:numPr>
+      </w:pPr>
+      <w:r>
+        <w:t>detección de anomalías</w:t>
+      </w:r>
+    </w:p>
+    <w:p>
+      <w:r>
+        <w:rPr>
+          <w:b/>
+          <w:bCs/>
+        </w:rPr>
+        <w:t>Entrada:</w:t>
+      </w:r>
+      <w:r>
+        <w:t xml:space="preserve"> variables estructuradas</w:t>
+      </w:r>
+      <w:r>
+        <w:br/>
+      </w:r>
+      <w:r>
+        <w:rPr>
+          <w:b/>
+          <w:bCs/>
+        </w:rPr>
+        <w:t>Salida:</w:t>
+      </w:r>
+      <w:r>
+        <w:t xml:space="preserve"> predicción + variables importantes</w:t>
+      </w:r>
+    </w:p>
+    <w:p>
+      <w:r>
+        <w:t xml:space="preserve">Regla: ML </w:t>
+      </w:r>
+      <w:r>
+        <w:rPr>
+          <w:b/>
+          <w:bCs/>
+        </w:rPr>
+        <w:t>decide</w:t>
+      </w:r>
+      <w:r>
+        <w:t>, no explica en lenguaje.</w:t>
+      </w:r>
+    </w:p>
+    <w:p>
+      <w:r>
+        <w:pict w14:anchorId="592C487F">
+          <v:rect id="_x0000_i1173" style="width:0;height:1.5pt" o:hralign="center" o:hrstd="t" o:hr="t" fillcolor="#a0a0a0" stroked="f"/>
+        </w:pict>
+      </w:r>
+    </w:p>
+    <w:p>
+      <w:pPr>
+        <w:rPr>
+          <w:rFonts w:cstheme="minorHAnsi"/>
+          <w:b/>
+          <w:bCs/>
+          <w:sz w:val="28"/>
+          <w:szCs w:val="28"/>
+          <w:u w:val="single"/>
+        </w:rPr>
+      </w:pPr>
+      <w:r>
+        <w:rPr>
+          <w:rFonts w:cstheme="minorHAnsi"/>
+          <w:b/>
+          <w:bCs/>
+          <w:sz w:val="28"/>
+          <w:szCs w:val="28"/>
+          <w:u w:val="single"/>
+        </w:rPr>
+        <w:t>4) LLM (razonamiento y lenguaje)</w:t>
+      </w:r>
+    </w:p>
+    <w:p>
+      <w:r>
+        <w:t>Usa:</w:t>
+      </w:r>
+    </w:p>
+    <w:p>
+      <w:pPr>
+        <w:numPr>
+          <w:ilvl w:val="0"/>
+          <w:numId w:val="42"/>
+        </w:numPr>
+      </w:pPr>
+      <w:r>
+        <w:t>contexto recuperado (RAG)</w:t>
+      </w:r>
+    </w:p>
+    <w:p>
+      <w:pPr>
+        <w:numPr>
+          <w:ilvl w:val="0"/>
+          <w:numId w:val="42"/>
+        </w:numPr>
+      </w:pPr>
+      <w:r>
+        <w:t>resultados del ML</w:t>
+      </w:r>
+    </w:p>
+    <w:p>
+      <w:pPr>
+        <w:numPr>
+          <w:ilvl w:val="0"/>
+          <w:numId w:val="42"/>
+        </w:numPr>
+      </w:pPr>
+      <w:r>
+        <w:t>prompt con rol y restricciones</w:t>
+      </w:r>
+    </w:p>
+    <w:p>
+      <w:r>
+        <w:lastRenderedPageBreak/>
+        <w:t>Para generar:</w:t>
+      </w:r>
+    </w:p>
+    <w:p>
+      <w:pPr>
+        <w:numPr>
+          <w:ilvl w:val="0"/>
+          <w:numId w:val="43"/>
+        </w:numPr>
+      </w:pPr>
+      <w:r>
+        <w:t>explicación</w:t>
+      </w:r>
+    </w:p>
+    <w:p>
+      <w:pPr>
+        <w:numPr>
+          <w:ilvl w:val="0"/>
+          <w:numId w:val="43"/>
+        </w:numPr>
+      </w:pPr>
+      <w:r>
+        <w:t>resumen</w:t>
+      </w:r>
+    </w:p>
+    <w:p>
+      <w:pPr>
+        <w:numPr>
+          <w:ilvl w:val="0"/>
+          <w:numId w:val="43"/>
+        </w:numPr>
+      </w:pPr>
+      <w:r>
+        <w:t>respuesta</w:t>
+      </w:r>
+    </w:p>
+    <w:p>
+      <w:pPr>
+        <w:numPr>
+          <w:ilvl w:val="0"/>
+          <w:numId w:val="43"/>
+        </w:numPr>
+      </w:pPr>
+      <w:r>
+        <w:t>instrucciones</w:t>
+      </w:r>
+    </w:p>
+    <w:p>
+      <w:r>
+        <w:t xml:space="preserve">Regla: LLM </w:t>
+      </w:r>
+      <w:r>
+        <w:rPr>
+          <w:b/>
+          <w:bCs/>
+        </w:rPr>
+        <w:t>explica / redacta / razona</w:t>
+      </w:r>
+      <w:r>
+        <w:t>, no optimiza métricas.</w:t>
+      </w:r>
+    </w:p>
+    <w:p>
+      <w:r>
+        <w:pict w14:anchorId="12E6069B">
+          <v:rect id="_x0000_i1174" style="width:0;height:1.5pt" o:hralign="center" o:hrstd="t" o:hr="t" fillcolor="#a0a0a0" stroked="f"/>
+        </w:pict>
+      </w:r>
+    </w:p>
+    <w:p>
+      <w:pPr>
+        <w:rPr>
+          <w:rFonts w:cstheme="minorHAnsi"/>
+          <w:b/>
+          <w:bCs/>
+          <w:sz w:val="28"/>
+          <w:szCs w:val="28"/>
+          <w:u w:val="single"/>
+        </w:rPr>
+      </w:pPr>
+      <w:r>
+        <w:rPr>
+          <w:rFonts w:cstheme="minorHAnsi"/>
+          <w:b/>
+          <w:bCs/>
+          <w:sz w:val="28"/>
+          <w:szCs w:val="28"/>
+          <w:u w:val="single"/>
+        </w:rPr>
+        <w:t>5) Herramientas (Tools)</w:t>
+      </w:r>
+    </w:p>
+    <w:p>
+      <w:r>
+        <w:t>El sistema puede llamar:</w:t>
+      </w:r>
+    </w:p>
+    <w:p>
+      <w:pPr>
+        <w:numPr>
+          <w:ilvl w:val="0"/>
+          <w:numId w:val="44"/>
+        </w:numPr>
+      </w:pPr>
+      <w:r>
+        <w:t>calculadoras</w:t>
+      </w:r>
+    </w:p>
+    <w:p>
+      <w:pPr>
+        <w:numPr>
+          <w:ilvl w:val="0"/>
+          <w:numId w:val="44"/>
+        </w:numPr>
+      </w:pPr>
+      <w:r>
+        <w:t>APIs</w:t>
+      </w:r>
+    </w:p>
+    <w:p>
+      <w:pPr>
+        <w:numPr>
+          <w:ilvl w:val="0"/>
+          <w:numId w:val="44"/>
+        </w:numPr>
+      </w:pPr>
+      <w:r>
+        <w:t>bases de datos</w:t>
+      </w:r>
+    </w:p>
+    <w:p>
+      <w:pPr>
+        <w:numPr>
+          <w:ilvl w:val="0"/>
+          <w:numId w:val="44"/>
+        </w:numPr>
+      </w:pPr>
+      <w:r>
+        <w:t>modelos ML</w:t>
+      </w:r>
+    </w:p>
+    <w:p>
+      <w:pPr>
+        <w:numPr>
+          <w:ilvl w:val="0"/>
+          <w:numId w:val="44"/>
+        </w:numPr>
+      </w:pPr>
+      <w:r>
+        <w:t>motores de búsqueda</w:t>
+      </w:r>
+    </w:p>
+    <w:p>
+      <w:r>
+        <w:t xml:space="preserve">El LLM </w:t>
+      </w:r>
+      <w:r>
+        <w:rPr>
+          <w:b/>
+          <w:bCs/>
+        </w:rPr>
+        <w:t>elige cuándo usar una herramienta</w:t>
+      </w:r>
+      <w:r>
+        <w:t>, pero no la reemplaza.</w:t>
+      </w:r>
+    </w:p>
+    <w:p>
+      <w:r>
+        <w:pict w14:anchorId="1D983350">
+          <v:rect id="_x0000_i1175" style="width:0;height:1.5pt" o:hralign="center" o:hrstd="t" o:hr="t" fillcolor="#a0a0a0" stroked="f"/>
+        </w:pict>
+      </w:r>
+    </w:p>
+    <w:p>
+      <w:pPr>
+        <w:rPr>
+          <w:rFonts w:cstheme="minorHAnsi"/>
+          <w:b/>
+          <w:bCs/>
+          <w:sz w:val="28"/>
+          <w:szCs w:val="28"/>
+          <w:u w:val="single"/>
+        </w:rPr>
+      </w:pPr>
+      <w:r>
+        <w:rPr>
+          <w:rFonts w:cstheme="minorHAnsi"/>
+          <w:b/>
+          <w:bCs/>
+          <w:sz w:val="28"/>
+          <w:szCs w:val="28"/>
+          <w:u w:val="single"/>
+        </w:rPr>
+        <w:t>6) Memoria</w:t>
+      </w:r>
+    </w:p>
+    <w:p>
+      <w:r>
+        <w:t>Para sistemas persistentes (tipo copiloto):</w:t>
+      </w:r>
+    </w:p>
+    <w:p>
+      <w:pPr>
+        <w:numPr>
+          <w:ilvl w:val="0"/>
+          <w:numId w:val="45"/>
+        </w:numPr>
+      </w:pPr>
+      <w:r>
+        <w:t>historial relevante</w:t>
+      </w:r>
+    </w:p>
+    <w:p>
+      <w:pPr>
+        <w:numPr>
+          <w:ilvl w:val="0"/>
+          <w:numId w:val="45"/>
+        </w:numPr>
+      </w:pPr>
+      <w:r>
+        <w:t>embeddings de conversaciones</w:t>
+      </w:r>
+    </w:p>
+    <w:p>
+      <w:pPr>
+        <w:numPr>
+          <w:ilvl w:val="0"/>
+          <w:numId w:val="45"/>
+        </w:numPr>
+      </w:pPr>
+      <w:r>
+        <w:t>perfil del usuario</w:t>
+      </w:r>
+    </w:p>
+    <w:p>
+      <w:r>
+        <w:t xml:space="preserve">Esto permite </w:t>
+      </w:r>
+      <w:r>
+        <w:rPr>
+          <w:b/>
+          <w:bCs/>
+        </w:rPr>
+        <w:t>continuidad</w:t>
+      </w:r>
+      <w:r>
+        <w:t>.</w:t>
+      </w:r>
+    </w:p>
+    <w:p>
+      <w:r>
+        <w:pict w14:anchorId="72F55715">
+          <v:rect id="_x0000_i1176" style="width:0;height:1.5pt" o:hralign="center" o:hrstd="t" o:hr="t" fillcolor="#a0a0a0" stroked="f"/>
+        </w:pict>
+      </w:r>
+    </w:p>
+    <w:p>
+      <w:pPr>
+        <w:rPr>
+          <w:rFonts w:cstheme="minorHAnsi"/>
+          <w:b/>
+          <w:bCs/>
+          <w:sz w:val="28"/>
+          <w:szCs w:val="28"/>
+          <w:u w:val="single"/>
+        </w:rPr>
+      </w:pPr>
+      <w:r>
+        <w:rPr>
+          <w:rFonts w:cstheme="minorHAnsi"/>
+          <w:b/>
+          <w:bCs/>
+          <w:sz w:val="28"/>
+          <w:szCs w:val="28"/>
+          <w:u w:val="single"/>
+        </w:rPr>
+        <w:t>7) Orquestación</w:t>
+      </w:r>
+    </w:p>
+    <w:p>
+      <w:r>
+        <w:t>El componente que conecta todo.</w:t>
+      </w:r>
+    </w:p>
+    <w:p>
+      <w:r>
+        <w:t>Decide el flujo:</w:t>
+      </w:r>
+    </w:p>
+    <w:p>
+      <w:r>
+        <w:t>Usuario → recuperar contexto → ML → LLM → respuesta</w:t>
+      </w:r>
+    </w:p>
+    <w:p>
+      <w:r>
+        <w:pict w14:anchorId="491AA45C">
+          <v:rect id="_x0000_i1177" style="width:0;height:1.5pt" o:hralign="center" o:hrstd="t" o:hr="t" fillcolor="#a0a0a0" stroked="f"/>
+        </w:pict>
+      </w:r>
+    </w:p>
+    <w:p>
+      <w:pPr>
         <w:rPr>
           <w:rFonts w:ascii="Segoe UI Emoji" w:hAnsi="Segoe UI Emoji" w:cs="Segoe UI Emoji"/>
-        </w:rPr>
-        <w:t>❌</w:t>
-      </w:r>
-      <w:r>
-        <w:t xml:space="preserve"> Eso es </w:t>
-      </w:r>
-      <w:r>
-        <w:rPr>
-          <w:b/>
-          <w:bCs/>
-        </w:rPr>
-        <w:t>distorsión</w:t>
+          <w:b/>
+          <w:bCs/>
+          <w:sz w:val="28"/>
+          <w:szCs w:val="28"/>
+          <w:u w:val="single"/>
+        </w:rPr>
+      </w:pPr>
+    </w:p>
+    <w:p>
+      <w:pPr>
+        <w:rPr>
+          <w:rFonts w:ascii="Segoe UI Emoji" w:hAnsi="Segoe UI Emoji" w:cs="Segoe UI Emoji"/>
+          <w:b/>
+          <w:bCs/>
+          <w:sz w:val="28"/>
+          <w:szCs w:val="28"/>
+          <w:u w:val="single"/>
+        </w:rPr>
+      </w:pPr>
+    </w:p>
+    <w:p>
+      <w:pPr>
+        <w:rPr>
+          <w:rFonts w:cstheme="minorHAnsi"/>
+          <w:b/>
+          <w:bCs/>
+          <w:sz w:val="28"/>
+          <w:szCs w:val="28"/>
+          <w:u w:val="single"/>
+        </w:rPr>
+      </w:pPr>
+      <w:r>
+        <w:rPr>
+          <w:rFonts w:ascii="Segoe UI Emoji" w:hAnsi="Segoe UI Emoji" w:cs="Segoe UI Emoji"/>
+          <w:b/>
+          <w:bCs/>
+          <w:sz w:val="28"/>
+          <w:szCs w:val="28"/>
+          <w:u w:val="single"/>
+        </w:rPr>
+        <w:lastRenderedPageBreak/>
+        <w:t>🧠</w:t>
+      </w:r>
+      <w:r>
+        <w:rPr>
+          <w:rFonts w:cstheme="minorHAnsi"/>
+          <w:b/>
+          <w:bCs/>
+          <w:sz w:val="28"/>
+          <w:szCs w:val="28"/>
+          <w:u w:val="single"/>
+        </w:rPr>
+        <w:t xml:space="preserve"> Esquema completo</w:t>
+      </w:r>
+    </w:p>
+    <w:p>
+      <w:r>
+        <w:t>Podés guardarlo así:</w:t>
+      </w:r>
+    </w:p>
+    <w:p>
+      <w:r>
+        <w:t>Input</w:t>
+      </w:r>
+      <w:r>
+        <w:br/>
+        <w:t xml:space="preserve">   ↓</w:t>
+      </w:r>
+      <w:r>
+        <w:br/>
+        <w:t>RAG (recuperación)</w:t>
+      </w:r>
+      <w:r>
+        <w:br/>
+        <w:t xml:space="preserve">   ↓</w:t>
+      </w:r>
+      <w:r>
+        <w:br/>
+        <w:t>ML clásico (si hay decisión estructurada)</w:t>
+      </w:r>
+      <w:r>
+        <w:br/>
+        <w:t xml:space="preserve">   ↓</w:t>
+      </w:r>
+      <w:r>
+        <w:br/>
+        <w:t>LLM (explicación / generación)</w:t>
+      </w:r>
+      <w:r>
+        <w:br/>
+        <w:t xml:space="preserve">   ↓</w:t>
+      </w:r>
+      <w:r>
+        <w:br/>
+        <w:t>Tools / APIs</w:t>
+      </w:r>
+      <w:r>
+        <w:br/>
+        <w:t xml:space="preserve">   ↓</w:t>
+      </w:r>
+      <w:r>
+        <w:br/>
+        <w:t>Respuesta</w:t>
+      </w:r>
+      <w:r>
+        <w:br/>
+        <w:t xml:space="preserve">   ↓</w:t>
+      </w:r>
+      <w:r>
+        <w:br/>
+        <w:t>Memoria</w:t>
+      </w:r>
+    </w:p>
+    <w:p>
+      <w:r>
+        <w:pict w14:anchorId="1E202E46">
+          <v:rect id="_x0000_i1178" style="width:0;height:1.5pt" o:hralign="center" o:hrstd="t" o:hr="t" fillcolor="#a0a0a0" stroked="f"/>
+        </w:pict>
+      </w:r>
+    </w:p>
+    <w:p>
+      <w:pPr>
+        <w:rPr>
+          <w:rFonts w:cstheme="minorHAnsi"/>
+          <w:b/>
+          <w:bCs/>
+          <w:sz w:val="28"/>
+          <w:szCs w:val="28"/>
+          <w:u w:val="single"/>
+        </w:rPr>
+      </w:pPr>
+      <w:r>
+        <w:rPr>
+          <w:rFonts w:ascii="Segoe UI Symbol" w:hAnsi="Segoe UI Symbol" w:cs="Segoe UI Symbol"/>
+          <w:b/>
+          <w:bCs/>
+          <w:sz w:val="28"/>
+          <w:szCs w:val="28"/>
+          <w:u w:val="single"/>
+        </w:rPr>
+        <w:t>⚠</w:t>
+      </w:r>
+      <w:r>
+        <w:rPr>
+          <w:rFonts w:cstheme="minorHAnsi"/>
+          <w:b/>
+          <w:bCs/>
+          <w:sz w:val="28"/>
+          <w:szCs w:val="28"/>
+          <w:u w:val="single"/>
+        </w:rPr>
+        <w:t xml:space="preserve"> Error típico que ahora ya sabés evitar</w:t>
+      </w:r>
+    </w:p>
+    <w:p>
+      <w:r>
+        <w:t>Muchos sistemas hacen:</w:t>
+      </w:r>
+    </w:p>
+    <w:p>
+      <w:r>
+        <w:t>Usuario → LLM → respuesta</w:t>
+      </w:r>
+    </w:p>
+    <w:p>
+      <w:r>
+        <w:t>Eso funciona para demos.</w:t>
+      </w:r>
+    </w:p>
+    <w:p>
+      <w:r>
+        <w:t>Pero sistemas reales necesitan:</w:t>
+      </w:r>
+    </w:p>
+    <w:p>
+      <w:pPr>
+        <w:numPr>
+          <w:ilvl w:val="0"/>
+          <w:numId w:val="46"/>
+        </w:numPr>
+      </w:pPr>
+      <w:r>
+        <w:t>ML para decisiones</w:t>
+      </w:r>
+    </w:p>
+    <w:p>
+      <w:pPr>
+        <w:numPr>
+          <w:ilvl w:val="0"/>
+          <w:numId w:val="46"/>
+        </w:numPr>
+      </w:pPr>
+      <w:r>
+        <w:t>RAG para conocimiento</w:t>
+      </w:r>
+    </w:p>
+    <w:p>
+      <w:pPr>
+        <w:numPr>
+          <w:ilvl w:val="0"/>
+          <w:numId w:val="46"/>
+        </w:numPr>
+      </w:pPr>
+      <w:r>
+        <w:t>memoria para continuidad</w:t>
+      </w:r>
+    </w:p>
+    <w:p>
+      <w:pPr>
+        <w:numPr>
+          <w:ilvl w:val="0"/>
+          <w:numId w:val="46"/>
+        </w:numPr>
+      </w:pPr>
+      <w:r>
+        <w:t>herramientas para acciones</w:t>
+      </w:r>
+    </w:p>
+    <w:p/>
+    <w:p>
+      <w:pPr>
+        <w:rPr>
+          <w:b/>
+          <w:bCs/>
+          <w:sz w:val="28"/>
+          <w:szCs w:val="28"/>
+          <w:u w:val="single"/>
+        </w:rPr>
+      </w:pPr>
+      <w:r>
+        <w:rPr>
+          <w:b/>
+          <w:bCs/>
+          <w:sz w:val="28"/>
+          <w:szCs w:val="28"/>
+          <w:u w:val="single"/>
+        </w:rPr>
+        <w:t xml:space="preserve">Mini ejercicio del Día </w:t>
+      </w:r>
+    </w:p>
+    <w:p>
+      <w:r>
+        <w:t xml:space="preserve">Imaginá un </w:t>
+      </w:r>
+      <w:r>
+        <w:rPr>
+          <w:b/>
+          <w:bCs/>
+        </w:rPr>
+        <w:t>copiloto de estudio universitario</w:t>
       </w:r>
       <w:r>
         <w:t>.</w:t>
       </w:r>
     </w:p>
+    <w:p>
+      <w:r>
+        <w:t>Debe:</w:t>
+      </w:r>
+    </w:p>
+    <w:p>
+      <w:pPr>
+        <w:numPr>
+          <w:ilvl w:val="0"/>
+          <w:numId w:val="47"/>
+        </w:numPr>
+      </w:pPr>
+      <w:r>
+        <w:t>predecir si vas a aprobar una materia</w:t>
+      </w:r>
+    </w:p>
+    <w:p>
+      <w:pPr>
+        <w:numPr>
+          <w:ilvl w:val="0"/>
+          <w:numId w:val="47"/>
+        </w:numPr>
+      </w:pPr>
+      <w:r>
+        <w:t>responder preguntas teóricas</w:t>
+      </w:r>
+    </w:p>
+    <w:p>
+      <w:pPr>
+        <w:numPr>
+          <w:ilvl w:val="0"/>
+          <w:numId w:val="47"/>
+        </w:numPr>
+      </w:pPr>
+      <w:r>
+        <w:t>recordar tus materias anteriores</w:t>
+      </w:r>
+    </w:p>
+    <w:p>
+      <w:pPr>
+        <w:numPr>
+          <w:ilvl w:val="0"/>
+          <w:numId w:val="47"/>
+        </w:numPr>
+      </w:pPr>
+      <w:r>
+        <w:t>sugerir plan de estudio</w:t>
+      </w:r>
+    </w:p>
+    <w:p>
+      <w:pPr>
+        <w:rPr>
+          <w:u w:val="single"/>
+        </w:rPr>
+      </w:pPr>
+      <w:r>
+        <w:rPr>
+          <w:u w:val="single"/>
+        </w:rPr>
+        <w:t>Respuesta</w:t>
+      </w:r>
+      <w:r>
+        <w:rPr>
+          <w:u w:val="single"/>
+        </w:rPr>
+        <w:t>:</w:t>
+      </w:r>
+    </w:p>
     <w:p/>
+    <w:p>
+      <w:r>
+        <w:lastRenderedPageBreak/>
+        <w:t>Input →</w:t>
+      </w:r>
+      <w:r>
+        <w:t xml:space="preserve"> notas, materias, dudas, material de estudio</w:t>
+      </w:r>
+      <w:r>
+        <w:t>, contexto(en caso de ser necesario)</w:t>
+      </w:r>
+    </w:p>
+    <w:p>
+      <w:r>
+        <w:t>RAG →</w:t>
+      </w:r>
+      <w:r>
+        <w:t xml:space="preserve"> recupera lo que necesite el momento, si se pregunta por una nota esa nota, por un tema especifico solo el tema, etc.</w:t>
+      </w:r>
+    </w:p>
+    <w:p>
+      <w:r>
+        <w:t>ML →</w:t>
+      </w:r>
+      <w:r>
+        <w:t xml:space="preserve"> </w:t>
+      </w:r>
+      <w:r>
+        <w:t>predecir si vas a aprobar una materia</w:t>
+      </w:r>
+      <w:r>
+        <w:t>, en base a las notas y como le fue en materias pasadas</w:t>
+      </w:r>
+    </w:p>
+    <w:p>
+      <w:r>
+        <w:t>LLM →</w:t>
+      </w:r>
+      <w:r>
+        <w:t xml:space="preserve"> </w:t>
+      </w:r>
+      <w:r>
+        <w:t>sugerir plan de estudio</w:t>
+      </w:r>
+      <w:r>
+        <w:t>.</w:t>
+      </w:r>
+      <w:r>
+        <w:t xml:space="preserve"> </w:t>
+      </w:r>
+      <w:r>
+        <w:t>responder preguntas teóricas</w:t>
+      </w:r>
+      <w:r>
+        <w:t xml:space="preserve">. </w:t>
+      </w:r>
+      <w:r>
+        <w:t xml:space="preserve">Orienta dudas y responde </w:t>
+      </w:r>
+    </w:p>
+    <w:p>
+      <w:r>
+        <w:t>Memoria →</w:t>
+      </w:r>
+      <w:r>
+        <w:t xml:space="preserve"> </w:t>
+      </w:r>
+      <w:r>
+        <w:t>recordar tus materias anteriores</w:t>
+      </w:r>
+      <w:r>
+        <w:t>, tus dificultades o debilidades en el aprendizaje y también las virtudes</w:t>
+      </w:r>
+    </w:p>
     <w:p/>
-    <w:p>
-      <w:pPr>
-        <w:rPr>
-          <w:b/>
-          <w:bCs/>
-          <w:sz w:val="32"/>
-          <w:szCs w:val="32"/>
-          <w:u w:val="single"/>
-        </w:rPr>
-      </w:pPr>
-      <w:r>
-        <w:rPr>
-          <w:b/>
-          <w:bCs/>
-          <w:sz w:val="32"/>
-          <w:szCs w:val="32"/>
-          <w:u w:val="single"/>
-        </w:rPr>
-        <w:lastRenderedPageBreak/>
-        <w:t>¿Qué hacer si el LLM falla o alucina?</w:t>
-      </w:r>
-    </w:p>
-    <w:p>
-      <w:pPr>
-        <w:rPr>
-          <w:b/>
-          <w:bCs/>
-        </w:rPr>
-      </w:pPr>
-      <w:r>
-        <w:rPr>
-          <w:rFonts w:ascii="Segoe UI Emoji" w:hAnsi="Segoe UI Emoji" w:cs="Segoe UI Emoji"/>
-          <w:b/>
-          <w:bCs/>
-        </w:rPr>
-        <w:t>🔑</w:t>
-      </w:r>
-      <w:r>
-        <w:rPr>
-          <w:b/>
-          <w:bCs/>
-        </w:rPr>
-        <w:t xml:space="preserve"> Idea clave</w:t>
-      </w:r>
-    </w:p>
-    <w:p>
-      <w:r>
-        <w:rPr>
-          <w:b/>
-          <w:bCs/>
-        </w:rPr>
-        <w:t>La calidad del sistema híbrido está limitada por su parte más débil.</w:t>
-      </w:r>
-    </w:p>
-    <w:p>
-      <w:r>
-        <w:t xml:space="preserve">Si el ML es 0.92 </w:t>
-      </w:r>
-      <w:proofErr w:type="spellStart"/>
-      <w:proofErr w:type="gramStart"/>
-      <w:r>
-        <w:t>precision</w:t>
-      </w:r>
-      <w:proofErr w:type="spellEnd"/>
-      <w:proofErr w:type="gramEnd"/>
-      <w:r>
-        <w:t xml:space="preserve"> pero el LLM “explica inventando”, el sistema:</w:t>
-      </w:r>
-    </w:p>
-    <w:p>
-      <w:pPr>
-        <w:numPr>
-          <w:ilvl w:val="0"/>
-          <w:numId w:val="35"/>
-        </w:numPr>
-      </w:pPr>
-      <w:r>
-        <w:t>pierde confianza</w:t>
-      </w:r>
-    </w:p>
-    <w:p>
-      <w:pPr>
-        <w:numPr>
-          <w:ilvl w:val="0"/>
-          <w:numId w:val="35"/>
-        </w:numPr>
-      </w:pPr>
-      <w:r>
-        <w:t>puede causar conflictos (soporte, reclamos)</w:t>
-      </w:r>
-    </w:p>
-    <w:p>
-      <w:pPr>
-        <w:numPr>
-          <w:ilvl w:val="0"/>
-          <w:numId w:val="35"/>
-        </w:numPr>
-      </w:pPr>
-      <w:r>
-        <w:t>puede ser riesgoso (en fraude/crédito aún más)</w:t>
-      </w:r>
-    </w:p>
-    <w:p>
-      <w:r>
-        <w:pict w14:anchorId="556CC4DC">
-          <v:rect id="_x0000_i1153" style="width:0;height:1.5pt" o:hralign="center" o:hrstd="t" o:hr="t" fillcolor="#a0a0a0" stroked="f"/>
-        </w:pict>
-      </w:r>
-    </w:p>
-    <w:p>
-      <w:pPr>
-        <w:rPr>
-          <w:b/>
-          <w:bCs/>
-        </w:rPr>
-      </w:pPr>
-      <w:r>
-        <w:rPr>
-          <w:rFonts w:ascii="Segoe UI Emoji" w:hAnsi="Segoe UI Emoji" w:cs="Segoe UI Emoji"/>
-          <w:b/>
-          <w:bCs/>
-        </w:rPr>
-        <w:t>✅</w:t>
-      </w:r>
-      <w:r>
-        <w:rPr>
-          <w:b/>
-          <w:bCs/>
-        </w:rPr>
-        <w:t xml:space="preserve"> Cómo se corrige (sin entrar en API)</w:t>
-      </w:r>
-    </w:p>
-    <w:p>
-      <w:r>
-        <w:t xml:space="preserve">Se arregla con </w:t>
-      </w:r>
-      <w:r>
-        <w:rPr>
-          <w:b/>
-          <w:bCs/>
-        </w:rPr>
-        <w:t>diseño</w:t>
-      </w:r>
-      <w:r>
-        <w:t>, no con “mejor modelo”.</w:t>
-      </w:r>
-    </w:p>
-    <w:p>
-      <w:pPr>
-        <w:rPr>
-          <w:b/>
-          <w:bCs/>
-        </w:rPr>
-      </w:pPr>
-      <w:r>
-        <w:rPr>
-          <w:b/>
-          <w:bCs/>
-        </w:rPr>
-        <w:t>1) Contrato de salida (interface)</w:t>
-      </w:r>
-    </w:p>
-    <w:p>
-      <w:r>
-        <w:t>El LLM solo puede usar:</w:t>
-      </w:r>
-    </w:p>
-    <w:p>
-      <w:pPr>
-        <w:numPr>
-          <w:ilvl w:val="0"/>
-          <w:numId w:val="36"/>
-        </w:numPr>
-      </w:pPr>
-      <w:proofErr w:type="spellStart"/>
-      <w:r>
-        <w:t>prediccion</w:t>
-      </w:r>
-      <w:proofErr w:type="spellEnd"/>
-    </w:p>
-    <w:p>
-      <w:pPr>
-        <w:numPr>
-          <w:ilvl w:val="0"/>
-          <w:numId w:val="36"/>
-        </w:numPr>
-      </w:pPr>
-      <w:proofErr w:type="spellStart"/>
-      <w:r>
-        <w:t>razones_ml</w:t>
-      </w:r>
-      <w:proofErr w:type="spellEnd"/>
-      <w:r>
-        <w:t xml:space="preserve"> (top </w:t>
-      </w:r>
-      <w:proofErr w:type="spellStart"/>
-      <w:r>
-        <w:t>features</w:t>
-      </w:r>
-      <w:proofErr w:type="spellEnd"/>
-      <w:r>
-        <w:t>)</w:t>
-      </w:r>
-    </w:p>
-    <w:p>
-      <w:pPr>
-        <w:numPr>
-          <w:ilvl w:val="0"/>
-          <w:numId w:val="36"/>
-        </w:numPr>
-      </w:pPr>
-      <w:r>
-        <w:t>evidencia (texto autorizado)</w:t>
-      </w:r>
-    </w:p>
-    <w:p>
-      <w:proofErr w:type="gramStart"/>
-      <w:r>
-        <w:t>Y</w:t>
-      </w:r>
-      <w:proofErr w:type="gramEnd"/>
-      <w:r>
-        <w:t xml:space="preserve"> además:</w:t>
-      </w:r>
-    </w:p>
-    <w:p>
-      <w:r>
-        <w:t>“Si algo no está en esos campos, no lo menciones.”</w:t>
-      </w:r>
-    </w:p>
-    <w:p>
-      <w:r>
-        <w:pict w14:anchorId="48C915CC">
-          <v:rect id="_x0000_i1154" style="width:0;height:1.5pt" o:hralign="center" o:hrstd="t" o:hr="t" fillcolor="#a0a0a0" stroked="f"/>
-        </w:pict>
-      </w:r>
-    </w:p>
-    <w:p>
-      <w:pPr>
-        <w:rPr>
-          <w:b/>
-          <w:bCs/>
-        </w:rPr>
-      </w:pPr>
-      <w:r>
-        <w:rPr>
-          <w:b/>
-          <w:bCs/>
-        </w:rPr>
-        <w:t>2) Rúbrica de fidelidad (la más importante)</w:t>
-      </w:r>
-    </w:p>
-    <w:p>
-      <w:r>
-        <w:t xml:space="preserve">Cuando </w:t>
-      </w:r>
-      <w:proofErr w:type="spellStart"/>
-      <w:r>
-        <w:t>evaluás</w:t>
-      </w:r>
-      <w:proofErr w:type="spellEnd"/>
-      <w:r>
-        <w:t xml:space="preserve"> explicaciones del LLM, el criterio #1 es:</w:t>
-      </w:r>
-    </w:p>
-    <w:p>
-      <w:pPr>
-        <w:numPr>
-          <w:ilvl w:val="0"/>
-          <w:numId w:val="37"/>
-        </w:numPr>
-      </w:pPr>
-      <w:r>
-        <w:rPr>
-          <w:b/>
-          <w:bCs/>
-        </w:rPr>
-        <w:t>Fidelidad</w:t>
-      </w:r>
-      <w:r>
-        <w:t>: “¿Dice SOLO lo que se puede justificar con evidencia?”</w:t>
-      </w:r>
-    </w:p>
-    <w:p>
-      <w:r>
-        <w:t>Si falla eso, es “no pasa”, aunque sea clarísimo.</w:t>
-      </w:r>
-    </w:p>
-    <w:p>
-      <w:r>
-        <w:pict w14:anchorId="6555FFD6">
-          <v:rect id="_x0000_i1155" style="width:0;height:1.5pt" o:hralign="center" o:hrstd="t" o:hr="t" fillcolor="#a0a0a0" stroked="f"/>
-        </w:pict>
-      </w:r>
-    </w:p>
-    <w:p>
-      <w:pPr>
-        <w:rPr>
-          <w:b/>
-          <w:bCs/>
-        </w:rPr>
-      </w:pPr>
-      <w:r>
-        <w:rPr>
-          <w:b/>
-          <w:bCs/>
-        </w:rPr>
-        <w:t>3) Plantilla de explicación</w:t>
-      </w:r>
-    </w:p>
-    <w:p>
-      <w:r>
-        <w:t>En vez de respuesta libre:</w:t>
-      </w:r>
-    </w:p>
-    <w:p>
-      <w:pPr>
-        <w:numPr>
-          <w:ilvl w:val="0"/>
-          <w:numId w:val="38"/>
-        </w:numPr>
-      </w:pPr>
-      <w:r>
-        <w:t>“Decisión: …”</w:t>
-      </w:r>
-    </w:p>
-    <w:p>
-      <w:pPr>
-        <w:numPr>
-          <w:ilvl w:val="0"/>
-          <w:numId w:val="38"/>
-        </w:numPr>
-      </w:pPr>
-      <w:r>
-        <w:t>“Motivos (del modelo): …”</w:t>
-      </w:r>
-    </w:p>
-    <w:p>
-      <w:pPr>
-        <w:numPr>
-          <w:ilvl w:val="0"/>
-          <w:numId w:val="38"/>
-        </w:numPr>
-      </w:pPr>
-      <w:r>
-        <w:t xml:space="preserve">“Qué </w:t>
-      </w:r>
-      <w:proofErr w:type="spellStart"/>
-      <w:r>
-        <w:t>podés</w:t>
-      </w:r>
-      <w:proofErr w:type="spellEnd"/>
-      <w:r>
-        <w:t xml:space="preserve"> hacer: …”</w:t>
-      </w:r>
-    </w:p>
-    <w:p>
-      <w:pPr>
-        <w:numPr>
-          <w:ilvl w:val="0"/>
-          <w:numId w:val="38"/>
-        </w:numPr>
-      </w:pPr>
-      <w:r>
-        <w:t>“Qué NO podemos afirmar: …”</w:t>
-      </w:r>
-    </w:p>
-    <w:p>
-      <w:r>
-        <w:t>Eso corta alucinación de raíz.</w:t>
-      </w:r>
-    </w:p>
     <w:p/>
     <w:p/>
     <w:p/>
@@ -3667,6 +4563,155 @@
     </w:lvl>
   </w:abstractNum>
   <w:abstractNum w:abstractNumId="1" w15:restartNumberingAfterBreak="0">
+    <w:nsid w:val="05F37A8D"/>
+    <w:multiLevelType w:val="multilevel"/>
+    <w:tmpl w:val="87DA4602"/>
+    <w:lvl w:ilvl="0">
+      <w:start w:val="1"/>
+      <w:numFmt w:val="bullet"/>
+      <w:lvlText w:val=""/>
+      <w:lvlJc w:val="left"/>
+      <w:pPr>
+        <w:tabs>
+          <w:tab w:val="num" w:pos="720"/>
+        </w:tabs>
+        <w:ind w:left="720" w:hanging="360"/>
+      </w:pPr>
+      <w:rPr>
+        <w:rFonts w:ascii="Symbol" w:hAnsi="Symbol" w:hint="default"/>
+        <w:sz w:val="20"/>
+      </w:rPr>
+    </w:lvl>
+    <w:lvl w:ilvl="1" w:tentative="1">
+      <w:start w:val="1"/>
+      <w:numFmt w:val="bullet"/>
+      <w:lvlText w:val="o"/>
+      <w:lvlJc w:val="left"/>
+      <w:pPr>
+        <w:tabs>
+          <w:tab w:val="num" w:pos="1440"/>
+        </w:tabs>
+        <w:ind w:left="1440" w:hanging="360"/>
+      </w:pPr>
+      <w:rPr>
+        <w:rFonts w:ascii="Courier New" w:hAnsi="Courier New" w:hint="default"/>
+        <w:sz w:val="20"/>
+      </w:rPr>
+    </w:lvl>
+    <w:lvl w:ilvl="2" w:tentative="1">
+      <w:start w:val="1"/>
+      <w:numFmt w:val="bullet"/>
+      <w:lvlText w:val=""/>
+      <w:lvlJc w:val="left"/>
+      <w:pPr>
+        <w:tabs>
+          <w:tab w:val="num" w:pos="2160"/>
+        </w:tabs>
+        <w:ind w:left="2160" w:hanging="360"/>
+      </w:pPr>
+      <w:rPr>
+        <w:rFonts w:ascii="Wingdings" w:hAnsi="Wingdings" w:hint="default"/>
+        <w:sz w:val="20"/>
+      </w:rPr>
+    </w:lvl>
+    <w:lvl w:ilvl="3" w:tentative="1">
+      <w:start w:val="1"/>
+      <w:numFmt w:val="bullet"/>
+      <w:lvlText w:val=""/>
+      <w:lvlJc w:val="left"/>
+      <w:pPr>
+        <w:tabs>
+          <w:tab w:val="num" w:pos="2880"/>
+        </w:tabs>
+        <w:ind w:left="2880" w:hanging="360"/>
+      </w:pPr>
+      <w:rPr>
+        <w:rFonts w:ascii="Wingdings" w:hAnsi="Wingdings" w:hint="default"/>
+        <w:sz w:val="20"/>
+      </w:rPr>
+    </w:lvl>
+    <w:lvl w:ilvl="4" w:tentative="1">
+      <w:start w:val="1"/>
+      <w:numFmt w:val="bullet"/>
+      <w:lvlText w:val=""/>
+      <w:lvlJc w:val="left"/>
+      <w:pPr>
+        <w:tabs>
+          <w:tab w:val="num" w:pos="3600"/>
+        </w:tabs>
+        <w:ind w:left="3600" w:hanging="360"/>
+      </w:pPr>
+      <w:rPr>
+        <w:rFonts w:ascii="Wingdings" w:hAnsi="Wingdings" w:hint="default"/>
+        <w:sz w:val="20"/>
+      </w:rPr>
+    </w:lvl>
+    <w:lvl w:ilvl="5" w:tentative="1">
+      <w:start w:val="1"/>
+      <w:numFmt w:val="bullet"/>
+      <w:lvlText w:val=""/>
+      <w:lvlJc w:val="left"/>
+      <w:pPr>
+        <w:tabs>
+          <w:tab w:val="num" w:pos="4320"/>
+        </w:tabs>
+        <w:ind w:left="4320" w:hanging="360"/>
+      </w:pPr>
+      <w:rPr>
+        <w:rFonts w:ascii="Wingdings" w:hAnsi="Wingdings" w:hint="default"/>
+        <w:sz w:val="20"/>
+      </w:rPr>
+    </w:lvl>
+    <w:lvl w:ilvl="6" w:tentative="1">
+      <w:start w:val="1"/>
+      <w:numFmt w:val="bullet"/>
+      <w:lvlText w:val=""/>
+      <w:lvlJc w:val="left"/>
+      <w:pPr>
+        <w:tabs>
+          <w:tab w:val="num" w:pos="5040"/>
+        </w:tabs>
+        <w:ind w:left="5040" w:hanging="360"/>
+      </w:pPr>
+      <w:rPr>
+        <w:rFonts w:ascii="Wingdings" w:hAnsi="Wingdings" w:hint="default"/>
+        <w:sz w:val="20"/>
+      </w:rPr>
+    </w:lvl>
+    <w:lvl w:ilvl="7" w:tentative="1">
+      <w:start w:val="1"/>
+      <w:numFmt w:val="bullet"/>
+      <w:lvlText w:val=""/>
+      <w:lvlJc w:val="left"/>
+      <w:pPr>
+        <w:tabs>
+          <w:tab w:val="num" w:pos="5760"/>
+        </w:tabs>
+        <w:ind w:left="5760" w:hanging="360"/>
+      </w:pPr>
+      <w:rPr>
+        <w:rFonts w:ascii="Wingdings" w:hAnsi="Wingdings" w:hint="default"/>
+        <w:sz w:val="20"/>
+      </w:rPr>
+    </w:lvl>
+    <w:lvl w:ilvl="8" w:tentative="1">
+      <w:start w:val="1"/>
+      <w:numFmt w:val="bullet"/>
+      <w:lvlText w:val=""/>
+      <w:lvlJc w:val="left"/>
+      <w:pPr>
+        <w:tabs>
+          <w:tab w:val="num" w:pos="6480"/>
+        </w:tabs>
+        <w:ind w:left="6480" w:hanging="360"/>
+      </w:pPr>
+      <w:rPr>
+        <w:rFonts w:ascii="Wingdings" w:hAnsi="Wingdings" w:hint="default"/>
+        <w:sz w:val="20"/>
+      </w:rPr>
+    </w:lvl>
+  </w:abstractNum>
+  <w:abstractNum w:abstractNumId="2" w15:restartNumberingAfterBreak="0">
     <w:nsid w:val="06564B2D"/>
     <w:multiLevelType w:val="multilevel"/>
     <w:tmpl w:val="700E666E"/>
@@ -3815,7 +4860,7 @@
       </w:rPr>
     </w:lvl>
   </w:abstractNum>
-  <w:abstractNum w:abstractNumId="2" w15:restartNumberingAfterBreak="0">
+  <w:abstractNum w:abstractNumId="3" w15:restartNumberingAfterBreak="0">
     <w:nsid w:val="065D5FE6"/>
     <w:multiLevelType w:val="multilevel"/>
     <w:tmpl w:val="97BED464"/>
@@ -3964,7 +5009,7 @@
       </w:rPr>
     </w:lvl>
   </w:abstractNum>
-  <w:abstractNum w:abstractNumId="3" w15:restartNumberingAfterBreak="0">
+  <w:abstractNum w:abstractNumId="4" w15:restartNumberingAfterBreak="0">
     <w:nsid w:val="0663362A"/>
     <w:multiLevelType w:val="multilevel"/>
     <w:tmpl w:val="4F0E6462"/>
@@ -4113,7 +5158,7 @@
       </w:rPr>
     </w:lvl>
   </w:abstractNum>
-  <w:abstractNum w:abstractNumId="4" w15:restartNumberingAfterBreak="0">
+  <w:abstractNum w:abstractNumId="5" w15:restartNumberingAfterBreak="0">
     <w:nsid w:val="0D010857"/>
     <w:multiLevelType w:val="multilevel"/>
     <w:tmpl w:val="1EC603FC"/>
@@ -4262,7 +5307,7 @@
       </w:rPr>
     </w:lvl>
   </w:abstractNum>
-  <w:abstractNum w:abstractNumId="5" w15:restartNumberingAfterBreak="0">
+  <w:abstractNum w:abstractNumId="6" w15:restartNumberingAfterBreak="0">
     <w:nsid w:val="12A319D4"/>
     <w:multiLevelType w:val="multilevel"/>
     <w:tmpl w:val="2C622292"/>
@@ -4411,7 +5456,7 @@
       </w:rPr>
     </w:lvl>
   </w:abstractNum>
-  <w:abstractNum w:abstractNumId="6" w15:restartNumberingAfterBreak="0">
+  <w:abstractNum w:abstractNumId="7" w15:restartNumberingAfterBreak="0">
     <w:nsid w:val="13944DD0"/>
     <w:multiLevelType w:val="multilevel"/>
     <w:tmpl w:val="E9A27296"/>
@@ -4560,7 +5605,7 @@
       </w:rPr>
     </w:lvl>
   </w:abstractNum>
-  <w:abstractNum w:abstractNumId="7" w15:restartNumberingAfterBreak="0">
+  <w:abstractNum w:abstractNumId="8" w15:restartNumberingAfterBreak="0">
     <w:nsid w:val="146F2D1C"/>
     <w:multiLevelType w:val="multilevel"/>
     <w:tmpl w:val="9EF82712"/>
@@ -4709,7 +5754,7 @@
       </w:rPr>
     </w:lvl>
   </w:abstractNum>
-  <w:abstractNum w:abstractNumId="8" w15:restartNumberingAfterBreak="0">
+  <w:abstractNum w:abstractNumId="9" w15:restartNumberingAfterBreak="0">
     <w:nsid w:val="152A158D"/>
     <w:multiLevelType w:val="multilevel"/>
     <w:tmpl w:val="FB80F726"/>
@@ -4858,7 +5903,7 @@
       </w:rPr>
     </w:lvl>
   </w:abstractNum>
-  <w:abstractNum w:abstractNumId="9" w15:restartNumberingAfterBreak="0">
+  <w:abstractNum w:abstractNumId="10" w15:restartNumberingAfterBreak="0">
     <w:nsid w:val="153B299B"/>
     <w:multiLevelType w:val="multilevel"/>
     <w:tmpl w:val="B7BE7A2E"/>
@@ -5007,7 +6052,7 @@
       </w:rPr>
     </w:lvl>
   </w:abstractNum>
-  <w:abstractNum w:abstractNumId="10" w15:restartNumberingAfterBreak="0">
+  <w:abstractNum w:abstractNumId="11" w15:restartNumberingAfterBreak="0">
     <w:nsid w:val="16E87DC8"/>
     <w:multiLevelType w:val="multilevel"/>
     <w:tmpl w:val="782A7C94"/>
@@ -5156,7 +6201,7 @@
       </w:rPr>
     </w:lvl>
   </w:abstractNum>
-  <w:abstractNum w:abstractNumId="11" w15:restartNumberingAfterBreak="0">
+  <w:abstractNum w:abstractNumId="12" w15:restartNumberingAfterBreak="0">
     <w:nsid w:val="1E1554BE"/>
     <w:multiLevelType w:val="multilevel"/>
     <w:tmpl w:val="68A0640E"/>
@@ -5305,7 +6350,7 @@
       </w:rPr>
     </w:lvl>
   </w:abstractNum>
-  <w:abstractNum w:abstractNumId="12" w15:restartNumberingAfterBreak="0">
+  <w:abstractNum w:abstractNumId="13" w15:restartNumberingAfterBreak="0">
     <w:nsid w:val="1F5A7787"/>
     <w:multiLevelType w:val="multilevel"/>
     <w:tmpl w:val="72E65428"/>
@@ -5454,7 +6499,7 @@
       </w:rPr>
     </w:lvl>
   </w:abstractNum>
-  <w:abstractNum w:abstractNumId="13" w15:restartNumberingAfterBreak="0">
+  <w:abstractNum w:abstractNumId="14" w15:restartNumberingAfterBreak="0">
     <w:nsid w:val="1FA23015"/>
     <w:multiLevelType w:val="multilevel"/>
     <w:tmpl w:val="B17C8C1E"/>
@@ -5603,7 +6648,7 @@
       </w:rPr>
     </w:lvl>
   </w:abstractNum>
-  <w:abstractNum w:abstractNumId="14" w15:restartNumberingAfterBreak="0">
+  <w:abstractNum w:abstractNumId="15" w15:restartNumberingAfterBreak="0">
     <w:nsid w:val="261641E3"/>
     <w:multiLevelType w:val="multilevel"/>
     <w:tmpl w:val="A2F29504"/>
@@ -5752,7 +6797,7 @@
       </w:rPr>
     </w:lvl>
   </w:abstractNum>
-  <w:abstractNum w:abstractNumId="15" w15:restartNumberingAfterBreak="0">
+  <w:abstractNum w:abstractNumId="16" w15:restartNumberingAfterBreak="0">
     <w:nsid w:val="2C631985"/>
     <w:multiLevelType w:val="multilevel"/>
     <w:tmpl w:val="7146106A"/>
@@ -5901,7 +6946,7 @@
       </w:rPr>
     </w:lvl>
   </w:abstractNum>
-  <w:abstractNum w:abstractNumId="16" w15:restartNumberingAfterBreak="0">
+  <w:abstractNum w:abstractNumId="17" w15:restartNumberingAfterBreak="0">
     <w:nsid w:val="2C894CD6"/>
     <w:multiLevelType w:val="multilevel"/>
     <w:tmpl w:val="DA5A3198"/>
@@ -6014,7 +7059,7 @@
       </w:pPr>
     </w:lvl>
   </w:abstractNum>
-  <w:abstractNum w:abstractNumId="17" w15:restartNumberingAfterBreak="0">
+  <w:abstractNum w:abstractNumId="18" w15:restartNumberingAfterBreak="0">
     <w:nsid w:val="2E0704B5"/>
     <w:multiLevelType w:val="multilevel"/>
     <w:tmpl w:val="93D8486A"/>
@@ -6163,7 +7208,7 @@
       </w:rPr>
     </w:lvl>
   </w:abstractNum>
-  <w:abstractNum w:abstractNumId="18" w15:restartNumberingAfterBreak="0">
+  <w:abstractNum w:abstractNumId="19" w15:restartNumberingAfterBreak="0">
     <w:nsid w:val="3625634C"/>
     <w:multiLevelType w:val="multilevel"/>
     <w:tmpl w:val="480C6060"/>
@@ -6312,7 +7357,7 @@
       </w:rPr>
     </w:lvl>
   </w:abstractNum>
-  <w:abstractNum w:abstractNumId="19" w15:restartNumberingAfterBreak="0">
+  <w:abstractNum w:abstractNumId="20" w15:restartNumberingAfterBreak="0">
     <w:nsid w:val="3CF66B99"/>
     <w:multiLevelType w:val="multilevel"/>
     <w:tmpl w:val="247E3C30"/>
@@ -6461,7 +7506,7 @@
       </w:rPr>
     </w:lvl>
   </w:abstractNum>
-  <w:abstractNum w:abstractNumId="20" w15:restartNumberingAfterBreak="0">
+  <w:abstractNum w:abstractNumId="21" w15:restartNumberingAfterBreak="0">
     <w:nsid w:val="3F431E86"/>
     <w:multiLevelType w:val="multilevel"/>
     <w:tmpl w:val="71683C9A"/>
@@ -6610,7 +7655,7 @@
       </w:rPr>
     </w:lvl>
   </w:abstractNum>
-  <w:abstractNum w:abstractNumId="21" w15:restartNumberingAfterBreak="0">
+  <w:abstractNum w:abstractNumId="22" w15:restartNumberingAfterBreak="0">
     <w:nsid w:val="3FBE27FE"/>
     <w:multiLevelType w:val="multilevel"/>
     <w:tmpl w:val="CE843100"/>
@@ -6759,7 +7804,7 @@
       </w:rPr>
     </w:lvl>
   </w:abstractNum>
-  <w:abstractNum w:abstractNumId="22" w15:restartNumberingAfterBreak="0">
+  <w:abstractNum w:abstractNumId="23" w15:restartNumberingAfterBreak="0">
     <w:nsid w:val="41552755"/>
     <w:multiLevelType w:val="multilevel"/>
     <w:tmpl w:val="43C0AF22"/>
@@ -6908,7 +7953,7 @@
       </w:rPr>
     </w:lvl>
   </w:abstractNum>
-  <w:abstractNum w:abstractNumId="23" w15:restartNumberingAfterBreak="0">
+  <w:abstractNum w:abstractNumId="24" w15:restartNumberingAfterBreak="0">
     <w:nsid w:val="425B6D5D"/>
     <w:multiLevelType w:val="multilevel"/>
     <w:tmpl w:val="A86A55BA"/>
@@ -7057,7 +8102,305 @@
       </w:rPr>
     </w:lvl>
   </w:abstractNum>
-  <w:abstractNum w:abstractNumId="24" w15:restartNumberingAfterBreak="0">
+  <w:abstractNum w:abstractNumId="25" w15:restartNumberingAfterBreak="0">
+    <w:nsid w:val="430B498A"/>
+    <w:multiLevelType w:val="multilevel"/>
+    <w:tmpl w:val="08D65AF6"/>
+    <w:lvl w:ilvl="0">
+      <w:start w:val="1"/>
+      <w:numFmt w:val="bullet"/>
+      <w:lvlText w:val=""/>
+      <w:lvlJc w:val="left"/>
+      <w:pPr>
+        <w:tabs>
+          <w:tab w:val="num" w:pos="720"/>
+        </w:tabs>
+        <w:ind w:left="720" w:hanging="360"/>
+      </w:pPr>
+      <w:rPr>
+        <w:rFonts w:ascii="Symbol" w:hAnsi="Symbol" w:hint="default"/>
+        <w:sz w:val="20"/>
+      </w:rPr>
+    </w:lvl>
+    <w:lvl w:ilvl="1" w:tentative="1">
+      <w:start w:val="1"/>
+      <w:numFmt w:val="bullet"/>
+      <w:lvlText w:val="o"/>
+      <w:lvlJc w:val="left"/>
+      <w:pPr>
+        <w:tabs>
+          <w:tab w:val="num" w:pos="1440"/>
+        </w:tabs>
+        <w:ind w:left="1440" w:hanging="360"/>
+      </w:pPr>
+      <w:rPr>
+        <w:rFonts w:ascii="Courier New" w:hAnsi="Courier New" w:hint="default"/>
+        <w:sz w:val="20"/>
+      </w:rPr>
+    </w:lvl>
+    <w:lvl w:ilvl="2" w:tentative="1">
+      <w:start w:val="1"/>
+      <w:numFmt w:val="bullet"/>
+      <w:lvlText w:val=""/>
+      <w:lvlJc w:val="left"/>
+      <w:pPr>
+        <w:tabs>
+          <w:tab w:val="num" w:pos="2160"/>
+        </w:tabs>
+        <w:ind w:left="2160" w:hanging="360"/>
+      </w:pPr>
+      <w:rPr>
+        <w:rFonts w:ascii="Wingdings" w:hAnsi="Wingdings" w:hint="default"/>
+        <w:sz w:val="20"/>
+      </w:rPr>
+    </w:lvl>
+    <w:lvl w:ilvl="3" w:tentative="1">
+      <w:start w:val="1"/>
+      <w:numFmt w:val="bullet"/>
+      <w:lvlText w:val=""/>
+      <w:lvlJc w:val="left"/>
+      <w:pPr>
+        <w:tabs>
+          <w:tab w:val="num" w:pos="2880"/>
+        </w:tabs>
+        <w:ind w:left="2880" w:hanging="360"/>
+      </w:pPr>
+      <w:rPr>
+        <w:rFonts w:ascii="Wingdings" w:hAnsi="Wingdings" w:hint="default"/>
+        <w:sz w:val="20"/>
+      </w:rPr>
+    </w:lvl>
+    <w:lvl w:ilvl="4" w:tentative="1">
+      <w:start w:val="1"/>
+      <w:numFmt w:val="bullet"/>
+      <w:lvlText w:val=""/>
+      <w:lvlJc w:val="left"/>
+      <w:pPr>
+        <w:tabs>
+          <w:tab w:val="num" w:pos="3600"/>
+        </w:tabs>
+        <w:ind w:left="3600" w:hanging="360"/>
+      </w:pPr>
+      <w:rPr>
+        <w:rFonts w:ascii="Wingdings" w:hAnsi="Wingdings" w:hint="default"/>
+        <w:sz w:val="20"/>
+      </w:rPr>
+    </w:lvl>
+    <w:lvl w:ilvl="5" w:tentative="1">
+      <w:start w:val="1"/>
+      <w:numFmt w:val="bullet"/>
+      <w:lvlText w:val=""/>
+      <w:lvlJc w:val="left"/>
+      <w:pPr>
+        <w:tabs>
+          <w:tab w:val="num" w:pos="4320"/>
+        </w:tabs>
+        <w:ind w:left="4320" w:hanging="360"/>
+      </w:pPr>
+      <w:rPr>
+        <w:rFonts w:ascii="Wingdings" w:hAnsi="Wingdings" w:hint="default"/>
+        <w:sz w:val="20"/>
+      </w:rPr>
+    </w:lvl>
+    <w:lvl w:ilvl="6" w:tentative="1">
+      <w:start w:val="1"/>
+      <w:numFmt w:val="bullet"/>
+      <w:lvlText w:val=""/>
+      <w:lvlJc w:val="left"/>
+      <w:pPr>
+        <w:tabs>
+          <w:tab w:val="num" w:pos="5040"/>
+        </w:tabs>
+        <w:ind w:left="5040" w:hanging="360"/>
+      </w:pPr>
+      <w:rPr>
+        <w:rFonts w:ascii="Wingdings" w:hAnsi="Wingdings" w:hint="default"/>
+        <w:sz w:val="20"/>
+      </w:rPr>
+    </w:lvl>
+    <w:lvl w:ilvl="7" w:tentative="1">
+      <w:start w:val="1"/>
+      <w:numFmt w:val="bullet"/>
+      <w:lvlText w:val=""/>
+      <w:lvlJc w:val="left"/>
+      <w:pPr>
+        <w:tabs>
+          <w:tab w:val="num" w:pos="5760"/>
+        </w:tabs>
+        <w:ind w:left="5760" w:hanging="360"/>
+      </w:pPr>
+      <w:rPr>
+        <w:rFonts w:ascii="Wingdings" w:hAnsi="Wingdings" w:hint="default"/>
+        <w:sz w:val="20"/>
+      </w:rPr>
+    </w:lvl>
+    <w:lvl w:ilvl="8" w:tentative="1">
+      <w:start w:val="1"/>
+      <w:numFmt w:val="bullet"/>
+      <w:lvlText w:val=""/>
+      <w:lvlJc w:val="left"/>
+      <w:pPr>
+        <w:tabs>
+          <w:tab w:val="num" w:pos="6480"/>
+        </w:tabs>
+        <w:ind w:left="6480" w:hanging="360"/>
+      </w:pPr>
+      <w:rPr>
+        <w:rFonts w:ascii="Wingdings" w:hAnsi="Wingdings" w:hint="default"/>
+        <w:sz w:val="20"/>
+      </w:rPr>
+    </w:lvl>
+  </w:abstractNum>
+  <w:abstractNum w:abstractNumId="26" w15:restartNumberingAfterBreak="0">
+    <w:nsid w:val="43B00359"/>
+    <w:multiLevelType w:val="multilevel"/>
+    <w:tmpl w:val="4074FDB2"/>
+    <w:lvl w:ilvl="0">
+      <w:start w:val="1"/>
+      <w:numFmt w:val="bullet"/>
+      <w:lvlText w:val=""/>
+      <w:lvlJc w:val="left"/>
+      <w:pPr>
+        <w:tabs>
+          <w:tab w:val="num" w:pos="720"/>
+        </w:tabs>
+        <w:ind w:left="720" w:hanging="360"/>
+      </w:pPr>
+      <w:rPr>
+        <w:rFonts w:ascii="Symbol" w:hAnsi="Symbol" w:hint="default"/>
+        <w:sz w:val="20"/>
+      </w:rPr>
+    </w:lvl>
+    <w:lvl w:ilvl="1" w:tentative="1">
+      <w:start w:val="1"/>
+      <w:numFmt w:val="bullet"/>
+      <w:lvlText w:val="o"/>
+      <w:lvlJc w:val="left"/>
+      <w:pPr>
+        <w:tabs>
+          <w:tab w:val="num" w:pos="1440"/>
+        </w:tabs>
+        <w:ind w:left="1440" w:hanging="360"/>
+      </w:pPr>
+      <w:rPr>
+        <w:rFonts w:ascii="Courier New" w:hAnsi="Courier New" w:hint="default"/>
+        <w:sz w:val="20"/>
+      </w:rPr>
+    </w:lvl>
+    <w:lvl w:ilvl="2" w:tentative="1">
+      <w:start w:val="1"/>
+      <w:numFmt w:val="bullet"/>
+      <w:lvlText w:val=""/>
+      <w:lvlJc w:val="left"/>
+      <w:pPr>
+        <w:tabs>
+          <w:tab w:val="num" w:pos="2160"/>
+        </w:tabs>
+        <w:ind w:left="2160" w:hanging="360"/>
+      </w:pPr>
+      <w:rPr>
+        <w:rFonts w:ascii="Wingdings" w:hAnsi="Wingdings" w:hint="default"/>
+        <w:sz w:val="20"/>
+      </w:rPr>
+    </w:lvl>
+    <w:lvl w:ilvl="3" w:tentative="1">
+      <w:start w:val="1"/>
+      <w:numFmt w:val="bullet"/>
+      <w:lvlText w:val=""/>
+      <w:lvlJc w:val="left"/>
+      <w:pPr>
+        <w:tabs>
+          <w:tab w:val="num" w:pos="2880"/>
+        </w:tabs>
+        <w:ind w:left="2880" w:hanging="360"/>
+      </w:pPr>
+      <w:rPr>
+        <w:rFonts w:ascii="Wingdings" w:hAnsi="Wingdings" w:hint="default"/>
+        <w:sz w:val="20"/>
+      </w:rPr>
+    </w:lvl>
+    <w:lvl w:ilvl="4" w:tentative="1">
+      <w:start w:val="1"/>
+      <w:numFmt w:val="bullet"/>
+      <w:lvlText w:val=""/>
+      <w:lvlJc w:val="left"/>
+      <w:pPr>
+        <w:tabs>
+          <w:tab w:val="num" w:pos="3600"/>
+        </w:tabs>
+        <w:ind w:left="3600" w:hanging="360"/>
+      </w:pPr>
+      <w:rPr>
+        <w:rFonts w:ascii="Wingdings" w:hAnsi="Wingdings" w:hint="default"/>
+        <w:sz w:val="20"/>
+      </w:rPr>
+    </w:lvl>
+    <w:lvl w:ilvl="5" w:tentative="1">
+      <w:start w:val="1"/>
+      <w:numFmt w:val="bullet"/>
+      <w:lvlText w:val=""/>
+      <w:lvlJc w:val="left"/>
+      <w:pPr>
+        <w:tabs>
+          <w:tab w:val="num" w:pos="4320"/>
+        </w:tabs>
+        <w:ind w:left="4320" w:hanging="360"/>
+      </w:pPr>
+      <w:rPr>
+        <w:rFonts w:ascii="Wingdings" w:hAnsi="Wingdings" w:hint="default"/>
+        <w:sz w:val="20"/>
+      </w:rPr>
+    </w:lvl>
+    <w:lvl w:ilvl="6" w:tentative="1">
+      <w:start w:val="1"/>
+      <w:numFmt w:val="bullet"/>
+      <w:lvlText w:val=""/>
+      <w:lvlJc w:val="left"/>
+      <w:pPr>
+        <w:tabs>
+          <w:tab w:val="num" w:pos="5040"/>
+        </w:tabs>
+        <w:ind w:left="5040" w:hanging="360"/>
+      </w:pPr>
+      <w:rPr>
+        <w:rFonts w:ascii="Wingdings" w:hAnsi="Wingdings" w:hint="default"/>
+        <w:sz w:val="20"/>
+      </w:rPr>
+    </w:lvl>
+    <w:lvl w:ilvl="7" w:tentative="1">
+      <w:start w:val="1"/>
+      <w:numFmt w:val="bullet"/>
+      <w:lvlText w:val=""/>
+      <w:lvlJc w:val="left"/>
+      <w:pPr>
+        <w:tabs>
+          <w:tab w:val="num" w:pos="5760"/>
+        </w:tabs>
+        <w:ind w:left="5760" w:hanging="360"/>
+      </w:pPr>
+      <w:rPr>
+        <w:rFonts w:ascii="Wingdings" w:hAnsi="Wingdings" w:hint="default"/>
+        <w:sz w:val="20"/>
+      </w:rPr>
+    </w:lvl>
+    <w:lvl w:ilvl="8" w:tentative="1">
+      <w:start w:val="1"/>
+      <w:numFmt w:val="bullet"/>
+      <w:lvlText w:val=""/>
+      <w:lvlJc w:val="left"/>
+      <w:pPr>
+        <w:tabs>
+          <w:tab w:val="num" w:pos="6480"/>
+        </w:tabs>
+        <w:ind w:left="6480" w:hanging="360"/>
+      </w:pPr>
+      <w:rPr>
+        <w:rFonts w:ascii="Wingdings" w:hAnsi="Wingdings" w:hint="default"/>
+        <w:sz w:val="20"/>
+      </w:rPr>
+    </w:lvl>
+  </w:abstractNum>
+  <w:abstractNum w:abstractNumId="27" w15:restartNumberingAfterBreak="0">
     <w:nsid w:val="4405324E"/>
     <w:multiLevelType w:val="multilevel"/>
     <w:tmpl w:val="3190ADBA"/>
@@ -7206,7 +8549,7 @@
       </w:rPr>
     </w:lvl>
   </w:abstractNum>
-  <w:abstractNum w:abstractNumId="25" w15:restartNumberingAfterBreak="0">
+  <w:abstractNum w:abstractNumId="28" w15:restartNumberingAfterBreak="0">
     <w:nsid w:val="471C315C"/>
     <w:multiLevelType w:val="multilevel"/>
     <w:tmpl w:val="C01EE712"/>
@@ -7355,7 +8698,7 @@
       </w:rPr>
     </w:lvl>
   </w:abstractNum>
-  <w:abstractNum w:abstractNumId="26" w15:restartNumberingAfterBreak="0">
+  <w:abstractNum w:abstractNumId="29" w15:restartNumberingAfterBreak="0">
     <w:nsid w:val="4A421664"/>
     <w:multiLevelType w:val="multilevel"/>
     <w:tmpl w:val="387C34F2"/>
@@ -7504,7 +8847,305 @@
       </w:rPr>
     </w:lvl>
   </w:abstractNum>
-  <w:abstractNum w:abstractNumId="27" w15:restartNumberingAfterBreak="0">
+  <w:abstractNum w:abstractNumId="30" w15:restartNumberingAfterBreak="0">
+    <w:nsid w:val="4E794547"/>
+    <w:multiLevelType w:val="multilevel"/>
+    <w:tmpl w:val="D0D40B82"/>
+    <w:lvl w:ilvl="0">
+      <w:start w:val="1"/>
+      <w:numFmt w:val="bullet"/>
+      <w:lvlText w:val=""/>
+      <w:lvlJc w:val="left"/>
+      <w:pPr>
+        <w:tabs>
+          <w:tab w:val="num" w:pos="720"/>
+        </w:tabs>
+        <w:ind w:left="720" w:hanging="360"/>
+      </w:pPr>
+      <w:rPr>
+        <w:rFonts w:ascii="Symbol" w:hAnsi="Symbol" w:hint="default"/>
+        <w:sz w:val="20"/>
+      </w:rPr>
+    </w:lvl>
+    <w:lvl w:ilvl="1" w:tentative="1">
+      <w:start w:val="1"/>
+      <w:numFmt w:val="bullet"/>
+      <w:lvlText w:val="o"/>
+      <w:lvlJc w:val="left"/>
+      <w:pPr>
+        <w:tabs>
+          <w:tab w:val="num" w:pos="1440"/>
+        </w:tabs>
+        <w:ind w:left="1440" w:hanging="360"/>
+      </w:pPr>
+      <w:rPr>
+        <w:rFonts w:ascii="Courier New" w:hAnsi="Courier New" w:hint="default"/>
+        <w:sz w:val="20"/>
+      </w:rPr>
+    </w:lvl>
+    <w:lvl w:ilvl="2" w:tentative="1">
+      <w:start w:val="1"/>
+      <w:numFmt w:val="bullet"/>
+      <w:lvlText w:val=""/>
+      <w:lvlJc w:val="left"/>
+      <w:pPr>
+        <w:tabs>
+          <w:tab w:val="num" w:pos="2160"/>
+        </w:tabs>
+        <w:ind w:left="2160" w:hanging="360"/>
+      </w:pPr>
+      <w:rPr>
+        <w:rFonts w:ascii="Wingdings" w:hAnsi="Wingdings" w:hint="default"/>
+        <w:sz w:val="20"/>
+      </w:rPr>
+    </w:lvl>
+    <w:lvl w:ilvl="3" w:tentative="1">
+      <w:start w:val="1"/>
+      <w:numFmt w:val="bullet"/>
+      <w:lvlText w:val=""/>
+      <w:lvlJc w:val="left"/>
+      <w:pPr>
+        <w:tabs>
+          <w:tab w:val="num" w:pos="2880"/>
+        </w:tabs>
+        <w:ind w:left="2880" w:hanging="360"/>
+      </w:pPr>
+      <w:rPr>
+        <w:rFonts w:ascii="Wingdings" w:hAnsi="Wingdings" w:hint="default"/>
+        <w:sz w:val="20"/>
+      </w:rPr>
+    </w:lvl>
+    <w:lvl w:ilvl="4" w:tentative="1">
+      <w:start w:val="1"/>
+      <w:numFmt w:val="bullet"/>
+      <w:lvlText w:val=""/>
+      <w:lvlJc w:val="left"/>
+      <w:pPr>
+        <w:tabs>
+          <w:tab w:val="num" w:pos="3600"/>
+        </w:tabs>
+        <w:ind w:left="3600" w:hanging="360"/>
+      </w:pPr>
+      <w:rPr>
+        <w:rFonts w:ascii="Wingdings" w:hAnsi="Wingdings" w:hint="default"/>
+        <w:sz w:val="20"/>
+      </w:rPr>
+    </w:lvl>
+    <w:lvl w:ilvl="5" w:tentative="1">
+      <w:start w:val="1"/>
+      <w:numFmt w:val="bullet"/>
+      <w:lvlText w:val=""/>
+      <w:lvlJc w:val="left"/>
+      <w:pPr>
+        <w:tabs>
+          <w:tab w:val="num" w:pos="4320"/>
+        </w:tabs>
+        <w:ind w:left="4320" w:hanging="360"/>
+      </w:pPr>
+      <w:rPr>
+        <w:rFonts w:ascii="Wingdings" w:hAnsi="Wingdings" w:hint="default"/>
+        <w:sz w:val="20"/>
+      </w:rPr>
+    </w:lvl>
+    <w:lvl w:ilvl="6" w:tentative="1">
+      <w:start w:val="1"/>
+      <w:numFmt w:val="bullet"/>
+      <w:lvlText w:val=""/>
+      <w:lvlJc w:val="left"/>
+      <w:pPr>
+        <w:tabs>
+          <w:tab w:val="num" w:pos="5040"/>
+        </w:tabs>
+        <w:ind w:left="5040" w:hanging="360"/>
+      </w:pPr>
+      <w:rPr>
+        <w:rFonts w:ascii="Wingdings" w:hAnsi="Wingdings" w:hint="default"/>
+        <w:sz w:val="20"/>
+      </w:rPr>
+    </w:lvl>
+    <w:lvl w:ilvl="7" w:tentative="1">
+      <w:start w:val="1"/>
+      <w:numFmt w:val="bullet"/>
+      <w:lvlText w:val=""/>
+      <w:lvlJc w:val="left"/>
+      <w:pPr>
+        <w:tabs>
+          <w:tab w:val="num" w:pos="5760"/>
+        </w:tabs>
+        <w:ind w:left="5760" w:hanging="360"/>
+      </w:pPr>
+      <w:rPr>
+        <w:rFonts w:ascii="Wingdings" w:hAnsi="Wingdings" w:hint="default"/>
+        <w:sz w:val="20"/>
+      </w:rPr>
+    </w:lvl>
+    <w:lvl w:ilvl="8" w:tentative="1">
+      <w:start w:val="1"/>
+      <w:numFmt w:val="bullet"/>
+      <w:lvlText w:val=""/>
+      <w:lvlJc w:val="left"/>
+      <w:pPr>
+        <w:tabs>
+          <w:tab w:val="num" w:pos="6480"/>
+        </w:tabs>
+        <w:ind w:left="6480" w:hanging="360"/>
+      </w:pPr>
+      <w:rPr>
+        <w:rFonts w:ascii="Wingdings" w:hAnsi="Wingdings" w:hint="default"/>
+        <w:sz w:val="20"/>
+      </w:rPr>
+    </w:lvl>
+  </w:abstractNum>
+  <w:abstractNum w:abstractNumId="31" w15:restartNumberingAfterBreak="0">
+    <w:nsid w:val="4F0A702E"/>
+    <w:multiLevelType w:val="multilevel"/>
+    <w:tmpl w:val="DC7073F8"/>
+    <w:lvl w:ilvl="0">
+      <w:start w:val="1"/>
+      <w:numFmt w:val="bullet"/>
+      <w:lvlText w:val=""/>
+      <w:lvlJc w:val="left"/>
+      <w:pPr>
+        <w:tabs>
+          <w:tab w:val="num" w:pos="720"/>
+        </w:tabs>
+        <w:ind w:left="720" w:hanging="360"/>
+      </w:pPr>
+      <w:rPr>
+        <w:rFonts w:ascii="Symbol" w:hAnsi="Symbol" w:hint="default"/>
+        <w:sz w:val="20"/>
+      </w:rPr>
+    </w:lvl>
+    <w:lvl w:ilvl="1" w:tentative="1">
+      <w:start w:val="1"/>
+      <w:numFmt w:val="bullet"/>
+      <w:lvlText w:val="o"/>
+      <w:lvlJc w:val="left"/>
+      <w:pPr>
+        <w:tabs>
+          <w:tab w:val="num" w:pos="1440"/>
+        </w:tabs>
+        <w:ind w:left="1440" w:hanging="360"/>
+      </w:pPr>
+      <w:rPr>
+        <w:rFonts w:ascii="Courier New" w:hAnsi="Courier New" w:hint="default"/>
+        <w:sz w:val="20"/>
+      </w:rPr>
+    </w:lvl>
+    <w:lvl w:ilvl="2" w:tentative="1">
+      <w:start w:val="1"/>
+      <w:numFmt w:val="bullet"/>
+      <w:lvlText w:val=""/>
+      <w:lvlJc w:val="left"/>
+      <w:pPr>
+        <w:tabs>
+          <w:tab w:val="num" w:pos="2160"/>
+        </w:tabs>
+        <w:ind w:left="2160" w:hanging="360"/>
+      </w:pPr>
+      <w:rPr>
+        <w:rFonts w:ascii="Wingdings" w:hAnsi="Wingdings" w:hint="default"/>
+        <w:sz w:val="20"/>
+      </w:rPr>
+    </w:lvl>
+    <w:lvl w:ilvl="3" w:tentative="1">
+      <w:start w:val="1"/>
+      <w:numFmt w:val="bullet"/>
+      <w:lvlText w:val=""/>
+      <w:lvlJc w:val="left"/>
+      <w:pPr>
+        <w:tabs>
+          <w:tab w:val="num" w:pos="2880"/>
+        </w:tabs>
+        <w:ind w:left="2880" w:hanging="360"/>
+      </w:pPr>
+      <w:rPr>
+        <w:rFonts w:ascii="Wingdings" w:hAnsi="Wingdings" w:hint="default"/>
+        <w:sz w:val="20"/>
+      </w:rPr>
+    </w:lvl>
+    <w:lvl w:ilvl="4" w:tentative="1">
+      <w:start w:val="1"/>
+      <w:numFmt w:val="bullet"/>
+      <w:lvlText w:val=""/>
+      <w:lvlJc w:val="left"/>
+      <w:pPr>
+        <w:tabs>
+          <w:tab w:val="num" w:pos="3600"/>
+        </w:tabs>
+        <w:ind w:left="3600" w:hanging="360"/>
+      </w:pPr>
+      <w:rPr>
+        <w:rFonts w:ascii="Wingdings" w:hAnsi="Wingdings" w:hint="default"/>
+        <w:sz w:val="20"/>
+      </w:rPr>
+    </w:lvl>
+    <w:lvl w:ilvl="5" w:tentative="1">
+      <w:start w:val="1"/>
+      <w:numFmt w:val="bullet"/>
+      <w:lvlText w:val=""/>
+      <w:lvlJc w:val="left"/>
+      <w:pPr>
+        <w:tabs>
+          <w:tab w:val="num" w:pos="4320"/>
+        </w:tabs>
+        <w:ind w:left="4320" w:hanging="360"/>
+      </w:pPr>
+      <w:rPr>
+        <w:rFonts w:ascii="Wingdings" w:hAnsi="Wingdings" w:hint="default"/>
+        <w:sz w:val="20"/>
+      </w:rPr>
+    </w:lvl>
+    <w:lvl w:ilvl="6" w:tentative="1">
+      <w:start w:val="1"/>
+      <w:numFmt w:val="bullet"/>
+      <w:lvlText w:val=""/>
+      <w:lvlJc w:val="left"/>
+      <w:pPr>
+        <w:tabs>
+          <w:tab w:val="num" w:pos="5040"/>
+        </w:tabs>
+        <w:ind w:left="5040" w:hanging="360"/>
+      </w:pPr>
+      <w:rPr>
+        <w:rFonts w:ascii="Wingdings" w:hAnsi="Wingdings" w:hint="default"/>
+        <w:sz w:val="20"/>
+      </w:rPr>
+    </w:lvl>
+    <w:lvl w:ilvl="7" w:tentative="1">
+      <w:start w:val="1"/>
+      <w:numFmt w:val="bullet"/>
+      <w:lvlText w:val=""/>
+      <w:lvlJc w:val="left"/>
+      <w:pPr>
+        <w:tabs>
+          <w:tab w:val="num" w:pos="5760"/>
+        </w:tabs>
+        <w:ind w:left="5760" w:hanging="360"/>
+      </w:pPr>
+      <w:rPr>
+        <w:rFonts w:ascii="Wingdings" w:hAnsi="Wingdings" w:hint="default"/>
+        <w:sz w:val="20"/>
+      </w:rPr>
+    </w:lvl>
+    <w:lvl w:ilvl="8" w:tentative="1">
+      <w:start w:val="1"/>
+      <w:numFmt w:val="bullet"/>
+      <w:lvlText w:val=""/>
+      <w:lvlJc w:val="left"/>
+      <w:pPr>
+        <w:tabs>
+          <w:tab w:val="num" w:pos="6480"/>
+        </w:tabs>
+        <w:ind w:left="6480" w:hanging="360"/>
+      </w:pPr>
+      <w:rPr>
+        <w:rFonts w:ascii="Wingdings" w:hAnsi="Wingdings" w:hint="default"/>
+        <w:sz w:val="20"/>
+      </w:rPr>
+    </w:lvl>
+  </w:abstractNum>
+  <w:abstractNum w:abstractNumId="32" w15:restartNumberingAfterBreak="0">
     <w:nsid w:val="503F437F"/>
     <w:multiLevelType w:val="multilevel"/>
     <w:tmpl w:val="638E97C2"/>
@@ -7653,7 +9294,7 @@
       </w:rPr>
     </w:lvl>
   </w:abstractNum>
-  <w:abstractNum w:abstractNumId="28" w15:restartNumberingAfterBreak="0">
+  <w:abstractNum w:abstractNumId="33" w15:restartNumberingAfterBreak="0">
     <w:nsid w:val="514F1507"/>
     <w:multiLevelType w:val="multilevel"/>
     <w:tmpl w:val="BE289292"/>
@@ -7802,7 +9443,156 @@
       </w:rPr>
     </w:lvl>
   </w:abstractNum>
-  <w:abstractNum w:abstractNumId="29" w15:restartNumberingAfterBreak="0">
+  <w:abstractNum w:abstractNumId="34" w15:restartNumberingAfterBreak="0">
+    <w:nsid w:val="536460B3"/>
+    <w:multiLevelType w:val="multilevel"/>
+    <w:tmpl w:val="0ACC9C62"/>
+    <w:lvl w:ilvl="0">
+      <w:start w:val="1"/>
+      <w:numFmt w:val="bullet"/>
+      <w:lvlText w:val=""/>
+      <w:lvlJc w:val="left"/>
+      <w:pPr>
+        <w:tabs>
+          <w:tab w:val="num" w:pos="720"/>
+        </w:tabs>
+        <w:ind w:left="720" w:hanging="360"/>
+      </w:pPr>
+      <w:rPr>
+        <w:rFonts w:ascii="Symbol" w:hAnsi="Symbol" w:hint="default"/>
+        <w:sz w:val="20"/>
+      </w:rPr>
+    </w:lvl>
+    <w:lvl w:ilvl="1" w:tentative="1">
+      <w:start w:val="1"/>
+      <w:numFmt w:val="bullet"/>
+      <w:lvlText w:val="o"/>
+      <w:lvlJc w:val="left"/>
+      <w:pPr>
+        <w:tabs>
+          <w:tab w:val="num" w:pos="1440"/>
+        </w:tabs>
+        <w:ind w:left="1440" w:hanging="360"/>
+      </w:pPr>
+      <w:rPr>
+        <w:rFonts w:ascii="Courier New" w:hAnsi="Courier New" w:hint="default"/>
+        <w:sz w:val="20"/>
+      </w:rPr>
+    </w:lvl>
+    <w:lvl w:ilvl="2" w:tentative="1">
+      <w:start w:val="1"/>
+      <w:numFmt w:val="bullet"/>
+      <w:lvlText w:val=""/>
+      <w:lvlJc w:val="left"/>
+      <w:pPr>
+        <w:tabs>
+          <w:tab w:val="num" w:pos="2160"/>
+        </w:tabs>
+        <w:ind w:left="2160" w:hanging="360"/>
+      </w:pPr>
+      <w:rPr>
+        <w:rFonts w:ascii="Wingdings" w:hAnsi="Wingdings" w:hint="default"/>
+        <w:sz w:val="20"/>
+      </w:rPr>
+    </w:lvl>
+    <w:lvl w:ilvl="3" w:tentative="1">
+      <w:start w:val="1"/>
+      <w:numFmt w:val="bullet"/>
+      <w:lvlText w:val=""/>
+      <w:lvlJc w:val="left"/>
+      <w:pPr>
+        <w:tabs>
+          <w:tab w:val="num" w:pos="2880"/>
+        </w:tabs>
+        <w:ind w:left="2880" w:hanging="360"/>
+      </w:pPr>
+      <w:rPr>
+        <w:rFonts w:ascii="Wingdings" w:hAnsi="Wingdings" w:hint="default"/>
+        <w:sz w:val="20"/>
+      </w:rPr>
+    </w:lvl>
+    <w:lvl w:ilvl="4" w:tentative="1">
+      <w:start w:val="1"/>
+      <w:numFmt w:val="bullet"/>
+      <w:lvlText w:val=""/>
+      <w:lvlJc w:val="left"/>
+      <w:pPr>
+        <w:tabs>
+          <w:tab w:val="num" w:pos="3600"/>
+        </w:tabs>
+        <w:ind w:left="3600" w:hanging="360"/>
+      </w:pPr>
+      <w:rPr>
+        <w:rFonts w:ascii="Wingdings" w:hAnsi="Wingdings" w:hint="default"/>
+        <w:sz w:val="20"/>
+      </w:rPr>
+    </w:lvl>
+    <w:lvl w:ilvl="5" w:tentative="1">
+      <w:start w:val="1"/>
+      <w:numFmt w:val="bullet"/>
+      <w:lvlText w:val=""/>
+      <w:lvlJc w:val="left"/>
+      <w:pPr>
+        <w:tabs>
+          <w:tab w:val="num" w:pos="4320"/>
+        </w:tabs>
+        <w:ind w:left="4320" w:hanging="360"/>
+      </w:pPr>
+      <w:rPr>
+        <w:rFonts w:ascii="Wingdings" w:hAnsi="Wingdings" w:hint="default"/>
+        <w:sz w:val="20"/>
+      </w:rPr>
+    </w:lvl>
+    <w:lvl w:ilvl="6" w:tentative="1">
+      <w:start w:val="1"/>
+      <w:numFmt w:val="bullet"/>
+      <w:lvlText w:val=""/>
+      <w:lvlJc w:val="left"/>
+      <w:pPr>
+        <w:tabs>
+          <w:tab w:val="num" w:pos="5040"/>
+        </w:tabs>
+        <w:ind w:left="5040" w:hanging="360"/>
+      </w:pPr>
+      <w:rPr>
+        <w:rFonts w:ascii="Wingdings" w:hAnsi="Wingdings" w:hint="default"/>
+        <w:sz w:val="20"/>
+      </w:rPr>
+    </w:lvl>
+    <w:lvl w:ilvl="7" w:tentative="1">
+      <w:start w:val="1"/>
+      <w:numFmt w:val="bullet"/>
+      <w:lvlText w:val=""/>
+      <w:lvlJc w:val="left"/>
+      <w:pPr>
+        <w:tabs>
+          <w:tab w:val="num" w:pos="5760"/>
+        </w:tabs>
+        <w:ind w:left="5760" w:hanging="360"/>
+      </w:pPr>
+      <w:rPr>
+        <w:rFonts w:ascii="Wingdings" w:hAnsi="Wingdings" w:hint="default"/>
+        <w:sz w:val="20"/>
+      </w:rPr>
+    </w:lvl>
+    <w:lvl w:ilvl="8" w:tentative="1">
+      <w:start w:val="1"/>
+      <w:numFmt w:val="bullet"/>
+      <w:lvlText w:val=""/>
+      <w:lvlJc w:val="left"/>
+      <w:pPr>
+        <w:tabs>
+          <w:tab w:val="num" w:pos="6480"/>
+        </w:tabs>
+        <w:ind w:left="6480" w:hanging="360"/>
+      </w:pPr>
+      <w:rPr>
+        <w:rFonts w:ascii="Wingdings" w:hAnsi="Wingdings" w:hint="default"/>
+        <w:sz w:val="20"/>
+      </w:rPr>
+    </w:lvl>
+  </w:abstractNum>
+  <w:abstractNum w:abstractNumId="35" w15:restartNumberingAfterBreak="0">
     <w:nsid w:val="57F16EC6"/>
     <w:multiLevelType w:val="multilevel"/>
     <w:tmpl w:val="E00835D0"/>
@@ -7951,7 +9741,7 @@
       </w:rPr>
     </w:lvl>
   </w:abstractNum>
-  <w:abstractNum w:abstractNumId="30" w15:restartNumberingAfterBreak="0">
+  <w:abstractNum w:abstractNumId="36" w15:restartNumberingAfterBreak="0">
     <w:nsid w:val="58310EE2"/>
     <w:multiLevelType w:val="multilevel"/>
     <w:tmpl w:val="668C5E2C"/>
@@ -8064,7 +9854,7 @@
       </w:pPr>
     </w:lvl>
   </w:abstractNum>
-  <w:abstractNum w:abstractNumId="31" w15:restartNumberingAfterBreak="0">
+  <w:abstractNum w:abstractNumId="37" w15:restartNumberingAfterBreak="0">
     <w:nsid w:val="5834078D"/>
     <w:multiLevelType w:val="multilevel"/>
     <w:tmpl w:val="B7EC5BEE"/>
@@ -8213,7 +10003,156 @@
       </w:rPr>
     </w:lvl>
   </w:abstractNum>
-  <w:abstractNum w:abstractNumId="32" w15:restartNumberingAfterBreak="0">
+  <w:abstractNum w:abstractNumId="38" w15:restartNumberingAfterBreak="0">
+    <w:nsid w:val="58F734F6"/>
+    <w:multiLevelType w:val="multilevel"/>
+    <w:tmpl w:val="EF064D90"/>
+    <w:lvl w:ilvl="0">
+      <w:start w:val="1"/>
+      <w:numFmt w:val="bullet"/>
+      <w:lvlText w:val=""/>
+      <w:lvlJc w:val="left"/>
+      <w:pPr>
+        <w:tabs>
+          <w:tab w:val="num" w:pos="720"/>
+        </w:tabs>
+        <w:ind w:left="720" w:hanging="360"/>
+      </w:pPr>
+      <w:rPr>
+        <w:rFonts w:ascii="Symbol" w:hAnsi="Symbol" w:hint="default"/>
+        <w:sz w:val="20"/>
+      </w:rPr>
+    </w:lvl>
+    <w:lvl w:ilvl="1" w:tentative="1">
+      <w:start w:val="1"/>
+      <w:numFmt w:val="bullet"/>
+      <w:lvlText w:val="o"/>
+      <w:lvlJc w:val="left"/>
+      <w:pPr>
+        <w:tabs>
+          <w:tab w:val="num" w:pos="1440"/>
+        </w:tabs>
+        <w:ind w:left="1440" w:hanging="360"/>
+      </w:pPr>
+      <w:rPr>
+        <w:rFonts w:ascii="Courier New" w:hAnsi="Courier New" w:hint="default"/>
+        <w:sz w:val="20"/>
+      </w:rPr>
+    </w:lvl>
+    <w:lvl w:ilvl="2" w:tentative="1">
+      <w:start w:val="1"/>
+      <w:numFmt w:val="bullet"/>
+      <w:lvlText w:val=""/>
+      <w:lvlJc w:val="left"/>
+      <w:pPr>
+        <w:tabs>
+          <w:tab w:val="num" w:pos="2160"/>
+        </w:tabs>
+        <w:ind w:left="2160" w:hanging="360"/>
+      </w:pPr>
+      <w:rPr>
+        <w:rFonts w:ascii="Wingdings" w:hAnsi="Wingdings" w:hint="default"/>
+        <w:sz w:val="20"/>
+      </w:rPr>
+    </w:lvl>
+    <w:lvl w:ilvl="3" w:tentative="1">
+      <w:start w:val="1"/>
+      <w:numFmt w:val="bullet"/>
+      <w:lvlText w:val=""/>
+      <w:lvlJc w:val="left"/>
+      <w:pPr>
+        <w:tabs>
+          <w:tab w:val="num" w:pos="2880"/>
+        </w:tabs>
+        <w:ind w:left="2880" w:hanging="360"/>
+      </w:pPr>
+      <w:rPr>
+        <w:rFonts w:ascii="Wingdings" w:hAnsi="Wingdings" w:hint="default"/>
+        <w:sz w:val="20"/>
+      </w:rPr>
+    </w:lvl>
+    <w:lvl w:ilvl="4" w:tentative="1">
+      <w:start w:val="1"/>
+      <w:numFmt w:val="bullet"/>
+      <w:lvlText w:val=""/>
+      <w:lvlJc w:val="left"/>
+      <w:pPr>
+        <w:tabs>
+          <w:tab w:val="num" w:pos="3600"/>
+        </w:tabs>
+        <w:ind w:left="3600" w:hanging="360"/>
+      </w:pPr>
+      <w:rPr>
+        <w:rFonts w:ascii="Wingdings" w:hAnsi="Wingdings" w:hint="default"/>
+        <w:sz w:val="20"/>
+      </w:rPr>
+    </w:lvl>
+    <w:lvl w:ilvl="5" w:tentative="1">
+      <w:start w:val="1"/>
+      <w:numFmt w:val="bullet"/>
+      <w:lvlText w:val=""/>
+      <w:lvlJc w:val="left"/>
+      <w:pPr>
+        <w:tabs>
+          <w:tab w:val="num" w:pos="4320"/>
+        </w:tabs>
+        <w:ind w:left="4320" w:hanging="360"/>
+      </w:pPr>
+      <w:rPr>
+        <w:rFonts w:ascii="Wingdings" w:hAnsi="Wingdings" w:hint="default"/>
+        <w:sz w:val="20"/>
+      </w:rPr>
+    </w:lvl>
+    <w:lvl w:ilvl="6" w:tentative="1">
+      <w:start w:val="1"/>
+      <w:numFmt w:val="bullet"/>
+      <w:lvlText w:val=""/>
+      <w:lvlJc w:val="left"/>
+      <w:pPr>
+        <w:tabs>
+          <w:tab w:val="num" w:pos="5040"/>
+        </w:tabs>
+        <w:ind w:left="5040" w:hanging="360"/>
+      </w:pPr>
+      <w:rPr>
+        <w:rFonts w:ascii="Wingdings" w:hAnsi="Wingdings" w:hint="default"/>
+        <w:sz w:val="20"/>
+      </w:rPr>
+    </w:lvl>
+    <w:lvl w:ilvl="7" w:tentative="1">
+      <w:start w:val="1"/>
+      <w:numFmt w:val="bullet"/>
+      <w:lvlText w:val=""/>
+      <w:lvlJc w:val="left"/>
+      <w:pPr>
+        <w:tabs>
+          <w:tab w:val="num" w:pos="5760"/>
+        </w:tabs>
+        <w:ind w:left="5760" w:hanging="360"/>
+      </w:pPr>
+      <w:rPr>
+        <w:rFonts w:ascii="Wingdings" w:hAnsi="Wingdings" w:hint="default"/>
+        <w:sz w:val="20"/>
+      </w:rPr>
+    </w:lvl>
+    <w:lvl w:ilvl="8" w:tentative="1">
+      <w:start w:val="1"/>
+      <w:numFmt w:val="bullet"/>
+      <w:lvlText w:val=""/>
+      <w:lvlJc w:val="left"/>
+      <w:pPr>
+        <w:tabs>
+          <w:tab w:val="num" w:pos="6480"/>
+        </w:tabs>
+        <w:ind w:left="6480" w:hanging="360"/>
+      </w:pPr>
+      <w:rPr>
+        <w:rFonts w:ascii="Wingdings" w:hAnsi="Wingdings" w:hint="default"/>
+        <w:sz w:val="20"/>
+      </w:rPr>
+    </w:lvl>
+  </w:abstractNum>
+  <w:abstractNum w:abstractNumId="39" w15:restartNumberingAfterBreak="0">
     <w:nsid w:val="5C1F5117"/>
     <w:multiLevelType w:val="multilevel"/>
     <w:tmpl w:val="538A43B2"/>
@@ -8362,7 +10301,7 @@
       </w:rPr>
     </w:lvl>
   </w:abstractNum>
-  <w:abstractNum w:abstractNumId="33" w15:restartNumberingAfterBreak="0">
+  <w:abstractNum w:abstractNumId="40" w15:restartNumberingAfterBreak="0">
     <w:nsid w:val="5DF96BE6"/>
     <w:multiLevelType w:val="multilevel"/>
     <w:tmpl w:val="4054486A"/>
@@ -8511,7 +10450,156 @@
       </w:rPr>
     </w:lvl>
   </w:abstractNum>
-  <w:abstractNum w:abstractNumId="34" w15:restartNumberingAfterBreak="0">
+  <w:abstractNum w:abstractNumId="41" w15:restartNumberingAfterBreak="0">
+    <w:nsid w:val="6F364392"/>
+    <w:multiLevelType w:val="multilevel"/>
+    <w:tmpl w:val="E9505532"/>
+    <w:lvl w:ilvl="0">
+      <w:start w:val="1"/>
+      <w:numFmt w:val="bullet"/>
+      <w:lvlText w:val=""/>
+      <w:lvlJc w:val="left"/>
+      <w:pPr>
+        <w:tabs>
+          <w:tab w:val="num" w:pos="720"/>
+        </w:tabs>
+        <w:ind w:left="720" w:hanging="360"/>
+      </w:pPr>
+      <w:rPr>
+        <w:rFonts w:ascii="Symbol" w:hAnsi="Symbol" w:hint="default"/>
+        <w:sz w:val="20"/>
+      </w:rPr>
+    </w:lvl>
+    <w:lvl w:ilvl="1" w:tentative="1">
+      <w:start w:val="1"/>
+      <w:numFmt w:val="bullet"/>
+      <w:lvlText w:val="o"/>
+      <w:lvlJc w:val="left"/>
+      <w:pPr>
+        <w:tabs>
+          <w:tab w:val="num" w:pos="1440"/>
+        </w:tabs>
+        <w:ind w:left="1440" w:hanging="360"/>
+      </w:pPr>
+      <w:rPr>
+        <w:rFonts w:ascii="Courier New" w:hAnsi="Courier New" w:hint="default"/>
+        <w:sz w:val="20"/>
+      </w:rPr>
+    </w:lvl>
+    <w:lvl w:ilvl="2" w:tentative="1">
+      <w:start w:val="1"/>
+      <w:numFmt w:val="bullet"/>
+      <w:lvlText w:val=""/>
+      <w:lvlJc w:val="left"/>
+      <w:pPr>
+        <w:tabs>
+          <w:tab w:val="num" w:pos="2160"/>
+        </w:tabs>
+        <w:ind w:left="2160" w:hanging="360"/>
+      </w:pPr>
+      <w:rPr>
+        <w:rFonts w:ascii="Wingdings" w:hAnsi="Wingdings" w:hint="default"/>
+        <w:sz w:val="20"/>
+      </w:rPr>
+    </w:lvl>
+    <w:lvl w:ilvl="3" w:tentative="1">
+      <w:start w:val="1"/>
+      <w:numFmt w:val="bullet"/>
+      <w:lvlText w:val=""/>
+      <w:lvlJc w:val="left"/>
+      <w:pPr>
+        <w:tabs>
+          <w:tab w:val="num" w:pos="2880"/>
+        </w:tabs>
+        <w:ind w:left="2880" w:hanging="360"/>
+      </w:pPr>
+      <w:rPr>
+        <w:rFonts w:ascii="Wingdings" w:hAnsi="Wingdings" w:hint="default"/>
+        <w:sz w:val="20"/>
+      </w:rPr>
+    </w:lvl>
+    <w:lvl w:ilvl="4" w:tentative="1">
+      <w:start w:val="1"/>
+      <w:numFmt w:val="bullet"/>
+      <w:lvlText w:val=""/>
+      <w:lvlJc w:val="left"/>
+      <w:pPr>
+        <w:tabs>
+          <w:tab w:val="num" w:pos="3600"/>
+        </w:tabs>
+        <w:ind w:left="3600" w:hanging="360"/>
+      </w:pPr>
+      <w:rPr>
+        <w:rFonts w:ascii="Wingdings" w:hAnsi="Wingdings" w:hint="default"/>
+        <w:sz w:val="20"/>
+      </w:rPr>
+    </w:lvl>
+    <w:lvl w:ilvl="5" w:tentative="1">
+      <w:start w:val="1"/>
+      <w:numFmt w:val="bullet"/>
+      <w:lvlText w:val=""/>
+      <w:lvlJc w:val="left"/>
+      <w:pPr>
+        <w:tabs>
+          <w:tab w:val="num" w:pos="4320"/>
+        </w:tabs>
+        <w:ind w:left="4320" w:hanging="360"/>
+      </w:pPr>
+      <w:rPr>
+        <w:rFonts w:ascii="Wingdings" w:hAnsi="Wingdings" w:hint="default"/>
+        <w:sz w:val="20"/>
+      </w:rPr>
+    </w:lvl>
+    <w:lvl w:ilvl="6" w:tentative="1">
+      <w:start w:val="1"/>
+      <w:numFmt w:val="bullet"/>
+      <w:lvlText w:val=""/>
+      <w:lvlJc w:val="left"/>
+      <w:pPr>
+        <w:tabs>
+          <w:tab w:val="num" w:pos="5040"/>
+        </w:tabs>
+        <w:ind w:left="5040" w:hanging="360"/>
+      </w:pPr>
+      <w:rPr>
+        <w:rFonts w:ascii="Wingdings" w:hAnsi="Wingdings" w:hint="default"/>
+        <w:sz w:val="20"/>
+      </w:rPr>
+    </w:lvl>
+    <w:lvl w:ilvl="7" w:tentative="1">
+      <w:start w:val="1"/>
+      <w:numFmt w:val="bullet"/>
+      <w:lvlText w:val=""/>
+      <w:lvlJc w:val="left"/>
+      <w:pPr>
+        <w:tabs>
+          <w:tab w:val="num" w:pos="5760"/>
+        </w:tabs>
+        <w:ind w:left="5760" w:hanging="360"/>
+      </w:pPr>
+      <w:rPr>
+        <w:rFonts w:ascii="Wingdings" w:hAnsi="Wingdings" w:hint="default"/>
+        <w:sz w:val="20"/>
+      </w:rPr>
+    </w:lvl>
+    <w:lvl w:ilvl="8" w:tentative="1">
+      <w:start w:val="1"/>
+      <w:numFmt w:val="bullet"/>
+      <w:lvlText w:val=""/>
+      <w:lvlJc w:val="left"/>
+      <w:pPr>
+        <w:tabs>
+          <w:tab w:val="num" w:pos="6480"/>
+        </w:tabs>
+        <w:ind w:left="6480" w:hanging="360"/>
+      </w:pPr>
+      <w:rPr>
+        <w:rFonts w:ascii="Wingdings" w:hAnsi="Wingdings" w:hint="default"/>
+        <w:sz w:val="20"/>
+      </w:rPr>
+    </w:lvl>
+  </w:abstractNum>
+  <w:abstractNum w:abstractNumId="42" w15:restartNumberingAfterBreak="0">
     <w:nsid w:val="72031CF4"/>
     <w:multiLevelType w:val="multilevel"/>
     <w:tmpl w:val="E808156C"/>
@@ -8660,7 +10748,7 @@
       </w:rPr>
     </w:lvl>
   </w:abstractNum>
-  <w:abstractNum w:abstractNumId="35" w15:restartNumberingAfterBreak="0">
+  <w:abstractNum w:abstractNumId="43" w15:restartNumberingAfterBreak="0">
     <w:nsid w:val="73E27E35"/>
     <w:multiLevelType w:val="multilevel"/>
     <w:tmpl w:val="1452DBEA"/>
@@ -8809,7 +10897,7 @@
       </w:rPr>
     </w:lvl>
   </w:abstractNum>
-  <w:abstractNum w:abstractNumId="36" w15:restartNumberingAfterBreak="0">
+  <w:abstractNum w:abstractNumId="44" w15:restartNumberingAfterBreak="0">
     <w:nsid w:val="776B0E68"/>
     <w:multiLevelType w:val="multilevel"/>
     <w:tmpl w:val="B92691EC"/>
@@ -8958,7 +11046,7 @@
       </w:rPr>
     </w:lvl>
   </w:abstractNum>
-  <w:abstractNum w:abstractNumId="37" w15:restartNumberingAfterBreak="0">
+  <w:abstractNum w:abstractNumId="45" w15:restartNumberingAfterBreak="0">
     <w:nsid w:val="78C448DC"/>
     <w:multiLevelType w:val="multilevel"/>
     <w:tmpl w:val="C13E05A8"/>
@@ -9107,119 +11195,295 @@
       </w:rPr>
     </w:lvl>
   </w:abstractNum>
+  <w:abstractNum w:abstractNumId="46" w15:restartNumberingAfterBreak="0">
+    <w:nsid w:val="7A933BC1"/>
+    <w:multiLevelType w:val="multilevel"/>
+    <w:tmpl w:val="3F7859C2"/>
+    <w:lvl w:ilvl="0">
+      <w:start w:val="1"/>
+      <w:numFmt w:val="bullet"/>
+      <w:lvlText w:val=""/>
+      <w:lvlJc w:val="left"/>
+      <w:pPr>
+        <w:tabs>
+          <w:tab w:val="num" w:pos="720"/>
+        </w:tabs>
+        <w:ind w:left="720" w:hanging="360"/>
+      </w:pPr>
+      <w:rPr>
+        <w:rFonts w:ascii="Symbol" w:hAnsi="Symbol" w:hint="default"/>
+        <w:sz w:val="20"/>
+      </w:rPr>
+    </w:lvl>
+    <w:lvl w:ilvl="1" w:tentative="1">
+      <w:start w:val="1"/>
+      <w:numFmt w:val="bullet"/>
+      <w:lvlText w:val="o"/>
+      <w:lvlJc w:val="left"/>
+      <w:pPr>
+        <w:tabs>
+          <w:tab w:val="num" w:pos="1440"/>
+        </w:tabs>
+        <w:ind w:left="1440" w:hanging="360"/>
+      </w:pPr>
+      <w:rPr>
+        <w:rFonts w:ascii="Courier New" w:hAnsi="Courier New" w:hint="default"/>
+        <w:sz w:val="20"/>
+      </w:rPr>
+    </w:lvl>
+    <w:lvl w:ilvl="2" w:tentative="1">
+      <w:start w:val="1"/>
+      <w:numFmt w:val="bullet"/>
+      <w:lvlText w:val=""/>
+      <w:lvlJc w:val="left"/>
+      <w:pPr>
+        <w:tabs>
+          <w:tab w:val="num" w:pos="2160"/>
+        </w:tabs>
+        <w:ind w:left="2160" w:hanging="360"/>
+      </w:pPr>
+      <w:rPr>
+        <w:rFonts w:ascii="Wingdings" w:hAnsi="Wingdings" w:hint="default"/>
+        <w:sz w:val="20"/>
+      </w:rPr>
+    </w:lvl>
+    <w:lvl w:ilvl="3" w:tentative="1">
+      <w:start w:val="1"/>
+      <w:numFmt w:val="bullet"/>
+      <w:lvlText w:val=""/>
+      <w:lvlJc w:val="left"/>
+      <w:pPr>
+        <w:tabs>
+          <w:tab w:val="num" w:pos="2880"/>
+        </w:tabs>
+        <w:ind w:left="2880" w:hanging="360"/>
+      </w:pPr>
+      <w:rPr>
+        <w:rFonts w:ascii="Wingdings" w:hAnsi="Wingdings" w:hint="default"/>
+        <w:sz w:val="20"/>
+      </w:rPr>
+    </w:lvl>
+    <w:lvl w:ilvl="4" w:tentative="1">
+      <w:start w:val="1"/>
+      <w:numFmt w:val="bullet"/>
+      <w:lvlText w:val=""/>
+      <w:lvlJc w:val="left"/>
+      <w:pPr>
+        <w:tabs>
+          <w:tab w:val="num" w:pos="3600"/>
+        </w:tabs>
+        <w:ind w:left="3600" w:hanging="360"/>
+      </w:pPr>
+      <w:rPr>
+        <w:rFonts w:ascii="Wingdings" w:hAnsi="Wingdings" w:hint="default"/>
+        <w:sz w:val="20"/>
+      </w:rPr>
+    </w:lvl>
+    <w:lvl w:ilvl="5" w:tentative="1">
+      <w:start w:val="1"/>
+      <w:numFmt w:val="bullet"/>
+      <w:lvlText w:val=""/>
+      <w:lvlJc w:val="left"/>
+      <w:pPr>
+        <w:tabs>
+          <w:tab w:val="num" w:pos="4320"/>
+        </w:tabs>
+        <w:ind w:left="4320" w:hanging="360"/>
+      </w:pPr>
+      <w:rPr>
+        <w:rFonts w:ascii="Wingdings" w:hAnsi="Wingdings" w:hint="default"/>
+        <w:sz w:val="20"/>
+      </w:rPr>
+    </w:lvl>
+    <w:lvl w:ilvl="6" w:tentative="1">
+      <w:start w:val="1"/>
+      <w:numFmt w:val="bullet"/>
+      <w:lvlText w:val=""/>
+      <w:lvlJc w:val="left"/>
+      <w:pPr>
+        <w:tabs>
+          <w:tab w:val="num" w:pos="5040"/>
+        </w:tabs>
+        <w:ind w:left="5040" w:hanging="360"/>
+      </w:pPr>
+      <w:rPr>
+        <w:rFonts w:ascii="Wingdings" w:hAnsi="Wingdings" w:hint="default"/>
+        <w:sz w:val="20"/>
+      </w:rPr>
+    </w:lvl>
+    <w:lvl w:ilvl="7" w:tentative="1">
+      <w:start w:val="1"/>
+      <w:numFmt w:val="bullet"/>
+      <w:lvlText w:val=""/>
+      <w:lvlJc w:val="left"/>
+      <w:pPr>
+        <w:tabs>
+          <w:tab w:val="num" w:pos="5760"/>
+        </w:tabs>
+        <w:ind w:left="5760" w:hanging="360"/>
+      </w:pPr>
+      <w:rPr>
+        <w:rFonts w:ascii="Wingdings" w:hAnsi="Wingdings" w:hint="default"/>
+        <w:sz w:val="20"/>
+      </w:rPr>
+    </w:lvl>
+    <w:lvl w:ilvl="8" w:tentative="1">
+      <w:start w:val="1"/>
+      <w:numFmt w:val="bullet"/>
+      <w:lvlText w:val=""/>
+      <w:lvlJc w:val="left"/>
+      <w:pPr>
+        <w:tabs>
+          <w:tab w:val="num" w:pos="6480"/>
+        </w:tabs>
+        <w:ind w:left="6480" w:hanging="360"/>
+      </w:pPr>
+      <w:rPr>
+        <w:rFonts w:ascii="Wingdings" w:hAnsi="Wingdings" w:hint="default"/>
+        <w:sz w:val="20"/>
+      </w:rPr>
+    </w:lvl>
+  </w:abstractNum>
   <w:num w:numId="1" w16cid:durableId="94332662">
-    <w:abstractNumId w:val="20"/>
+    <w:abstractNumId w:val="21"/>
   </w:num>
   <w:num w:numId="2" w16cid:durableId="1113944286">
+    <w:abstractNumId w:val="44"/>
+  </w:num>
+  <w:num w:numId="3" w16cid:durableId="1058550911">
+    <w:abstractNumId w:val="5"/>
+  </w:num>
+  <w:num w:numId="4" w16cid:durableId="538396424">
+    <w:abstractNumId w:val="10"/>
+  </w:num>
+  <w:num w:numId="5" w16cid:durableId="975186975">
+    <w:abstractNumId w:val="29"/>
+  </w:num>
+  <w:num w:numId="6" w16cid:durableId="1814329753">
     <w:abstractNumId w:val="36"/>
   </w:num>
-  <w:num w:numId="3" w16cid:durableId="1058550911">
-    <w:abstractNumId w:val="4"/>
-  </w:num>
-  <w:num w:numId="4" w16cid:durableId="538396424">
-    <w:abstractNumId w:val="9"/>
-  </w:num>
-  <w:num w:numId="5" w16cid:durableId="975186975">
-    <w:abstractNumId w:val="26"/>
-  </w:num>
-  <w:num w:numId="6" w16cid:durableId="1814329753">
-    <w:abstractNumId w:val="30"/>
-  </w:num>
   <w:num w:numId="7" w16cid:durableId="1173690040">
-    <w:abstractNumId w:val="28"/>
+    <w:abstractNumId w:val="33"/>
   </w:num>
   <w:num w:numId="8" w16cid:durableId="331109436">
-    <w:abstractNumId w:val="2"/>
+    <w:abstractNumId w:val="3"/>
   </w:num>
   <w:num w:numId="9" w16cid:durableId="1001393496">
-    <w:abstractNumId w:val="17"/>
+    <w:abstractNumId w:val="18"/>
   </w:num>
   <w:num w:numId="10" w16cid:durableId="414399510">
-    <w:abstractNumId w:val="14"/>
+    <w:abstractNumId w:val="15"/>
   </w:num>
   <w:num w:numId="11" w16cid:durableId="1630815640">
-    <w:abstractNumId w:val="22"/>
+    <w:abstractNumId w:val="23"/>
   </w:num>
   <w:num w:numId="12" w16cid:durableId="247927921">
     <w:abstractNumId w:val="0"/>
   </w:num>
   <w:num w:numId="13" w16cid:durableId="1879511623">
-    <w:abstractNumId w:val="10"/>
+    <w:abstractNumId w:val="11"/>
   </w:num>
   <w:num w:numId="14" w16cid:durableId="1835563121">
-    <w:abstractNumId w:val="33"/>
+    <w:abstractNumId w:val="40"/>
   </w:num>
   <w:num w:numId="15" w16cid:durableId="1333878340">
-    <w:abstractNumId w:val="29"/>
+    <w:abstractNumId w:val="35"/>
   </w:num>
   <w:num w:numId="16" w16cid:durableId="734543948">
+    <w:abstractNumId w:val="37"/>
+  </w:num>
+  <w:num w:numId="17" w16cid:durableId="1431580308">
+    <w:abstractNumId w:val="16"/>
+  </w:num>
+  <w:num w:numId="18" w16cid:durableId="238711473">
+    <w:abstractNumId w:val="45"/>
+  </w:num>
+  <w:num w:numId="19" w16cid:durableId="1198078395">
+    <w:abstractNumId w:val="6"/>
+  </w:num>
+  <w:num w:numId="20" w16cid:durableId="2006467281">
+    <w:abstractNumId w:val="32"/>
+  </w:num>
+  <w:num w:numId="21" w16cid:durableId="278336639">
+    <w:abstractNumId w:val="8"/>
+  </w:num>
+  <w:num w:numId="22" w16cid:durableId="2019650626">
+    <w:abstractNumId w:val="22"/>
+  </w:num>
+  <w:num w:numId="23" w16cid:durableId="1858544659">
+    <w:abstractNumId w:val="20"/>
+  </w:num>
+  <w:num w:numId="24" w16cid:durableId="915210875">
+    <w:abstractNumId w:val="27"/>
+  </w:num>
+  <w:num w:numId="25" w16cid:durableId="1719207101">
+    <w:abstractNumId w:val="28"/>
+  </w:num>
+  <w:num w:numId="26" w16cid:durableId="128400261">
+    <w:abstractNumId w:val="39"/>
+  </w:num>
+  <w:num w:numId="27" w16cid:durableId="502208126">
+    <w:abstractNumId w:val="4"/>
+  </w:num>
+  <w:num w:numId="28" w16cid:durableId="285426373">
+    <w:abstractNumId w:val="14"/>
+  </w:num>
+  <w:num w:numId="29" w16cid:durableId="923565524">
+    <w:abstractNumId w:val="13"/>
+  </w:num>
+  <w:num w:numId="30" w16cid:durableId="18164325">
+    <w:abstractNumId w:val="17"/>
+  </w:num>
+  <w:num w:numId="31" w16cid:durableId="1772823898">
+    <w:abstractNumId w:val="12"/>
+  </w:num>
+  <w:num w:numId="32" w16cid:durableId="971520924">
+    <w:abstractNumId w:val="9"/>
+  </w:num>
+  <w:num w:numId="33" w16cid:durableId="170461905">
+    <w:abstractNumId w:val="42"/>
+  </w:num>
+  <w:num w:numId="34" w16cid:durableId="469247231">
+    <w:abstractNumId w:val="19"/>
+  </w:num>
+  <w:num w:numId="35" w16cid:durableId="1646396441">
+    <w:abstractNumId w:val="2"/>
+  </w:num>
+  <w:num w:numId="36" w16cid:durableId="1964575246">
+    <w:abstractNumId w:val="24"/>
+  </w:num>
+  <w:num w:numId="37" w16cid:durableId="2135904848">
+    <w:abstractNumId w:val="7"/>
+  </w:num>
+  <w:num w:numId="38" w16cid:durableId="47186873">
+    <w:abstractNumId w:val="43"/>
+  </w:num>
+  <w:num w:numId="39" w16cid:durableId="1332949133">
+    <w:abstractNumId w:val="25"/>
+  </w:num>
+  <w:num w:numId="40" w16cid:durableId="1257061698">
+    <w:abstractNumId w:val="30"/>
+  </w:num>
+  <w:num w:numId="41" w16cid:durableId="1490832183">
+    <w:abstractNumId w:val="41"/>
+  </w:num>
+  <w:num w:numId="42" w16cid:durableId="1082139732">
+    <w:abstractNumId w:val="1"/>
+  </w:num>
+  <w:num w:numId="43" w16cid:durableId="1711949946">
     <w:abstractNumId w:val="31"/>
   </w:num>
-  <w:num w:numId="17" w16cid:durableId="1431580308">
-    <w:abstractNumId w:val="15"/>
+  <w:num w:numId="44" w16cid:durableId="1145319860">
+    <w:abstractNumId w:val="26"/>
   </w:num>
-  <w:num w:numId="18" w16cid:durableId="238711473">
-    <w:abstractNumId w:val="37"/>
+  <w:num w:numId="45" w16cid:durableId="1952545649">
+    <w:abstractNumId w:val="46"/>
   </w:num>
-  <w:num w:numId="19" w16cid:durableId="1198078395">
-    <w:abstractNumId w:val="5"/>
+  <w:num w:numId="46" w16cid:durableId="2043048563">
+    <w:abstractNumId w:val="38"/>
   </w:num>
-  <w:num w:numId="20" w16cid:durableId="2006467281">
-    <w:abstractNumId w:val="27"/>
-  </w:num>
-  <w:num w:numId="21" w16cid:durableId="278336639">
-    <w:abstractNumId w:val="7"/>
-  </w:num>
-  <w:num w:numId="22" w16cid:durableId="2019650626">
-    <w:abstractNumId w:val="21"/>
-  </w:num>
-  <w:num w:numId="23" w16cid:durableId="1858544659">
-    <w:abstractNumId w:val="19"/>
-  </w:num>
-  <w:num w:numId="24" w16cid:durableId="915210875">
-    <w:abstractNumId w:val="24"/>
-  </w:num>
-  <w:num w:numId="25" w16cid:durableId="1719207101">
-    <w:abstractNumId w:val="25"/>
-  </w:num>
-  <w:num w:numId="26" w16cid:durableId="128400261">
-    <w:abstractNumId w:val="32"/>
-  </w:num>
-  <w:num w:numId="27" w16cid:durableId="502208126">
-    <w:abstractNumId w:val="3"/>
-  </w:num>
-  <w:num w:numId="28" w16cid:durableId="285426373">
-    <w:abstractNumId w:val="13"/>
-  </w:num>
-  <w:num w:numId="29" w16cid:durableId="923565524">
-    <w:abstractNumId w:val="12"/>
-  </w:num>
-  <w:num w:numId="30" w16cid:durableId="18164325">
-    <w:abstractNumId w:val="16"/>
-  </w:num>
-  <w:num w:numId="31" w16cid:durableId="1772823898">
-    <w:abstractNumId w:val="11"/>
-  </w:num>
-  <w:num w:numId="32" w16cid:durableId="971520924">
-    <w:abstractNumId w:val="8"/>
-  </w:num>
-  <w:num w:numId="33" w16cid:durableId="170461905">
+  <w:num w:numId="47" w16cid:durableId="1465924742">
     <w:abstractNumId w:val="34"/>
-  </w:num>
-  <w:num w:numId="34" w16cid:durableId="469247231">
-    <w:abstractNumId w:val="18"/>
-  </w:num>
-  <w:num w:numId="35" w16cid:durableId="1646396441">
-    <w:abstractNumId w:val="1"/>
-  </w:num>
-  <w:num w:numId="36" w16cid:durableId="1964575246">
-    <w:abstractNumId w:val="23"/>
-  </w:num>
-  <w:num w:numId="37" w16cid:durableId="2135904848">
-    <w:abstractNumId w:val="6"/>
-  </w:num>
-  <w:num w:numId="38" w16cid:durableId="47186873">
-    <w:abstractNumId w:val="35"/>
   </w:num>
 </w:numbering>
 </file>

</xml_diff>

<commit_message>
Dia 31: Errores comunes en sistemas LLM
</commit_message>
<xml_diff>
--- a/Sistemas híbridos ML + LLM/Sistemas híbridos ML + LLM.docx
+++ b/Sistemas híbridos ML + LLM/Sistemas híbridos ML + LLM.docx
@@ -80,8 +80,13 @@
           <w:numId w:val="1"/>
         </w:numPr>
       </w:pPr>
-      <w:r>
-        <w:t>Random Forest → estabilidad</w:t>
+      <w:proofErr w:type="spellStart"/>
+      <w:r>
+        <w:t>Random</w:t>
+      </w:r>
+      <w:proofErr w:type="spellEnd"/>
+      <w:r>
+        <w:t xml:space="preserve"> Forest → estabilidad</w:t>
       </w:r>
     </w:p>
     <w:p>
@@ -103,7 +108,23 @@
         </w:numPr>
       </w:pPr>
       <w:r>
-        <w:t>Métricas → accuracy, recall, F1</w:t>
+        <w:t xml:space="preserve">Métricas → </w:t>
+      </w:r>
+      <w:proofErr w:type="spellStart"/>
+      <w:r>
+        <w:t>accuracy</w:t>
+      </w:r>
+      <w:proofErr w:type="spellEnd"/>
+      <w:r>
+        <w:t xml:space="preserve">, </w:t>
+      </w:r>
+      <w:proofErr w:type="spellStart"/>
+      <w:r>
+        <w:t>recall</w:t>
+      </w:r>
+      <w:proofErr w:type="spellEnd"/>
+      <w:r>
+        <w:t>, F1</w:t>
       </w:r>
     </w:p>
     <w:p>
@@ -268,7 +289,15 @@
         <w:t>generativo y probabilístico</w:t>
       </w:r>
       <w:r>
-        <w:t>, no un clasificador entrenado en tu dataset.</w:t>
+        <w:t xml:space="preserve">, no un clasificador entrenado en tu </w:t>
+      </w:r>
+      <w:proofErr w:type="spellStart"/>
+      <w:r>
+        <w:t>dataset</w:t>
+      </w:r>
+      <w:proofErr w:type="spellEnd"/>
+      <w:r>
+        <w:t>.</w:t>
       </w:r>
     </w:p>
     <w:p>
@@ -985,8 +1014,13 @@
         </w:numPr>
       </w:pPr>
       <w:r>
-        <w:t>LLM propone features</w:t>
-      </w:r>
+        <w:t xml:space="preserve">LLM propone </w:t>
+      </w:r>
+      <w:proofErr w:type="spellStart"/>
+      <w:r>
+        <w:t>features</w:t>
+      </w:r>
+      <w:proofErr w:type="spellEnd"/>
     </w:p>
     <w:p>
       <w:pPr>
@@ -1248,7 +1282,23 @@
         </w:numPr>
       </w:pPr>
       <w:r>
-        <w:t>Se necesitan métricas (accuracy, recall, riesgo, score)</w:t>
+        <w:t>Se necesitan métricas (</w:t>
+      </w:r>
+      <w:proofErr w:type="spellStart"/>
+      <w:r>
+        <w:t>accuracy</w:t>
+      </w:r>
+      <w:proofErr w:type="spellEnd"/>
+      <w:r>
+        <w:t xml:space="preserve">, </w:t>
+      </w:r>
+      <w:proofErr w:type="spellStart"/>
+      <w:r>
+        <w:t>recall</w:t>
+      </w:r>
+      <w:proofErr w:type="spellEnd"/>
+      <w:r>
+        <w:t>, riesgo, score)</w:t>
       </w:r>
     </w:p>
     <w:p>
@@ -1373,7 +1423,23 @@
         </w:numPr>
       </w:pPr>
       <w:r>
-        <w:t>Variables importantes (feature importance)</w:t>
+        <w:t>Variables importantes (</w:t>
+      </w:r>
+      <w:proofErr w:type="spellStart"/>
+      <w:r>
+        <w:t>feature</w:t>
+      </w:r>
+      <w:proofErr w:type="spellEnd"/>
+      <w:r>
+        <w:t xml:space="preserve"> </w:t>
+      </w:r>
+      <w:proofErr w:type="spellStart"/>
+      <w:r>
+        <w:t>importance</w:t>
+      </w:r>
+      <w:proofErr w:type="spellEnd"/>
+      <w:r>
+        <w:t>)</w:t>
       </w:r>
     </w:p>
     <w:p>
@@ -1743,8 +1809,13 @@
           <w:numId w:val="24"/>
         </w:numPr>
       </w:pPr>
-      <w:r>
-        <w:t>Necesitás convertir lenguaje en variables estructuradas</w:t>
+      <w:proofErr w:type="spellStart"/>
+      <w:r>
+        <w:t>Necesitás</w:t>
+      </w:r>
+      <w:proofErr w:type="spellEnd"/>
+      <w:r>
+        <w:t xml:space="preserve"> convertir lenguaje en variables estructuradas</w:t>
       </w:r>
     </w:p>
     <w:p>
@@ -2014,8 +2085,13 @@
           <w:numId w:val="29"/>
         </w:numPr>
       </w:pPr>
-      <w:r>
-        <w:t>Necesitás clasificación automática</w:t>
+      <w:proofErr w:type="spellStart"/>
+      <w:r>
+        <w:t>Necesitás</w:t>
+      </w:r>
+      <w:proofErr w:type="spellEnd"/>
+      <w:r>
+        <w:t xml:space="preserve"> clasificación automática</w:t>
       </w:r>
     </w:p>
     <w:p>
@@ -2246,7 +2322,15 @@
     </w:p>
     <w:p>
       <w:r>
-        <w:t>Esto ya lo conocés.</w:t>
+        <w:t xml:space="preserve">Esto ya lo </w:t>
+      </w:r>
+      <w:proofErr w:type="spellStart"/>
+      <w:r>
+        <w:t>conocés</w:t>
+      </w:r>
+      <w:proofErr w:type="spellEnd"/>
+      <w:r>
+        <w:t>.</w:t>
       </w:r>
     </w:p>
     <w:p>
@@ -2261,9 +2345,11 @@
           <w:numId w:val="31"/>
         </w:numPr>
       </w:pPr>
+      <w:proofErr w:type="spellStart"/>
       <w:r>
         <w:t>Accuracy</w:t>
       </w:r>
+      <w:proofErr w:type="spellEnd"/>
     </w:p>
     <w:p>
       <w:pPr>
@@ -2272,9 +2358,11 @@
           <w:numId w:val="31"/>
         </w:numPr>
       </w:pPr>
+      <w:proofErr w:type="spellStart"/>
       <w:r>
         <w:t>Precision</w:t>
       </w:r>
+      <w:proofErr w:type="spellEnd"/>
     </w:p>
     <w:p>
       <w:pPr>
@@ -2283,9 +2371,11 @@
           <w:numId w:val="31"/>
         </w:numPr>
       </w:pPr>
+      <w:proofErr w:type="spellStart"/>
       <w:r>
         <w:t>Recall</w:t>
       </w:r>
+      <w:proofErr w:type="spellEnd"/>
     </w:p>
     <w:p>
       <w:pPr>
@@ -2320,15 +2410,36 @@
       </w:r>
       <w:r>
         <w:br/>
-        <w:t>Accuracy: 0.84</w:t>
+      </w:r>
+      <w:proofErr w:type="spellStart"/>
+      <w:r>
+        <w:t>Accuracy</w:t>
+      </w:r>
+      <w:proofErr w:type="spellEnd"/>
+      <w:r>
+        <w:t>: 0.84</w:t>
       </w:r>
       <w:r>
         <w:br/>
-        <w:t>Recall: 0.78</w:t>
+      </w:r>
+      <w:proofErr w:type="spellStart"/>
+      <w:r>
+        <w:t>Recall</w:t>
+      </w:r>
+      <w:proofErr w:type="spellEnd"/>
+      <w:r>
+        <w:t>: 0.78</w:t>
       </w:r>
       <w:r>
         <w:br/>
-        <w:t>Precision: 0.81</w:t>
+      </w:r>
+      <w:proofErr w:type="spellStart"/>
+      <w:r>
+        <w:t>Precision</w:t>
+      </w:r>
+      <w:proofErr w:type="spellEnd"/>
+      <w:r>
+        <w:t>: 0.81</w:t>
       </w:r>
     </w:p>
     <w:p>
@@ -2737,8 +2848,13 @@
       </w:r>
     </w:p>
     <w:p>
-      <w:r>
-        <w:t>Accuracy → 0.84</w:t>
+      <w:proofErr w:type="spellStart"/>
+      <w:r>
+        <w:t>Accuracy</w:t>
+      </w:r>
+      <w:proofErr w:type="spellEnd"/>
+      <w:r>
+        <w:t xml:space="preserve"> → 0.84</w:t>
       </w:r>
     </w:p>
     <w:p>
@@ -2982,7 +3098,17 @@
     </w:p>
     <w:p>
       <w:r>
-        <w:t>Si el ML es 0.92 precision pero el LLM “explica inventando”, el sistema:</w:t>
+        <w:t xml:space="preserve">Si el ML es 0.92 </w:t>
+      </w:r>
+      <w:proofErr w:type="spellStart"/>
+      <w:proofErr w:type="gramStart"/>
+      <w:r>
+        <w:t>precision</w:t>
+      </w:r>
+      <w:proofErr w:type="spellEnd"/>
+      <w:proofErr w:type="gramEnd"/>
+      <w:r>
+        <w:t xml:space="preserve"> pero el LLM “explica inventando”, el sistema:</w:t>
       </w:r>
     </w:p>
     <w:p>
@@ -3090,9 +3216,11 @@
           <w:numId w:val="36"/>
         </w:numPr>
       </w:pPr>
+      <w:proofErr w:type="spellStart"/>
       <w:r>
         <w:t>prediccion</w:t>
       </w:r>
+      <w:proofErr w:type="spellEnd"/>
     </w:p>
     <w:p>
       <w:pPr>
@@ -3101,8 +3229,21 @@
           <w:numId w:val="36"/>
         </w:numPr>
       </w:pPr>
-      <w:r>
-        <w:t>razones_ml (top features)</w:t>
+      <w:proofErr w:type="spellStart"/>
+      <w:r>
+        <w:t>razones_ml</w:t>
+      </w:r>
+      <w:proofErr w:type="spellEnd"/>
+      <w:r>
+        <w:t xml:space="preserve"> (top </w:t>
+      </w:r>
+      <w:proofErr w:type="spellStart"/>
+      <w:r>
+        <w:t>features</w:t>
+      </w:r>
+      <w:proofErr w:type="spellEnd"/>
+      <w:r>
+        <w:t>)</w:t>
       </w:r>
     </w:p>
     <w:p>
@@ -3117,8 +3258,13 @@
       </w:r>
     </w:p>
     <w:p>
-      <w:r>
-        <w:t>Y además:</w:t>
+      <w:proofErr w:type="gramStart"/>
+      <w:r>
+        <w:t>Y</w:t>
+      </w:r>
+      <w:proofErr w:type="gramEnd"/>
+      <w:r>
+        <w:t xml:space="preserve"> además:</w:t>
       </w:r>
     </w:p>
     <w:p>
@@ -3150,7 +3296,15 @@
     </w:p>
     <w:p>
       <w:r>
-        <w:t>Cuando evaluás explicaciones del LLM, el criterio #1 es:</w:t>
+        <w:t xml:space="preserve">Cuando </w:t>
+      </w:r>
+      <w:proofErr w:type="spellStart"/>
+      <w:r>
+        <w:t>evaluás</w:t>
+      </w:r>
+      <w:proofErr w:type="spellEnd"/>
+      <w:r>
+        <w:t xml:space="preserve"> explicaciones del LLM, el criterio #1 es:</w:t>
       </w:r>
     </w:p>
     <w:p>
@@ -3233,7 +3387,15 @@
         </w:numPr>
       </w:pPr>
       <w:r>
-        <w:t>“Qué podés hacer: …”</w:t>
+        <w:t xml:space="preserve">“Qué </w:t>
+      </w:r>
+      <w:proofErr w:type="spellStart"/>
+      <w:r>
+        <w:t>podés</w:t>
+      </w:r>
+      <w:proofErr w:type="spellEnd"/>
+      <w:r>
+        <w:t xml:space="preserve"> hacer: …”</w:t>
       </w:r>
     </w:p>
     <w:p>
@@ -3380,7 +3542,7 @@
     <w:p>
       <w:r>
         <w:pict w14:anchorId="74311A05">
-          <v:rect id="_x0000_i1171" style="width:0;height:1.5pt" o:hralign="center" o:hrstd="t" o:hr="t" fillcolor="#a0a0a0" stroked="f"/>
+          <v:rect id="_x0000_i1051" style="width:0;height:1.5pt" o:hralign="center" o:hrstd="t" o:hr="t" fillcolor="#a0a0a0" stroked="f"/>
         </w:pict>
       </w:r>
     </w:p>
@@ -3422,6 +3584,7 @@
       <w:r>
         <w:t xml:space="preserve">convertir consulta a </w:t>
       </w:r>
+      <w:proofErr w:type="spellStart"/>
       <w:r>
         <w:rPr>
           <w:b/>
@@ -3429,6 +3592,7 @@
         </w:rPr>
         <w:t>embedding</w:t>
       </w:r>
+      <w:proofErr w:type="spellEnd"/>
     </w:p>
     <w:p>
       <w:pPr>
@@ -3506,7 +3670,7 @@
     <w:p>
       <w:r>
         <w:pict w14:anchorId="1AC02A87">
-          <v:rect id="_x0000_i1172" style="width:0;height:1.5pt" o:hralign="center" o:hrstd="t" o:hr="t" fillcolor="#a0a0a0" stroked="f"/>
+          <v:rect id="_x0000_i1052" style="width:0;height:1.5pt" o:hralign="center" o:hrstd="t" o:hr="t" fillcolor="#a0a0a0" stroked="f"/>
         </w:pict>
       </w:r>
     </w:p>
@@ -3567,9 +3731,11 @@
           <w:numId w:val="41"/>
         </w:numPr>
       </w:pPr>
+      <w:proofErr w:type="spellStart"/>
       <w:r>
         <w:t>scoring</w:t>
       </w:r>
+      <w:proofErr w:type="spellEnd"/>
     </w:p>
     <w:p>
       <w:pPr>
@@ -3625,7 +3791,7 @@
     <w:p>
       <w:r>
         <w:pict w14:anchorId="592C487F">
-          <v:rect id="_x0000_i1173" style="width:0;height:1.5pt" o:hralign="center" o:hrstd="t" o:hr="t" fillcolor="#a0a0a0" stroked="f"/>
+          <v:rect id="_x0000_i1053" style="width:0;height:1.5pt" o:hralign="center" o:hrstd="t" o:hr="t" fillcolor="#a0a0a0" stroked="f"/>
         </w:pict>
       </w:r>
     </w:p>
@@ -3686,8 +3852,13 @@
           <w:numId w:val="42"/>
         </w:numPr>
       </w:pPr>
-      <w:r>
-        <w:t>prompt con rol y restricciones</w:t>
+      <w:proofErr w:type="spellStart"/>
+      <w:r>
+        <w:t>prompt</w:t>
+      </w:r>
+      <w:proofErr w:type="spellEnd"/>
+      <w:r>
+        <w:t xml:space="preserve"> con rol y restricciones</w:t>
       </w:r>
     </w:p>
     <w:p>
@@ -3758,7 +3929,7 @@
     <w:p>
       <w:r>
         <w:pict w14:anchorId="12E6069B">
-          <v:rect id="_x0000_i1174" style="width:0;height:1.5pt" o:hralign="center" o:hrstd="t" o:hr="t" fillcolor="#a0a0a0" stroked="f"/>
+          <v:rect id="_x0000_i1054" style="width:0;height:1.5pt" o:hralign="center" o:hrstd="t" o:hr="t" fillcolor="#a0a0a0" stroked="f"/>
         </w:pict>
       </w:r>
     </w:p>
@@ -3808,9 +3979,11 @@
           <w:numId w:val="44"/>
         </w:numPr>
       </w:pPr>
+      <w:proofErr w:type="spellStart"/>
       <w:r>
         <w:t>APIs</w:t>
       </w:r>
+      <w:proofErr w:type="spellEnd"/>
     </w:p>
     <w:p>
       <w:pPr>
@@ -3863,7 +4036,7 @@
     <w:p>
       <w:r>
         <w:pict w14:anchorId="1D983350">
-          <v:rect id="_x0000_i1175" style="width:0;height:1.5pt" o:hralign="center" o:hrstd="t" o:hr="t" fillcolor="#a0a0a0" stroked="f"/>
+          <v:rect id="_x0000_i1055" style="width:0;height:1.5pt" o:hralign="center" o:hrstd="t" o:hr="t" fillcolor="#a0a0a0" stroked="f"/>
         </w:pict>
       </w:r>
     </w:p>
@@ -3913,8 +4086,13 @@
           <w:numId w:val="45"/>
         </w:numPr>
       </w:pPr>
-      <w:r>
-        <w:t>embeddings de conversaciones</w:t>
+      <w:proofErr w:type="spellStart"/>
+      <w:r>
+        <w:t>embeddings</w:t>
+      </w:r>
+      <w:proofErr w:type="spellEnd"/>
+      <w:r>
+        <w:t xml:space="preserve"> de conversaciones</w:t>
       </w:r>
     </w:p>
     <w:p>
@@ -3946,7 +4124,7 @@
     <w:p>
       <w:r>
         <w:pict w14:anchorId="72F55715">
-          <v:rect id="_x0000_i1176" style="width:0;height:1.5pt" o:hralign="center" o:hrstd="t" o:hr="t" fillcolor="#a0a0a0" stroked="f"/>
+          <v:rect id="_x0000_i1056" style="width:0;height:1.5pt" o:hralign="center" o:hrstd="t" o:hr="t" fillcolor="#a0a0a0" stroked="f"/>
         </w:pict>
       </w:r>
     </w:p>
@@ -3991,7 +4169,7 @@
     <w:p>
       <w:r>
         <w:pict w14:anchorId="491AA45C">
-          <v:rect id="_x0000_i1177" style="width:0;height:1.5pt" o:hralign="center" o:hrstd="t" o:hr="t" fillcolor="#a0a0a0" stroked="f"/>
+          <v:rect id="_x0000_i1057" style="width:0;height:1.5pt" o:hralign="center" o:hrstd="t" o:hr="t" fillcolor="#a0a0a0" stroked="f"/>
         </w:pict>
       </w:r>
     </w:p>
@@ -4055,8 +4233,13 @@
       </w:r>
     </w:p>
     <w:p>
-      <w:r>
-        <w:t>Podés guardarlo así:</w:t>
+      <w:proofErr w:type="spellStart"/>
+      <w:r>
+        <w:t>Podés</w:t>
+      </w:r>
+      <w:proofErr w:type="spellEnd"/>
+      <w:r>
+        <w:t xml:space="preserve"> guardarlo así:</w:t>
       </w:r>
     </w:p>
     <w:p>
@@ -4093,8 +4276,13 @@
       </w:r>
       <w:r>
         <w:br/>
-        <w:t>Tools / APIs</w:t>
-      </w:r>
+        <w:t xml:space="preserve">Tools / </w:t>
+      </w:r>
+      <w:proofErr w:type="spellStart"/>
+      <w:r>
+        <w:t>APIs</w:t>
+      </w:r>
+      <w:proofErr w:type="spellEnd"/>
       <w:r>
         <w:br/>
         <w:t xml:space="preserve">   ↓</w:t>
@@ -4115,7 +4303,7 @@
     <w:p>
       <w:r>
         <w:pict w14:anchorId="1E202E46">
-          <v:rect id="_x0000_i1178" style="width:0;height:1.5pt" o:hralign="center" o:hrstd="t" o:hr="t" fillcolor="#a0a0a0" stroked="f"/>
+          <v:rect id="_x0000_i1058" style="width:0;height:1.5pt" o:hralign="center" o:hrstd="t" o:hr="t" fillcolor="#a0a0a0" stroked="f"/>
         </w:pict>
       </w:r>
     </w:p>
@@ -4150,98 +4338,127 @@
           <w:szCs w:val="28"/>
           <w:u w:val="single"/>
         </w:rPr>
-        <w:t xml:space="preserve"> Error típico que ahora ya sabés evitar</w:t>
-      </w:r>
-    </w:p>
-    <w:p>
-      <w:r>
-        <w:t>Muchos sistemas hacen:</w:t>
-      </w:r>
-    </w:p>
-    <w:p>
-      <w:r>
-        <w:t>Usuario → LLM → respuesta</w:t>
-      </w:r>
-    </w:p>
-    <w:p>
-      <w:r>
-        <w:t>Eso funciona para demos.</w:t>
-      </w:r>
-    </w:p>
-    <w:p>
-      <w:r>
-        <w:t>Pero sistemas reales necesitan:</w:t>
-      </w:r>
-    </w:p>
-    <w:p>
-      <w:pPr>
-        <w:numPr>
-          <w:ilvl w:val="0"/>
-          <w:numId w:val="46"/>
-        </w:numPr>
-      </w:pPr>
-      <w:r>
-        <w:t>ML para decisiones</w:t>
-      </w:r>
-    </w:p>
-    <w:p>
-      <w:pPr>
-        <w:numPr>
-          <w:ilvl w:val="0"/>
-          <w:numId w:val="46"/>
-        </w:numPr>
-      </w:pPr>
-      <w:r>
-        <w:t>RAG para conocimiento</w:t>
-      </w:r>
-    </w:p>
-    <w:p>
-      <w:pPr>
-        <w:numPr>
-          <w:ilvl w:val="0"/>
-          <w:numId w:val="46"/>
-        </w:numPr>
-      </w:pPr>
-      <w:r>
-        <w:t>memoria para continuidad</w:t>
-      </w:r>
-    </w:p>
-    <w:p>
-      <w:pPr>
-        <w:numPr>
-          <w:ilvl w:val="0"/>
-          <w:numId w:val="46"/>
-        </w:numPr>
-      </w:pPr>
-      <w:r>
-        <w:t>herramientas para acciones</w:t>
-      </w:r>
-    </w:p>
-    <w:p/>
-    <w:p>
-      <w:pPr>
-        <w:rPr>
+        <w:t xml:space="preserve"> Error típico que ahora ya </w:t>
+      </w:r>
+      <w:proofErr w:type="spellStart"/>
+      <w:r>
+        <w:rPr>
+          <w:rFonts w:cstheme="minorHAnsi"/>
           <w:b/>
           <w:bCs/>
           <w:sz w:val="28"/>
           <w:szCs w:val="28"/>
           <w:u w:val="single"/>
         </w:rPr>
-      </w:pPr>
-      <w:r>
-        <w:rPr>
+        <w:t>sabés</w:t>
+      </w:r>
+      <w:proofErr w:type="spellEnd"/>
+      <w:r>
+        <w:rPr>
+          <w:rFonts w:cstheme="minorHAnsi"/>
           <w:b/>
           <w:bCs/>
           <w:sz w:val="28"/>
           <w:szCs w:val="28"/>
           <w:u w:val="single"/>
         </w:rPr>
+        <w:t xml:space="preserve"> evitar</w:t>
+      </w:r>
+    </w:p>
+    <w:p>
+      <w:r>
+        <w:t>Muchos sistemas hacen:</w:t>
+      </w:r>
+    </w:p>
+    <w:p>
+      <w:r>
+        <w:t>Usuario → LLM → respuesta</w:t>
+      </w:r>
+    </w:p>
+    <w:p>
+      <w:r>
+        <w:t>Eso funciona para demos.</w:t>
+      </w:r>
+    </w:p>
+    <w:p>
+      <w:r>
+        <w:t>Pero sistemas reales necesitan:</w:t>
+      </w:r>
+    </w:p>
+    <w:p>
+      <w:pPr>
+        <w:numPr>
+          <w:ilvl w:val="0"/>
+          <w:numId w:val="46"/>
+        </w:numPr>
+      </w:pPr>
+      <w:r>
+        <w:t>ML para decisiones</w:t>
+      </w:r>
+    </w:p>
+    <w:p>
+      <w:pPr>
+        <w:numPr>
+          <w:ilvl w:val="0"/>
+          <w:numId w:val="46"/>
+        </w:numPr>
+      </w:pPr>
+      <w:r>
+        <w:t>RAG para conocimiento</w:t>
+      </w:r>
+    </w:p>
+    <w:p>
+      <w:pPr>
+        <w:numPr>
+          <w:ilvl w:val="0"/>
+          <w:numId w:val="46"/>
+        </w:numPr>
+      </w:pPr>
+      <w:r>
+        <w:t>memoria para continuidad</w:t>
+      </w:r>
+    </w:p>
+    <w:p>
+      <w:pPr>
+        <w:numPr>
+          <w:ilvl w:val="0"/>
+          <w:numId w:val="46"/>
+        </w:numPr>
+      </w:pPr>
+      <w:r>
+        <w:t>herramientas para acciones</w:t>
+      </w:r>
+    </w:p>
+    <w:p/>
+    <w:p>
+      <w:pPr>
+        <w:rPr>
+          <w:b/>
+          <w:bCs/>
+          <w:sz w:val="28"/>
+          <w:szCs w:val="28"/>
+          <w:u w:val="single"/>
+        </w:rPr>
+      </w:pPr>
+      <w:r>
+        <w:rPr>
+          <w:b/>
+          <w:bCs/>
+          <w:sz w:val="28"/>
+          <w:szCs w:val="28"/>
+          <w:u w:val="single"/>
+        </w:rPr>
         <w:t xml:space="preserve">Mini ejercicio del Día </w:t>
       </w:r>
     </w:p>
     <w:p>
-      <w:r>
-        <w:t xml:space="preserve">Imaginá un </w:t>
+      <w:proofErr w:type="spellStart"/>
+      <w:r>
+        <w:t>Imaginá</w:t>
+      </w:r>
+      <w:proofErr w:type="spellEnd"/>
+      <w:r>
+        <w:t xml:space="preserve"> un </w:t>
       </w:r>
       <w:r>
         <w:rPr>
@@ -4326,77 +4543,878 @@
     <w:p>
       <w:r>
         <w:lastRenderedPageBreak/>
-        <w:t>Input →</w:t>
-      </w:r>
-      <w:r>
-        <w:t xml:space="preserve"> notas, materias, dudas, material de estudio</w:t>
-      </w:r>
-      <w:r>
-        <w:t>, contexto(en caso de ser necesario)</w:t>
-      </w:r>
-    </w:p>
-    <w:p>
-      <w:r>
-        <w:t>RAG →</w:t>
-      </w:r>
-      <w:r>
-        <w:t xml:space="preserve"> recupera lo que necesite el momento, si se pregunta por una nota esa nota, por un tema especifico solo el tema, etc.</w:t>
-      </w:r>
-    </w:p>
-    <w:p>
-      <w:r>
-        <w:t>ML →</w:t>
+        <w:t>Input → notas, materias, dudas, material de estudio</w:t>
+      </w:r>
+      <w:r>
+        <w:t xml:space="preserve">, </w:t>
+      </w:r>
+      <w:proofErr w:type="gramStart"/>
+      <w:r>
+        <w:t>contexto(</w:t>
+      </w:r>
+      <w:proofErr w:type="gramEnd"/>
+      <w:r>
+        <w:t>en caso de ser necesario)</w:t>
+      </w:r>
+    </w:p>
+    <w:p>
+      <w:r>
+        <w:t xml:space="preserve">RAG → recupera lo que necesite el momento, si se pregunta por una nota esa nota, por un tema </w:t>
+      </w:r>
+      <w:proofErr w:type="spellStart"/>
+      <w:r>
+        <w:t>especifico</w:t>
+      </w:r>
+      <w:proofErr w:type="spellEnd"/>
+      <w:r>
+        <w:t xml:space="preserve"> solo el tema, etc.</w:t>
+      </w:r>
+    </w:p>
+    <w:p>
+      <w:r>
+        <w:t>ML → predecir si vas a aprobar una materia, en base a las notas y como le fue en materias pasadas</w:t>
+      </w:r>
+    </w:p>
+    <w:p>
+      <w:r>
+        <w:t>LLM → sugerir plan de estudio.</w:t>
       </w:r>
       <w:r>
         <w:t xml:space="preserve"> </w:t>
       </w:r>
       <w:r>
-        <w:t>predecir si vas a aprobar una materia</w:t>
-      </w:r>
-      <w:r>
-        <w:t>, en base a las notas y como le fue en materias pasadas</w:t>
-      </w:r>
-    </w:p>
-    <w:p>
-      <w:r>
-        <w:t>LLM →</w:t>
+        <w:t xml:space="preserve">responder preguntas teóricas. </w:t>
+      </w:r>
+      <w:r>
+        <w:t xml:space="preserve">Orienta dudas y responde </w:t>
+      </w:r>
+    </w:p>
+    <w:p>
+      <w:r>
+        <w:t>Memoria →</w:t>
       </w:r>
       <w:r>
         <w:t xml:space="preserve"> </w:t>
       </w:r>
       <w:r>
-        <w:t>sugerir plan de estudio</w:t>
+        <w:t>recordar tus materias anteriores</w:t>
+      </w:r>
+      <w:r>
+        <w:t>, tus dificultades o debilidades en el aprendizaje y también las virtudes</w:t>
+      </w:r>
+    </w:p>
+    <w:p/>
+    <w:p>
+      <w:pPr>
+        <w:rPr>
+          <w:b/>
+          <w:bCs/>
+          <w:sz w:val="36"/>
+          <w:szCs w:val="36"/>
+          <w:u w:val="single"/>
+        </w:rPr>
+      </w:pPr>
+      <w:r>
+        <w:rPr>
+          <w:b/>
+          <w:bCs/>
+          <w:sz w:val="36"/>
+          <w:szCs w:val="36"/>
+          <w:u w:val="single"/>
+        </w:rPr>
+        <w:t xml:space="preserve">Los 5 errores más comunes al construir sistemas con </w:t>
+      </w:r>
+      <w:proofErr w:type="spellStart"/>
+      <w:r>
+        <w:rPr>
+          <w:b/>
+          <w:bCs/>
+          <w:sz w:val="36"/>
+          <w:szCs w:val="36"/>
+          <w:u w:val="single"/>
+        </w:rPr>
+        <w:t>LLMs</w:t>
+      </w:r>
+      <w:proofErr w:type="spellEnd"/>
+    </w:p>
+    <w:p>
+      <w:pPr>
+        <w:rPr>
+          <w:b/>
+          <w:bCs/>
+        </w:rPr>
+      </w:pPr>
+      <w:r>
+        <w:rPr>
+          <w:rFonts w:ascii="Segoe UI Emoji" w:hAnsi="Segoe UI Emoji" w:cs="Segoe UI Emoji"/>
+          <w:b/>
+          <w:bCs/>
+        </w:rPr>
+        <w:t>🧠</w:t>
+      </w:r>
+      <w:r>
+        <w:rPr>
+          <w:b/>
+          <w:bCs/>
+        </w:rPr>
+        <w:t xml:space="preserve"> Error 1 — Usar LLM para decisiones estructuradas</w:t>
+      </w:r>
+    </w:p>
+    <w:p>
+      <w:r>
+        <w:t>Ejemplo malo:</w:t>
+      </w:r>
+    </w:p>
+    <w:p>
+      <w:r>
+        <w:t>LLM decide si aprobar un crédito</w:t>
+      </w:r>
+    </w:p>
+    <w:p>
+      <w:r>
+        <w:t>Problema:</w:t>
+      </w:r>
+    </w:p>
+    <w:p>
+      <w:pPr>
+        <w:numPr>
+          <w:ilvl w:val="0"/>
+          <w:numId w:val="48"/>
+        </w:numPr>
+      </w:pPr>
+      <w:r>
+        <w:t>no optimiza métricas</w:t>
+      </w:r>
+    </w:p>
+    <w:p>
+      <w:pPr>
+        <w:numPr>
+          <w:ilvl w:val="0"/>
+          <w:numId w:val="48"/>
+        </w:numPr>
+      </w:pPr>
+      <w:r>
+        <w:t>no es estable</w:t>
+      </w:r>
+    </w:p>
+    <w:p>
+      <w:pPr>
+        <w:numPr>
+          <w:ilvl w:val="0"/>
+          <w:numId w:val="48"/>
+        </w:numPr>
+      </w:pPr>
+      <w:r>
+        <w:t>no es auditable</w:t>
+      </w:r>
+    </w:p>
+    <w:p>
+      <w:r>
+        <w:t>Solución correcta:</w:t>
+      </w:r>
+    </w:p>
+    <w:p>
+      <w:r>
+        <w:t>ML clásico decide</w:t>
+      </w:r>
+      <w:r>
+        <w:br/>
+        <w:t>LLM explica</w:t>
+      </w:r>
+    </w:p>
+    <w:p>
+      <w:r>
+        <w:pict w14:anchorId="5B0CC6ED">
+          <v:rect id="_x0000_i1119" style="width:0;height:1.5pt" o:hralign="center" o:hrstd="t" o:hr="t" fillcolor="#a0a0a0" stroked="f"/>
+        </w:pict>
+      </w:r>
+    </w:p>
+    <w:p>
+      <w:pPr>
+        <w:rPr>
+          <w:b/>
+          <w:bCs/>
+        </w:rPr>
+      </w:pPr>
+      <w:r>
+        <w:rPr>
+          <w:rFonts w:ascii="Segoe UI Emoji" w:hAnsi="Segoe UI Emoji" w:cs="Segoe UI Emoji"/>
+          <w:b/>
+          <w:bCs/>
+        </w:rPr>
+        <w:t>🧠</w:t>
+      </w:r>
+      <w:r>
+        <w:rPr>
+          <w:b/>
+          <w:bCs/>
+        </w:rPr>
+        <w:t xml:space="preserve"> Error 2 — Confiar en la memoria del modelo</w:t>
+      </w:r>
+    </w:p>
+    <w:p>
+      <w:r>
+        <w:t>Mucha gente piensa:</w:t>
+      </w:r>
+    </w:p>
+    <w:p>
+      <w:r>
+        <w:t>“El modelo ya sabe todo.”</w:t>
+      </w:r>
+    </w:p>
+    <w:p>
+      <w:r>
+        <w:t>Problema:</w:t>
+      </w:r>
+    </w:p>
+    <w:p>
+      <w:pPr>
+        <w:numPr>
+          <w:ilvl w:val="0"/>
+          <w:numId w:val="49"/>
+        </w:numPr>
+      </w:pPr>
+      <w:r>
+        <w:t>conocimiento desactualizado</w:t>
+      </w:r>
+    </w:p>
+    <w:p>
+      <w:pPr>
+        <w:numPr>
+          <w:ilvl w:val="0"/>
+          <w:numId w:val="49"/>
+        </w:numPr>
+      </w:pPr>
+      <w:r>
+        <w:t>información incompleta</w:t>
+      </w:r>
+    </w:p>
+    <w:p>
+      <w:pPr>
+        <w:numPr>
+          <w:ilvl w:val="0"/>
+          <w:numId w:val="49"/>
+        </w:numPr>
+      </w:pPr>
+      <w:r>
+        <w:t>alucinaciones</w:t>
+      </w:r>
+    </w:p>
+    <w:p>
+      <w:r>
+        <w:t>Solución:</w:t>
+      </w:r>
+    </w:p>
+    <w:p>
+      <w:r>
+        <w:t>LLM + RAG</w:t>
+      </w:r>
+    </w:p>
+    <w:p>
+      <w:r>
+        <w:t xml:space="preserve">El modelo </w:t>
+      </w:r>
+      <w:r>
+        <w:rPr>
+          <w:b/>
+          <w:bCs/>
+        </w:rPr>
+        <w:t>recupera información externa</w:t>
+      </w:r>
+      <w:r>
+        <w:t xml:space="preserve"> en lugar de confiar en su entrenamiento.</w:t>
+      </w:r>
+    </w:p>
+    <w:p>
+      <w:r>
+        <w:lastRenderedPageBreak/>
+        <w:pict w14:anchorId="1438639E">
+          <v:rect id="_x0000_i1120" style="width:0;height:1.5pt" o:hralign="center" o:hrstd="t" o:hr="t" fillcolor="#a0a0a0" stroked="f"/>
+        </w:pict>
+      </w:r>
+    </w:p>
+    <w:p>
+      <w:pPr>
+        <w:rPr>
+          <w:b/>
+          <w:bCs/>
+        </w:rPr>
+      </w:pPr>
+      <w:r>
+        <w:rPr>
+          <w:rFonts w:ascii="Segoe UI Emoji" w:hAnsi="Segoe UI Emoji" w:cs="Segoe UI Emoji"/>
+          <w:b/>
+          <w:bCs/>
+        </w:rPr>
+        <w:t>🧠</w:t>
+      </w:r>
+      <w:r>
+        <w:rPr>
+          <w:b/>
+          <w:bCs/>
+        </w:rPr>
+        <w:t xml:space="preserve"> Error 3 — </w:t>
+      </w:r>
+      <w:proofErr w:type="spellStart"/>
+      <w:r>
+        <w:rPr>
+          <w:b/>
+          <w:bCs/>
+        </w:rPr>
+        <w:t>Prompt</w:t>
+      </w:r>
+      <w:proofErr w:type="spellEnd"/>
+      <w:r>
+        <w:rPr>
+          <w:b/>
+          <w:bCs/>
+        </w:rPr>
+        <w:t xml:space="preserve"> sin restricciones</w:t>
+      </w:r>
+    </w:p>
+    <w:p>
+      <w:proofErr w:type="spellStart"/>
+      <w:r>
+        <w:t>Prompt</w:t>
+      </w:r>
+      <w:proofErr w:type="spellEnd"/>
+      <w:r>
+        <w:t xml:space="preserve"> malo:</w:t>
+      </w:r>
+    </w:p>
+    <w:p>
+      <w:r>
+        <w:t xml:space="preserve">"Explica machine </w:t>
+      </w:r>
+      <w:proofErr w:type="spellStart"/>
+      <w:r>
+        <w:t>learning</w:t>
+      </w:r>
+      <w:proofErr w:type="spellEnd"/>
+      <w:r>
+        <w:t>"</w:t>
+      </w:r>
+    </w:p>
+    <w:p>
+      <w:r>
+        <w:t xml:space="preserve">El modelo tiene </w:t>
+      </w:r>
+      <w:r>
+        <w:rPr>
+          <w:b/>
+          <w:bCs/>
+        </w:rPr>
+        <w:t>demasiados grados de libertad</w:t>
       </w:r>
       <w:r>
         <w:t>.</w:t>
       </w:r>
-      <w:r>
-        <w:t xml:space="preserve"> </w:t>
-      </w:r>
-      <w:r>
-        <w:t>responder preguntas teóricas</w:t>
-      </w:r>
-      <w:r>
-        <w:t xml:space="preserve">. </w:t>
-      </w:r>
-      <w:r>
-        <w:t xml:space="preserve">Orienta dudas y responde </w:t>
-      </w:r>
-    </w:p>
-    <w:p>
-      <w:r>
-        <w:t>Memoria →</w:t>
-      </w:r>
-      <w:r>
-        <w:t xml:space="preserve"> </w:t>
-      </w:r>
-      <w:r>
-        <w:t>recordar tus materias anteriores</w:t>
-      </w:r>
-      <w:r>
-        <w:t>, tus dificultades o debilidades en el aprendizaje y también las virtudes</w:t>
-      </w:r>
-    </w:p>
+    </w:p>
+    <w:p>
+      <w:proofErr w:type="spellStart"/>
+      <w:r>
+        <w:t>Prompt</w:t>
+      </w:r>
+      <w:proofErr w:type="spellEnd"/>
+      <w:r>
+        <w:t xml:space="preserve"> mejor:</w:t>
+      </w:r>
+    </w:p>
+    <w:p>
+      <w:r>
+        <w:t xml:space="preserve">"Explica qué es machine </w:t>
+      </w:r>
+      <w:proofErr w:type="spellStart"/>
+      <w:r>
+        <w:t>learning</w:t>
+      </w:r>
+      <w:proofErr w:type="spellEnd"/>
+      <w:r>
+        <w:t xml:space="preserve"> para alguien que sabe programar, usando un ejemplo simple y sin fórmulas."</w:t>
+      </w:r>
+    </w:p>
+    <w:p>
+      <w:r>
+        <w:t>Regla:</w:t>
+      </w:r>
+    </w:p>
+    <w:p>
+      <w:r>
+        <w:t xml:space="preserve">Buen </w:t>
+      </w:r>
+      <w:proofErr w:type="spellStart"/>
+      <w:r>
+        <w:t>prompt</w:t>
+      </w:r>
+      <w:proofErr w:type="spellEnd"/>
+      <w:r>
+        <w:t xml:space="preserve"> = menos libertad.</w:t>
+      </w:r>
+    </w:p>
+    <w:p>
+      <w:r>
+        <w:pict w14:anchorId="52525EFE">
+          <v:rect id="_x0000_i1121" style="width:0;height:1.5pt" o:hralign="center" o:hrstd="t" o:hr="t" fillcolor="#a0a0a0" stroked="f"/>
+        </w:pict>
+      </w:r>
+    </w:p>
+    <w:p>
+      <w:pPr>
+        <w:rPr>
+          <w:b/>
+          <w:bCs/>
+        </w:rPr>
+      </w:pPr>
+      <w:r>
+        <w:rPr>
+          <w:rFonts w:ascii="Segoe UI Emoji" w:hAnsi="Segoe UI Emoji" w:cs="Segoe UI Emoji"/>
+          <w:b/>
+          <w:bCs/>
+        </w:rPr>
+        <w:t>🧠</w:t>
+      </w:r>
+      <w:r>
+        <w:rPr>
+          <w:b/>
+          <w:bCs/>
+        </w:rPr>
+        <w:t xml:space="preserve"> Error 4 — Mezclar responsabilidades</w:t>
+      </w:r>
+    </w:p>
+    <w:p>
+      <w:r>
+        <w:t>Ejemplo caótico:</w:t>
+      </w:r>
+    </w:p>
+    <w:p>
+      <w:r>
+        <w:t>LLM decide</w:t>
+      </w:r>
+      <w:r>
+        <w:br/>
+        <w:t>LLM busca</w:t>
+      </w:r>
+      <w:r>
+        <w:br/>
+        <w:t>LLM calcula</w:t>
+      </w:r>
+      <w:r>
+        <w:br/>
+        <w:t>LLM explica</w:t>
+      </w:r>
+    </w:p>
+    <w:p>
+      <w:r>
+        <w:t>Todo depende del LLM.</w:t>
+      </w:r>
+    </w:p>
+    <w:p>
+      <w:r>
+        <w:t>Arquitectura correcta:</w:t>
+      </w:r>
+    </w:p>
+    <w:p>
+      <w:r>
+        <w:t>ML → decisiones</w:t>
+      </w:r>
+      <w:r>
+        <w:br/>
+        <w:t>RAG → conocimiento</w:t>
+      </w:r>
+      <w:r>
+        <w:br/>
+        <w:t>Tools → cálculos</w:t>
+      </w:r>
+      <w:r>
+        <w:br/>
+        <w:t>LLM → lenguaje</w:t>
+      </w:r>
+    </w:p>
+    <w:p>
+      <w:r>
+        <w:pict w14:anchorId="3D1311C3">
+          <v:rect id="_x0000_i1122" style="width:0;height:1.5pt" o:hralign="center" o:hrstd="t" o:hr="t" fillcolor="#a0a0a0" stroked="f"/>
+        </w:pict>
+      </w:r>
+    </w:p>
+    <w:p>
+      <w:pPr>
+        <w:rPr>
+          <w:b/>
+          <w:bCs/>
+        </w:rPr>
+      </w:pPr>
+      <w:r>
+        <w:rPr>
+          <w:rFonts w:ascii="Segoe UI Emoji" w:hAnsi="Segoe UI Emoji" w:cs="Segoe UI Emoji"/>
+          <w:b/>
+          <w:bCs/>
+        </w:rPr>
+        <w:t>🧠</w:t>
+      </w:r>
+      <w:r>
+        <w:rPr>
+          <w:b/>
+          <w:bCs/>
+        </w:rPr>
+        <w:t xml:space="preserve"> Error 5 — No evaluar el sistema</w:t>
+      </w:r>
+    </w:p>
+    <w:p>
+      <w:r>
+        <w:t>Muchos proyectos hacen:</w:t>
+      </w:r>
+    </w:p>
+    <w:p>
+      <w:proofErr w:type="spellStart"/>
+      <w:r>
+        <w:t>prompt</w:t>
+      </w:r>
+      <w:proofErr w:type="spellEnd"/>
+      <w:r>
+        <w:t xml:space="preserve"> → respuesta</w:t>
+      </w:r>
+    </w:p>
+    <w:p>
+      <w:r>
+        <w:t>Y dicen:</w:t>
+      </w:r>
+    </w:p>
+    <w:p>
+      <w:r>
+        <w:t>"funciona".</w:t>
+      </w:r>
+    </w:p>
+    <w:p>
+      <w:r>
+        <w:t>Pero sin evaluar:</w:t>
+      </w:r>
+    </w:p>
+    <w:p>
+      <w:pPr>
+        <w:numPr>
+          <w:ilvl w:val="0"/>
+          <w:numId w:val="50"/>
+        </w:numPr>
+      </w:pPr>
+      <w:r>
+        <w:t>fidelidad</w:t>
+      </w:r>
+    </w:p>
+    <w:p>
+      <w:pPr>
+        <w:numPr>
+          <w:ilvl w:val="0"/>
+          <w:numId w:val="50"/>
+        </w:numPr>
+      </w:pPr>
+      <w:r>
+        <w:t>consistencia</w:t>
+      </w:r>
+    </w:p>
+    <w:p>
+      <w:pPr>
+        <w:numPr>
+          <w:ilvl w:val="0"/>
+          <w:numId w:val="50"/>
+        </w:numPr>
+      </w:pPr>
+      <w:r>
+        <w:t>utilidad</w:t>
+      </w:r>
+    </w:p>
+    <w:p>
+      <w:r>
+        <w:lastRenderedPageBreak/>
+        <w:t>Por eso hiciste:</w:t>
+      </w:r>
+    </w:p>
+    <w:p>
+      <w:r>
+        <w:rPr>
+          <w:rFonts w:ascii="Segoe UI Symbol" w:hAnsi="Segoe UI Symbol" w:cs="Segoe UI Symbol"/>
+        </w:rPr>
+        <w:t>✔</w:t>
+      </w:r>
+      <w:r>
+        <w:t xml:space="preserve"> rúbricas</w:t>
+      </w:r>
+      <w:r>
+        <w:br/>
+      </w:r>
+      <w:r>
+        <w:rPr>
+          <w:rFonts w:ascii="Segoe UI Symbol" w:hAnsi="Segoe UI Symbol" w:cs="Segoe UI Symbol"/>
+        </w:rPr>
+        <w:t>✔</w:t>
+      </w:r>
+      <w:r>
+        <w:t xml:space="preserve"> evaluaci</w:t>
+      </w:r>
+      <w:r>
+        <w:rPr>
+          <w:rFonts w:ascii="Calibri" w:hAnsi="Calibri" w:cs="Calibri"/>
+        </w:rPr>
+        <w:t>ó</w:t>
+      </w:r>
+      <w:r>
+        <w:t>n de fidelidad</w:t>
+      </w:r>
+    </w:p>
+    <w:p/>
+    <w:p>
+      <w:pPr>
+        <w:rPr>
+          <w:rFonts w:cstheme="minorHAnsi"/>
+          <w:b/>
+          <w:bCs/>
+          <w:sz w:val="28"/>
+          <w:szCs w:val="28"/>
+          <w:u w:val="single"/>
+        </w:rPr>
+      </w:pPr>
+      <w:r>
+        <w:rPr>
+          <w:rFonts w:ascii="Segoe UI Emoji" w:hAnsi="Segoe UI Emoji" w:cs="Segoe UI Emoji"/>
+          <w:b/>
+          <w:bCs/>
+          <w:sz w:val="28"/>
+          <w:szCs w:val="28"/>
+          <w:u w:val="single"/>
+        </w:rPr>
+        <w:t>📌</w:t>
+      </w:r>
+      <w:r>
+        <w:rPr>
+          <w:rFonts w:cstheme="minorHAnsi"/>
+          <w:b/>
+          <w:bCs/>
+          <w:sz w:val="28"/>
+          <w:szCs w:val="28"/>
+          <w:u w:val="single"/>
+        </w:rPr>
+        <w:t xml:space="preserve"> Regla </w:t>
+      </w:r>
+      <w:r>
+        <w:rPr>
+          <w:rFonts w:cstheme="minorHAnsi"/>
+          <w:b/>
+          <w:bCs/>
+          <w:sz w:val="28"/>
+          <w:szCs w:val="28"/>
+          <w:u w:val="single"/>
+        </w:rPr>
+        <w:t>de oro</w:t>
+      </w:r>
+    </w:p>
+    <w:p>
+      <w:r>
+        <w:t xml:space="preserve">El LLM debe ser </w:t>
+      </w:r>
+      <w:r>
+        <w:rPr>
+          <w:b/>
+          <w:bCs/>
+        </w:rPr>
+        <w:t>una pieza del sistema</w:t>
+      </w:r>
+      <w:r>
+        <w:t>, no el sistema.</w:t>
+      </w:r>
+    </w:p>
+    <w:p/>
+    <w:p>
+      <w:pPr>
+        <w:rPr>
+          <w:b/>
+          <w:bCs/>
+          <w:sz w:val="28"/>
+          <w:szCs w:val="28"/>
+          <w:u w:val="single"/>
+        </w:rPr>
+      </w:pPr>
+      <w:r>
+        <w:rPr>
+          <w:b/>
+          <w:bCs/>
+          <w:sz w:val="28"/>
+          <w:szCs w:val="28"/>
+          <w:u w:val="single"/>
+        </w:rPr>
+        <w:t xml:space="preserve">Mini ejercicio </w:t>
+      </w:r>
+    </w:p>
+    <w:p>
+      <w:r>
+        <w:t>Te doy un sistema mal diseñado:</w:t>
+      </w:r>
+    </w:p>
+    <w:p>
+      <w:r>
+        <w:t>Usuario pregunta</w:t>
+      </w:r>
+      <w:r>
+        <w:br/>
+        <w:t>↓</w:t>
+      </w:r>
+      <w:r>
+        <w:br/>
+        <w:t>LLM busca información</w:t>
+      </w:r>
+      <w:r>
+        <w:br/>
+        <w:t>↓</w:t>
+      </w:r>
+      <w:r>
+        <w:br/>
+        <w:t>LLM calcula probabilidad</w:t>
+      </w:r>
+      <w:r>
+        <w:br/>
+        <w:t>↓</w:t>
+      </w:r>
+      <w:r>
+        <w:br/>
+        <w:t>LLM toma decisión</w:t>
+      </w:r>
+      <w:r>
+        <w:br/>
+        <w:t>↓</w:t>
+      </w:r>
+      <w:r>
+        <w:br/>
+        <w:t>LLM explica</w:t>
+      </w:r>
+    </w:p>
+    <w:p>
+      <w:pPr>
+        <w:rPr>
+          <w:u w:val="single"/>
+        </w:rPr>
+      </w:pPr>
+      <w:r>
+        <w:rPr>
+          <w:u w:val="single"/>
+        </w:rPr>
+        <w:t>Pregunta:</w:t>
+      </w:r>
+    </w:p>
+    <w:p>
+      <w:pPr>
+        <w:rPr>
+          <w:b/>
+          <w:bCs/>
+        </w:rPr>
+      </w:pPr>
+      <w:r>
+        <w:rPr>
+          <w:b/>
+          <w:bCs/>
+        </w:rPr>
+        <w:t>¿Qué tres cosas cambiarías para corregir esta arquitectura?</w:t>
+      </w:r>
+    </w:p>
+    <w:p>
+      <w:pPr>
+        <w:rPr>
+          <w:u w:val="single"/>
+        </w:rPr>
+      </w:pPr>
+      <w:r>
+        <w:rPr>
+          <w:u w:val="single"/>
+        </w:rPr>
+        <w:t>Respuesta:</w:t>
+      </w:r>
+    </w:p>
+    <w:p>
+      <w:r>
+        <w:t>1 →</w:t>
+      </w:r>
+      <w:r>
+        <w:t xml:space="preserve"> RAG busca la información necesaria</w:t>
+      </w:r>
+    </w:p>
+    <w:p>
+      <w:r>
+        <w:t>2 →</w:t>
+      </w:r>
+      <w:r>
+        <w:t xml:space="preserve"> Tools calcula la probabilidad</w:t>
+      </w:r>
+    </w:p>
+    <w:p>
+      <w:r>
+        <w:t>3 →</w:t>
+      </w:r>
+      <w:r>
+        <w:t xml:space="preserve"> ML toma la decisión </w:t>
+      </w:r>
+    </w:p>
+    <w:p/>
+    <w:p>
+      <w:pPr>
+        <w:rPr>
+          <w:u w:val="single"/>
+        </w:rPr>
+      </w:pPr>
+      <w:r>
+        <w:rPr>
+          <w:u w:val="single"/>
+        </w:rPr>
+        <w:t xml:space="preserve">Arquitectura corregida </w:t>
+      </w:r>
+    </w:p>
+    <w:p>
+      <w:r>
+        <w:t>Usuario pregunta</w:t>
+      </w:r>
+    </w:p>
+    <w:p>
+      <w:r>
+        <w:t>↓</w:t>
+      </w:r>
+    </w:p>
+    <w:p>
+      <w:r>
+        <w:t>RAG recupera información</w:t>
+      </w:r>
+    </w:p>
+    <w:p>
+      <w:r>
+        <w:t>↓</w:t>
+      </w:r>
+    </w:p>
+    <w:p>
+      <w:r>
+        <w:t>Tools realizan cálculos</w:t>
+      </w:r>
+    </w:p>
+    <w:p>
+      <w:r>
+        <w:t>↓</w:t>
+      </w:r>
+    </w:p>
+    <w:p>
+      <w:r>
+        <w:t>ML toma la decisión</w:t>
+      </w:r>
+    </w:p>
+    <w:p>
+      <w:r>
+        <w:t>↓</w:t>
+      </w:r>
+    </w:p>
+    <w:p>
+      <w:r>
+        <w:lastRenderedPageBreak/>
+        <w:t>LLM explica la decisión</w:t>
+      </w:r>
+    </w:p>
+    <w:p/>
+    <w:p/>
+    <w:p/>
+    <w:p/>
     <w:p/>
     <w:p/>
     <w:p/>
@@ -5308,6 +6326,304 @@
     </w:lvl>
   </w:abstractNum>
   <w:abstractNum w:abstractNumId="6" w15:restartNumberingAfterBreak="0">
+    <w:nsid w:val="0DA64C53"/>
+    <w:multiLevelType w:val="multilevel"/>
+    <w:tmpl w:val="ACF6F18A"/>
+    <w:lvl w:ilvl="0">
+      <w:start w:val="1"/>
+      <w:numFmt w:val="bullet"/>
+      <w:lvlText w:val=""/>
+      <w:lvlJc w:val="left"/>
+      <w:pPr>
+        <w:tabs>
+          <w:tab w:val="num" w:pos="720"/>
+        </w:tabs>
+        <w:ind w:left="720" w:hanging="360"/>
+      </w:pPr>
+      <w:rPr>
+        <w:rFonts w:ascii="Symbol" w:hAnsi="Symbol" w:hint="default"/>
+        <w:sz w:val="20"/>
+      </w:rPr>
+    </w:lvl>
+    <w:lvl w:ilvl="1" w:tentative="1">
+      <w:start w:val="1"/>
+      <w:numFmt w:val="bullet"/>
+      <w:lvlText w:val="o"/>
+      <w:lvlJc w:val="left"/>
+      <w:pPr>
+        <w:tabs>
+          <w:tab w:val="num" w:pos="1440"/>
+        </w:tabs>
+        <w:ind w:left="1440" w:hanging="360"/>
+      </w:pPr>
+      <w:rPr>
+        <w:rFonts w:ascii="Courier New" w:hAnsi="Courier New" w:hint="default"/>
+        <w:sz w:val="20"/>
+      </w:rPr>
+    </w:lvl>
+    <w:lvl w:ilvl="2" w:tentative="1">
+      <w:start w:val="1"/>
+      <w:numFmt w:val="bullet"/>
+      <w:lvlText w:val=""/>
+      <w:lvlJc w:val="left"/>
+      <w:pPr>
+        <w:tabs>
+          <w:tab w:val="num" w:pos="2160"/>
+        </w:tabs>
+        <w:ind w:left="2160" w:hanging="360"/>
+      </w:pPr>
+      <w:rPr>
+        <w:rFonts w:ascii="Wingdings" w:hAnsi="Wingdings" w:hint="default"/>
+        <w:sz w:val="20"/>
+      </w:rPr>
+    </w:lvl>
+    <w:lvl w:ilvl="3" w:tentative="1">
+      <w:start w:val="1"/>
+      <w:numFmt w:val="bullet"/>
+      <w:lvlText w:val=""/>
+      <w:lvlJc w:val="left"/>
+      <w:pPr>
+        <w:tabs>
+          <w:tab w:val="num" w:pos="2880"/>
+        </w:tabs>
+        <w:ind w:left="2880" w:hanging="360"/>
+      </w:pPr>
+      <w:rPr>
+        <w:rFonts w:ascii="Wingdings" w:hAnsi="Wingdings" w:hint="default"/>
+        <w:sz w:val="20"/>
+      </w:rPr>
+    </w:lvl>
+    <w:lvl w:ilvl="4" w:tentative="1">
+      <w:start w:val="1"/>
+      <w:numFmt w:val="bullet"/>
+      <w:lvlText w:val=""/>
+      <w:lvlJc w:val="left"/>
+      <w:pPr>
+        <w:tabs>
+          <w:tab w:val="num" w:pos="3600"/>
+        </w:tabs>
+        <w:ind w:left="3600" w:hanging="360"/>
+      </w:pPr>
+      <w:rPr>
+        <w:rFonts w:ascii="Wingdings" w:hAnsi="Wingdings" w:hint="default"/>
+        <w:sz w:val="20"/>
+      </w:rPr>
+    </w:lvl>
+    <w:lvl w:ilvl="5" w:tentative="1">
+      <w:start w:val="1"/>
+      <w:numFmt w:val="bullet"/>
+      <w:lvlText w:val=""/>
+      <w:lvlJc w:val="left"/>
+      <w:pPr>
+        <w:tabs>
+          <w:tab w:val="num" w:pos="4320"/>
+        </w:tabs>
+        <w:ind w:left="4320" w:hanging="360"/>
+      </w:pPr>
+      <w:rPr>
+        <w:rFonts w:ascii="Wingdings" w:hAnsi="Wingdings" w:hint="default"/>
+        <w:sz w:val="20"/>
+      </w:rPr>
+    </w:lvl>
+    <w:lvl w:ilvl="6" w:tentative="1">
+      <w:start w:val="1"/>
+      <w:numFmt w:val="bullet"/>
+      <w:lvlText w:val=""/>
+      <w:lvlJc w:val="left"/>
+      <w:pPr>
+        <w:tabs>
+          <w:tab w:val="num" w:pos="5040"/>
+        </w:tabs>
+        <w:ind w:left="5040" w:hanging="360"/>
+      </w:pPr>
+      <w:rPr>
+        <w:rFonts w:ascii="Wingdings" w:hAnsi="Wingdings" w:hint="default"/>
+        <w:sz w:val="20"/>
+      </w:rPr>
+    </w:lvl>
+    <w:lvl w:ilvl="7" w:tentative="1">
+      <w:start w:val="1"/>
+      <w:numFmt w:val="bullet"/>
+      <w:lvlText w:val=""/>
+      <w:lvlJc w:val="left"/>
+      <w:pPr>
+        <w:tabs>
+          <w:tab w:val="num" w:pos="5760"/>
+        </w:tabs>
+        <w:ind w:left="5760" w:hanging="360"/>
+      </w:pPr>
+      <w:rPr>
+        <w:rFonts w:ascii="Wingdings" w:hAnsi="Wingdings" w:hint="default"/>
+        <w:sz w:val="20"/>
+      </w:rPr>
+    </w:lvl>
+    <w:lvl w:ilvl="8" w:tentative="1">
+      <w:start w:val="1"/>
+      <w:numFmt w:val="bullet"/>
+      <w:lvlText w:val=""/>
+      <w:lvlJc w:val="left"/>
+      <w:pPr>
+        <w:tabs>
+          <w:tab w:val="num" w:pos="6480"/>
+        </w:tabs>
+        <w:ind w:left="6480" w:hanging="360"/>
+      </w:pPr>
+      <w:rPr>
+        <w:rFonts w:ascii="Wingdings" w:hAnsi="Wingdings" w:hint="default"/>
+        <w:sz w:val="20"/>
+      </w:rPr>
+    </w:lvl>
+  </w:abstractNum>
+  <w:abstractNum w:abstractNumId="7" w15:restartNumberingAfterBreak="0">
+    <w:nsid w:val="0F3929A8"/>
+    <w:multiLevelType w:val="multilevel"/>
+    <w:tmpl w:val="8208E128"/>
+    <w:lvl w:ilvl="0">
+      <w:start w:val="1"/>
+      <w:numFmt w:val="bullet"/>
+      <w:lvlText w:val=""/>
+      <w:lvlJc w:val="left"/>
+      <w:pPr>
+        <w:tabs>
+          <w:tab w:val="num" w:pos="720"/>
+        </w:tabs>
+        <w:ind w:left="720" w:hanging="360"/>
+      </w:pPr>
+      <w:rPr>
+        <w:rFonts w:ascii="Symbol" w:hAnsi="Symbol" w:hint="default"/>
+        <w:sz w:val="20"/>
+      </w:rPr>
+    </w:lvl>
+    <w:lvl w:ilvl="1" w:tentative="1">
+      <w:start w:val="1"/>
+      <w:numFmt w:val="bullet"/>
+      <w:lvlText w:val="o"/>
+      <w:lvlJc w:val="left"/>
+      <w:pPr>
+        <w:tabs>
+          <w:tab w:val="num" w:pos="1440"/>
+        </w:tabs>
+        <w:ind w:left="1440" w:hanging="360"/>
+      </w:pPr>
+      <w:rPr>
+        <w:rFonts w:ascii="Courier New" w:hAnsi="Courier New" w:hint="default"/>
+        <w:sz w:val="20"/>
+      </w:rPr>
+    </w:lvl>
+    <w:lvl w:ilvl="2" w:tentative="1">
+      <w:start w:val="1"/>
+      <w:numFmt w:val="bullet"/>
+      <w:lvlText w:val=""/>
+      <w:lvlJc w:val="left"/>
+      <w:pPr>
+        <w:tabs>
+          <w:tab w:val="num" w:pos="2160"/>
+        </w:tabs>
+        <w:ind w:left="2160" w:hanging="360"/>
+      </w:pPr>
+      <w:rPr>
+        <w:rFonts w:ascii="Wingdings" w:hAnsi="Wingdings" w:hint="default"/>
+        <w:sz w:val="20"/>
+      </w:rPr>
+    </w:lvl>
+    <w:lvl w:ilvl="3" w:tentative="1">
+      <w:start w:val="1"/>
+      <w:numFmt w:val="bullet"/>
+      <w:lvlText w:val=""/>
+      <w:lvlJc w:val="left"/>
+      <w:pPr>
+        <w:tabs>
+          <w:tab w:val="num" w:pos="2880"/>
+        </w:tabs>
+        <w:ind w:left="2880" w:hanging="360"/>
+      </w:pPr>
+      <w:rPr>
+        <w:rFonts w:ascii="Wingdings" w:hAnsi="Wingdings" w:hint="default"/>
+        <w:sz w:val="20"/>
+      </w:rPr>
+    </w:lvl>
+    <w:lvl w:ilvl="4" w:tentative="1">
+      <w:start w:val="1"/>
+      <w:numFmt w:val="bullet"/>
+      <w:lvlText w:val=""/>
+      <w:lvlJc w:val="left"/>
+      <w:pPr>
+        <w:tabs>
+          <w:tab w:val="num" w:pos="3600"/>
+        </w:tabs>
+        <w:ind w:left="3600" w:hanging="360"/>
+      </w:pPr>
+      <w:rPr>
+        <w:rFonts w:ascii="Wingdings" w:hAnsi="Wingdings" w:hint="default"/>
+        <w:sz w:val="20"/>
+      </w:rPr>
+    </w:lvl>
+    <w:lvl w:ilvl="5" w:tentative="1">
+      <w:start w:val="1"/>
+      <w:numFmt w:val="bullet"/>
+      <w:lvlText w:val=""/>
+      <w:lvlJc w:val="left"/>
+      <w:pPr>
+        <w:tabs>
+          <w:tab w:val="num" w:pos="4320"/>
+        </w:tabs>
+        <w:ind w:left="4320" w:hanging="360"/>
+      </w:pPr>
+      <w:rPr>
+        <w:rFonts w:ascii="Wingdings" w:hAnsi="Wingdings" w:hint="default"/>
+        <w:sz w:val="20"/>
+      </w:rPr>
+    </w:lvl>
+    <w:lvl w:ilvl="6" w:tentative="1">
+      <w:start w:val="1"/>
+      <w:numFmt w:val="bullet"/>
+      <w:lvlText w:val=""/>
+      <w:lvlJc w:val="left"/>
+      <w:pPr>
+        <w:tabs>
+          <w:tab w:val="num" w:pos="5040"/>
+        </w:tabs>
+        <w:ind w:left="5040" w:hanging="360"/>
+      </w:pPr>
+      <w:rPr>
+        <w:rFonts w:ascii="Wingdings" w:hAnsi="Wingdings" w:hint="default"/>
+        <w:sz w:val="20"/>
+      </w:rPr>
+    </w:lvl>
+    <w:lvl w:ilvl="7" w:tentative="1">
+      <w:start w:val="1"/>
+      <w:numFmt w:val="bullet"/>
+      <w:lvlText w:val=""/>
+      <w:lvlJc w:val="left"/>
+      <w:pPr>
+        <w:tabs>
+          <w:tab w:val="num" w:pos="5760"/>
+        </w:tabs>
+        <w:ind w:left="5760" w:hanging="360"/>
+      </w:pPr>
+      <w:rPr>
+        <w:rFonts w:ascii="Wingdings" w:hAnsi="Wingdings" w:hint="default"/>
+        <w:sz w:val="20"/>
+      </w:rPr>
+    </w:lvl>
+    <w:lvl w:ilvl="8" w:tentative="1">
+      <w:start w:val="1"/>
+      <w:numFmt w:val="bullet"/>
+      <w:lvlText w:val=""/>
+      <w:lvlJc w:val="left"/>
+      <w:pPr>
+        <w:tabs>
+          <w:tab w:val="num" w:pos="6480"/>
+        </w:tabs>
+        <w:ind w:left="6480" w:hanging="360"/>
+      </w:pPr>
+      <w:rPr>
+        <w:rFonts w:ascii="Wingdings" w:hAnsi="Wingdings" w:hint="default"/>
+        <w:sz w:val="20"/>
+      </w:rPr>
+    </w:lvl>
+  </w:abstractNum>
+  <w:abstractNum w:abstractNumId="8" w15:restartNumberingAfterBreak="0">
     <w:nsid w:val="12A319D4"/>
     <w:multiLevelType w:val="multilevel"/>
     <w:tmpl w:val="2C622292"/>
@@ -5456,7 +6772,7 @@
       </w:rPr>
     </w:lvl>
   </w:abstractNum>
-  <w:abstractNum w:abstractNumId="7" w15:restartNumberingAfterBreak="0">
+  <w:abstractNum w:abstractNumId="9" w15:restartNumberingAfterBreak="0">
     <w:nsid w:val="13944DD0"/>
     <w:multiLevelType w:val="multilevel"/>
     <w:tmpl w:val="E9A27296"/>
@@ -5605,7 +6921,7 @@
       </w:rPr>
     </w:lvl>
   </w:abstractNum>
-  <w:abstractNum w:abstractNumId="8" w15:restartNumberingAfterBreak="0">
+  <w:abstractNum w:abstractNumId="10" w15:restartNumberingAfterBreak="0">
     <w:nsid w:val="146F2D1C"/>
     <w:multiLevelType w:val="multilevel"/>
     <w:tmpl w:val="9EF82712"/>
@@ -5754,7 +7070,7 @@
       </w:rPr>
     </w:lvl>
   </w:abstractNum>
-  <w:abstractNum w:abstractNumId="9" w15:restartNumberingAfterBreak="0">
+  <w:abstractNum w:abstractNumId="11" w15:restartNumberingAfterBreak="0">
     <w:nsid w:val="152A158D"/>
     <w:multiLevelType w:val="multilevel"/>
     <w:tmpl w:val="FB80F726"/>
@@ -5903,7 +7219,7 @@
       </w:rPr>
     </w:lvl>
   </w:abstractNum>
-  <w:abstractNum w:abstractNumId="10" w15:restartNumberingAfterBreak="0">
+  <w:abstractNum w:abstractNumId="12" w15:restartNumberingAfterBreak="0">
     <w:nsid w:val="153B299B"/>
     <w:multiLevelType w:val="multilevel"/>
     <w:tmpl w:val="B7BE7A2E"/>
@@ -6052,7 +7368,7 @@
       </w:rPr>
     </w:lvl>
   </w:abstractNum>
-  <w:abstractNum w:abstractNumId="11" w15:restartNumberingAfterBreak="0">
+  <w:abstractNum w:abstractNumId="13" w15:restartNumberingAfterBreak="0">
     <w:nsid w:val="16E87DC8"/>
     <w:multiLevelType w:val="multilevel"/>
     <w:tmpl w:val="782A7C94"/>
@@ -6201,7 +7517,7 @@
       </w:rPr>
     </w:lvl>
   </w:abstractNum>
-  <w:abstractNum w:abstractNumId="12" w15:restartNumberingAfterBreak="0">
+  <w:abstractNum w:abstractNumId="14" w15:restartNumberingAfterBreak="0">
     <w:nsid w:val="1E1554BE"/>
     <w:multiLevelType w:val="multilevel"/>
     <w:tmpl w:val="68A0640E"/>
@@ -6350,7 +7666,7 @@
       </w:rPr>
     </w:lvl>
   </w:abstractNum>
-  <w:abstractNum w:abstractNumId="13" w15:restartNumberingAfterBreak="0">
+  <w:abstractNum w:abstractNumId="15" w15:restartNumberingAfterBreak="0">
     <w:nsid w:val="1F5A7787"/>
     <w:multiLevelType w:val="multilevel"/>
     <w:tmpl w:val="72E65428"/>
@@ -6499,7 +7815,7 @@
       </w:rPr>
     </w:lvl>
   </w:abstractNum>
-  <w:abstractNum w:abstractNumId="14" w15:restartNumberingAfterBreak="0">
+  <w:abstractNum w:abstractNumId="16" w15:restartNumberingAfterBreak="0">
     <w:nsid w:val="1FA23015"/>
     <w:multiLevelType w:val="multilevel"/>
     <w:tmpl w:val="B17C8C1E"/>
@@ -6648,7 +7964,7 @@
       </w:rPr>
     </w:lvl>
   </w:abstractNum>
-  <w:abstractNum w:abstractNumId="15" w15:restartNumberingAfterBreak="0">
+  <w:abstractNum w:abstractNumId="17" w15:restartNumberingAfterBreak="0">
     <w:nsid w:val="261641E3"/>
     <w:multiLevelType w:val="multilevel"/>
     <w:tmpl w:val="A2F29504"/>
@@ -6797,7 +8113,7 @@
       </w:rPr>
     </w:lvl>
   </w:abstractNum>
-  <w:abstractNum w:abstractNumId="16" w15:restartNumberingAfterBreak="0">
+  <w:abstractNum w:abstractNumId="18" w15:restartNumberingAfterBreak="0">
     <w:nsid w:val="2C631985"/>
     <w:multiLevelType w:val="multilevel"/>
     <w:tmpl w:val="7146106A"/>
@@ -6946,7 +8262,7 @@
       </w:rPr>
     </w:lvl>
   </w:abstractNum>
-  <w:abstractNum w:abstractNumId="17" w15:restartNumberingAfterBreak="0">
+  <w:abstractNum w:abstractNumId="19" w15:restartNumberingAfterBreak="0">
     <w:nsid w:val="2C894CD6"/>
     <w:multiLevelType w:val="multilevel"/>
     <w:tmpl w:val="DA5A3198"/>
@@ -7059,7 +8375,7 @@
       </w:pPr>
     </w:lvl>
   </w:abstractNum>
-  <w:abstractNum w:abstractNumId="18" w15:restartNumberingAfterBreak="0">
+  <w:abstractNum w:abstractNumId="20" w15:restartNumberingAfterBreak="0">
     <w:nsid w:val="2E0704B5"/>
     <w:multiLevelType w:val="multilevel"/>
     <w:tmpl w:val="93D8486A"/>
@@ -7208,7 +8524,7 @@
       </w:rPr>
     </w:lvl>
   </w:abstractNum>
-  <w:abstractNum w:abstractNumId="19" w15:restartNumberingAfterBreak="0">
+  <w:abstractNum w:abstractNumId="21" w15:restartNumberingAfterBreak="0">
     <w:nsid w:val="3625634C"/>
     <w:multiLevelType w:val="multilevel"/>
     <w:tmpl w:val="480C6060"/>
@@ -7357,7 +8673,7 @@
       </w:rPr>
     </w:lvl>
   </w:abstractNum>
-  <w:abstractNum w:abstractNumId="20" w15:restartNumberingAfterBreak="0">
+  <w:abstractNum w:abstractNumId="22" w15:restartNumberingAfterBreak="0">
     <w:nsid w:val="3CF66B99"/>
     <w:multiLevelType w:val="multilevel"/>
     <w:tmpl w:val="247E3C30"/>
@@ -7506,7 +8822,7 @@
       </w:rPr>
     </w:lvl>
   </w:abstractNum>
-  <w:abstractNum w:abstractNumId="21" w15:restartNumberingAfterBreak="0">
+  <w:abstractNum w:abstractNumId="23" w15:restartNumberingAfterBreak="0">
     <w:nsid w:val="3F431E86"/>
     <w:multiLevelType w:val="multilevel"/>
     <w:tmpl w:val="71683C9A"/>
@@ -7655,7 +8971,7 @@
       </w:rPr>
     </w:lvl>
   </w:abstractNum>
-  <w:abstractNum w:abstractNumId="22" w15:restartNumberingAfterBreak="0">
+  <w:abstractNum w:abstractNumId="24" w15:restartNumberingAfterBreak="0">
     <w:nsid w:val="3FBE27FE"/>
     <w:multiLevelType w:val="multilevel"/>
     <w:tmpl w:val="CE843100"/>
@@ -7804,7 +9120,7 @@
       </w:rPr>
     </w:lvl>
   </w:abstractNum>
-  <w:abstractNum w:abstractNumId="23" w15:restartNumberingAfterBreak="0">
+  <w:abstractNum w:abstractNumId="25" w15:restartNumberingAfterBreak="0">
     <w:nsid w:val="41552755"/>
     <w:multiLevelType w:val="multilevel"/>
     <w:tmpl w:val="43C0AF22"/>
@@ -7953,7 +9269,7 @@
       </w:rPr>
     </w:lvl>
   </w:abstractNum>
-  <w:abstractNum w:abstractNumId="24" w15:restartNumberingAfterBreak="0">
+  <w:abstractNum w:abstractNumId="26" w15:restartNumberingAfterBreak="0">
     <w:nsid w:val="425B6D5D"/>
     <w:multiLevelType w:val="multilevel"/>
     <w:tmpl w:val="A86A55BA"/>
@@ -8102,7 +9418,7 @@
       </w:rPr>
     </w:lvl>
   </w:abstractNum>
-  <w:abstractNum w:abstractNumId="25" w15:restartNumberingAfterBreak="0">
+  <w:abstractNum w:abstractNumId="27" w15:restartNumberingAfterBreak="0">
     <w:nsid w:val="430B498A"/>
     <w:multiLevelType w:val="multilevel"/>
     <w:tmpl w:val="08D65AF6"/>
@@ -8251,7 +9567,7 @@
       </w:rPr>
     </w:lvl>
   </w:abstractNum>
-  <w:abstractNum w:abstractNumId="26" w15:restartNumberingAfterBreak="0">
+  <w:abstractNum w:abstractNumId="28" w15:restartNumberingAfterBreak="0">
     <w:nsid w:val="43B00359"/>
     <w:multiLevelType w:val="multilevel"/>
     <w:tmpl w:val="4074FDB2"/>
@@ -8400,7 +9716,7 @@
       </w:rPr>
     </w:lvl>
   </w:abstractNum>
-  <w:abstractNum w:abstractNumId="27" w15:restartNumberingAfterBreak="0">
+  <w:abstractNum w:abstractNumId="29" w15:restartNumberingAfterBreak="0">
     <w:nsid w:val="4405324E"/>
     <w:multiLevelType w:val="multilevel"/>
     <w:tmpl w:val="3190ADBA"/>
@@ -8549,7 +9865,7 @@
       </w:rPr>
     </w:lvl>
   </w:abstractNum>
-  <w:abstractNum w:abstractNumId="28" w15:restartNumberingAfterBreak="0">
+  <w:abstractNum w:abstractNumId="30" w15:restartNumberingAfterBreak="0">
     <w:nsid w:val="471C315C"/>
     <w:multiLevelType w:val="multilevel"/>
     <w:tmpl w:val="C01EE712"/>
@@ -8698,7 +10014,7 @@
       </w:rPr>
     </w:lvl>
   </w:abstractNum>
-  <w:abstractNum w:abstractNumId="29" w15:restartNumberingAfterBreak="0">
+  <w:abstractNum w:abstractNumId="31" w15:restartNumberingAfterBreak="0">
     <w:nsid w:val="4A421664"/>
     <w:multiLevelType w:val="multilevel"/>
     <w:tmpl w:val="387C34F2"/>
@@ -8847,7 +10163,7 @@
       </w:rPr>
     </w:lvl>
   </w:abstractNum>
-  <w:abstractNum w:abstractNumId="30" w15:restartNumberingAfterBreak="0">
+  <w:abstractNum w:abstractNumId="32" w15:restartNumberingAfterBreak="0">
     <w:nsid w:val="4E794547"/>
     <w:multiLevelType w:val="multilevel"/>
     <w:tmpl w:val="D0D40B82"/>
@@ -8996,7 +10312,7 @@
       </w:rPr>
     </w:lvl>
   </w:abstractNum>
-  <w:abstractNum w:abstractNumId="31" w15:restartNumberingAfterBreak="0">
+  <w:abstractNum w:abstractNumId="33" w15:restartNumberingAfterBreak="0">
     <w:nsid w:val="4F0A702E"/>
     <w:multiLevelType w:val="multilevel"/>
     <w:tmpl w:val="DC7073F8"/>
@@ -9145,7 +10461,7 @@
       </w:rPr>
     </w:lvl>
   </w:abstractNum>
-  <w:abstractNum w:abstractNumId="32" w15:restartNumberingAfterBreak="0">
+  <w:abstractNum w:abstractNumId="34" w15:restartNumberingAfterBreak="0">
     <w:nsid w:val="503F437F"/>
     <w:multiLevelType w:val="multilevel"/>
     <w:tmpl w:val="638E97C2"/>
@@ -9294,7 +10610,7 @@
       </w:rPr>
     </w:lvl>
   </w:abstractNum>
-  <w:abstractNum w:abstractNumId="33" w15:restartNumberingAfterBreak="0">
+  <w:abstractNum w:abstractNumId="35" w15:restartNumberingAfterBreak="0">
     <w:nsid w:val="514F1507"/>
     <w:multiLevelType w:val="multilevel"/>
     <w:tmpl w:val="BE289292"/>
@@ -9443,7 +10759,156 @@
       </w:rPr>
     </w:lvl>
   </w:abstractNum>
-  <w:abstractNum w:abstractNumId="34" w15:restartNumberingAfterBreak="0">
+  <w:abstractNum w:abstractNumId="36" w15:restartNumberingAfterBreak="0">
+    <w:nsid w:val="51ED3D90"/>
+    <w:multiLevelType w:val="multilevel"/>
+    <w:tmpl w:val="F85C83BC"/>
+    <w:lvl w:ilvl="0">
+      <w:start w:val="1"/>
+      <w:numFmt w:val="bullet"/>
+      <w:lvlText w:val=""/>
+      <w:lvlJc w:val="left"/>
+      <w:pPr>
+        <w:tabs>
+          <w:tab w:val="num" w:pos="720"/>
+        </w:tabs>
+        <w:ind w:left="720" w:hanging="360"/>
+      </w:pPr>
+      <w:rPr>
+        <w:rFonts w:ascii="Symbol" w:hAnsi="Symbol" w:hint="default"/>
+        <w:sz w:val="20"/>
+      </w:rPr>
+    </w:lvl>
+    <w:lvl w:ilvl="1" w:tentative="1">
+      <w:start w:val="1"/>
+      <w:numFmt w:val="bullet"/>
+      <w:lvlText w:val="o"/>
+      <w:lvlJc w:val="left"/>
+      <w:pPr>
+        <w:tabs>
+          <w:tab w:val="num" w:pos="1440"/>
+        </w:tabs>
+        <w:ind w:left="1440" w:hanging="360"/>
+      </w:pPr>
+      <w:rPr>
+        <w:rFonts w:ascii="Courier New" w:hAnsi="Courier New" w:hint="default"/>
+        <w:sz w:val="20"/>
+      </w:rPr>
+    </w:lvl>
+    <w:lvl w:ilvl="2" w:tentative="1">
+      <w:start w:val="1"/>
+      <w:numFmt w:val="bullet"/>
+      <w:lvlText w:val=""/>
+      <w:lvlJc w:val="left"/>
+      <w:pPr>
+        <w:tabs>
+          <w:tab w:val="num" w:pos="2160"/>
+        </w:tabs>
+        <w:ind w:left="2160" w:hanging="360"/>
+      </w:pPr>
+      <w:rPr>
+        <w:rFonts w:ascii="Wingdings" w:hAnsi="Wingdings" w:hint="default"/>
+        <w:sz w:val="20"/>
+      </w:rPr>
+    </w:lvl>
+    <w:lvl w:ilvl="3" w:tentative="1">
+      <w:start w:val="1"/>
+      <w:numFmt w:val="bullet"/>
+      <w:lvlText w:val=""/>
+      <w:lvlJc w:val="left"/>
+      <w:pPr>
+        <w:tabs>
+          <w:tab w:val="num" w:pos="2880"/>
+        </w:tabs>
+        <w:ind w:left="2880" w:hanging="360"/>
+      </w:pPr>
+      <w:rPr>
+        <w:rFonts w:ascii="Wingdings" w:hAnsi="Wingdings" w:hint="default"/>
+        <w:sz w:val="20"/>
+      </w:rPr>
+    </w:lvl>
+    <w:lvl w:ilvl="4" w:tentative="1">
+      <w:start w:val="1"/>
+      <w:numFmt w:val="bullet"/>
+      <w:lvlText w:val=""/>
+      <w:lvlJc w:val="left"/>
+      <w:pPr>
+        <w:tabs>
+          <w:tab w:val="num" w:pos="3600"/>
+        </w:tabs>
+        <w:ind w:left="3600" w:hanging="360"/>
+      </w:pPr>
+      <w:rPr>
+        <w:rFonts w:ascii="Wingdings" w:hAnsi="Wingdings" w:hint="default"/>
+        <w:sz w:val="20"/>
+      </w:rPr>
+    </w:lvl>
+    <w:lvl w:ilvl="5" w:tentative="1">
+      <w:start w:val="1"/>
+      <w:numFmt w:val="bullet"/>
+      <w:lvlText w:val=""/>
+      <w:lvlJc w:val="left"/>
+      <w:pPr>
+        <w:tabs>
+          <w:tab w:val="num" w:pos="4320"/>
+        </w:tabs>
+        <w:ind w:left="4320" w:hanging="360"/>
+      </w:pPr>
+      <w:rPr>
+        <w:rFonts w:ascii="Wingdings" w:hAnsi="Wingdings" w:hint="default"/>
+        <w:sz w:val="20"/>
+      </w:rPr>
+    </w:lvl>
+    <w:lvl w:ilvl="6" w:tentative="1">
+      <w:start w:val="1"/>
+      <w:numFmt w:val="bullet"/>
+      <w:lvlText w:val=""/>
+      <w:lvlJc w:val="left"/>
+      <w:pPr>
+        <w:tabs>
+          <w:tab w:val="num" w:pos="5040"/>
+        </w:tabs>
+        <w:ind w:left="5040" w:hanging="360"/>
+      </w:pPr>
+      <w:rPr>
+        <w:rFonts w:ascii="Wingdings" w:hAnsi="Wingdings" w:hint="default"/>
+        <w:sz w:val="20"/>
+      </w:rPr>
+    </w:lvl>
+    <w:lvl w:ilvl="7" w:tentative="1">
+      <w:start w:val="1"/>
+      <w:numFmt w:val="bullet"/>
+      <w:lvlText w:val=""/>
+      <w:lvlJc w:val="left"/>
+      <w:pPr>
+        <w:tabs>
+          <w:tab w:val="num" w:pos="5760"/>
+        </w:tabs>
+        <w:ind w:left="5760" w:hanging="360"/>
+      </w:pPr>
+      <w:rPr>
+        <w:rFonts w:ascii="Wingdings" w:hAnsi="Wingdings" w:hint="default"/>
+        <w:sz w:val="20"/>
+      </w:rPr>
+    </w:lvl>
+    <w:lvl w:ilvl="8" w:tentative="1">
+      <w:start w:val="1"/>
+      <w:numFmt w:val="bullet"/>
+      <w:lvlText w:val=""/>
+      <w:lvlJc w:val="left"/>
+      <w:pPr>
+        <w:tabs>
+          <w:tab w:val="num" w:pos="6480"/>
+        </w:tabs>
+        <w:ind w:left="6480" w:hanging="360"/>
+      </w:pPr>
+      <w:rPr>
+        <w:rFonts w:ascii="Wingdings" w:hAnsi="Wingdings" w:hint="default"/>
+        <w:sz w:val="20"/>
+      </w:rPr>
+    </w:lvl>
+  </w:abstractNum>
+  <w:abstractNum w:abstractNumId="37" w15:restartNumberingAfterBreak="0">
     <w:nsid w:val="536460B3"/>
     <w:multiLevelType w:val="multilevel"/>
     <w:tmpl w:val="0ACC9C62"/>
@@ -9592,7 +11057,7 @@
       </w:rPr>
     </w:lvl>
   </w:abstractNum>
-  <w:abstractNum w:abstractNumId="35" w15:restartNumberingAfterBreak="0">
+  <w:abstractNum w:abstractNumId="38" w15:restartNumberingAfterBreak="0">
     <w:nsid w:val="57F16EC6"/>
     <w:multiLevelType w:val="multilevel"/>
     <w:tmpl w:val="E00835D0"/>
@@ -9741,7 +11206,7 @@
       </w:rPr>
     </w:lvl>
   </w:abstractNum>
-  <w:abstractNum w:abstractNumId="36" w15:restartNumberingAfterBreak="0">
+  <w:abstractNum w:abstractNumId="39" w15:restartNumberingAfterBreak="0">
     <w:nsid w:val="58310EE2"/>
     <w:multiLevelType w:val="multilevel"/>
     <w:tmpl w:val="668C5E2C"/>
@@ -9854,7 +11319,7 @@
       </w:pPr>
     </w:lvl>
   </w:abstractNum>
-  <w:abstractNum w:abstractNumId="37" w15:restartNumberingAfterBreak="0">
+  <w:abstractNum w:abstractNumId="40" w15:restartNumberingAfterBreak="0">
     <w:nsid w:val="5834078D"/>
     <w:multiLevelType w:val="multilevel"/>
     <w:tmpl w:val="B7EC5BEE"/>
@@ -10003,7 +11468,7 @@
       </w:rPr>
     </w:lvl>
   </w:abstractNum>
-  <w:abstractNum w:abstractNumId="38" w15:restartNumberingAfterBreak="0">
+  <w:abstractNum w:abstractNumId="41" w15:restartNumberingAfterBreak="0">
     <w:nsid w:val="58F734F6"/>
     <w:multiLevelType w:val="multilevel"/>
     <w:tmpl w:val="EF064D90"/>
@@ -10152,7 +11617,7 @@
       </w:rPr>
     </w:lvl>
   </w:abstractNum>
-  <w:abstractNum w:abstractNumId="39" w15:restartNumberingAfterBreak="0">
+  <w:abstractNum w:abstractNumId="42" w15:restartNumberingAfterBreak="0">
     <w:nsid w:val="5C1F5117"/>
     <w:multiLevelType w:val="multilevel"/>
     <w:tmpl w:val="538A43B2"/>
@@ -10301,7 +11766,7 @@
       </w:rPr>
     </w:lvl>
   </w:abstractNum>
-  <w:abstractNum w:abstractNumId="40" w15:restartNumberingAfterBreak="0">
+  <w:abstractNum w:abstractNumId="43" w15:restartNumberingAfterBreak="0">
     <w:nsid w:val="5DF96BE6"/>
     <w:multiLevelType w:val="multilevel"/>
     <w:tmpl w:val="4054486A"/>
@@ -10450,7 +11915,7 @@
       </w:rPr>
     </w:lvl>
   </w:abstractNum>
-  <w:abstractNum w:abstractNumId="41" w15:restartNumberingAfterBreak="0">
+  <w:abstractNum w:abstractNumId="44" w15:restartNumberingAfterBreak="0">
     <w:nsid w:val="6F364392"/>
     <w:multiLevelType w:val="multilevel"/>
     <w:tmpl w:val="E9505532"/>
@@ -10599,7 +12064,7 @@
       </w:rPr>
     </w:lvl>
   </w:abstractNum>
-  <w:abstractNum w:abstractNumId="42" w15:restartNumberingAfterBreak="0">
+  <w:abstractNum w:abstractNumId="45" w15:restartNumberingAfterBreak="0">
     <w:nsid w:val="72031CF4"/>
     <w:multiLevelType w:val="multilevel"/>
     <w:tmpl w:val="E808156C"/>
@@ -10748,7 +12213,7 @@
       </w:rPr>
     </w:lvl>
   </w:abstractNum>
-  <w:abstractNum w:abstractNumId="43" w15:restartNumberingAfterBreak="0">
+  <w:abstractNum w:abstractNumId="46" w15:restartNumberingAfterBreak="0">
     <w:nsid w:val="73E27E35"/>
     <w:multiLevelType w:val="multilevel"/>
     <w:tmpl w:val="1452DBEA"/>
@@ -10897,7 +12362,7 @@
       </w:rPr>
     </w:lvl>
   </w:abstractNum>
-  <w:abstractNum w:abstractNumId="44" w15:restartNumberingAfterBreak="0">
+  <w:abstractNum w:abstractNumId="47" w15:restartNumberingAfterBreak="0">
     <w:nsid w:val="776B0E68"/>
     <w:multiLevelType w:val="multilevel"/>
     <w:tmpl w:val="B92691EC"/>
@@ -11046,7 +12511,7 @@
       </w:rPr>
     </w:lvl>
   </w:abstractNum>
-  <w:abstractNum w:abstractNumId="45" w15:restartNumberingAfterBreak="0">
+  <w:abstractNum w:abstractNumId="48" w15:restartNumberingAfterBreak="0">
     <w:nsid w:val="78C448DC"/>
     <w:multiLevelType w:val="multilevel"/>
     <w:tmpl w:val="C13E05A8"/>
@@ -11195,7 +12660,7 @@
       </w:rPr>
     </w:lvl>
   </w:abstractNum>
-  <w:abstractNum w:abstractNumId="46" w15:restartNumberingAfterBreak="0">
+  <w:abstractNum w:abstractNumId="49" w15:restartNumberingAfterBreak="0">
     <w:nsid w:val="7A933BC1"/>
     <w:multiLevelType w:val="multilevel"/>
     <w:tmpl w:val="3F7859C2"/>
@@ -11345,145 +12810,154 @@
     </w:lvl>
   </w:abstractNum>
   <w:num w:numId="1" w16cid:durableId="94332662">
-    <w:abstractNumId w:val="21"/>
+    <w:abstractNumId w:val="23"/>
   </w:num>
   <w:num w:numId="2" w16cid:durableId="1113944286">
-    <w:abstractNumId w:val="44"/>
+    <w:abstractNumId w:val="47"/>
   </w:num>
   <w:num w:numId="3" w16cid:durableId="1058550911">
     <w:abstractNumId w:val="5"/>
   </w:num>
   <w:num w:numId="4" w16cid:durableId="538396424">
-    <w:abstractNumId w:val="10"/>
+    <w:abstractNumId w:val="12"/>
   </w:num>
   <w:num w:numId="5" w16cid:durableId="975186975">
-    <w:abstractNumId w:val="29"/>
+    <w:abstractNumId w:val="31"/>
   </w:num>
   <w:num w:numId="6" w16cid:durableId="1814329753">
-    <w:abstractNumId w:val="36"/>
+    <w:abstractNumId w:val="39"/>
   </w:num>
   <w:num w:numId="7" w16cid:durableId="1173690040">
-    <w:abstractNumId w:val="33"/>
+    <w:abstractNumId w:val="35"/>
   </w:num>
   <w:num w:numId="8" w16cid:durableId="331109436">
     <w:abstractNumId w:val="3"/>
   </w:num>
   <w:num w:numId="9" w16cid:durableId="1001393496">
-    <w:abstractNumId w:val="18"/>
+    <w:abstractNumId w:val="20"/>
   </w:num>
   <w:num w:numId="10" w16cid:durableId="414399510">
-    <w:abstractNumId w:val="15"/>
+    <w:abstractNumId w:val="17"/>
   </w:num>
   <w:num w:numId="11" w16cid:durableId="1630815640">
-    <w:abstractNumId w:val="23"/>
+    <w:abstractNumId w:val="25"/>
   </w:num>
   <w:num w:numId="12" w16cid:durableId="247927921">
     <w:abstractNumId w:val="0"/>
   </w:num>
   <w:num w:numId="13" w16cid:durableId="1879511623">
-    <w:abstractNumId w:val="11"/>
+    <w:abstractNumId w:val="13"/>
   </w:num>
   <w:num w:numId="14" w16cid:durableId="1835563121">
+    <w:abstractNumId w:val="43"/>
+  </w:num>
+  <w:num w:numId="15" w16cid:durableId="1333878340">
+    <w:abstractNumId w:val="38"/>
+  </w:num>
+  <w:num w:numId="16" w16cid:durableId="734543948">
     <w:abstractNumId w:val="40"/>
   </w:num>
-  <w:num w:numId="15" w16cid:durableId="1333878340">
-    <w:abstractNumId w:val="35"/>
-  </w:num>
-  <w:num w:numId="16" w16cid:durableId="734543948">
-    <w:abstractNumId w:val="37"/>
-  </w:num>
   <w:num w:numId="17" w16cid:durableId="1431580308">
-    <w:abstractNumId w:val="16"/>
+    <w:abstractNumId w:val="18"/>
   </w:num>
   <w:num w:numId="18" w16cid:durableId="238711473">
-    <w:abstractNumId w:val="45"/>
+    <w:abstractNumId w:val="48"/>
   </w:num>
   <w:num w:numId="19" w16cid:durableId="1198078395">
-    <w:abstractNumId w:val="6"/>
+    <w:abstractNumId w:val="8"/>
   </w:num>
   <w:num w:numId="20" w16cid:durableId="2006467281">
-    <w:abstractNumId w:val="32"/>
+    <w:abstractNumId w:val="34"/>
   </w:num>
   <w:num w:numId="21" w16cid:durableId="278336639">
-    <w:abstractNumId w:val="8"/>
+    <w:abstractNumId w:val="10"/>
   </w:num>
   <w:num w:numId="22" w16cid:durableId="2019650626">
+    <w:abstractNumId w:val="24"/>
+  </w:num>
+  <w:num w:numId="23" w16cid:durableId="1858544659">
     <w:abstractNumId w:val="22"/>
   </w:num>
-  <w:num w:numId="23" w16cid:durableId="1858544659">
-    <w:abstractNumId w:val="20"/>
-  </w:num>
   <w:num w:numId="24" w16cid:durableId="915210875">
-    <w:abstractNumId w:val="27"/>
+    <w:abstractNumId w:val="29"/>
   </w:num>
   <w:num w:numId="25" w16cid:durableId="1719207101">
-    <w:abstractNumId w:val="28"/>
+    <w:abstractNumId w:val="30"/>
   </w:num>
   <w:num w:numId="26" w16cid:durableId="128400261">
-    <w:abstractNumId w:val="39"/>
+    <w:abstractNumId w:val="42"/>
   </w:num>
   <w:num w:numId="27" w16cid:durableId="502208126">
     <w:abstractNumId w:val="4"/>
   </w:num>
   <w:num w:numId="28" w16cid:durableId="285426373">
+    <w:abstractNumId w:val="16"/>
+  </w:num>
+  <w:num w:numId="29" w16cid:durableId="923565524">
+    <w:abstractNumId w:val="15"/>
+  </w:num>
+  <w:num w:numId="30" w16cid:durableId="18164325">
+    <w:abstractNumId w:val="19"/>
+  </w:num>
+  <w:num w:numId="31" w16cid:durableId="1772823898">
     <w:abstractNumId w:val="14"/>
   </w:num>
-  <w:num w:numId="29" w16cid:durableId="923565524">
-    <w:abstractNumId w:val="13"/>
-  </w:num>
-  <w:num w:numId="30" w16cid:durableId="18164325">
-    <w:abstractNumId w:val="17"/>
-  </w:num>
-  <w:num w:numId="31" w16cid:durableId="1772823898">
-    <w:abstractNumId w:val="12"/>
-  </w:num>
   <w:num w:numId="32" w16cid:durableId="971520924">
-    <w:abstractNumId w:val="9"/>
+    <w:abstractNumId w:val="11"/>
   </w:num>
   <w:num w:numId="33" w16cid:durableId="170461905">
-    <w:abstractNumId w:val="42"/>
+    <w:abstractNumId w:val="45"/>
   </w:num>
   <w:num w:numId="34" w16cid:durableId="469247231">
-    <w:abstractNumId w:val="19"/>
+    <w:abstractNumId w:val="21"/>
   </w:num>
   <w:num w:numId="35" w16cid:durableId="1646396441">
     <w:abstractNumId w:val="2"/>
   </w:num>
   <w:num w:numId="36" w16cid:durableId="1964575246">
-    <w:abstractNumId w:val="24"/>
+    <w:abstractNumId w:val="26"/>
   </w:num>
   <w:num w:numId="37" w16cid:durableId="2135904848">
-    <w:abstractNumId w:val="7"/>
+    <w:abstractNumId w:val="9"/>
   </w:num>
   <w:num w:numId="38" w16cid:durableId="47186873">
-    <w:abstractNumId w:val="43"/>
+    <w:abstractNumId w:val="46"/>
   </w:num>
   <w:num w:numId="39" w16cid:durableId="1332949133">
-    <w:abstractNumId w:val="25"/>
+    <w:abstractNumId w:val="27"/>
   </w:num>
   <w:num w:numId="40" w16cid:durableId="1257061698">
-    <w:abstractNumId w:val="30"/>
+    <w:abstractNumId w:val="32"/>
   </w:num>
   <w:num w:numId="41" w16cid:durableId="1490832183">
-    <w:abstractNumId w:val="41"/>
+    <w:abstractNumId w:val="44"/>
   </w:num>
   <w:num w:numId="42" w16cid:durableId="1082139732">
     <w:abstractNumId w:val="1"/>
   </w:num>
   <w:num w:numId="43" w16cid:durableId="1711949946">
-    <w:abstractNumId w:val="31"/>
+    <w:abstractNumId w:val="33"/>
   </w:num>
   <w:num w:numId="44" w16cid:durableId="1145319860">
-    <w:abstractNumId w:val="26"/>
+    <w:abstractNumId w:val="28"/>
   </w:num>
   <w:num w:numId="45" w16cid:durableId="1952545649">
-    <w:abstractNumId w:val="46"/>
+    <w:abstractNumId w:val="49"/>
   </w:num>
   <w:num w:numId="46" w16cid:durableId="2043048563">
-    <w:abstractNumId w:val="38"/>
+    <w:abstractNumId w:val="41"/>
   </w:num>
   <w:num w:numId="47" w16cid:durableId="1465924742">
-    <w:abstractNumId w:val="34"/>
+    <w:abstractNumId w:val="37"/>
+  </w:num>
+  <w:num w:numId="48" w16cid:durableId="2037731848">
+    <w:abstractNumId w:val="36"/>
+  </w:num>
+  <w:num w:numId="49" w16cid:durableId="951085966">
+    <w:abstractNumId w:val="6"/>
+  </w:num>
+  <w:num w:numId="50" w16cid:durableId="1997487556">
+    <w:abstractNumId w:val="7"/>
   </w:num>
 </w:numbering>
 </file>

</xml_diff>

<commit_message>
Dia 32: proceso para diseñar proyectos de IA
</commit_message>
<xml_diff>
--- a/Sistemas híbridos ML + LLM/Sistemas híbridos ML + LLM.docx
+++ b/Sistemas híbridos ML + LLM/Sistemas híbridos ML + LLM.docx
@@ -4725,7 +4725,7 @@
     <w:p>
       <w:r>
         <w:pict w14:anchorId="5B0CC6ED">
-          <v:rect id="_x0000_i1119" style="width:0;height:1.5pt" o:hralign="center" o:hrstd="t" o:hr="t" fillcolor="#a0a0a0" stroked="f"/>
+          <v:rect id="_x0000_i1059" style="width:0;height:1.5pt" o:hralign="center" o:hrstd="t" o:hr="t" fillcolor="#a0a0a0" stroked="f"/>
         </w:pict>
       </w:r>
     </w:p>
@@ -4829,7 +4829,7 @@
       <w:r>
         <w:lastRenderedPageBreak/>
         <w:pict w14:anchorId="1438639E">
-          <v:rect id="_x0000_i1120" style="width:0;height:1.5pt" o:hralign="center" o:hrstd="t" o:hr="t" fillcolor="#a0a0a0" stroked="f"/>
+          <v:rect id="_x0000_i1060" style="width:0;height:1.5pt" o:hralign="center" o:hrstd="t" o:hr="t" fillcolor="#a0a0a0" stroked="f"/>
         </w:pict>
       </w:r>
     </w:p>
@@ -4954,7 +4954,7 @@
     <w:p>
       <w:r>
         <w:pict w14:anchorId="52525EFE">
-          <v:rect id="_x0000_i1121" style="width:0;height:1.5pt" o:hralign="center" o:hrstd="t" o:hr="t" fillcolor="#a0a0a0" stroked="f"/>
+          <v:rect id="_x0000_i1061" style="width:0;height:1.5pt" o:hralign="center" o:hrstd="t" o:hr="t" fillcolor="#a0a0a0" stroked="f"/>
         </w:pict>
       </w:r>
     </w:p>
@@ -5033,7 +5033,7 @@
     <w:p>
       <w:r>
         <w:pict w14:anchorId="3D1311C3">
-          <v:rect id="_x0000_i1122" style="width:0;height:1.5pt" o:hralign="center" o:hrstd="t" o:hr="t" fillcolor="#a0a0a0" stroked="f"/>
+          <v:rect id="_x0000_i1062" style="width:0;height:1.5pt" o:hralign="center" o:hrstd="t" o:hr="t" fillcolor="#a0a0a0" stroked="f"/>
         </w:pict>
       </w:r>
     </w:p>
@@ -5329,26 +5329,17 @@
     </w:p>
     <w:p>
       <w:r>
-        <w:t>1 →</w:t>
-      </w:r>
-      <w:r>
-        <w:t xml:space="preserve"> RAG busca la información necesaria</w:t>
-      </w:r>
-    </w:p>
-    <w:p>
-      <w:r>
-        <w:t>2 →</w:t>
-      </w:r>
-      <w:r>
-        <w:t xml:space="preserve"> Tools calcula la probabilidad</w:t>
-      </w:r>
-    </w:p>
-    <w:p>
-      <w:r>
-        <w:t>3 →</w:t>
-      </w:r>
-      <w:r>
-        <w:t xml:space="preserve"> ML toma la decisión </w:t>
+        <w:t>1 → RAG busca la información necesaria</w:t>
+      </w:r>
+    </w:p>
+    <w:p>
+      <w:r>
+        <w:t>2 → Tools calcula la probabilidad</w:t>
+      </w:r>
+    </w:p>
+    <w:p>
+      <w:r>
+        <w:t xml:space="preserve">3 → ML toma la decisión </w:t>
       </w:r>
     </w:p>
     <w:p/>
@@ -5409,11 +5400,1043 @@
       <w:r>
         <w:lastRenderedPageBreak/>
         <w:t>LLM explica la decisión</w:t>
+      </w:r>
+    </w:p>
+    <w:p/>
+    <w:p>
+      <w:pPr>
+        <w:rPr>
+          <w:b/>
+          <w:bCs/>
+          <w:sz w:val="36"/>
+          <w:szCs w:val="36"/>
+          <w:u w:val="single"/>
+        </w:rPr>
+      </w:pPr>
+      <w:r>
+        <w:rPr>
+          <w:b/>
+          <w:bCs/>
+          <w:sz w:val="36"/>
+          <w:szCs w:val="36"/>
+          <w:u w:val="single"/>
+        </w:rPr>
+        <w:t>Cómo pensar un proyecto de IA</w:t>
+      </w:r>
+    </w:p>
+    <w:p>
+      <w:pPr>
+        <w:rPr>
+          <w:rFonts w:cstheme="minorHAnsi"/>
+          <w:b/>
+          <w:bCs/>
+          <w:sz w:val="28"/>
+          <w:szCs w:val="28"/>
+          <w:u w:val="single"/>
+        </w:rPr>
+      </w:pPr>
+      <w:r>
+        <w:rPr>
+          <w:rFonts w:cstheme="minorHAnsi"/>
+          <w:b/>
+          <w:bCs/>
+          <w:sz w:val="28"/>
+          <w:szCs w:val="28"/>
+          <w:u w:val="single"/>
+        </w:rPr>
+        <w:t>1️</w:t>
+      </w:r>
+      <w:r>
+        <w:rPr>
+          <w:rFonts w:cstheme="minorHAnsi"/>
+          <w:b/>
+          <w:bCs/>
+          <w:sz w:val="28"/>
+          <w:szCs w:val="28"/>
+          <w:u w:val="single"/>
+        </w:rPr>
+        <w:t xml:space="preserve">) </w:t>
+      </w:r>
+      <w:r>
+        <w:rPr>
+          <w:rFonts w:cstheme="minorHAnsi"/>
+          <w:b/>
+          <w:bCs/>
+          <w:sz w:val="28"/>
+          <w:szCs w:val="28"/>
+          <w:u w:val="single"/>
+        </w:rPr>
+        <w:t>Definir el problema</w:t>
+      </w:r>
+    </w:p>
+    <w:p>
+      <w:r>
+        <w:t xml:space="preserve">Primero </w:t>
+      </w:r>
+      <w:proofErr w:type="spellStart"/>
+      <w:r>
+        <w:t>preguntás</w:t>
+      </w:r>
+      <w:proofErr w:type="spellEnd"/>
+      <w:r>
+        <w:t>:</w:t>
+      </w:r>
+    </w:p>
+    <w:p>
+      <w:pPr>
+        <w:numPr>
+          <w:ilvl w:val="0"/>
+          <w:numId w:val="51"/>
+        </w:numPr>
+      </w:pPr>
+      <w:r>
+        <w:t>¿Qué problema quiero resolver?</w:t>
+      </w:r>
+    </w:p>
+    <w:p>
+      <w:pPr>
+        <w:numPr>
+          <w:ilvl w:val="0"/>
+          <w:numId w:val="51"/>
+        </w:numPr>
+      </w:pPr>
+      <w:r>
+        <w:t>¿Qué decisión o tarea quiero automatizar?</w:t>
+      </w:r>
+    </w:p>
+    <w:p>
+      <w:r>
+        <w:t>Ejemplos:</w:t>
+      </w:r>
+    </w:p>
+    <w:p>
+      <w:pPr>
+        <w:numPr>
+          <w:ilvl w:val="0"/>
+          <w:numId w:val="52"/>
+        </w:numPr>
+      </w:pPr>
+      <w:r>
+        <w:t>predecir abandono universitario</w:t>
+      </w:r>
+    </w:p>
+    <w:p>
+      <w:pPr>
+        <w:numPr>
+          <w:ilvl w:val="0"/>
+          <w:numId w:val="52"/>
+        </w:numPr>
+      </w:pPr>
+      <w:r>
+        <w:t>detectar fraude</w:t>
+      </w:r>
+    </w:p>
+    <w:p>
+      <w:pPr>
+        <w:numPr>
+          <w:ilvl w:val="0"/>
+          <w:numId w:val="52"/>
+        </w:numPr>
+      </w:pPr>
+      <w:r>
+        <w:t>resumir documentos</w:t>
+      </w:r>
+    </w:p>
+    <w:p>
+      <w:pPr>
+        <w:numPr>
+          <w:ilvl w:val="0"/>
+          <w:numId w:val="52"/>
+        </w:numPr>
+      </w:pPr>
+      <w:r>
+        <w:t>responder preguntas sobre un manual</w:t>
+      </w:r>
+    </w:p>
+    <w:p>
+      <w:r>
+        <w:pict w14:anchorId="6E156291">
+          <v:rect id="_x0000_i1138" style="width:0;height:1.5pt" o:hralign="center" o:hrstd="t" o:hr="t" fillcolor="#a0a0a0" stroked="f"/>
+        </w:pict>
+      </w:r>
+    </w:p>
+    <w:p>
+      <w:pPr>
+        <w:rPr>
+          <w:rFonts w:cstheme="minorHAnsi"/>
+          <w:b/>
+          <w:bCs/>
+          <w:sz w:val="28"/>
+          <w:szCs w:val="28"/>
+          <w:u w:val="single"/>
+        </w:rPr>
+      </w:pPr>
+      <w:r>
+        <w:rPr>
+          <w:rFonts w:cstheme="minorHAnsi"/>
+          <w:b/>
+          <w:bCs/>
+          <w:sz w:val="28"/>
+          <w:szCs w:val="28"/>
+          <w:u w:val="single"/>
+        </w:rPr>
+        <w:t>2️</w:t>
+      </w:r>
+      <w:r>
+        <w:rPr>
+          <w:rFonts w:cstheme="minorHAnsi"/>
+          <w:b/>
+          <w:bCs/>
+          <w:sz w:val="28"/>
+          <w:szCs w:val="28"/>
+          <w:u w:val="single"/>
+        </w:rPr>
+        <w:t xml:space="preserve">) </w:t>
+      </w:r>
+      <w:r>
+        <w:rPr>
+          <w:rFonts w:cstheme="minorHAnsi"/>
+          <w:b/>
+          <w:bCs/>
+          <w:sz w:val="28"/>
+          <w:szCs w:val="28"/>
+          <w:u w:val="single"/>
+        </w:rPr>
+        <w:t>Identificar el tipo de problema</w:t>
+      </w:r>
+    </w:p>
+    <w:p>
+      <w:r>
+        <w:t xml:space="preserve">Acá decidís </w:t>
+      </w:r>
+      <w:r>
+        <w:rPr>
+          <w:b/>
+          <w:bCs/>
+        </w:rPr>
+        <w:t>qué tipo de IA usar</w:t>
+      </w:r>
+      <w:r>
+        <w:t>.</w:t>
+      </w:r>
+    </w:p>
+    <w:tbl>
+      <w:tblPr>
+        <w:tblStyle w:val="TableGrid"/>
+        <w:tblW w:w="0" w:type="auto"/>
+        <w:tblLook w:val="04A0" w:firstRow="1" w:lastRow="0" w:firstColumn="1" w:lastColumn="0" w:noHBand="0" w:noVBand="1"/>
+      </w:tblPr>
+      <w:tblGrid>
+        <w:gridCol w:w="2645"/>
+        <w:gridCol w:w="1363"/>
+      </w:tblGrid>
+      <w:tr>
+        <w:tc>
+          <w:tcPr>
+            <w:tcW w:w="0" w:type="auto"/>
+            <w:hideMark/>
+          </w:tcPr>
+          <w:p>
+            <w:pPr>
+              <w:spacing w:after="160" w:line="259" w:lineRule="auto"/>
+              <w:rPr>
+                <w:b/>
+                <w:bCs/>
+              </w:rPr>
+            </w:pPr>
+            <w:r>
+              <w:rPr>
+                <w:b/>
+                <w:bCs/>
+              </w:rPr>
+              <w:t>Tipo de problema</w:t>
+            </w:r>
+          </w:p>
+        </w:tc>
+        <w:tc>
+          <w:tcPr>
+            <w:tcW w:w="0" w:type="auto"/>
+            <w:hideMark/>
+          </w:tcPr>
+          <w:p>
+            <w:pPr>
+              <w:spacing w:after="160" w:line="259" w:lineRule="auto"/>
+              <w:rPr>
+                <w:b/>
+                <w:bCs/>
+              </w:rPr>
+            </w:pPr>
+            <w:r>
+              <w:rPr>
+                <w:b/>
+                <w:bCs/>
+              </w:rPr>
+              <w:t>Solución</w:t>
+            </w:r>
+          </w:p>
+        </w:tc>
+      </w:tr>
+      <w:tr>
+        <w:tc>
+          <w:tcPr>
+            <w:tcW w:w="0" w:type="auto"/>
+            <w:hideMark/>
+          </w:tcPr>
+          <w:p>
+            <w:pPr>
+              <w:spacing w:after="160" w:line="259" w:lineRule="auto"/>
+            </w:pPr>
+            <w:r>
+              <w:t>predicción numérica</w:t>
+            </w:r>
+          </w:p>
+        </w:tc>
+        <w:tc>
+          <w:tcPr>
+            <w:tcW w:w="0" w:type="auto"/>
+            <w:hideMark/>
+          </w:tcPr>
+          <w:p>
+            <w:r>
+              <w:t>ML clásico</w:t>
+            </w:r>
+          </w:p>
+        </w:tc>
+      </w:tr>
+      <w:tr>
+        <w:tc>
+          <w:tcPr>
+            <w:tcW w:w="0" w:type="auto"/>
+            <w:hideMark/>
+          </w:tcPr>
+          <w:p>
+            <w:r>
+              <w:t>clasificación</w:t>
+            </w:r>
+          </w:p>
+        </w:tc>
+        <w:tc>
+          <w:tcPr>
+            <w:tcW w:w="0" w:type="auto"/>
+            <w:hideMark/>
+          </w:tcPr>
+          <w:p>
+            <w:r>
+              <w:t>ML clásico</w:t>
+            </w:r>
+          </w:p>
+        </w:tc>
+      </w:tr>
+      <w:tr>
+        <w:tc>
+          <w:tcPr>
+            <w:tcW w:w="0" w:type="auto"/>
+            <w:hideMark/>
+          </w:tcPr>
+          <w:p>
+            <w:r>
+              <w:t>texto / conversación</w:t>
+            </w:r>
+          </w:p>
+        </w:tc>
+        <w:tc>
+          <w:tcPr>
+            <w:tcW w:w="0" w:type="auto"/>
+            <w:hideMark/>
+          </w:tcPr>
+          <w:p>
+            <w:r>
+              <w:t>LLM</w:t>
+            </w:r>
+          </w:p>
+        </w:tc>
+      </w:tr>
+      <w:tr>
+        <w:tc>
+          <w:tcPr>
+            <w:tcW w:w="0" w:type="auto"/>
+            <w:hideMark/>
+          </w:tcPr>
+          <w:p>
+            <w:r>
+              <w:t>búsqueda de conocimiento</w:t>
+            </w:r>
+          </w:p>
+        </w:tc>
+        <w:tc>
+          <w:tcPr>
+            <w:tcW w:w="0" w:type="auto"/>
+            <w:hideMark/>
+          </w:tcPr>
+          <w:p>
+            <w:r>
+              <w:t>RAG</w:t>
+            </w:r>
+          </w:p>
+        </w:tc>
+      </w:tr>
+      <w:tr>
+        <w:tc>
+          <w:tcPr>
+            <w:tcW w:w="0" w:type="auto"/>
+            <w:hideMark/>
+          </w:tcPr>
+          <w:p>
+            <w:r>
+              <w:t>decisiones complejas</w:t>
+            </w:r>
+          </w:p>
+        </w:tc>
+        <w:tc>
+          <w:tcPr>
+            <w:tcW w:w="0" w:type="auto"/>
+            <w:hideMark/>
+          </w:tcPr>
+          <w:p>
+            <w:r>
+              <w:t>combinación</w:t>
+            </w:r>
+          </w:p>
+        </w:tc>
+      </w:tr>
+    </w:tbl>
+    <w:p>
+      <w:r>
+        <w:pict w14:anchorId="4573454B">
+          <v:rect id="_x0000_i1139" style="width:0;height:1.5pt" o:hralign="center" o:hrstd="t" o:hr="t" fillcolor="#a0a0a0" stroked="f"/>
+        </w:pict>
+      </w:r>
+    </w:p>
+    <w:p>
+      <w:pPr>
+        <w:rPr>
+          <w:rFonts w:cstheme="minorHAnsi"/>
+          <w:b/>
+          <w:bCs/>
+          <w:sz w:val="28"/>
+          <w:szCs w:val="28"/>
+          <w:u w:val="single"/>
+        </w:rPr>
+      </w:pPr>
+      <w:r>
+        <w:rPr>
+          <w:rFonts w:cstheme="minorHAnsi"/>
+          <w:b/>
+          <w:bCs/>
+          <w:sz w:val="28"/>
+          <w:szCs w:val="28"/>
+          <w:u w:val="single"/>
+        </w:rPr>
+        <w:t>3️</w:t>
+      </w:r>
+      <w:r>
+        <w:rPr>
+          <w:rFonts w:cstheme="minorHAnsi"/>
+          <w:b/>
+          <w:bCs/>
+          <w:sz w:val="28"/>
+          <w:szCs w:val="28"/>
+          <w:u w:val="single"/>
+        </w:rPr>
+        <w:t xml:space="preserve">) </w:t>
+      </w:r>
+      <w:r>
+        <w:rPr>
+          <w:rFonts w:cstheme="minorHAnsi"/>
+          <w:b/>
+          <w:bCs/>
+          <w:sz w:val="28"/>
+          <w:szCs w:val="28"/>
+          <w:u w:val="single"/>
+        </w:rPr>
+        <w:t>Identificar los datos disponibles</w:t>
+      </w:r>
+    </w:p>
+    <w:p>
+      <w:r>
+        <w:t>Preguntas clave:</w:t>
+      </w:r>
+    </w:p>
+    <w:p>
+      <w:pPr>
+        <w:numPr>
+          <w:ilvl w:val="0"/>
+          <w:numId w:val="53"/>
+        </w:numPr>
+      </w:pPr>
+      <w:r>
+        <w:t>¿Tengo datos estructurados?</w:t>
+      </w:r>
+    </w:p>
+    <w:p>
+      <w:pPr>
+        <w:numPr>
+          <w:ilvl w:val="0"/>
+          <w:numId w:val="53"/>
+        </w:numPr>
+      </w:pPr>
+      <w:r>
+        <w:t>¿Tengo documentos?</w:t>
+      </w:r>
+    </w:p>
+    <w:p>
+      <w:pPr>
+        <w:numPr>
+          <w:ilvl w:val="0"/>
+          <w:numId w:val="53"/>
+        </w:numPr>
+      </w:pPr>
+      <w:r>
+        <w:t>¿Tengo historial?</w:t>
+      </w:r>
+    </w:p>
+    <w:p>
+      <w:pPr>
+        <w:numPr>
+          <w:ilvl w:val="0"/>
+          <w:numId w:val="53"/>
+        </w:numPr>
+      </w:pPr>
+      <w:r>
+        <w:t xml:space="preserve">¿Tengo </w:t>
+      </w:r>
+      <w:proofErr w:type="spellStart"/>
+      <w:r>
+        <w:t>feedback</w:t>
+      </w:r>
+      <w:proofErr w:type="spellEnd"/>
+      <w:r>
+        <w:t xml:space="preserve"> del usuario?</w:t>
+      </w:r>
+    </w:p>
+    <w:p>
+      <w:r>
+        <w:t xml:space="preserve">Porque </w:t>
+      </w:r>
+      <w:r>
+        <w:rPr>
+          <w:b/>
+          <w:bCs/>
+        </w:rPr>
+        <w:t>sin datos no hay IA útil</w:t>
+      </w:r>
+      <w:r>
+        <w:t>.</w:t>
+      </w:r>
+    </w:p>
+    <w:p>
+      <w:r>
+        <w:pict w14:anchorId="72362862">
+          <v:rect id="_x0000_i1140" style="width:0;height:1.5pt" o:hralign="center" o:hrstd="t" o:hr="t" fillcolor="#a0a0a0" stroked="f"/>
+        </w:pict>
+      </w:r>
+    </w:p>
+    <w:p>
+      <w:pPr>
+        <w:rPr>
+          <w:rFonts w:cstheme="minorHAnsi"/>
+          <w:b/>
+          <w:bCs/>
+          <w:sz w:val="28"/>
+          <w:szCs w:val="28"/>
+          <w:u w:val="single"/>
+        </w:rPr>
+      </w:pPr>
+      <w:r>
+        <w:rPr>
+          <w:rFonts w:cstheme="minorHAnsi"/>
+          <w:b/>
+          <w:bCs/>
+          <w:sz w:val="28"/>
+          <w:szCs w:val="28"/>
+          <w:u w:val="single"/>
+        </w:rPr>
+        <w:lastRenderedPageBreak/>
+        <w:t>4️</w:t>
+      </w:r>
+      <w:r>
+        <w:rPr>
+          <w:rFonts w:cstheme="minorHAnsi"/>
+          <w:b/>
+          <w:bCs/>
+          <w:sz w:val="28"/>
+          <w:szCs w:val="28"/>
+          <w:u w:val="single"/>
+        </w:rPr>
+        <w:t xml:space="preserve">) </w:t>
+      </w:r>
+      <w:r>
+        <w:rPr>
+          <w:rFonts w:cstheme="minorHAnsi"/>
+          <w:b/>
+          <w:bCs/>
+          <w:sz w:val="28"/>
+          <w:szCs w:val="28"/>
+          <w:u w:val="single"/>
+        </w:rPr>
+        <w:t>Diseñar la arquitectura</w:t>
+      </w:r>
+    </w:p>
+    <w:p>
+      <w:r>
+        <w:t xml:space="preserve">Recién ahora </w:t>
+      </w:r>
+      <w:proofErr w:type="spellStart"/>
+      <w:r>
+        <w:t>pensás</w:t>
+      </w:r>
+      <w:proofErr w:type="spellEnd"/>
+      <w:r>
+        <w:t xml:space="preserve"> el sistema.</w:t>
+      </w:r>
+    </w:p>
+    <w:p>
+      <w:r>
+        <w:t>Ejemplo:</w:t>
+      </w:r>
+    </w:p>
+    <w:p>
+      <w:r>
+        <w:t>Input</w:t>
+      </w:r>
+      <w:r>
+        <w:br/>
+        <w:t>↓</w:t>
+      </w:r>
+      <w:r>
+        <w:br/>
+        <w:t>RAG (material de estudio)</w:t>
+      </w:r>
+      <w:r>
+        <w:br/>
+        <w:t>↓</w:t>
+      </w:r>
+      <w:r>
+        <w:br/>
+        <w:t>ML (predicción de abandono)</w:t>
+      </w:r>
+      <w:r>
+        <w:br/>
+        <w:t>↓</w:t>
+      </w:r>
+      <w:r>
+        <w:br/>
+        <w:t>LLM (explicación y tutoría)</w:t>
+      </w:r>
+      <w:r>
+        <w:br/>
+        <w:t>↓</w:t>
+      </w:r>
+      <w:r>
+        <w:br/>
+        <w:t>Memoria (perfil del estudiante)</w:t>
+      </w:r>
+    </w:p>
+    <w:p>
+      <w:r>
+        <w:pict w14:anchorId="22B82526">
+          <v:rect id="_x0000_i1141" style="width:0;height:1.5pt" o:hralign="center" o:hrstd="t" o:hr="t" fillcolor="#a0a0a0" stroked="f"/>
+        </w:pict>
+      </w:r>
+    </w:p>
+    <w:p>
+      <w:pPr>
+        <w:rPr>
+          <w:rFonts w:cstheme="minorHAnsi"/>
+          <w:b/>
+          <w:bCs/>
+          <w:sz w:val="28"/>
+          <w:szCs w:val="28"/>
+          <w:u w:val="single"/>
+        </w:rPr>
+      </w:pPr>
+      <w:r>
+        <w:rPr>
+          <w:rFonts w:cstheme="minorHAnsi"/>
+          <w:b/>
+          <w:bCs/>
+          <w:sz w:val="28"/>
+          <w:szCs w:val="28"/>
+          <w:u w:val="single"/>
+        </w:rPr>
+        <w:t>5️</w:t>
+      </w:r>
+      <w:r>
+        <w:rPr>
+          <w:rFonts w:cstheme="minorHAnsi"/>
+          <w:b/>
+          <w:bCs/>
+          <w:sz w:val="28"/>
+          <w:szCs w:val="28"/>
+          <w:u w:val="single"/>
+        </w:rPr>
+        <w:t xml:space="preserve">) </w:t>
+      </w:r>
+      <w:r>
+        <w:rPr>
+          <w:rFonts w:cstheme="minorHAnsi"/>
+          <w:b/>
+          <w:bCs/>
+          <w:sz w:val="28"/>
+          <w:szCs w:val="28"/>
+          <w:u w:val="single"/>
+        </w:rPr>
+        <w:t>Definir cómo se evalúa</w:t>
+      </w:r>
+    </w:p>
+    <w:p>
+      <w:r>
+        <w:t xml:space="preserve">Siempre </w:t>
+      </w:r>
+      <w:proofErr w:type="spellStart"/>
+      <w:r>
+        <w:t>preguntás</w:t>
+      </w:r>
+      <w:proofErr w:type="spellEnd"/>
+      <w:r>
+        <w:t>:</w:t>
+      </w:r>
+    </w:p>
+    <w:p>
+      <w:pPr>
+        <w:numPr>
+          <w:ilvl w:val="0"/>
+          <w:numId w:val="54"/>
+        </w:numPr>
+      </w:pPr>
+      <w:r>
+        <w:t>¿Cómo sé que funciona?</w:t>
+      </w:r>
+    </w:p>
+    <w:p>
+      <w:pPr>
+        <w:numPr>
+          <w:ilvl w:val="0"/>
+          <w:numId w:val="54"/>
+        </w:numPr>
+      </w:pPr>
+      <w:r>
+        <w:t>¿Qué métricas uso?</w:t>
+      </w:r>
+    </w:p>
+    <w:p>
+      <w:r>
+        <w:t>Ejemplo:</w:t>
+      </w:r>
+    </w:p>
+    <w:p>
+      <w:r>
+        <w:t>ML:</w:t>
+      </w:r>
+    </w:p>
+    <w:p>
+      <w:pPr>
+        <w:numPr>
+          <w:ilvl w:val="0"/>
+          <w:numId w:val="55"/>
+        </w:numPr>
+      </w:pPr>
+      <w:proofErr w:type="spellStart"/>
+      <w:r>
+        <w:t>accuracy</w:t>
+      </w:r>
+      <w:proofErr w:type="spellEnd"/>
+    </w:p>
+    <w:p>
+      <w:pPr>
+        <w:numPr>
+          <w:ilvl w:val="0"/>
+          <w:numId w:val="55"/>
+        </w:numPr>
+      </w:pPr>
+      <w:proofErr w:type="spellStart"/>
+      <w:r>
+        <w:t>recall</w:t>
+      </w:r>
+      <w:proofErr w:type="spellEnd"/>
+    </w:p>
+    <w:p>
+      <w:pPr>
+        <w:numPr>
+          <w:ilvl w:val="0"/>
+          <w:numId w:val="55"/>
+        </w:numPr>
+      </w:pPr>
+      <w:r>
+        <w:t>F1</w:t>
+      </w:r>
+    </w:p>
+    <w:p>
+      <w:r>
+        <w:t>LLM:</w:t>
+      </w:r>
+    </w:p>
+    <w:p>
+      <w:pPr>
+        <w:numPr>
+          <w:ilvl w:val="0"/>
+          <w:numId w:val="56"/>
+        </w:numPr>
+      </w:pPr>
+      <w:r>
+        <w:t>fidelidad</w:t>
+      </w:r>
+    </w:p>
+    <w:p>
+      <w:pPr>
+        <w:numPr>
+          <w:ilvl w:val="0"/>
+          <w:numId w:val="56"/>
+        </w:numPr>
+      </w:pPr>
+      <w:r>
+        <w:t>claridad</w:t>
+      </w:r>
+    </w:p>
+    <w:p>
+      <w:pPr>
+        <w:numPr>
+          <w:ilvl w:val="0"/>
+          <w:numId w:val="56"/>
+        </w:numPr>
+      </w:pPr>
+      <w:r>
+        <w:t>utilidad</w:t>
+      </w:r>
+    </w:p>
+    <w:p>
+      <w:r>
+        <w:pict w14:anchorId="0D75EBDD">
+          <v:rect id="_x0000_i1142" style="width:0;height:1.5pt" o:hralign="center" o:hrstd="t" o:hr="t" fillcolor="#a0a0a0" stroked="f"/>
+        </w:pict>
+      </w:r>
+    </w:p>
+    <w:p>
+      <w:pPr>
+        <w:rPr>
+          <w:rFonts w:cstheme="minorHAnsi"/>
+          <w:b/>
+          <w:bCs/>
+          <w:sz w:val="28"/>
+          <w:szCs w:val="28"/>
+          <w:u w:val="single"/>
+        </w:rPr>
+      </w:pPr>
+      <w:r>
+        <w:rPr>
+          <w:rFonts w:ascii="Segoe UI Emoji" w:hAnsi="Segoe UI Emoji" w:cs="Segoe UI Emoji"/>
+          <w:b/>
+          <w:bCs/>
+          <w:sz w:val="28"/>
+          <w:szCs w:val="28"/>
+          <w:u w:val="single"/>
+        </w:rPr>
+        <w:t>📌</w:t>
+      </w:r>
+      <w:r>
+        <w:rPr>
+          <w:rFonts w:cstheme="minorHAnsi"/>
+          <w:b/>
+          <w:bCs/>
+          <w:sz w:val="28"/>
+          <w:szCs w:val="28"/>
+          <w:u w:val="single"/>
+        </w:rPr>
+        <w:t xml:space="preserve"> Regla central</w:t>
+      </w:r>
+    </w:p>
+    <w:p>
+      <w:r>
+        <w:t>Primero el problema.</w:t>
+      </w:r>
+      <w:r>
+        <w:br/>
+        <w:t>Después la arquitectura.</w:t>
+      </w:r>
+      <w:r>
+        <w:br/>
+        <w:t>Nunca al revés.</w:t>
       </w:r>
     </w:p>
     <w:p/>
     <w:p/>
     <w:p/>
+    <w:p>
+      <w:pPr>
+        <w:rPr>
+          <w:b/>
+          <w:bCs/>
+          <w:sz w:val="28"/>
+          <w:szCs w:val="28"/>
+          <w:u w:val="single"/>
+        </w:rPr>
+      </w:pPr>
+      <w:r>
+        <w:rPr>
+          <w:b/>
+          <w:bCs/>
+          <w:sz w:val="28"/>
+          <w:szCs w:val="28"/>
+          <w:u w:val="single"/>
+        </w:rPr>
+        <w:lastRenderedPageBreak/>
+        <w:t xml:space="preserve">Mini ejercicio </w:t>
+      </w:r>
+    </w:p>
+    <w:p>
+      <w:proofErr w:type="spellStart"/>
+      <w:r>
+        <w:t>Imaginá</w:t>
+      </w:r>
+      <w:proofErr w:type="spellEnd"/>
+      <w:r>
+        <w:t xml:space="preserve"> este problema:</w:t>
+      </w:r>
+    </w:p>
+    <w:p>
+      <w:r>
+        <w:t xml:space="preserve">Una empresa quiere analizar </w:t>
+      </w:r>
+      <w:r>
+        <w:rPr>
+          <w:b/>
+          <w:bCs/>
+        </w:rPr>
+        <w:t>miles de CV</w:t>
+      </w:r>
+      <w:r>
+        <w:t xml:space="preserve"> para encontrar los mejores candidatos.</w:t>
+      </w:r>
+    </w:p>
+    <w:p>
+      <w:proofErr w:type="spellStart"/>
+      <w:r>
+        <w:t>Diseñá</w:t>
+      </w:r>
+      <w:proofErr w:type="spellEnd"/>
+      <w:r>
+        <w:t xml:space="preserve"> el sistema siguiendo los pasos.</w:t>
+      </w:r>
+    </w:p>
+    <w:p>
+      <w:r>
+        <w:t>Problema →</w:t>
+      </w:r>
+      <w:r>
+        <w:t xml:space="preserve"> </w:t>
+      </w:r>
+      <w:r>
+        <w:t xml:space="preserve">Clasificar y priorizar </w:t>
+      </w:r>
+      <w:proofErr w:type="spellStart"/>
+      <w:r>
+        <w:t>CVs</w:t>
+      </w:r>
+      <w:proofErr w:type="spellEnd"/>
+    </w:p>
+    <w:p>
+      <w:r>
+        <w:t>Tipo de IA →</w:t>
+      </w:r>
+      <w:r>
+        <w:t xml:space="preserve"> </w:t>
+      </w:r>
+      <w:r>
+        <w:t>LLM + ML</w:t>
+      </w:r>
+    </w:p>
+    <w:p>
+      <w:r>
+        <w:t>Datos →</w:t>
+      </w:r>
+      <w:proofErr w:type="spellStart"/>
+      <w:r>
+        <w:t>CVs</w:t>
+      </w:r>
+      <w:proofErr w:type="spellEnd"/>
+      <w:r>
+        <w:t xml:space="preserve">, </w:t>
+      </w:r>
+      <w:r>
+        <w:t>historial de contrataciones</w:t>
+      </w:r>
+      <w:r>
+        <w:t xml:space="preserve">, </w:t>
+      </w:r>
+      <w:r>
+        <w:t>descripción del puesto</w:t>
+      </w:r>
+    </w:p>
+    <w:p/>
+    <w:p>
+      <w:r>
+        <w:t>Arquitectura →</w:t>
+      </w:r>
+    </w:p>
+    <w:p>
+      <w:r>
+        <w:t>Input → CV</w:t>
+      </w:r>
+    </w:p>
+    <w:p>
+      <w:r>
+        <w:t>↓</w:t>
+      </w:r>
+    </w:p>
+    <w:p>
+      <w:r>
+        <w:t>LLM → extracción de datos</w:t>
+      </w:r>
+    </w:p>
+    <w:p>
+      <w:r>
+        <w:t>↓</w:t>
+      </w:r>
+    </w:p>
+    <w:p>
+      <w:r>
+        <w:t>ML → ranking de candidatos</w:t>
+      </w:r>
+    </w:p>
+    <w:p>
+      <w:r>
+        <w:t>↓</w:t>
+      </w:r>
+    </w:p>
+    <w:p>
+      <w:r>
+        <w:t>LLM → explicación del ranking</w:t>
+      </w:r>
+    </w:p>
+    <w:p/>
+    <w:p>
+      <w:r>
+        <w:t>Evaluación →</w:t>
+      </w:r>
+    </w:p>
+    <w:p>
+      <w:r>
+        <w:t xml:space="preserve">ML: </w:t>
+      </w:r>
+      <w:proofErr w:type="spellStart"/>
+      <w:r>
+        <w:t>precision</w:t>
+      </w:r>
+      <w:proofErr w:type="spellEnd"/>
+      <w:r>
+        <w:t xml:space="preserve"> / ranking </w:t>
+      </w:r>
+      <w:proofErr w:type="spellStart"/>
+      <w:r>
+        <w:t>accuracy</w:t>
+      </w:r>
+      <w:proofErr w:type="spellEnd"/>
+    </w:p>
+    <w:p>
+      <w:r>
+        <w:t>LLM: fidelidad y claridad</w:t>
+      </w:r>
+    </w:p>
     <w:p/>
     <w:p/>
     <w:p/>
@@ -5432,6 +6455,155 @@
 <file path=word/numbering.xml><?xml version="1.0" encoding="utf-8"?>
 <w:numbering xmlns:wpc="http://schemas.microsoft.com/office/word/2010/wordprocessingCanvas" xmlns:cx="http://schemas.microsoft.com/office/drawing/2014/chartex" xmlns:cx1="http://schemas.microsoft.com/office/drawing/2015/9/8/chartex" xmlns:cx2="http://schemas.microsoft.com/office/drawing/2015/10/21/chartex" xmlns:cx3="http://schemas.microsoft.com/office/drawing/2016/5/9/chartex" xmlns:cx4="http://schemas.microsoft.com/office/drawing/2016/5/10/chartex" xmlns:cx5="http://schemas.microsoft.com/office/drawing/2016/5/11/chartex" xmlns:cx6="http://schemas.microsoft.com/office/drawing/2016/5/12/chartex" xmlns:cx7="http://schemas.microsoft.com/office/drawing/2016/5/13/chartex" xmlns:cx8="http://schemas.microsoft.com/office/drawing/2016/5/14/chartex" xmlns:mc="http://schemas.openxmlformats.org/markup-compatibility/2006" xmlns:aink="http://schemas.microsoft.com/office/drawing/2016/ink" xmlns:am3d="http://schemas.microsoft.com/office/drawing/2017/model3d" xmlns:o="urn:schemas-microsoft-com:office:office" xmlns:oel="http://schemas.microsoft.com/office/2019/extlst" xmlns:r="http://schemas.openxmlformats.org/officeDocument/2006/relationships" xmlns:m="http://schemas.openxmlformats.org/officeDocument/2006/math" xmlns:v="urn:schemas-microsoft-com:vml" xmlns:wp14="http://schemas.microsoft.com/office/word/2010/wordprocessingDrawing" xmlns:wp="http://schemas.openxmlformats.org/drawingml/2006/wordprocessingDrawing" xmlns:w10="urn:schemas-microsoft-com:office:word" xmlns:w="http://schemas.openxmlformats.org/wordprocessingml/2006/main" xmlns:w14="http://schemas.microsoft.com/office/word/2010/wordml" xmlns:w15="http://schemas.microsoft.com/office/word/2012/wordml" xmlns:w16cex="http://schemas.microsoft.com/office/word/2018/wordml/cex" xmlns:w16cid="http://schemas.microsoft.com/office/word/2016/wordml/cid" xmlns:w16="http://schemas.microsoft.com/office/word/2018/wordml" xmlns:w16sdtdh="http://schemas.microsoft.com/office/word/2020/wordml/sdtdatahash" xmlns:w16se="http://schemas.microsoft.com/office/word/2015/wordml/symex" xmlns:wpg="http://schemas.microsoft.com/office/word/2010/wordprocessingGroup" xmlns:wpi="http://schemas.microsoft.com/office/word/2010/wordprocessingInk" xmlns:wne="http://schemas.microsoft.com/office/word/2006/wordml" xmlns:wps="http://schemas.microsoft.com/office/word/2010/wordprocessingShape" mc:Ignorable="w14 w15 w16se w16cid w16 w16cex w16sdtdh wp14">
   <w:abstractNum w:abstractNumId="0" w15:restartNumberingAfterBreak="0">
+    <w:nsid w:val="01414977"/>
+    <w:multiLevelType w:val="multilevel"/>
+    <w:tmpl w:val="53B6E0C0"/>
+    <w:lvl w:ilvl="0">
+      <w:start w:val="1"/>
+      <w:numFmt w:val="bullet"/>
+      <w:lvlText w:val=""/>
+      <w:lvlJc w:val="left"/>
+      <w:pPr>
+        <w:tabs>
+          <w:tab w:val="num" w:pos="720"/>
+        </w:tabs>
+        <w:ind w:left="720" w:hanging="360"/>
+      </w:pPr>
+      <w:rPr>
+        <w:rFonts w:ascii="Symbol" w:hAnsi="Symbol" w:hint="default"/>
+        <w:sz w:val="20"/>
+      </w:rPr>
+    </w:lvl>
+    <w:lvl w:ilvl="1" w:tentative="1">
+      <w:start w:val="1"/>
+      <w:numFmt w:val="bullet"/>
+      <w:lvlText w:val="o"/>
+      <w:lvlJc w:val="left"/>
+      <w:pPr>
+        <w:tabs>
+          <w:tab w:val="num" w:pos="1440"/>
+        </w:tabs>
+        <w:ind w:left="1440" w:hanging="360"/>
+      </w:pPr>
+      <w:rPr>
+        <w:rFonts w:ascii="Courier New" w:hAnsi="Courier New" w:hint="default"/>
+        <w:sz w:val="20"/>
+      </w:rPr>
+    </w:lvl>
+    <w:lvl w:ilvl="2" w:tentative="1">
+      <w:start w:val="1"/>
+      <w:numFmt w:val="bullet"/>
+      <w:lvlText w:val=""/>
+      <w:lvlJc w:val="left"/>
+      <w:pPr>
+        <w:tabs>
+          <w:tab w:val="num" w:pos="2160"/>
+        </w:tabs>
+        <w:ind w:left="2160" w:hanging="360"/>
+      </w:pPr>
+      <w:rPr>
+        <w:rFonts w:ascii="Wingdings" w:hAnsi="Wingdings" w:hint="default"/>
+        <w:sz w:val="20"/>
+      </w:rPr>
+    </w:lvl>
+    <w:lvl w:ilvl="3" w:tentative="1">
+      <w:start w:val="1"/>
+      <w:numFmt w:val="bullet"/>
+      <w:lvlText w:val=""/>
+      <w:lvlJc w:val="left"/>
+      <w:pPr>
+        <w:tabs>
+          <w:tab w:val="num" w:pos="2880"/>
+        </w:tabs>
+        <w:ind w:left="2880" w:hanging="360"/>
+      </w:pPr>
+      <w:rPr>
+        <w:rFonts w:ascii="Wingdings" w:hAnsi="Wingdings" w:hint="default"/>
+        <w:sz w:val="20"/>
+      </w:rPr>
+    </w:lvl>
+    <w:lvl w:ilvl="4" w:tentative="1">
+      <w:start w:val="1"/>
+      <w:numFmt w:val="bullet"/>
+      <w:lvlText w:val=""/>
+      <w:lvlJc w:val="left"/>
+      <w:pPr>
+        <w:tabs>
+          <w:tab w:val="num" w:pos="3600"/>
+        </w:tabs>
+        <w:ind w:left="3600" w:hanging="360"/>
+      </w:pPr>
+      <w:rPr>
+        <w:rFonts w:ascii="Wingdings" w:hAnsi="Wingdings" w:hint="default"/>
+        <w:sz w:val="20"/>
+      </w:rPr>
+    </w:lvl>
+    <w:lvl w:ilvl="5" w:tentative="1">
+      <w:start w:val="1"/>
+      <w:numFmt w:val="bullet"/>
+      <w:lvlText w:val=""/>
+      <w:lvlJc w:val="left"/>
+      <w:pPr>
+        <w:tabs>
+          <w:tab w:val="num" w:pos="4320"/>
+        </w:tabs>
+        <w:ind w:left="4320" w:hanging="360"/>
+      </w:pPr>
+      <w:rPr>
+        <w:rFonts w:ascii="Wingdings" w:hAnsi="Wingdings" w:hint="default"/>
+        <w:sz w:val="20"/>
+      </w:rPr>
+    </w:lvl>
+    <w:lvl w:ilvl="6" w:tentative="1">
+      <w:start w:val="1"/>
+      <w:numFmt w:val="bullet"/>
+      <w:lvlText w:val=""/>
+      <w:lvlJc w:val="left"/>
+      <w:pPr>
+        <w:tabs>
+          <w:tab w:val="num" w:pos="5040"/>
+        </w:tabs>
+        <w:ind w:left="5040" w:hanging="360"/>
+      </w:pPr>
+      <w:rPr>
+        <w:rFonts w:ascii="Wingdings" w:hAnsi="Wingdings" w:hint="default"/>
+        <w:sz w:val="20"/>
+      </w:rPr>
+    </w:lvl>
+    <w:lvl w:ilvl="7" w:tentative="1">
+      <w:start w:val="1"/>
+      <w:numFmt w:val="bullet"/>
+      <w:lvlText w:val=""/>
+      <w:lvlJc w:val="left"/>
+      <w:pPr>
+        <w:tabs>
+          <w:tab w:val="num" w:pos="5760"/>
+        </w:tabs>
+        <w:ind w:left="5760" w:hanging="360"/>
+      </w:pPr>
+      <w:rPr>
+        <w:rFonts w:ascii="Wingdings" w:hAnsi="Wingdings" w:hint="default"/>
+        <w:sz w:val="20"/>
+      </w:rPr>
+    </w:lvl>
+    <w:lvl w:ilvl="8" w:tentative="1">
+      <w:start w:val="1"/>
+      <w:numFmt w:val="bullet"/>
+      <w:lvlText w:val=""/>
+      <w:lvlJc w:val="left"/>
+      <w:pPr>
+        <w:tabs>
+          <w:tab w:val="num" w:pos="6480"/>
+        </w:tabs>
+        <w:ind w:left="6480" w:hanging="360"/>
+      </w:pPr>
+      <w:rPr>
+        <w:rFonts w:ascii="Wingdings" w:hAnsi="Wingdings" w:hint="default"/>
+        <w:sz w:val="20"/>
+      </w:rPr>
+    </w:lvl>
+  </w:abstractNum>
+  <w:abstractNum w:abstractNumId="1" w15:restartNumberingAfterBreak="0">
     <w:nsid w:val="03492C27"/>
     <w:multiLevelType w:val="multilevel"/>
     <w:tmpl w:val="3A30D43C"/>
@@ -5580,7 +6752,7 @@
       </w:rPr>
     </w:lvl>
   </w:abstractNum>
-  <w:abstractNum w:abstractNumId="1" w15:restartNumberingAfterBreak="0">
+  <w:abstractNum w:abstractNumId="2" w15:restartNumberingAfterBreak="0">
     <w:nsid w:val="05F37A8D"/>
     <w:multiLevelType w:val="multilevel"/>
     <w:tmpl w:val="87DA4602"/>
@@ -5729,7 +6901,7 @@
       </w:rPr>
     </w:lvl>
   </w:abstractNum>
-  <w:abstractNum w:abstractNumId="2" w15:restartNumberingAfterBreak="0">
+  <w:abstractNum w:abstractNumId="3" w15:restartNumberingAfterBreak="0">
     <w:nsid w:val="06564B2D"/>
     <w:multiLevelType w:val="multilevel"/>
     <w:tmpl w:val="700E666E"/>
@@ -5878,7 +7050,7 @@
       </w:rPr>
     </w:lvl>
   </w:abstractNum>
-  <w:abstractNum w:abstractNumId="3" w15:restartNumberingAfterBreak="0">
+  <w:abstractNum w:abstractNumId="4" w15:restartNumberingAfterBreak="0">
     <w:nsid w:val="065D5FE6"/>
     <w:multiLevelType w:val="multilevel"/>
     <w:tmpl w:val="97BED464"/>
@@ -6027,7 +7199,7 @@
       </w:rPr>
     </w:lvl>
   </w:abstractNum>
-  <w:abstractNum w:abstractNumId="4" w15:restartNumberingAfterBreak="0">
+  <w:abstractNum w:abstractNumId="5" w15:restartNumberingAfterBreak="0">
     <w:nsid w:val="0663362A"/>
     <w:multiLevelType w:val="multilevel"/>
     <w:tmpl w:val="4F0E6462"/>
@@ -6176,7 +7348,7 @@
       </w:rPr>
     </w:lvl>
   </w:abstractNum>
-  <w:abstractNum w:abstractNumId="5" w15:restartNumberingAfterBreak="0">
+  <w:abstractNum w:abstractNumId="6" w15:restartNumberingAfterBreak="0">
     <w:nsid w:val="0D010857"/>
     <w:multiLevelType w:val="multilevel"/>
     <w:tmpl w:val="1EC603FC"/>
@@ -6325,7 +7497,7 @@
       </w:rPr>
     </w:lvl>
   </w:abstractNum>
-  <w:abstractNum w:abstractNumId="6" w15:restartNumberingAfterBreak="0">
+  <w:abstractNum w:abstractNumId="7" w15:restartNumberingAfterBreak="0">
     <w:nsid w:val="0DA64C53"/>
     <w:multiLevelType w:val="multilevel"/>
     <w:tmpl w:val="ACF6F18A"/>
@@ -6474,7 +7646,7 @@
       </w:rPr>
     </w:lvl>
   </w:abstractNum>
-  <w:abstractNum w:abstractNumId="7" w15:restartNumberingAfterBreak="0">
+  <w:abstractNum w:abstractNumId="8" w15:restartNumberingAfterBreak="0">
     <w:nsid w:val="0F3929A8"/>
     <w:multiLevelType w:val="multilevel"/>
     <w:tmpl w:val="8208E128"/>
@@ -6623,7 +7795,7 @@
       </w:rPr>
     </w:lvl>
   </w:abstractNum>
-  <w:abstractNum w:abstractNumId="8" w15:restartNumberingAfterBreak="0">
+  <w:abstractNum w:abstractNumId="9" w15:restartNumberingAfterBreak="0">
     <w:nsid w:val="12A319D4"/>
     <w:multiLevelType w:val="multilevel"/>
     <w:tmpl w:val="2C622292"/>
@@ -6772,7 +7944,7 @@
       </w:rPr>
     </w:lvl>
   </w:abstractNum>
-  <w:abstractNum w:abstractNumId="9" w15:restartNumberingAfterBreak="0">
+  <w:abstractNum w:abstractNumId="10" w15:restartNumberingAfterBreak="0">
     <w:nsid w:val="13944DD0"/>
     <w:multiLevelType w:val="multilevel"/>
     <w:tmpl w:val="E9A27296"/>
@@ -6921,7 +8093,7 @@
       </w:rPr>
     </w:lvl>
   </w:abstractNum>
-  <w:abstractNum w:abstractNumId="10" w15:restartNumberingAfterBreak="0">
+  <w:abstractNum w:abstractNumId="11" w15:restartNumberingAfterBreak="0">
     <w:nsid w:val="146F2D1C"/>
     <w:multiLevelType w:val="multilevel"/>
     <w:tmpl w:val="9EF82712"/>
@@ -7070,7 +8242,156 @@
       </w:rPr>
     </w:lvl>
   </w:abstractNum>
-  <w:abstractNum w:abstractNumId="11" w15:restartNumberingAfterBreak="0">
+  <w:abstractNum w:abstractNumId="12" w15:restartNumberingAfterBreak="0">
+    <w:nsid w:val="14CD2F19"/>
+    <w:multiLevelType w:val="multilevel"/>
+    <w:tmpl w:val="035EAAB4"/>
+    <w:lvl w:ilvl="0">
+      <w:start w:val="1"/>
+      <w:numFmt w:val="bullet"/>
+      <w:lvlText w:val=""/>
+      <w:lvlJc w:val="left"/>
+      <w:pPr>
+        <w:tabs>
+          <w:tab w:val="num" w:pos="720"/>
+        </w:tabs>
+        <w:ind w:left="720" w:hanging="360"/>
+      </w:pPr>
+      <w:rPr>
+        <w:rFonts w:ascii="Symbol" w:hAnsi="Symbol" w:hint="default"/>
+        <w:sz w:val="20"/>
+      </w:rPr>
+    </w:lvl>
+    <w:lvl w:ilvl="1" w:tentative="1">
+      <w:start w:val="1"/>
+      <w:numFmt w:val="bullet"/>
+      <w:lvlText w:val="o"/>
+      <w:lvlJc w:val="left"/>
+      <w:pPr>
+        <w:tabs>
+          <w:tab w:val="num" w:pos="1440"/>
+        </w:tabs>
+        <w:ind w:left="1440" w:hanging="360"/>
+      </w:pPr>
+      <w:rPr>
+        <w:rFonts w:ascii="Courier New" w:hAnsi="Courier New" w:hint="default"/>
+        <w:sz w:val="20"/>
+      </w:rPr>
+    </w:lvl>
+    <w:lvl w:ilvl="2" w:tentative="1">
+      <w:start w:val="1"/>
+      <w:numFmt w:val="bullet"/>
+      <w:lvlText w:val=""/>
+      <w:lvlJc w:val="left"/>
+      <w:pPr>
+        <w:tabs>
+          <w:tab w:val="num" w:pos="2160"/>
+        </w:tabs>
+        <w:ind w:left="2160" w:hanging="360"/>
+      </w:pPr>
+      <w:rPr>
+        <w:rFonts w:ascii="Wingdings" w:hAnsi="Wingdings" w:hint="default"/>
+        <w:sz w:val="20"/>
+      </w:rPr>
+    </w:lvl>
+    <w:lvl w:ilvl="3" w:tentative="1">
+      <w:start w:val="1"/>
+      <w:numFmt w:val="bullet"/>
+      <w:lvlText w:val=""/>
+      <w:lvlJc w:val="left"/>
+      <w:pPr>
+        <w:tabs>
+          <w:tab w:val="num" w:pos="2880"/>
+        </w:tabs>
+        <w:ind w:left="2880" w:hanging="360"/>
+      </w:pPr>
+      <w:rPr>
+        <w:rFonts w:ascii="Wingdings" w:hAnsi="Wingdings" w:hint="default"/>
+        <w:sz w:val="20"/>
+      </w:rPr>
+    </w:lvl>
+    <w:lvl w:ilvl="4" w:tentative="1">
+      <w:start w:val="1"/>
+      <w:numFmt w:val="bullet"/>
+      <w:lvlText w:val=""/>
+      <w:lvlJc w:val="left"/>
+      <w:pPr>
+        <w:tabs>
+          <w:tab w:val="num" w:pos="3600"/>
+        </w:tabs>
+        <w:ind w:left="3600" w:hanging="360"/>
+      </w:pPr>
+      <w:rPr>
+        <w:rFonts w:ascii="Wingdings" w:hAnsi="Wingdings" w:hint="default"/>
+        <w:sz w:val="20"/>
+      </w:rPr>
+    </w:lvl>
+    <w:lvl w:ilvl="5" w:tentative="1">
+      <w:start w:val="1"/>
+      <w:numFmt w:val="bullet"/>
+      <w:lvlText w:val=""/>
+      <w:lvlJc w:val="left"/>
+      <w:pPr>
+        <w:tabs>
+          <w:tab w:val="num" w:pos="4320"/>
+        </w:tabs>
+        <w:ind w:left="4320" w:hanging="360"/>
+      </w:pPr>
+      <w:rPr>
+        <w:rFonts w:ascii="Wingdings" w:hAnsi="Wingdings" w:hint="default"/>
+        <w:sz w:val="20"/>
+      </w:rPr>
+    </w:lvl>
+    <w:lvl w:ilvl="6" w:tentative="1">
+      <w:start w:val="1"/>
+      <w:numFmt w:val="bullet"/>
+      <w:lvlText w:val=""/>
+      <w:lvlJc w:val="left"/>
+      <w:pPr>
+        <w:tabs>
+          <w:tab w:val="num" w:pos="5040"/>
+        </w:tabs>
+        <w:ind w:left="5040" w:hanging="360"/>
+      </w:pPr>
+      <w:rPr>
+        <w:rFonts w:ascii="Wingdings" w:hAnsi="Wingdings" w:hint="default"/>
+        <w:sz w:val="20"/>
+      </w:rPr>
+    </w:lvl>
+    <w:lvl w:ilvl="7" w:tentative="1">
+      <w:start w:val="1"/>
+      <w:numFmt w:val="bullet"/>
+      <w:lvlText w:val=""/>
+      <w:lvlJc w:val="left"/>
+      <w:pPr>
+        <w:tabs>
+          <w:tab w:val="num" w:pos="5760"/>
+        </w:tabs>
+        <w:ind w:left="5760" w:hanging="360"/>
+      </w:pPr>
+      <w:rPr>
+        <w:rFonts w:ascii="Wingdings" w:hAnsi="Wingdings" w:hint="default"/>
+        <w:sz w:val="20"/>
+      </w:rPr>
+    </w:lvl>
+    <w:lvl w:ilvl="8" w:tentative="1">
+      <w:start w:val="1"/>
+      <w:numFmt w:val="bullet"/>
+      <w:lvlText w:val=""/>
+      <w:lvlJc w:val="left"/>
+      <w:pPr>
+        <w:tabs>
+          <w:tab w:val="num" w:pos="6480"/>
+        </w:tabs>
+        <w:ind w:left="6480" w:hanging="360"/>
+      </w:pPr>
+      <w:rPr>
+        <w:rFonts w:ascii="Wingdings" w:hAnsi="Wingdings" w:hint="default"/>
+        <w:sz w:val="20"/>
+      </w:rPr>
+    </w:lvl>
+  </w:abstractNum>
+  <w:abstractNum w:abstractNumId="13" w15:restartNumberingAfterBreak="0">
     <w:nsid w:val="152A158D"/>
     <w:multiLevelType w:val="multilevel"/>
     <w:tmpl w:val="FB80F726"/>
@@ -7219,7 +8540,7 @@
       </w:rPr>
     </w:lvl>
   </w:abstractNum>
-  <w:abstractNum w:abstractNumId="12" w15:restartNumberingAfterBreak="0">
+  <w:abstractNum w:abstractNumId="14" w15:restartNumberingAfterBreak="0">
     <w:nsid w:val="153B299B"/>
     <w:multiLevelType w:val="multilevel"/>
     <w:tmpl w:val="B7BE7A2E"/>
@@ -7368,7 +8689,7 @@
       </w:rPr>
     </w:lvl>
   </w:abstractNum>
-  <w:abstractNum w:abstractNumId="13" w15:restartNumberingAfterBreak="0">
+  <w:abstractNum w:abstractNumId="15" w15:restartNumberingAfterBreak="0">
     <w:nsid w:val="16E87DC8"/>
     <w:multiLevelType w:val="multilevel"/>
     <w:tmpl w:val="782A7C94"/>
@@ -7517,7 +8838,7 @@
       </w:rPr>
     </w:lvl>
   </w:abstractNum>
-  <w:abstractNum w:abstractNumId="14" w15:restartNumberingAfterBreak="0">
+  <w:abstractNum w:abstractNumId="16" w15:restartNumberingAfterBreak="0">
     <w:nsid w:val="1E1554BE"/>
     <w:multiLevelType w:val="multilevel"/>
     <w:tmpl w:val="68A0640E"/>
@@ -7666,7 +8987,7 @@
       </w:rPr>
     </w:lvl>
   </w:abstractNum>
-  <w:abstractNum w:abstractNumId="15" w15:restartNumberingAfterBreak="0">
+  <w:abstractNum w:abstractNumId="17" w15:restartNumberingAfterBreak="0">
     <w:nsid w:val="1F5A7787"/>
     <w:multiLevelType w:val="multilevel"/>
     <w:tmpl w:val="72E65428"/>
@@ -7815,7 +9136,7 @@
       </w:rPr>
     </w:lvl>
   </w:abstractNum>
-  <w:abstractNum w:abstractNumId="16" w15:restartNumberingAfterBreak="0">
+  <w:abstractNum w:abstractNumId="18" w15:restartNumberingAfterBreak="0">
     <w:nsid w:val="1FA23015"/>
     <w:multiLevelType w:val="multilevel"/>
     <w:tmpl w:val="B17C8C1E"/>
@@ -7964,7 +9285,305 @@
       </w:rPr>
     </w:lvl>
   </w:abstractNum>
-  <w:abstractNum w:abstractNumId="17" w15:restartNumberingAfterBreak="0">
+  <w:abstractNum w:abstractNumId="19" w15:restartNumberingAfterBreak="0">
+    <w:nsid w:val="23B50855"/>
+    <w:multiLevelType w:val="multilevel"/>
+    <w:tmpl w:val="B6E64CE6"/>
+    <w:lvl w:ilvl="0">
+      <w:start w:val="1"/>
+      <w:numFmt w:val="bullet"/>
+      <w:lvlText w:val=""/>
+      <w:lvlJc w:val="left"/>
+      <w:pPr>
+        <w:tabs>
+          <w:tab w:val="num" w:pos="720"/>
+        </w:tabs>
+        <w:ind w:left="720" w:hanging="360"/>
+      </w:pPr>
+      <w:rPr>
+        <w:rFonts w:ascii="Symbol" w:hAnsi="Symbol" w:hint="default"/>
+        <w:sz w:val="20"/>
+      </w:rPr>
+    </w:lvl>
+    <w:lvl w:ilvl="1" w:tentative="1">
+      <w:start w:val="1"/>
+      <w:numFmt w:val="bullet"/>
+      <w:lvlText w:val="o"/>
+      <w:lvlJc w:val="left"/>
+      <w:pPr>
+        <w:tabs>
+          <w:tab w:val="num" w:pos="1440"/>
+        </w:tabs>
+        <w:ind w:left="1440" w:hanging="360"/>
+      </w:pPr>
+      <w:rPr>
+        <w:rFonts w:ascii="Courier New" w:hAnsi="Courier New" w:hint="default"/>
+        <w:sz w:val="20"/>
+      </w:rPr>
+    </w:lvl>
+    <w:lvl w:ilvl="2" w:tentative="1">
+      <w:start w:val="1"/>
+      <w:numFmt w:val="bullet"/>
+      <w:lvlText w:val=""/>
+      <w:lvlJc w:val="left"/>
+      <w:pPr>
+        <w:tabs>
+          <w:tab w:val="num" w:pos="2160"/>
+        </w:tabs>
+        <w:ind w:left="2160" w:hanging="360"/>
+      </w:pPr>
+      <w:rPr>
+        <w:rFonts w:ascii="Wingdings" w:hAnsi="Wingdings" w:hint="default"/>
+        <w:sz w:val="20"/>
+      </w:rPr>
+    </w:lvl>
+    <w:lvl w:ilvl="3" w:tentative="1">
+      <w:start w:val="1"/>
+      <w:numFmt w:val="bullet"/>
+      <w:lvlText w:val=""/>
+      <w:lvlJc w:val="left"/>
+      <w:pPr>
+        <w:tabs>
+          <w:tab w:val="num" w:pos="2880"/>
+        </w:tabs>
+        <w:ind w:left="2880" w:hanging="360"/>
+      </w:pPr>
+      <w:rPr>
+        <w:rFonts w:ascii="Wingdings" w:hAnsi="Wingdings" w:hint="default"/>
+        <w:sz w:val="20"/>
+      </w:rPr>
+    </w:lvl>
+    <w:lvl w:ilvl="4" w:tentative="1">
+      <w:start w:val="1"/>
+      <w:numFmt w:val="bullet"/>
+      <w:lvlText w:val=""/>
+      <w:lvlJc w:val="left"/>
+      <w:pPr>
+        <w:tabs>
+          <w:tab w:val="num" w:pos="3600"/>
+        </w:tabs>
+        <w:ind w:left="3600" w:hanging="360"/>
+      </w:pPr>
+      <w:rPr>
+        <w:rFonts w:ascii="Wingdings" w:hAnsi="Wingdings" w:hint="default"/>
+        <w:sz w:val="20"/>
+      </w:rPr>
+    </w:lvl>
+    <w:lvl w:ilvl="5" w:tentative="1">
+      <w:start w:val="1"/>
+      <w:numFmt w:val="bullet"/>
+      <w:lvlText w:val=""/>
+      <w:lvlJc w:val="left"/>
+      <w:pPr>
+        <w:tabs>
+          <w:tab w:val="num" w:pos="4320"/>
+        </w:tabs>
+        <w:ind w:left="4320" w:hanging="360"/>
+      </w:pPr>
+      <w:rPr>
+        <w:rFonts w:ascii="Wingdings" w:hAnsi="Wingdings" w:hint="default"/>
+        <w:sz w:val="20"/>
+      </w:rPr>
+    </w:lvl>
+    <w:lvl w:ilvl="6" w:tentative="1">
+      <w:start w:val="1"/>
+      <w:numFmt w:val="bullet"/>
+      <w:lvlText w:val=""/>
+      <w:lvlJc w:val="left"/>
+      <w:pPr>
+        <w:tabs>
+          <w:tab w:val="num" w:pos="5040"/>
+        </w:tabs>
+        <w:ind w:left="5040" w:hanging="360"/>
+      </w:pPr>
+      <w:rPr>
+        <w:rFonts w:ascii="Wingdings" w:hAnsi="Wingdings" w:hint="default"/>
+        <w:sz w:val="20"/>
+      </w:rPr>
+    </w:lvl>
+    <w:lvl w:ilvl="7" w:tentative="1">
+      <w:start w:val="1"/>
+      <w:numFmt w:val="bullet"/>
+      <w:lvlText w:val=""/>
+      <w:lvlJc w:val="left"/>
+      <w:pPr>
+        <w:tabs>
+          <w:tab w:val="num" w:pos="5760"/>
+        </w:tabs>
+        <w:ind w:left="5760" w:hanging="360"/>
+      </w:pPr>
+      <w:rPr>
+        <w:rFonts w:ascii="Wingdings" w:hAnsi="Wingdings" w:hint="default"/>
+        <w:sz w:val="20"/>
+      </w:rPr>
+    </w:lvl>
+    <w:lvl w:ilvl="8" w:tentative="1">
+      <w:start w:val="1"/>
+      <w:numFmt w:val="bullet"/>
+      <w:lvlText w:val=""/>
+      <w:lvlJc w:val="left"/>
+      <w:pPr>
+        <w:tabs>
+          <w:tab w:val="num" w:pos="6480"/>
+        </w:tabs>
+        <w:ind w:left="6480" w:hanging="360"/>
+      </w:pPr>
+      <w:rPr>
+        <w:rFonts w:ascii="Wingdings" w:hAnsi="Wingdings" w:hint="default"/>
+        <w:sz w:val="20"/>
+      </w:rPr>
+    </w:lvl>
+  </w:abstractNum>
+  <w:abstractNum w:abstractNumId="20" w15:restartNumberingAfterBreak="0">
+    <w:nsid w:val="24F916FC"/>
+    <w:multiLevelType w:val="multilevel"/>
+    <w:tmpl w:val="DB32BF3E"/>
+    <w:lvl w:ilvl="0">
+      <w:start w:val="1"/>
+      <w:numFmt w:val="bullet"/>
+      <w:lvlText w:val=""/>
+      <w:lvlJc w:val="left"/>
+      <w:pPr>
+        <w:tabs>
+          <w:tab w:val="num" w:pos="720"/>
+        </w:tabs>
+        <w:ind w:left="720" w:hanging="360"/>
+      </w:pPr>
+      <w:rPr>
+        <w:rFonts w:ascii="Symbol" w:hAnsi="Symbol" w:hint="default"/>
+        <w:sz w:val="20"/>
+      </w:rPr>
+    </w:lvl>
+    <w:lvl w:ilvl="1" w:tentative="1">
+      <w:start w:val="1"/>
+      <w:numFmt w:val="bullet"/>
+      <w:lvlText w:val="o"/>
+      <w:lvlJc w:val="left"/>
+      <w:pPr>
+        <w:tabs>
+          <w:tab w:val="num" w:pos="1440"/>
+        </w:tabs>
+        <w:ind w:left="1440" w:hanging="360"/>
+      </w:pPr>
+      <w:rPr>
+        <w:rFonts w:ascii="Courier New" w:hAnsi="Courier New" w:hint="default"/>
+        <w:sz w:val="20"/>
+      </w:rPr>
+    </w:lvl>
+    <w:lvl w:ilvl="2" w:tentative="1">
+      <w:start w:val="1"/>
+      <w:numFmt w:val="bullet"/>
+      <w:lvlText w:val=""/>
+      <w:lvlJc w:val="left"/>
+      <w:pPr>
+        <w:tabs>
+          <w:tab w:val="num" w:pos="2160"/>
+        </w:tabs>
+        <w:ind w:left="2160" w:hanging="360"/>
+      </w:pPr>
+      <w:rPr>
+        <w:rFonts w:ascii="Wingdings" w:hAnsi="Wingdings" w:hint="default"/>
+        <w:sz w:val="20"/>
+      </w:rPr>
+    </w:lvl>
+    <w:lvl w:ilvl="3" w:tentative="1">
+      <w:start w:val="1"/>
+      <w:numFmt w:val="bullet"/>
+      <w:lvlText w:val=""/>
+      <w:lvlJc w:val="left"/>
+      <w:pPr>
+        <w:tabs>
+          <w:tab w:val="num" w:pos="2880"/>
+        </w:tabs>
+        <w:ind w:left="2880" w:hanging="360"/>
+      </w:pPr>
+      <w:rPr>
+        <w:rFonts w:ascii="Wingdings" w:hAnsi="Wingdings" w:hint="default"/>
+        <w:sz w:val="20"/>
+      </w:rPr>
+    </w:lvl>
+    <w:lvl w:ilvl="4" w:tentative="1">
+      <w:start w:val="1"/>
+      <w:numFmt w:val="bullet"/>
+      <w:lvlText w:val=""/>
+      <w:lvlJc w:val="left"/>
+      <w:pPr>
+        <w:tabs>
+          <w:tab w:val="num" w:pos="3600"/>
+        </w:tabs>
+        <w:ind w:left="3600" w:hanging="360"/>
+      </w:pPr>
+      <w:rPr>
+        <w:rFonts w:ascii="Wingdings" w:hAnsi="Wingdings" w:hint="default"/>
+        <w:sz w:val="20"/>
+      </w:rPr>
+    </w:lvl>
+    <w:lvl w:ilvl="5" w:tentative="1">
+      <w:start w:val="1"/>
+      <w:numFmt w:val="bullet"/>
+      <w:lvlText w:val=""/>
+      <w:lvlJc w:val="left"/>
+      <w:pPr>
+        <w:tabs>
+          <w:tab w:val="num" w:pos="4320"/>
+        </w:tabs>
+        <w:ind w:left="4320" w:hanging="360"/>
+      </w:pPr>
+      <w:rPr>
+        <w:rFonts w:ascii="Wingdings" w:hAnsi="Wingdings" w:hint="default"/>
+        <w:sz w:val="20"/>
+      </w:rPr>
+    </w:lvl>
+    <w:lvl w:ilvl="6" w:tentative="1">
+      <w:start w:val="1"/>
+      <w:numFmt w:val="bullet"/>
+      <w:lvlText w:val=""/>
+      <w:lvlJc w:val="left"/>
+      <w:pPr>
+        <w:tabs>
+          <w:tab w:val="num" w:pos="5040"/>
+        </w:tabs>
+        <w:ind w:left="5040" w:hanging="360"/>
+      </w:pPr>
+      <w:rPr>
+        <w:rFonts w:ascii="Wingdings" w:hAnsi="Wingdings" w:hint="default"/>
+        <w:sz w:val="20"/>
+      </w:rPr>
+    </w:lvl>
+    <w:lvl w:ilvl="7" w:tentative="1">
+      <w:start w:val="1"/>
+      <w:numFmt w:val="bullet"/>
+      <w:lvlText w:val=""/>
+      <w:lvlJc w:val="left"/>
+      <w:pPr>
+        <w:tabs>
+          <w:tab w:val="num" w:pos="5760"/>
+        </w:tabs>
+        <w:ind w:left="5760" w:hanging="360"/>
+      </w:pPr>
+      <w:rPr>
+        <w:rFonts w:ascii="Wingdings" w:hAnsi="Wingdings" w:hint="default"/>
+        <w:sz w:val="20"/>
+      </w:rPr>
+    </w:lvl>
+    <w:lvl w:ilvl="8" w:tentative="1">
+      <w:start w:val="1"/>
+      <w:numFmt w:val="bullet"/>
+      <w:lvlText w:val=""/>
+      <w:lvlJc w:val="left"/>
+      <w:pPr>
+        <w:tabs>
+          <w:tab w:val="num" w:pos="6480"/>
+        </w:tabs>
+        <w:ind w:left="6480" w:hanging="360"/>
+      </w:pPr>
+      <w:rPr>
+        <w:rFonts w:ascii="Wingdings" w:hAnsi="Wingdings" w:hint="default"/>
+        <w:sz w:val="20"/>
+      </w:rPr>
+    </w:lvl>
+  </w:abstractNum>
+  <w:abstractNum w:abstractNumId="21" w15:restartNumberingAfterBreak="0">
     <w:nsid w:val="261641E3"/>
     <w:multiLevelType w:val="multilevel"/>
     <w:tmpl w:val="A2F29504"/>
@@ -8113,7 +9732,7 @@
       </w:rPr>
     </w:lvl>
   </w:abstractNum>
-  <w:abstractNum w:abstractNumId="18" w15:restartNumberingAfterBreak="0">
+  <w:abstractNum w:abstractNumId="22" w15:restartNumberingAfterBreak="0">
     <w:nsid w:val="2C631985"/>
     <w:multiLevelType w:val="multilevel"/>
     <w:tmpl w:val="7146106A"/>
@@ -8262,7 +9881,7 @@
       </w:rPr>
     </w:lvl>
   </w:abstractNum>
-  <w:abstractNum w:abstractNumId="19" w15:restartNumberingAfterBreak="0">
+  <w:abstractNum w:abstractNumId="23" w15:restartNumberingAfterBreak="0">
     <w:nsid w:val="2C894CD6"/>
     <w:multiLevelType w:val="multilevel"/>
     <w:tmpl w:val="DA5A3198"/>
@@ -8375,7 +9994,7 @@
       </w:pPr>
     </w:lvl>
   </w:abstractNum>
-  <w:abstractNum w:abstractNumId="20" w15:restartNumberingAfterBreak="0">
+  <w:abstractNum w:abstractNumId="24" w15:restartNumberingAfterBreak="0">
     <w:nsid w:val="2E0704B5"/>
     <w:multiLevelType w:val="multilevel"/>
     <w:tmpl w:val="93D8486A"/>
@@ -8524,7 +10143,7 @@
       </w:rPr>
     </w:lvl>
   </w:abstractNum>
-  <w:abstractNum w:abstractNumId="21" w15:restartNumberingAfterBreak="0">
+  <w:abstractNum w:abstractNumId="25" w15:restartNumberingAfterBreak="0">
     <w:nsid w:val="3625634C"/>
     <w:multiLevelType w:val="multilevel"/>
     <w:tmpl w:val="480C6060"/>
@@ -8673,7 +10292,7 @@
       </w:rPr>
     </w:lvl>
   </w:abstractNum>
-  <w:abstractNum w:abstractNumId="22" w15:restartNumberingAfterBreak="0">
+  <w:abstractNum w:abstractNumId="26" w15:restartNumberingAfterBreak="0">
     <w:nsid w:val="3CF66B99"/>
     <w:multiLevelType w:val="multilevel"/>
     <w:tmpl w:val="247E3C30"/>
@@ -8822,7 +10441,7 @@
       </w:rPr>
     </w:lvl>
   </w:abstractNum>
-  <w:abstractNum w:abstractNumId="23" w15:restartNumberingAfterBreak="0">
+  <w:abstractNum w:abstractNumId="27" w15:restartNumberingAfterBreak="0">
     <w:nsid w:val="3F431E86"/>
     <w:multiLevelType w:val="multilevel"/>
     <w:tmpl w:val="71683C9A"/>
@@ -8971,7 +10590,7 @@
       </w:rPr>
     </w:lvl>
   </w:abstractNum>
-  <w:abstractNum w:abstractNumId="24" w15:restartNumberingAfterBreak="0">
+  <w:abstractNum w:abstractNumId="28" w15:restartNumberingAfterBreak="0">
     <w:nsid w:val="3FBE27FE"/>
     <w:multiLevelType w:val="multilevel"/>
     <w:tmpl w:val="CE843100"/>
@@ -9120,7 +10739,156 @@
       </w:rPr>
     </w:lvl>
   </w:abstractNum>
-  <w:abstractNum w:abstractNumId="25" w15:restartNumberingAfterBreak="0">
+  <w:abstractNum w:abstractNumId="29" w15:restartNumberingAfterBreak="0">
+    <w:nsid w:val="40787588"/>
+    <w:multiLevelType w:val="multilevel"/>
+    <w:tmpl w:val="56E2A682"/>
+    <w:lvl w:ilvl="0">
+      <w:start w:val="1"/>
+      <w:numFmt w:val="bullet"/>
+      <w:lvlText w:val=""/>
+      <w:lvlJc w:val="left"/>
+      <w:pPr>
+        <w:tabs>
+          <w:tab w:val="num" w:pos="720"/>
+        </w:tabs>
+        <w:ind w:left="720" w:hanging="360"/>
+      </w:pPr>
+      <w:rPr>
+        <w:rFonts w:ascii="Symbol" w:hAnsi="Symbol" w:hint="default"/>
+        <w:sz w:val="20"/>
+      </w:rPr>
+    </w:lvl>
+    <w:lvl w:ilvl="1" w:tentative="1">
+      <w:start w:val="1"/>
+      <w:numFmt w:val="bullet"/>
+      <w:lvlText w:val="o"/>
+      <w:lvlJc w:val="left"/>
+      <w:pPr>
+        <w:tabs>
+          <w:tab w:val="num" w:pos="1440"/>
+        </w:tabs>
+        <w:ind w:left="1440" w:hanging="360"/>
+      </w:pPr>
+      <w:rPr>
+        <w:rFonts w:ascii="Courier New" w:hAnsi="Courier New" w:hint="default"/>
+        <w:sz w:val="20"/>
+      </w:rPr>
+    </w:lvl>
+    <w:lvl w:ilvl="2" w:tentative="1">
+      <w:start w:val="1"/>
+      <w:numFmt w:val="bullet"/>
+      <w:lvlText w:val=""/>
+      <w:lvlJc w:val="left"/>
+      <w:pPr>
+        <w:tabs>
+          <w:tab w:val="num" w:pos="2160"/>
+        </w:tabs>
+        <w:ind w:left="2160" w:hanging="360"/>
+      </w:pPr>
+      <w:rPr>
+        <w:rFonts w:ascii="Wingdings" w:hAnsi="Wingdings" w:hint="default"/>
+        <w:sz w:val="20"/>
+      </w:rPr>
+    </w:lvl>
+    <w:lvl w:ilvl="3" w:tentative="1">
+      <w:start w:val="1"/>
+      <w:numFmt w:val="bullet"/>
+      <w:lvlText w:val=""/>
+      <w:lvlJc w:val="left"/>
+      <w:pPr>
+        <w:tabs>
+          <w:tab w:val="num" w:pos="2880"/>
+        </w:tabs>
+        <w:ind w:left="2880" w:hanging="360"/>
+      </w:pPr>
+      <w:rPr>
+        <w:rFonts w:ascii="Wingdings" w:hAnsi="Wingdings" w:hint="default"/>
+        <w:sz w:val="20"/>
+      </w:rPr>
+    </w:lvl>
+    <w:lvl w:ilvl="4" w:tentative="1">
+      <w:start w:val="1"/>
+      <w:numFmt w:val="bullet"/>
+      <w:lvlText w:val=""/>
+      <w:lvlJc w:val="left"/>
+      <w:pPr>
+        <w:tabs>
+          <w:tab w:val="num" w:pos="3600"/>
+        </w:tabs>
+        <w:ind w:left="3600" w:hanging="360"/>
+      </w:pPr>
+      <w:rPr>
+        <w:rFonts w:ascii="Wingdings" w:hAnsi="Wingdings" w:hint="default"/>
+        <w:sz w:val="20"/>
+      </w:rPr>
+    </w:lvl>
+    <w:lvl w:ilvl="5" w:tentative="1">
+      <w:start w:val="1"/>
+      <w:numFmt w:val="bullet"/>
+      <w:lvlText w:val=""/>
+      <w:lvlJc w:val="left"/>
+      <w:pPr>
+        <w:tabs>
+          <w:tab w:val="num" w:pos="4320"/>
+        </w:tabs>
+        <w:ind w:left="4320" w:hanging="360"/>
+      </w:pPr>
+      <w:rPr>
+        <w:rFonts w:ascii="Wingdings" w:hAnsi="Wingdings" w:hint="default"/>
+        <w:sz w:val="20"/>
+      </w:rPr>
+    </w:lvl>
+    <w:lvl w:ilvl="6" w:tentative="1">
+      <w:start w:val="1"/>
+      <w:numFmt w:val="bullet"/>
+      <w:lvlText w:val=""/>
+      <w:lvlJc w:val="left"/>
+      <w:pPr>
+        <w:tabs>
+          <w:tab w:val="num" w:pos="5040"/>
+        </w:tabs>
+        <w:ind w:left="5040" w:hanging="360"/>
+      </w:pPr>
+      <w:rPr>
+        <w:rFonts w:ascii="Wingdings" w:hAnsi="Wingdings" w:hint="default"/>
+        <w:sz w:val="20"/>
+      </w:rPr>
+    </w:lvl>
+    <w:lvl w:ilvl="7" w:tentative="1">
+      <w:start w:val="1"/>
+      <w:numFmt w:val="bullet"/>
+      <w:lvlText w:val=""/>
+      <w:lvlJc w:val="left"/>
+      <w:pPr>
+        <w:tabs>
+          <w:tab w:val="num" w:pos="5760"/>
+        </w:tabs>
+        <w:ind w:left="5760" w:hanging="360"/>
+      </w:pPr>
+      <w:rPr>
+        <w:rFonts w:ascii="Wingdings" w:hAnsi="Wingdings" w:hint="default"/>
+        <w:sz w:val="20"/>
+      </w:rPr>
+    </w:lvl>
+    <w:lvl w:ilvl="8" w:tentative="1">
+      <w:start w:val="1"/>
+      <w:numFmt w:val="bullet"/>
+      <w:lvlText w:val=""/>
+      <w:lvlJc w:val="left"/>
+      <w:pPr>
+        <w:tabs>
+          <w:tab w:val="num" w:pos="6480"/>
+        </w:tabs>
+        <w:ind w:left="6480" w:hanging="360"/>
+      </w:pPr>
+      <w:rPr>
+        <w:rFonts w:ascii="Wingdings" w:hAnsi="Wingdings" w:hint="default"/>
+        <w:sz w:val="20"/>
+      </w:rPr>
+    </w:lvl>
+  </w:abstractNum>
+  <w:abstractNum w:abstractNumId="30" w15:restartNumberingAfterBreak="0">
     <w:nsid w:val="41552755"/>
     <w:multiLevelType w:val="multilevel"/>
     <w:tmpl w:val="43C0AF22"/>
@@ -9269,7 +11037,7 @@
       </w:rPr>
     </w:lvl>
   </w:abstractNum>
-  <w:abstractNum w:abstractNumId="26" w15:restartNumberingAfterBreak="0">
+  <w:abstractNum w:abstractNumId="31" w15:restartNumberingAfterBreak="0">
     <w:nsid w:val="425B6D5D"/>
     <w:multiLevelType w:val="multilevel"/>
     <w:tmpl w:val="A86A55BA"/>
@@ -9418,7 +11186,7 @@
       </w:rPr>
     </w:lvl>
   </w:abstractNum>
-  <w:abstractNum w:abstractNumId="27" w15:restartNumberingAfterBreak="0">
+  <w:abstractNum w:abstractNumId="32" w15:restartNumberingAfterBreak="0">
     <w:nsid w:val="430B498A"/>
     <w:multiLevelType w:val="multilevel"/>
     <w:tmpl w:val="08D65AF6"/>
@@ -9567,7 +11335,7 @@
       </w:rPr>
     </w:lvl>
   </w:abstractNum>
-  <w:abstractNum w:abstractNumId="28" w15:restartNumberingAfterBreak="0">
+  <w:abstractNum w:abstractNumId="33" w15:restartNumberingAfterBreak="0">
     <w:nsid w:val="43B00359"/>
     <w:multiLevelType w:val="multilevel"/>
     <w:tmpl w:val="4074FDB2"/>
@@ -9716,7 +11484,7 @@
       </w:rPr>
     </w:lvl>
   </w:abstractNum>
-  <w:abstractNum w:abstractNumId="29" w15:restartNumberingAfterBreak="0">
+  <w:abstractNum w:abstractNumId="34" w15:restartNumberingAfterBreak="0">
     <w:nsid w:val="4405324E"/>
     <w:multiLevelType w:val="multilevel"/>
     <w:tmpl w:val="3190ADBA"/>
@@ -9865,7 +11633,7 @@
       </w:rPr>
     </w:lvl>
   </w:abstractNum>
-  <w:abstractNum w:abstractNumId="30" w15:restartNumberingAfterBreak="0">
+  <w:abstractNum w:abstractNumId="35" w15:restartNumberingAfterBreak="0">
     <w:nsid w:val="471C315C"/>
     <w:multiLevelType w:val="multilevel"/>
     <w:tmpl w:val="C01EE712"/>
@@ -10014,7 +11782,7 @@
       </w:rPr>
     </w:lvl>
   </w:abstractNum>
-  <w:abstractNum w:abstractNumId="31" w15:restartNumberingAfterBreak="0">
+  <w:abstractNum w:abstractNumId="36" w15:restartNumberingAfterBreak="0">
     <w:nsid w:val="4A421664"/>
     <w:multiLevelType w:val="multilevel"/>
     <w:tmpl w:val="387C34F2"/>
@@ -10163,7 +11931,7 @@
       </w:rPr>
     </w:lvl>
   </w:abstractNum>
-  <w:abstractNum w:abstractNumId="32" w15:restartNumberingAfterBreak="0">
+  <w:abstractNum w:abstractNumId="37" w15:restartNumberingAfterBreak="0">
     <w:nsid w:val="4E794547"/>
     <w:multiLevelType w:val="multilevel"/>
     <w:tmpl w:val="D0D40B82"/>
@@ -10312,7 +12080,7 @@
       </w:rPr>
     </w:lvl>
   </w:abstractNum>
-  <w:abstractNum w:abstractNumId="33" w15:restartNumberingAfterBreak="0">
+  <w:abstractNum w:abstractNumId="38" w15:restartNumberingAfterBreak="0">
     <w:nsid w:val="4F0A702E"/>
     <w:multiLevelType w:val="multilevel"/>
     <w:tmpl w:val="DC7073F8"/>
@@ -10461,7 +12229,7 @@
       </w:rPr>
     </w:lvl>
   </w:abstractNum>
-  <w:abstractNum w:abstractNumId="34" w15:restartNumberingAfterBreak="0">
+  <w:abstractNum w:abstractNumId="39" w15:restartNumberingAfterBreak="0">
     <w:nsid w:val="503F437F"/>
     <w:multiLevelType w:val="multilevel"/>
     <w:tmpl w:val="638E97C2"/>
@@ -10610,7 +12378,7 @@
       </w:rPr>
     </w:lvl>
   </w:abstractNum>
-  <w:abstractNum w:abstractNumId="35" w15:restartNumberingAfterBreak="0">
+  <w:abstractNum w:abstractNumId="40" w15:restartNumberingAfterBreak="0">
     <w:nsid w:val="514F1507"/>
     <w:multiLevelType w:val="multilevel"/>
     <w:tmpl w:val="BE289292"/>
@@ -10759,7 +12527,7 @@
       </w:rPr>
     </w:lvl>
   </w:abstractNum>
-  <w:abstractNum w:abstractNumId="36" w15:restartNumberingAfterBreak="0">
+  <w:abstractNum w:abstractNumId="41" w15:restartNumberingAfterBreak="0">
     <w:nsid w:val="51ED3D90"/>
     <w:multiLevelType w:val="multilevel"/>
     <w:tmpl w:val="F85C83BC"/>
@@ -10908,7 +12676,7 @@
       </w:rPr>
     </w:lvl>
   </w:abstractNum>
-  <w:abstractNum w:abstractNumId="37" w15:restartNumberingAfterBreak="0">
+  <w:abstractNum w:abstractNumId="42" w15:restartNumberingAfterBreak="0">
     <w:nsid w:val="536460B3"/>
     <w:multiLevelType w:val="multilevel"/>
     <w:tmpl w:val="0ACC9C62"/>
@@ -11057,7 +12825,7 @@
       </w:rPr>
     </w:lvl>
   </w:abstractNum>
-  <w:abstractNum w:abstractNumId="38" w15:restartNumberingAfterBreak="0">
+  <w:abstractNum w:abstractNumId="43" w15:restartNumberingAfterBreak="0">
     <w:nsid w:val="57F16EC6"/>
     <w:multiLevelType w:val="multilevel"/>
     <w:tmpl w:val="E00835D0"/>
@@ -11206,7 +12974,7 @@
       </w:rPr>
     </w:lvl>
   </w:abstractNum>
-  <w:abstractNum w:abstractNumId="39" w15:restartNumberingAfterBreak="0">
+  <w:abstractNum w:abstractNumId="44" w15:restartNumberingAfterBreak="0">
     <w:nsid w:val="58310EE2"/>
     <w:multiLevelType w:val="multilevel"/>
     <w:tmpl w:val="668C5E2C"/>
@@ -11319,7 +13087,7 @@
       </w:pPr>
     </w:lvl>
   </w:abstractNum>
-  <w:abstractNum w:abstractNumId="40" w15:restartNumberingAfterBreak="0">
+  <w:abstractNum w:abstractNumId="45" w15:restartNumberingAfterBreak="0">
     <w:nsid w:val="5834078D"/>
     <w:multiLevelType w:val="multilevel"/>
     <w:tmpl w:val="B7EC5BEE"/>
@@ -11468,7 +13236,7 @@
       </w:rPr>
     </w:lvl>
   </w:abstractNum>
-  <w:abstractNum w:abstractNumId="41" w15:restartNumberingAfterBreak="0">
+  <w:abstractNum w:abstractNumId="46" w15:restartNumberingAfterBreak="0">
     <w:nsid w:val="58F734F6"/>
     <w:multiLevelType w:val="multilevel"/>
     <w:tmpl w:val="EF064D90"/>
@@ -11617,7 +13385,7 @@
       </w:rPr>
     </w:lvl>
   </w:abstractNum>
-  <w:abstractNum w:abstractNumId="42" w15:restartNumberingAfterBreak="0">
+  <w:abstractNum w:abstractNumId="47" w15:restartNumberingAfterBreak="0">
     <w:nsid w:val="5C1F5117"/>
     <w:multiLevelType w:val="multilevel"/>
     <w:tmpl w:val="538A43B2"/>
@@ -11766,7 +13534,7 @@
       </w:rPr>
     </w:lvl>
   </w:abstractNum>
-  <w:abstractNum w:abstractNumId="43" w15:restartNumberingAfterBreak="0">
+  <w:abstractNum w:abstractNumId="48" w15:restartNumberingAfterBreak="0">
     <w:nsid w:val="5DF96BE6"/>
     <w:multiLevelType w:val="multilevel"/>
     <w:tmpl w:val="4054486A"/>
@@ -11915,7 +13683,156 @@
       </w:rPr>
     </w:lvl>
   </w:abstractNum>
-  <w:abstractNum w:abstractNumId="44" w15:restartNumberingAfterBreak="0">
+  <w:abstractNum w:abstractNumId="49" w15:restartNumberingAfterBreak="0">
+    <w:nsid w:val="6C427D99"/>
+    <w:multiLevelType w:val="multilevel"/>
+    <w:tmpl w:val="6C26539A"/>
+    <w:lvl w:ilvl="0">
+      <w:start w:val="1"/>
+      <w:numFmt w:val="bullet"/>
+      <w:lvlText w:val=""/>
+      <w:lvlJc w:val="left"/>
+      <w:pPr>
+        <w:tabs>
+          <w:tab w:val="num" w:pos="720"/>
+        </w:tabs>
+        <w:ind w:left="720" w:hanging="360"/>
+      </w:pPr>
+      <w:rPr>
+        <w:rFonts w:ascii="Symbol" w:hAnsi="Symbol" w:hint="default"/>
+        <w:sz w:val="20"/>
+      </w:rPr>
+    </w:lvl>
+    <w:lvl w:ilvl="1" w:tentative="1">
+      <w:start w:val="1"/>
+      <w:numFmt w:val="bullet"/>
+      <w:lvlText w:val="o"/>
+      <w:lvlJc w:val="left"/>
+      <w:pPr>
+        <w:tabs>
+          <w:tab w:val="num" w:pos="1440"/>
+        </w:tabs>
+        <w:ind w:left="1440" w:hanging="360"/>
+      </w:pPr>
+      <w:rPr>
+        <w:rFonts w:ascii="Courier New" w:hAnsi="Courier New" w:hint="default"/>
+        <w:sz w:val="20"/>
+      </w:rPr>
+    </w:lvl>
+    <w:lvl w:ilvl="2" w:tentative="1">
+      <w:start w:val="1"/>
+      <w:numFmt w:val="bullet"/>
+      <w:lvlText w:val=""/>
+      <w:lvlJc w:val="left"/>
+      <w:pPr>
+        <w:tabs>
+          <w:tab w:val="num" w:pos="2160"/>
+        </w:tabs>
+        <w:ind w:left="2160" w:hanging="360"/>
+      </w:pPr>
+      <w:rPr>
+        <w:rFonts w:ascii="Wingdings" w:hAnsi="Wingdings" w:hint="default"/>
+        <w:sz w:val="20"/>
+      </w:rPr>
+    </w:lvl>
+    <w:lvl w:ilvl="3" w:tentative="1">
+      <w:start w:val="1"/>
+      <w:numFmt w:val="bullet"/>
+      <w:lvlText w:val=""/>
+      <w:lvlJc w:val="left"/>
+      <w:pPr>
+        <w:tabs>
+          <w:tab w:val="num" w:pos="2880"/>
+        </w:tabs>
+        <w:ind w:left="2880" w:hanging="360"/>
+      </w:pPr>
+      <w:rPr>
+        <w:rFonts w:ascii="Wingdings" w:hAnsi="Wingdings" w:hint="default"/>
+        <w:sz w:val="20"/>
+      </w:rPr>
+    </w:lvl>
+    <w:lvl w:ilvl="4" w:tentative="1">
+      <w:start w:val="1"/>
+      <w:numFmt w:val="bullet"/>
+      <w:lvlText w:val=""/>
+      <w:lvlJc w:val="left"/>
+      <w:pPr>
+        <w:tabs>
+          <w:tab w:val="num" w:pos="3600"/>
+        </w:tabs>
+        <w:ind w:left="3600" w:hanging="360"/>
+      </w:pPr>
+      <w:rPr>
+        <w:rFonts w:ascii="Wingdings" w:hAnsi="Wingdings" w:hint="default"/>
+        <w:sz w:val="20"/>
+      </w:rPr>
+    </w:lvl>
+    <w:lvl w:ilvl="5" w:tentative="1">
+      <w:start w:val="1"/>
+      <w:numFmt w:val="bullet"/>
+      <w:lvlText w:val=""/>
+      <w:lvlJc w:val="left"/>
+      <w:pPr>
+        <w:tabs>
+          <w:tab w:val="num" w:pos="4320"/>
+        </w:tabs>
+        <w:ind w:left="4320" w:hanging="360"/>
+      </w:pPr>
+      <w:rPr>
+        <w:rFonts w:ascii="Wingdings" w:hAnsi="Wingdings" w:hint="default"/>
+        <w:sz w:val="20"/>
+      </w:rPr>
+    </w:lvl>
+    <w:lvl w:ilvl="6" w:tentative="1">
+      <w:start w:val="1"/>
+      <w:numFmt w:val="bullet"/>
+      <w:lvlText w:val=""/>
+      <w:lvlJc w:val="left"/>
+      <w:pPr>
+        <w:tabs>
+          <w:tab w:val="num" w:pos="5040"/>
+        </w:tabs>
+        <w:ind w:left="5040" w:hanging="360"/>
+      </w:pPr>
+      <w:rPr>
+        <w:rFonts w:ascii="Wingdings" w:hAnsi="Wingdings" w:hint="default"/>
+        <w:sz w:val="20"/>
+      </w:rPr>
+    </w:lvl>
+    <w:lvl w:ilvl="7" w:tentative="1">
+      <w:start w:val="1"/>
+      <w:numFmt w:val="bullet"/>
+      <w:lvlText w:val=""/>
+      <w:lvlJc w:val="left"/>
+      <w:pPr>
+        <w:tabs>
+          <w:tab w:val="num" w:pos="5760"/>
+        </w:tabs>
+        <w:ind w:left="5760" w:hanging="360"/>
+      </w:pPr>
+      <w:rPr>
+        <w:rFonts w:ascii="Wingdings" w:hAnsi="Wingdings" w:hint="default"/>
+        <w:sz w:val="20"/>
+      </w:rPr>
+    </w:lvl>
+    <w:lvl w:ilvl="8" w:tentative="1">
+      <w:start w:val="1"/>
+      <w:numFmt w:val="bullet"/>
+      <w:lvlText w:val=""/>
+      <w:lvlJc w:val="left"/>
+      <w:pPr>
+        <w:tabs>
+          <w:tab w:val="num" w:pos="6480"/>
+        </w:tabs>
+        <w:ind w:left="6480" w:hanging="360"/>
+      </w:pPr>
+      <w:rPr>
+        <w:rFonts w:ascii="Wingdings" w:hAnsi="Wingdings" w:hint="default"/>
+        <w:sz w:val="20"/>
+      </w:rPr>
+    </w:lvl>
+  </w:abstractNum>
+  <w:abstractNum w:abstractNumId="50" w15:restartNumberingAfterBreak="0">
     <w:nsid w:val="6F364392"/>
     <w:multiLevelType w:val="multilevel"/>
     <w:tmpl w:val="E9505532"/>
@@ -12064,7 +13981,7 @@
       </w:rPr>
     </w:lvl>
   </w:abstractNum>
-  <w:abstractNum w:abstractNumId="45" w15:restartNumberingAfterBreak="0">
+  <w:abstractNum w:abstractNumId="51" w15:restartNumberingAfterBreak="0">
     <w:nsid w:val="72031CF4"/>
     <w:multiLevelType w:val="multilevel"/>
     <w:tmpl w:val="E808156C"/>
@@ -12213,7 +14130,7 @@
       </w:rPr>
     </w:lvl>
   </w:abstractNum>
-  <w:abstractNum w:abstractNumId="46" w15:restartNumberingAfterBreak="0">
+  <w:abstractNum w:abstractNumId="52" w15:restartNumberingAfterBreak="0">
     <w:nsid w:val="73E27E35"/>
     <w:multiLevelType w:val="multilevel"/>
     <w:tmpl w:val="1452DBEA"/>
@@ -12362,7 +14279,7 @@
       </w:rPr>
     </w:lvl>
   </w:abstractNum>
-  <w:abstractNum w:abstractNumId="47" w15:restartNumberingAfterBreak="0">
+  <w:abstractNum w:abstractNumId="53" w15:restartNumberingAfterBreak="0">
     <w:nsid w:val="776B0E68"/>
     <w:multiLevelType w:val="multilevel"/>
     <w:tmpl w:val="B92691EC"/>
@@ -12511,7 +14428,7 @@
       </w:rPr>
     </w:lvl>
   </w:abstractNum>
-  <w:abstractNum w:abstractNumId="48" w15:restartNumberingAfterBreak="0">
+  <w:abstractNum w:abstractNumId="54" w15:restartNumberingAfterBreak="0">
     <w:nsid w:val="78C448DC"/>
     <w:multiLevelType w:val="multilevel"/>
     <w:tmpl w:val="C13E05A8"/>
@@ -12660,7 +14577,7 @@
       </w:rPr>
     </w:lvl>
   </w:abstractNum>
-  <w:abstractNum w:abstractNumId="49" w15:restartNumberingAfterBreak="0">
+  <w:abstractNum w:abstractNumId="55" w15:restartNumberingAfterBreak="0">
     <w:nsid w:val="7A933BC1"/>
     <w:multiLevelType w:val="multilevel"/>
     <w:tmpl w:val="3F7859C2"/>
@@ -12810,155 +14727,174 @@
     </w:lvl>
   </w:abstractNum>
   <w:num w:numId="1" w16cid:durableId="94332662">
+    <w:abstractNumId w:val="27"/>
+  </w:num>
+  <w:num w:numId="2" w16cid:durableId="1113944286">
+    <w:abstractNumId w:val="53"/>
+  </w:num>
+  <w:num w:numId="3" w16cid:durableId="1058550911">
+    <w:abstractNumId w:val="6"/>
+  </w:num>
+  <w:num w:numId="4" w16cid:durableId="538396424">
+    <w:abstractNumId w:val="14"/>
+  </w:num>
+  <w:num w:numId="5" w16cid:durableId="975186975">
+    <w:abstractNumId w:val="36"/>
+  </w:num>
+  <w:num w:numId="6" w16cid:durableId="1814329753">
+    <w:abstractNumId w:val="44"/>
+  </w:num>
+  <w:num w:numId="7" w16cid:durableId="1173690040">
+    <w:abstractNumId w:val="40"/>
+  </w:num>
+  <w:num w:numId="8" w16cid:durableId="331109436">
+    <w:abstractNumId w:val="4"/>
+  </w:num>
+  <w:num w:numId="9" w16cid:durableId="1001393496">
+    <w:abstractNumId w:val="24"/>
+  </w:num>
+  <w:num w:numId="10" w16cid:durableId="414399510">
+    <w:abstractNumId w:val="21"/>
+  </w:num>
+  <w:num w:numId="11" w16cid:durableId="1630815640">
+    <w:abstractNumId w:val="30"/>
+  </w:num>
+  <w:num w:numId="12" w16cid:durableId="247927921">
+    <w:abstractNumId w:val="1"/>
+  </w:num>
+  <w:num w:numId="13" w16cid:durableId="1879511623">
+    <w:abstractNumId w:val="15"/>
+  </w:num>
+  <w:num w:numId="14" w16cid:durableId="1835563121">
+    <w:abstractNumId w:val="48"/>
+  </w:num>
+  <w:num w:numId="15" w16cid:durableId="1333878340">
+    <w:abstractNumId w:val="43"/>
+  </w:num>
+  <w:num w:numId="16" w16cid:durableId="734543948">
+    <w:abstractNumId w:val="45"/>
+  </w:num>
+  <w:num w:numId="17" w16cid:durableId="1431580308">
+    <w:abstractNumId w:val="22"/>
+  </w:num>
+  <w:num w:numId="18" w16cid:durableId="238711473">
+    <w:abstractNumId w:val="54"/>
+  </w:num>
+  <w:num w:numId="19" w16cid:durableId="1198078395">
+    <w:abstractNumId w:val="9"/>
+  </w:num>
+  <w:num w:numId="20" w16cid:durableId="2006467281">
+    <w:abstractNumId w:val="39"/>
+  </w:num>
+  <w:num w:numId="21" w16cid:durableId="278336639">
+    <w:abstractNumId w:val="11"/>
+  </w:num>
+  <w:num w:numId="22" w16cid:durableId="2019650626">
+    <w:abstractNumId w:val="28"/>
+  </w:num>
+  <w:num w:numId="23" w16cid:durableId="1858544659">
+    <w:abstractNumId w:val="26"/>
+  </w:num>
+  <w:num w:numId="24" w16cid:durableId="915210875">
+    <w:abstractNumId w:val="34"/>
+  </w:num>
+  <w:num w:numId="25" w16cid:durableId="1719207101">
+    <w:abstractNumId w:val="35"/>
+  </w:num>
+  <w:num w:numId="26" w16cid:durableId="128400261">
+    <w:abstractNumId w:val="47"/>
+  </w:num>
+  <w:num w:numId="27" w16cid:durableId="502208126">
+    <w:abstractNumId w:val="5"/>
+  </w:num>
+  <w:num w:numId="28" w16cid:durableId="285426373">
+    <w:abstractNumId w:val="18"/>
+  </w:num>
+  <w:num w:numId="29" w16cid:durableId="923565524">
+    <w:abstractNumId w:val="17"/>
+  </w:num>
+  <w:num w:numId="30" w16cid:durableId="18164325">
     <w:abstractNumId w:val="23"/>
   </w:num>
-  <w:num w:numId="2" w16cid:durableId="1113944286">
-    <w:abstractNumId w:val="47"/>
+  <w:num w:numId="31" w16cid:durableId="1772823898">
+    <w:abstractNumId w:val="16"/>
   </w:num>
-  <w:num w:numId="3" w16cid:durableId="1058550911">
-    <w:abstractNumId w:val="5"/>
+  <w:num w:numId="32" w16cid:durableId="971520924">
+    <w:abstractNumId w:val="13"/>
   </w:num>
-  <w:num w:numId="4" w16cid:durableId="538396424">
+  <w:num w:numId="33" w16cid:durableId="170461905">
+    <w:abstractNumId w:val="51"/>
+  </w:num>
+  <w:num w:numId="34" w16cid:durableId="469247231">
+    <w:abstractNumId w:val="25"/>
+  </w:num>
+  <w:num w:numId="35" w16cid:durableId="1646396441">
+    <w:abstractNumId w:val="3"/>
+  </w:num>
+  <w:num w:numId="36" w16cid:durableId="1964575246">
+    <w:abstractNumId w:val="31"/>
+  </w:num>
+  <w:num w:numId="37" w16cid:durableId="2135904848">
+    <w:abstractNumId w:val="10"/>
+  </w:num>
+  <w:num w:numId="38" w16cid:durableId="47186873">
+    <w:abstractNumId w:val="52"/>
+  </w:num>
+  <w:num w:numId="39" w16cid:durableId="1332949133">
+    <w:abstractNumId w:val="32"/>
+  </w:num>
+  <w:num w:numId="40" w16cid:durableId="1257061698">
+    <w:abstractNumId w:val="37"/>
+  </w:num>
+  <w:num w:numId="41" w16cid:durableId="1490832183">
+    <w:abstractNumId w:val="50"/>
+  </w:num>
+  <w:num w:numId="42" w16cid:durableId="1082139732">
+    <w:abstractNumId w:val="2"/>
+  </w:num>
+  <w:num w:numId="43" w16cid:durableId="1711949946">
+    <w:abstractNumId w:val="38"/>
+  </w:num>
+  <w:num w:numId="44" w16cid:durableId="1145319860">
+    <w:abstractNumId w:val="33"/>
+  </w:num>
+  <w:num w:numId="45" w16cid:durableId="1952545649">
+    <w:abstractNumId w:val="55"/>
+  </w:num>
+  <w:num w:numId="46" w16cid:durableId="2043048563">
+    <w:abstractNumId w:val="46"/>
+  </w:num>
+  <w:num w:numId="47" w16cid:durableId="1465924742">
+    <w:abstractNumId w:val="42"/>
+  </w:num>
+  <w:num w:numId="48" w16cid:durableId="2037731848">
+    <w:abstractNumId w:val="41"/>
+  </w:num>
+  <w:num w:numId="49" w16cid:durableId="951085966">
+    <w:abstractNumId w:val="7"/>
+  </w:num>
+  <w:num w:numId="50" w16cid:durableId="1997487556">
+    <w:abstractNumId w:val="8"/>
+  </w:num>
+  <w:num w:numId="51" w16cid:durableId="1943151459">
+    <w:abstractNumId w:val="0"/>
+  </w:num>
+  <w:num w:numId="52" w16cid:durableId="1482501143">
+    <w:abstractNumId w:val="29"/>
+  </w:num>
+  <w:num w:numId="53" w16cid:durableId="391272402">
+    <w:abstractNumId w:val="19"/>
+  </w:num>
+  <w:num w:numId="54" w16cid:durableId="1767538139">
+    <w:abstractNumId w:val="49"/>
+  </w:num>
+  <w:num w:numId="55" w16cid:durableId="461464442">
+    <w:abstractNumId w:val="20"/>
+  </w:num>
+  <w:num w:numId="56" w16cid:durableId="162815962">
     <w:abstractNumId w:val="12"/>
   </w:num>
-  <w:num w:numId="5" w16cid:durableId="975186975">
-    <w:abstractNumId w:val="31"/>
-  </w:num>
-  <w:num w:numId="6" w16cid:durableId="1814329753">
-    <w:abstractNumId w:val="39"/>
-  </w:num>
-  <w:num w:numId="7" w16cid:durableId="1173690040">
-    <w:abstractNumId w:val="35"/>
-  </w:num>
-  <w:num w:numId="8" w16cid:durableId="331109436">
-    <w:abstractNumId w:val="3"/>
-  </w:num>
-  <w:num w:numId="9" w16cid:durableId="1001393496">
-    <w:abstractNumId w:val="20"/>
-  </w:num>
-  <w:num w:numId="10" w16cid:durableId="414399510">
-    <w:abstractNumId w:val="17"/>
-  </w:num>
-  <w:num w:numId="11" w16cid:durableId="1630815640">
-    <w:abstractNumId w:val="25"/>
-  </w:num>
-  <w:num w:numId="12" w16cid:durableId="247927921">
-    <w:abstractNumId w:val="0"/>
-  </w:num>
-  <w:num w:numId="13" w16cid:durableId="1879511623">
-    <w:abstractNumId w:val="13"/>
-  </w:num>
-  <w:num w:numId="14" w16cid:durableId="1835563121">
-    <w:abstractNumId w:val="43"/>
-  </w:num>
-  <w:num w:numId="15" w16cid:durableId="1333878340">
-    <w:abstractNumId w:val="38"/>
-  </w:num>
-  <w:num w:numId="16" w16cid:durableId="734543948">
-    <w:abstractNumId w:val="40"/>
-  </w:num>
-  <w:num w:numId="17" w16cid:durableId="1431580308">
-    <w:abstractNumId w:val="18"/>
-  </w:num>
-  <w:num w:numId="18" w16cid:durableId="238711473">
-    <w:abstractNumId w:val="48"/>
-  </w:num>
-  <w:num w:numId="19" w16cid:durableId="1198078395">
-    <w:abstractNumId w:val="8"/>
-  </w:num>
-  <w:num w:numId="20" w16cid:durableId="2006467281">
-    <w:abstractNumId w:val="34"/>
-  </w:num>
-  <w:num w:numId="21" w16cid:durableId="278336639">
-    <w:abstractNumId w:val="10"/>
-  </w:num>
-  <w:num w:numId="22" w16cid:durableId="2019650626">
-    <w:abstractNumId w:val="24"/>
-  </w:num>
-  <w:num w:numId="23" w16cid:durableId="1858544659">
-    <w:abstractNumId w:val="22"/>
-  </w:num>
-  <w:num w:numId="24" w16cid:durableId="915210875">
-    <w:abstractNumId w:val="29"/>
-  </w:num>
-  <w:num w:numId="25" w16cid:durableId="1719207101">
-    <w:abstractNumId w:val="30"/>
-  </w:num>
-  <w:num w:numId="26" w16cid:durableId="128400261">
-    <w:abstractNumId w:val="42"/>
-  </w:num>
-  <w:num w:numId="27" w16cid:durableId="502208126">
-    <w:abstractNumId w:val="4"/>
-  </w:num>
-  <w:num w:numId="28" w16cid:durableId="285426373">
-    <w:abstractNumId w:val="16"/>
-  </w:num>
-  <w:num w:numId="29" w16cid:durableId="923565524">
-    <w:abstractNumId w:val="15"/>
-  </w:num>
-  <w:num w:numId="30" w16cid:durableId="18164325">
-    <w:abstractNumId w:val="19"/>
-  </w:num>
-  <w:num w:numId="31" w16cid:durableId="1772823898">
-    <w:abstractNumId w:val="14"/>
-  </w:num>
-  <w:num w:numId="32" w16cid:durableId="971520924">
-    <w:abstractNumId w:val="11"/>
-  </w:num>
-  <w:num w:numId="33" w16cid:durableId="170461905">
-    <w:abstractNumId w:val="45"/>
-  </w:num>
-  <w:num w:numId="34" w16cid:durableId="469247231">
-    <w:abstractNumId w:val="21"/>
-  </w:num>
-  <w:num w:numId="35" w16cid:durableId="1646396441">
-    <w:abstractNumId w:val="2"/>
-  </w:num>
-  <w:num w:numId="36" w16cid:durableId="1964575246">
-    <w:abstractNumId w:val="26"/>
-  </w:num>
-  <w:num w:numId="37" w16cid:durableId="2135904848">
-    <w:abstractNumId w:val="9"/>
-  </w:num>
-  <w:num w:numId="38" w16cid:durableId="47186873">
-    <w:abstractNumId w:val="46"/>
-  </w:num>
-  <w:num w:numId="39" w16cid:durableId="1332949133">
-    <w:abstractNumId w:val="27"/>
-  </w:num>
-  <w:num w:numId="40" w16cid:durableId="1257061698">
-    <w:abstractNumId w:val="32"/>
-  </w:num>
-  <w:num w:numId="41" w16cid:durableId="1490832183">
-    <w:abstractNumId w:val="44"/>
-  </w:num>
-  <w:num w:numId="42" w16cid:durableId="1082139732">
-    <w:abstractNumId w:val="1"/>
-  </w:num>
-  <w:num w:numId="43" w16cid:durableId="1711949946">
-    <w:abstractNumId w:val="33"/>
-  </w:num>
-  <w:num w:numId="44" w16cid:durableId="1145319860">
-    <w:abstractNumId w:val="28"/>
-  </w:num>
-  <w:num w:numId="45" w16cid:durableId="1952545649">
-    <w:abstractNumId w:val="49"/>
-  </w:num>
-  <w:num w:numId="46" w16cid:durableId="2043048563">
-    <w:abstractNumId w:val="41"/>
-  </w:num>
-  <w:num w:numId="47" w16cid:durableId="1465924742">
-    <w:abstractNumId w:val="37"/>
-  </w:num>
-  <w:num w:numId="48" w16cid:durableId="2037731848">
-    <w:abstractNumId w:val="36"/>
-  </w:num>
-  <w:num w:numId="49" w16cid:durableId="951085966">
-    <w:abstractNumId w:val="6"/>
-  </w:num>
-  <w:num w:numId="50" w16cid:durableId="1997487556">
-    <w:abstractNumId w:val="7"/>
-  </w:num>
+  <w:numIdMacAtCleanup w:val="56"/>
 </w:numbering>
 </file>
 
@@ -13387,6 +15323,25 @@
     <w:semiHidden/>
     <w:unhideWhenUsed/>
   </w:style>
+  <w:style w:type="table" w:styleId="TableGrid">
+    <w:name w:val="Table Grid"/>
+    <w:basedOn w:val="TableNormal"/>
+    <w:uiPriority w:val="39"/>
+    <w:rsid w:val="00342C93"/>
+    <w:pPr>
+      <w:spacing w:after="0" w:line="240" w:lineRule="auto"/>
+    </w:pPr>
+    <w:tblPr>
+      <w:tblBorders>
+        <w:top w:val="single" w:sz="4" w:space="0" w:color="auto"/>
+        <w:left w:val="single" w:sz="4" w:space="0" w:color="auto"/>
+        <w:bottom w:val="single" w:sz="4" w:space="0" w:color="auto"/>
+        <w:right w:val="single" w:sz="4" w:space="0" w:color="auto"/>
+        <w:insideH w:val="single" w:sz="4" w:space="0" w:color="auto"/>
+        <w:insideV w:val="single" w:sz="4" w:space="0" w:color="auto"/>
+      </w:tblBorders>
+    </w:tblPr>
+  </w:style>
 </w:styles>
 </file>
 

</xml_diff>